<commit_message>
Format SafeWeb KHKT report to template
</commit_message>
<xml_diff>
--- a/Bao_cao_SafeWeb_KHKT_THPT.docx
+++ b/Bao_cao_SafeWeb_KHKT_THPT.docx
@@ -348,7 +348,7 @@
           <w:b w:val="0"/>
           <w:i w:val="0"/>
           <w:color w:val="23313F"/>
-          <w:sz w:val="22"/>
+          <w:sz w:val="24"/>
         </w:rPr>
         <w:t>Mục lục Word liên kết trực tiếp với các cấp tiêu đề của báo cáo. Khi mở tài liệu, dùng lệnh cập nhật toàn bộ trường nếu trình xử lý văn bản chưa tự làm mới mục lục.</w:t>
       </w:r>
@@ -399,7 +399,7 @@
           <w:b w:val="0"/>
           <w:i w:val="0"/>
           <w:color w:val="23313F"/>
-          <w:sz w:val="22"/>
+          <w:sz w:val="24"/>
         </w:rPr>
         <w:t>SafeWeb v2.3.0 là nguyên mẫu phần mềm hỗ trợ nhận diện tín hiệu rủi ro trong URL trước khi truy cập. Mục tiêu thiết kế là kết hợp phân tích có thể giải thích với xử lý cục bộ mặc định. Hệ thống kết hợp tra cứu PhishVN, trích xuất 55 đặc trưng URL, bốn bộ phân loại và giao diện web tĩnh thực thi mô hình trực tiếp trên trình duyệt. DNS, chuyển hướng, metadata và ảnh xem trước chỉ được yêu cầu sau khi người dùng đồng ý. Dự án còn cung cấp kho dữ liệu tương tác và gợi ý category/provider/brand theo luật chuỗi.</w:t>
       </w:r>
@@ -416,7 +416,7 @@
           <w:b w:val="0"/>
           <w:i w:val="0"/>
           <w:color w:val="23313F"/>
-          <w:sz w:val="22"/>
+          <w:sz w:val="24"/>
         </w:rPr>
         <w:t>Dữ liệu PhishVN v3.1.0 gồm 53.116 dòng nguồn, được chuẩn hóa còn 36.261 URL duy nhất; loại 16.855 bí danh và không ghi nhận nhóm URL xung đột nhãn. Huấn luyện sử dụng 29.637 mẫu PhishVN train/validation cùng 231.662 mẫu PhiUSIIL đã làm sạch, tổng cộng 261.299 mẫu. Tập test gồm 6.624 URL từ phân vùng PhishVN chính thức, tách biệt domain khỏi train. Bốn mô hình được so sánh bằng chỉ số lớp phishing và ma trận nhầm lẫn.</w:t>
       </w:r>
@@ -433,7 +433,7 @@
           <w:b w:val="0"/>
           <w:i w:val="0"/>
           <w:color w:val="23313F"/>
-          <w:sz w:val="22"/>
+          <w:sz w:val="24"/>
         </w:rPr>
         <w:t>Gradient Boosting đạt F1 phishing 0,8697 và recall 0,9561; SVM đạt ROC-AUC 0,9308 nhưng recall ở ngưỡng hiện tại chỉ 0,0071, cho thấy một metric đơn lẻ không đủ để đánh giá. Lần kiểm thử trong workspace ghi nhận 59 kiểm thử Python và 15 kiểm thử trình duyệt; parity trên 10 URL hợp lệ và 6 URL không hợp lệ có sai khác tối đa 1,33×10⁻¹⁵ ở đặc trưng và 7,77×10⁻¹⁶ ở xác suất. Điều này xác minh tính nhất quán trên các ca đã chọn, không chứng minh độ chính xác thực địa. SafeWeb là công cụ tham khảo giáo dục, không chứng nhận website an toàn hay độc hại.</w:t>
       </w:r>
@@ -449,7 +449,7 @@
           <w:b w:val="0"/>
           <w:i w:val="0"/>
           <w:color w:val="23313F"/>
-          <w:sz w:val="22"/>
+          <w:sz w:val="24"/>
         </w:rPr>
         <w:t>Từ khóa: phishing; URL; PhishVN; học máy; suy luận phía trình duyệt; bảo vệ quyền riêng tư.</w:t>
       </w:r>
@@ -498,7 +498,7 @@
           <w:b w:val="0"/>
           <w:i w:val="0"/>
           <w:color w:val="23313F"/>
-          <w:sz w:val="22"/>
+          <w:sz w:val="24"/>
         </w:rPr>
         <w:t>URL là định danh tài nguyên web có cấu trúc scheme, authority, path, query và fragment theo cú pháp URI (Berners-Lee et al., 2005); URL xuất hiện phổ biến trong email, tin nhắn, mạng xã hội và mã QR. Phishing thường lợi dụng tên miền gần giống thương hiệu, chuỗi đường dẫn dài, ký tự mã hóa hoặc lời mời đăng nhập để dẫn người dùng đến trang thu thập thông tin. Người dùng phổ thông khó phân biệt tên miền đăng ký thực với nhãn phụ trong hostname; biểu tượng ổ khóa HTTPS chỉ cho biết URL khai báo scheme HTTPS, không chứng minh chủ thể là tổ chức đáng tin cậy. Vì vậy, một công cụ giáo dục cần chỉ ra tín hiệu quan sát được, đồng thời tránh tuyên bố chắc chắn vượt quá dữ liệu đầu vào.</w:t>
       </w:r>
@@ -515,7 +515,7 @@
           <w:b w:val="0"/>
           <w:i w:val="0"/>
           <w:color w:val="23313F"/>
-          <w:sz w:val="22"/>
+          <w:sz w:val="24"/>
         </w:rPr>
         <w:t>Các dịch vụ kiểm tra trực tuyến có thể yêu cầu URL đi qua máy chủ hoặc nguồn dữ liệu bên thứ ba. URL riêng tư đôi khi chứa mã theo dõi, mã mời hoặc thông tin định danh. SafeWeb chọn kiến trúc ưu tiên xử lý cục bộ: chuẩn hóa và phân tích chuỗi, tra cứu chỉ mục đóng gói và chạy bộ phân loại trong trình duyệt. Chỉ các bước tùy chọn mới tạo yêu cầu tới Google DNS-over-HTTPS, Microlink hoặc dịch vụ ảnh xem trước WordPress.</w:t>
       </w:r>
@@ -542,7 +542,7 @@
           <w:b w:val="0"/>
           <w:i w:val="0"/>
           <w:color w:val="23313F"/>
-          <w:sz w:val="22"/>
+          <w:sz w:val="24"/>
         </w:rPr>
         <w:t>Nhu cầu kỹ thuật là xây dựng nguyên mẫu web có thể nhận một URL, chuẩn hóa đầu vào, tra cứu dữ liệu tham chiếu, đánh giá đặc trưng URL, hiển thị lý do và mức cảnh báo, đồng thời cung cấp kiểm tra trực tuyến theo cơ chế đồng ý rõ ràng. Câu hỏi đánh giá chính: liệu một pipeline chỉ sử dụng URL và các mô hình được huấn luyện có thể cung cấp tín hiệu phishing nhất quán giữa Python và JavaScript trên tập kiểm thử định trước hay không?</w:t>
       </w:r>
@@ -559,7 +559,7 @@
           <w:b w:val="0"/>
           <w:i w:val="0"/>
           <w:color w:val="23313F"/>
-          <w:sz w:val="22"/>
+          <w:sz w:val="24"/>
         </w:rPr>
         <w:t>Giả thuyết kỹ thuật: nếu giữ cố định lược đồ đặc trưng, thứ tự đặc trưng, trọng số mô hình và phép biến đổi tiền xử lý khi xuất sang JavaScript, thì xác suất suy luận phía trình duyệt sẽ gần trùng khớp với Python trong sai số số học dấu phẩy động trên bộ URL kiểm thử. Giả thuyết này được kiểm tra bằng script đối chiếu parity; nó không khẳng định mô hình chính xác với mọi URL ngoài tập thử.</w:t>
       </w:r>
@@ -1161,7 +1161,7 @@
           <w:b w:val="0"/>
           <w:i w:val="0"/>
           <w:color w:val="23313F"/>
-          <w:sz w:val="22"/>
+          <w:sz w:val="24"/>
         </w:rPr>
         <w:t>Đối tượng nghiên cứu là chuỗi URL và các bản ghi nhãn đã công bố trong PhishVN/PhiUSIIL. Luồng suy luận không tải HTML của website và không chạy mã trang đích. Không có xác thực chứng thư TLS, đánh giá tuổi tên miền, uy tín WHOIS, danh tiếng IP, phân tích nội dung DOM hoặc sandbox. DNS chỉ được truy vấn khi bật live inspection. Dự án là nguyên mẫu nghiên cứu, chưa có đánh giá người dùng, kiểm định độc lập theo thời gian thực hoặc chứng nhận an toàn thông tin.</w:t>
       </w:r>
@@ -1198,7 +1198,7 @@
           <w:b w:val="0"/>
           <w:i w:val="0"/>
           <w:color w:val="23313F"/>
-          <w:sz w:val="22"/>
+          <w:sz w:val="24"/>
         </w:rPr>
         <w:t>Theo cấu trúc KHKT được cung cấp, SafeWeb thuộc dự án kỹ thuật: đầu ra là một nguyên mẫu phần mềm giải quyết nhu cầu thực tiễn; tiêu chí chính là khả năng hoạt động, tính tái lập, độ nhất quán triển khai và giới hạn vận hành. Phần thí nghiệm học máy là thành phần đánh giá của quá trình thiết kế, không biến sản phẩm thành một nghiên cứu nhân quả về hành vi người dùng.</w:t>
       </w:r>
@@ -1708,7 +1708,7 @@
           <w:b w:val="0"/>
           <w:i w:val="0"/>
           <w:color w:val="23313F"/>
-          <w:sz w:val="22"/>
+          <w:sz w:val="24"/>
         </w:rPr>
         <w:t>Random Forest (rừng ngẫu nhiên) là tổ hợp cây quyết định được huấn luyện với lấy mẫu ngẫu nhiên; dự đoán xác suất lớp được tổng hợp qua các cây. Cách tiếp cận này mô tả quan hệ phi tuyến và tương tác đặc trưng, đồng thời cấu trúc cây có thể xuất sang JavaScript dưới dạng mảng nút, nhánh, điều kiện và đầu ra (Breiman, 2001). SafeWeb đặt 100 cây, độ sâu tối đa 16, lá tối thiểu 3 và balanced-subsample class weighting.</w:t>
       </w:r>
@@ -1725,7 +1725,7 @@
           <w:b w:val="0"/>
           <w:i w:val="0"/>
           <w:color w:val="23313F"/>
-          <w:sz w:val="22"/>
+          <w:sz w:val="24"/>
         </w:rPr>
         <w:t>Gradient Boosting (tăng cường gradient) xây dựng tuần tự các cây nông để giảm hàm mất mát theo gradient, thay vì bỏ phiếu độc lập (Friedman, 2001). Cấu hình hiện tại có 100 cây độ sâu 3, learning rate 0,1. Mô hình đạt recall phishing cao nhất trong phép đo hiện hành nhưng cũng phát sinh nhiều false positive hơn Random Forest.</w:t>
       </w:r>
@@ -1742,7 +1742,7 @@
           <w:b w:val="0"/>
           <w:i w:val="0"/>
           <w:color w:val="23313F"/>
-          <w:sz w:val="22"/>
+          <w:sz w:val="24"/>
         </w:rPr>
         <w:t>Linear SVM (máy véc-tơ hỗ trợ tuyến tính) tìm siêu phẳng có biên phân tách lớn trong không gian đặc trưng (Cortes &amp; Vapnik, 1995); `StandardScaler` chuẩn hóa đầu vào và `LinearSVC` tạo decision score. Xác suất giao diện được lấy qua sigmoid calibration 3-fold với `ensemble=False`. Trên test, ROC-AUC cao không đồng nghĩa ngưỡng phân lớp mặc định hữu ích: recall phishing chỉ 0,0071. Đây là cảnh báo thực nghiệm trọng yếu, không được che khuất bằng accuracy.</w:t>
       </w:r>
@@ -1759,7 +1759,7 @@
           <w:b w:val="0"/>
           <w:i w:val="0"/>
           <w:color w:val="23313F"/>
-          <w:sz w:val="22"/>
+          <w:sz w:val="24"/>
         </w:rPr>
         <w:t>Logistic Regression (hồi quy logistic) ánh xạ tổ hợp tuyến tính đặc trưng qua hàm sigmoid để ước lượng xác suất lớp, đóng vai trò baseline tuyến tính dễ kiểm tra. Cấu hình sử dụng `StandardScaler`, `class_weight=balanced` và tối đa 2.000 vòng lặp. Các hiện thực của bộ phân loại được xây dựng bằng scikit-learn (Pedregosa et al., 2011).</w:t>
       </w:r>
@@ -1786,7 +1786,7 @@
           <w:b w:val="0"/>
           <w:i w:val="0"/>
           <w:color w:val="23313F"/>
-          <w:sz w:val="22"/>
+          <w:sz w:val="24"/>
         </w:rPr>
         <w:t>Bốn mô hình tạo bốn xác suất riêng. Giao diện tính trung bình số học của chúng để tạo xác suất đồng thuận, rồi áp ngưỡng 0,5 cho nhãn tổng hợp. Đây là ensemble trung bình xác suất, không phải bỏ phiếu đa số và cũng không phải đảm bảo các mô hình độc lập về sai số. Giao diện vẫn hiển thị xác suất/mức riêng để người dùng thấy bất đồng. Đặc biệt, SVM hiện có recall rất thấp ở ngưỡng mặc định; việc đưa xác suất SVM vào trung bình có thể làm suy giảm độ hữu ích và cần hiệu chỉnh trước triển khai rộng.</w:t>
       </w:r>
@@ -1814,7 +1814,7 @@
           <w:b w:val="0"/>
           <w:i w:val="0"/>
           <w:color w:val="23313F"/>
-          <w:sz w:val="21"/>
+          <w:sz w:val="22"/>
         </w:rPr>
         <w:t>Ghép chỉ mục PhishVN có nguồn gốc với suy luận bốn mô hình trong một trải nghiệm phía trình duyệt.</w:t>
       </w:r>
@@ -1832,7 +1832,7 @@
           <w:b w:val="0"/>
           <w:i w:val="0"/>
           <w:color w:val="23313F"/>
-          <w:sz w:val="21"/>
+          <w:sz w:val="22"/>
         </w:rPr>
         <w:t>Tách kết quả khớp dữ liệu trực tiếp khỏi điểm số học máy để người dùng phân biệt provenance và generalization.</w:t>
       </w:r>
@@ -1850,7 +1850,7 @@
           <w:b w:val="0"/>
           <w:i w:val="0"/>
           <w:color w:val="23313F"/>
-          <w:sz w:val="21"/>
+          <w:sz w:val="22"/>
         </w:rPr>
         <w:t>Đóng gói tham số mô hình, cây, scaler, calibration và quy tắc public suffix để suy luận offline mà không gửi URL ở chế độ mặc định.</w:t>
       </w:r>
@@ -1868,7 +1868,7 @@
           <w:b w:val="0"/>
           <w:i w:val="0"/>
           <w:color w:val="23313F"/>
-          <w:sz w:val="21"/>
+          <w:sz w:val="22"/>
         </w:rPr>
         <w:t>Có consent gate trước DNS, redirect, metadata và preview; thể hiện trực tiếp đánh đổi giữa thông tin bổ sung và quyền riêng tư.</w:t>
       </w:r>
@@ -1886,7 +1886,7 @@
           <w:b w:val="0"/>
           <w:i w:val="0"/>
           <w:color w:val="23313F"/>
-          <w:sz w:val="21"/>
+          <w:sz w:val="22"/>
         </w:rPr>
         <w:t>Kiểm tra khả năng tái hiện giữa Python và JavaScript bằng vector đặc trưng và xác suất thay vì chỉ kiểm thử giao diện.</w:t>
       </w:r>
@@ -1903,7 +1903,7 @@
           <w:b w:val="0"/>
           <w:i w:val="0"/>
           <w:color w:val="23313F"/>
-          <w:sz w:val="22"/>
+          <w:sz w:val="24"/>
         </w:rPr>
         <w:t>Các điểm trên là đóng góp kỹ thuật của nguyên mẫu, không phải khẳng định thuật toán mới hoặc ưu thế vượt trội so với dịch vụ thương mại.</w:t>
       </w:r>
@@ -2342,7 +2342,7 @@
           <w:b w:val="0"/>
           <w:i w:val="0"/>
           <w:color w:val="23313F"/>
-          <w:sz w:val="22"/>
+          <w:sz w:val="24"/>
         </w:rPr>
         <w:t>PhishVN v3.1.0 cung cấp 53.116 dòng nguồn, nhãn, metadata provenance và phân vùng train/validation/test theo nhóm (Thai Nguyen Vu, 2026). Pipeline canonicalize URL, gộp alias apex/`www`, rà soát nhãn xung đột và giữ phân vùng chính thức. Sau xử lý còn 36.261 URL: 19.909 phishing và 16.352 benign; 16.855 dòng bí danh trùng bị loại, không có nhóm nhãn xung đột hoặc URL lỗi/truncated bị loại. Phân vùng gồm train 25.185, validation 4.452 và test 6.624; giao nhau domain đăng ký giữa các phân vùng bằng 0.</w:t>
       </w:r>
@@ -2359,7 +2359,7 @@
           <w:b w:val="0"/>
           <w:i w:val="0"/>
           <w:color w:val="23313F"/>
-          <w:sz w:val="22"/>
+          <w:sz w:val="24"/>
         </w:rPr>
         <w:t>PhiUSIIL Phishing URL Dataset có 235.795 dòng nguồn (PhiUSIIL Phishing URL Dataset, n.d.). Bước làm sạch loại 86 dòng URL xung đột nhãn, 3.586 URL canonical trùng và 461 dòng thuộc 4.260 domain của test PhishVN; không có URL lỗi bị loại ở thống kê hiện hành. Còn 231.662 dòng dùng huấn luyện. Nhãn nguồn được đảo để khớp quy ước SafeWeb. Train bao gồm 29.637 mẫu PhishVN train+validation và 231.662 mẫu PhiUSIIL; test vẫn là 6.624 dòng PhishVN không được đưa vào fit.</w:t>
       </w:r>
@@ -3287,7 +3287,7 @@
           <w:b w:val="0"/>
           <w:i w:val="0"/>
           <w:color w:val="23313F"/>
-          <w:sz w:val="22"/>
+          <w:sz w:val="24"/>
         </w:rPr>
         <w:t>Đặc trưng CompPhish có sẵn trên PhishVN được đối chiếu với phép trích xuất cục bộ: 797.742 giá trị trên 36.261 bản ghi khớp với bảng phát hành trong sai số dung sai của pipeline. Timestamp thu thập/scrape chỉ là provenance, không được dùng như thời điểm sự kiện hoặc nhãn.</w:t>
       </w:r>
@@ -3314,7 +3314,7 @@
           <w:b w:val="0"/>
           <w:i w:val="0"/>
           <w:color w:val="23313F"/>
-          <w:sz w:val="22"/>
+          <w:sz w:val="24"/>
         </w:rPr>
         <w:t>Đầu vào mô hình là một vector số có thứ tự cố định. Các biến trùng khái niệm giữa SafeWeb và PhishVN được giữ riêng vì chúng theo định nghĩa nguồn khác nhau. Một số giá trị về TLD lấy từ hồ sơ host PhishVN khi có; các URL không có hồ sơ dùng phép tính cục bộ và danh sách suspicious TLD đóng gói.</w:t>
       </w:r>
@@ -4317,7 +4317,7 @@
           <w:b w:val="0"/>
           <w:i w:val="0"/>
           <w:color w:val="23313F"/>
-          <w:sz w:val="22"/>
+          <w:sz w:val="24"/>
         </w:rPr>
         <w:t>Các nhóm ngữ nghĩa dưới đây giúp mô tả bề mặt đe dọa, nhưng không đồng nghĩa tất cả từ trong danh sách đều là feature model. Mô hình đang dùng đúng tám cờ từ khóa ở bảng 3.2; việc một từ xuất hiện không chứng minh phishing vì trang hợp lệ cũng có thể chứa những từ này.</w:t>
       </w:r>
@@ -4910,7 +4910,7 @@
           <w:b w:val="0"/>
           <w:i w:val="0"/>
           <w:color w:val="23313F"/>
-          <w:sz w:val="21"/>
+          <w:sz w:val="22"/>
         </w:rPr>
         <w:t>Đọc phân vùng chính thức PhishVN; lấy train và validation làm phần PhishVN dùng fit, giữ test ngoài huấn luyện.</w:t>
       </w:r>
@@ -4928,7 +4928,7 @@
           <w:b w:val="0"/>
           <w:i w:val="0"/>
           <w:color w:val="23313F"/>
-          <w:sz w:val="21"/>
+          <w:sz w:val="22"/>
         </w:rPr>
         <w:t>Đọc URL/label từ archive PhiUSIIL, chuẩn hóa URL, đổi quy ước nhãn, loại xung đột, bản ghi trùng và domain thuộc test.</w:t>
       </w:r>
@@ -4946,7 +4946,7 @@
           <w:b w:val="0"/>
           <w:i w:val="0"/>
           <w:color w:val="23313F"/>
-          <w:sz w:val="21"/>
+          <w:sz w:val="22"/>
         </w:rPr>
         <w:t>Tạo cùng một thứ tự 55 đặc trưng cho hai nguồn; dùng 21 cột CompPhish đã phát hành cùng cờ suspicious-TLD và ba feature obfuscation.</w:t>
       </w:r>
@@ -4964,7 +4964,7 @@
           <w:b w:val="0"/>
           <w:i w:val="0"/>
           <w:color w:val="23313F"/>
-          <w:sz w:val="21"/>
+          <w:sz w:val="22"/>
         </w:rPr>
         <w:t>Tạo sample weight bảo đảm mỗi nguồn có tổng trọng số bằng nhau, và hai lớp benign/phishing cân bằng trong từng nguồn.</w:t>
       </w:r>
@@ -4982,7 +4982,7 @@
           <w:b w:val="0"/>
           <w:i w:val="0"/>
           <w:color w:val="23313F"/>
-          <w:sz w:val="21"/>
+          <w:sz w:val="22"/>
         </w:rPr>
         <w:t>Fit bốn estimator với random seed 42; đánh giá đồng nhất trên 6.624 URL test PhishVN; ghi accuracy, precision/recall/F1 phishing, ROC-AUC và confusion matrix.</w:t>
       </w:r>
@@ -5009,7 +5009,7 @@
           <w:b w:val="0"/>
           <w:i w:val="0"/>
           <w:color w:val="23313F"/>
-          <w:sz w:val="22"/>
+          <w:sz w:val="24"/>
         </w:rPr>
         <w:t>`scripts/export_browser_model.py` tuần tự hóa danh sách feature và biểu diễn có thể thực thi: mỗi cây Random Forest/Gradient Boosting thành mảng left/right child, feature index, threshold và output; Logistic Regression/SVM mang mean, scale, coefficient, intercept; SVM kèm tham số sigmoid calibration. Bundle cũng chứa public suffix rules và chỉ mục PhishVN. `browser-model.js` tính feature trên chuỗi, đi qua cây, chuẩn hóa linear score và áp sigmoid; đây là thực thi tham số đã fit, không gọi Python hay backend.</w:t>
       </w:r>
@@ -5026,7 +5026,7 @@
           <w:b w:val="0"/>
           <w:i w:val="0"/>
           <w:color w:val="23313F"/>
-          <w:sz w:val="22"/>
+          <w:sz w:val="24"/>
         </w:rPr>
         <w:t>Tính riêng tư cần diễn đạt có điều kiện: luồng local-only không gửi URL ra ngoài, nhưng dữ liệu mô hình và kho tham chiếu được tải cùng ứng dụng; khi bật live inspection, URL được gửi đến Google DNS-over-HTTPS và dịch vụ metadata/preview. Do đó sản phẩm không bảo đảm “tuyệt đối riêng tư” trong mọi chế độ; người dùng phải tránh đưa token, thông tin đăng nhập hoặc URL bí mật vào công cụ.</w:t>
       </w:r>
@@ -5053,7 +5053,7 @@
           <w:b w:val="0"/>
           <w:i w:val="0"/>
           <w:color w:val="23313F"/>
-          <w:sz w:val="22"/>
+          <w:sz w:val="24"/>
         </w:rPr>
         <w:t>Bộ tra cứu so khớp theo URL canonical chính xác, host đã biết hoặc chữ ký đặc trưng không va chạm nhãn benign. Dữ liệu triển khai từ PhishVN ghi 19.909 khóa URL phishing, 19.859 host phishing độc quyền và 4.461 signature đặc trưng exclusive. Một match là thông tin provenance trực tiếp, không nằm trong metric held-out của mô hình. Trong UI, kết quả database được giữ riêng và có thể ghi đè verdict tổng hợp; các điểm số bốn mô hình vẫn được hiển thị nhằm phân biệt tra cứu với dự đoán.</w:t>
       </w:r>
@@ -5925,7 +5925,7 @@
           <w:b w:val="0"/>
           <w:i w:val="0"/>
           <w:color w:val="23313F"/>
-          <w:sz w:val="22"/>
+          <w:sz w:val="24"/>
         </w:rPr>
         <w:t>Các lý do hiển thị được gắn với vị trí có thể chỉ ra: URL dài từ 100 ký tự; từ ba subdomain; hostname là IP; có ít nhất tám ký tự đặc biệt; entropy URL ít nhất 4,5 bit/ký tự; percent-encoding; tín hiệu obfuscation PhiUSIIL; và các keyword đã cấu hình. Phần giải thích giới hạn tối đa năm lý do trong danh sách chi tiết. Các ngưỡng này là tiêu chí trình bày hiện hành, không phải chuẩn phổ quát của phishing.</w:t>
       </w:r>
@@ -5942,7 +5942,7 @@
           <w:b w:val="0"/>
           <w:i w:val="0"/>
           <w:color w:val="23313F"/>
-          <w:sz w:val="22"/>
+          <w:sz w:val="24"/>
         </w:rPr>
         <w:t>Điểm heuristic giao diện cộng: URL dài từ 120 ký tự +18; từ ba subdomain +16; hostname IP +18; có `@` +12; từ tám ký tự đặc biệt +10; có `%` +8; entropy từ 4,5 +10; mỗi keyword khớp +8. Điểm kết hợp được tính `clamp(0, 100, 0,6 × 100p + heuristicScore)`. Mức theme lại phân loại theo xác suất ensemble p: LOW nếu p &lt; 0,25; CAUTION nếu 0,25 ≤ p &lt; 0,50; HIGH nếu 0,50 ≤ p &lt; 0,75; VERY HIGH nếu p ≥ 0,75. Match PhishVN và Easter egg có nhánh ghi đè kết quả theo record/host. Vì score và tier có công thức khác nhau, không nên suy ra tier chỉ từ điểm heuristic.</w:t>
       </w:r>
@@ -5959,7 +5959,7 @@
           <w:b w:val="0"/>
           <w:i w:val="0"/>
           <w:color w:val="23313F"/>
-          <w:sz w:val="22"/>
+          <w:sz w:val="24"/>
         </w:rPr>
         <w:t>Giao diện đổi trạng thái trực quan theo mức LOW/CAUTION/HIGH/VERY HIGH, gồm badge, thanh mức tín hiệu, icon, phần kết luận và khuyến nghị. Màu là kênh trình bày; văn bản, nguồn match, xác suất từng model và disclaimer mới là bằng chứng để người đọc diễn giải. HTTPS được hiển thị như scheme có mặt, không phải trạng thái xác thực TLS.</w:t>
       </w:r>
@@ -6650,7 +6650,7 @@
           <w:b w:val="0"/>
           <w:i w:val="0"/>
           <w:color w:val="23313F"/>
-          <w:sz w:val="22"/>
+          <w:sz w:val="24"/>
         </w:rPr>
         <w:t>Quy trình dưới đây thể hiện đường đi chính của một lần phân tích. Bước live inspection nằm sau consent gate; luồng local-only dừng ở suy luận và render kết quả.</w:t>
       </w:r>
@@ -6744,7 +6744,7 @@
           <w:b w:val="0"/>
           <w:i w:val="0"/>
           <w:color w:val="23313F"/>
-          <w:sz w:val="22"/>
+          <w:sz w:val="24"/>
         </w:rPr>
         <w:t>Mỗi bộ phân loại được fit trên cùng 261.299 mẫu với cùng 55 cột đặc trưng và đánh giá trên cùng 6.624 mẫu PhishVN test chưa tham gia huấn luyện. Test gồm 3.825 benign và 2.799 phishing. Precision = TP/(TP+FP), recall = TP/(TP+FN), F1 = 2 × precision × recall/(precision+recall); các chỉ số này trong bảng dành cho lớp phishing. Ma trận nhầm lẫn trình bày theo thứ tự TN/FP/FN/TP. Accuracy là tỷ lệ dự đoán đúng trên toàn tập; ROC-AUC đo khả năng xếp hạng qua nhiều ngưỡng, không thay thế đánh giá ngưỡng quyết định. Số liệu được đọc từ artefact metric và báo cáo đánh giá trong repository (SafeWeb project, 2026).</w:t>
       </w:r>
@@ -7964,7 +7964,7 @@
           <w:b w:val="0"/>
           <w:i w:val="0"/>
           <w:color w:val="23313F"/>
-          <w:sz w:val="22"/>
+          <w:sz w:val="24"/>
         </w:rPr>
         <w:t>Gradient Boosting có accuracy 0,8789 và F1 phishing 0,8697; recall 0,9561 tương ứng 2.676/2.799 phishing phát hiện đúng, song false positive là 679. Random Forest đạt recall 0,9232, F1 0,8615 và ít false negative hơn một số baseline tuyến tính. Logistic Regression có F1 0,8371. SVM giữ 3.825 benign đúng và không có false positive ở ngưỡng phân loại hiện tại, nhưng bỏ sót 2.779/2.799 phishing; accuracy 0,5805 và F1 phishing 0,0142 khiến nhãn SVM hiện tại không thể xem là hữu ích. ROC-AUC SVM 0,9308 gợi ý khả năng xếp hạng khác với ngưỡng hoạt động, nhưng cần khảo sát calibration/threshold trên validation trước khi thay đổi.</w:t>
       </w:r>
@@ -8105,7 +8105,7 @@
           <w:b w:val="0"/>
           <w:i w:val="0"/>
           <w:color w:val="23313F"/>
-          <w:sz w:val="22"/>
+          <w:sz w:val="24"/>
         </w:rPr>
         <w:t>False negative là URL phishing bị gán benign; đây là loại sai số có thể làm người dùng mất cảnh giác. False positive làm URL hợp lệ bị cảnh báo, có thể gây mệt mỏi cảnh báo. Gradient Boosting giảm FN xuống 123 nhưng có 679 FP; Logistic Regression có 341 FN và 616 FP. SVM ưu tiên precision 1,0 trên 20 dự đoán phishing nhưng chỉ phát hiện 20 trường hợp, vì vậy precision cao ở đây không đại diện cho khả năng phát hiện tổng quát.</w:t>
       </w:r>
@@ -8122,7 +8122,7 @@
           <w:b w:val="0"/>
           <w:i w:val="0"/>
           <w:color w:val="23313F"/>
-          <w:sz w:val="22"/>
+          <w:sz w:val="24"/>
         </w:rPr>
         <w:t>Các chỉ số là hiệu năng trên một corpus có quy trình gán nhãn và phân vùng cụ thể. Chúng không đo calibration xác suất, không phản ánh phân phối URL triển khai, không đo khả năng chống né tránh/adversarial và không chứng minh quan hệ nhân quả giữa từng đặc trưng với phishing. Phân vùng domain-disjoint làm giảm rò rỉ cùng tên miền nhưng không loại bỏ mọi dạng trùng chiến dịch, nguồn feed hoặc drift theo thời gian.</w:t>
       </w:r>
@@ -8622,7 +8622,7 @@
           <w:b w:val="0"/>
           <w:i w:val="0"/>
           <w:color w:val="23313F"/>
-          <w:sz w:val="22"/>
+          <w:sz w:val="24"/>
         </w:rPr>
         <w:t>Parity là xác minh kỹ thuật hai hiện thực đang dùng cùng công thức/parameters với các ca đã chọn, không phải bằng chứng mô hình đúng về mặt bảo mật. Test suite mới chạy trên bộ ca được lưu trong repository; cần bổ sung URL IDN, IPv6, user-info, query lồng nhiều tầng, public suffix hiếm và URL adversarial trước khi coi độ bao phủ là rộng.</w:t>
       </w:r>
@@ -9122,7 +9122,7 @@
           <w:b w:val="0"/>
           <w:i w:val="0"/>
           <w:color w:val="23313F"/>
-          <w:sz w:val="22"/>
+          <w:sz w:val="24"/>
         </w:rPr>
         <w:t>Các con số trên lấy từ tài liệu evidence của release hiện hành; chúng được tái chạy trong quy trình hoàn tất báo cáo nếu môi trường có đủ dữ liệu và công cụ. Một test pass xác nhận assertion tương ứng, không thay thế kiểm thử bảo mật độc lập.</w:t>
       </w:r>
@@ -9148,7 +9148,7 @@
           <w:b w:val="0"/>
           <w:i w:val="0"/>
           <w:color w:val="23313F"/>
-          <w:sz w:val="22"/>
+          <w:sz w:val="24"/>
         </w:rPr>
         <w:t>Các mô tả dưới đây được đối chiếu trực tiếp với DOM/accessible snapshot của ứng dụng Flask cục bộ tại `http://127.0.0.1:5000/`. Công cụ chụp màn hình của phiên làm việc không cung cấp tệp ảnh có thể nhúng vào DOCX; vì vậy đây là mô tả giao diện thực tế, không phải ảnh chụp và không giả lập kết quả phân tích.</w:t>
       </w:r>
@@ -9407,7 +9407,7 @@
           <w:b w:val="0"/>
           <w:i w:val="0"/>
           <w:color w:val="23313F"/>
-          <w:sz w:val="22"/>
+          <w:sz w:val="24"/>
         </w:rPr>
         <w:t>DNS resolve không đồng nghĩa domain đáng tin; metadata/ảnh preview là dữ liệu do dịch vụ bên thứ ba trả về; redirect chỉ đầy đủ trong giới hạn trình duyệt và CORS; phân loại brand/provider là luật nhận diện chuỗi chứ không kiểm tra quyền sở hữu. Mẫu phishing đối ứng chỉ mang tính giáo dục. Easter egg của URL dự án là nhánh demo. Các nguồn này phải được trình bày độc lập với xác suất ML để tránh tạo cảm giác một phép kiểm tra đơn lẻ đã “chứng nhận” website.</w:t>
       </w:r>
@@ -9444,7 +9444,7 @@
           <w:b w:val="0"/>
           <w:i w:val="0"/>
           <w:color w:val="23313F"/>
-          <w:sz w:val="22"/>
+          <w:sz w:val="24"/>
         </w:rPr>
         <w:t>Nguyên mẫu hoàn thành luồng phân tích URL cục bộ, tra cứu dữ liệu PhishVN, trích xuất schema 55 feature, suy luận bốn mô hình trên trình duyệt, giao diện đa ngôn ngữ, explorer dữ liệu và nhánh kiểm tra DNS/redirect có đồng ý. Kiểm thử parity và build cung cấp bằng chứng triển khai nhất quán trên phạm vi đã định. Tuy vậy, kết quả SVM cho thấy ensemble hiện tại chưa đủ căn cứ để được mô tả là đồng thuận chất lượng đồng đều; cần ưu tiên sửa calibration hoặc ngưỡng dựa trên validation và báo cáo lại trên test độc lập sau khi khóa quy trình.</w:t>
       </w:r>
@@ -9471,7 +9471,7 @@
           <w:b w:val="0"/>
           <w:i w:val="0"/>
           <w:color w:val="23313F"/>
-          <w:sz w:val="22"/>
+          <w:sz w:val="24"/>
         </w:rPr>
         <w:t>SafeWeb v2.3.0 chứng minh tính khả thi của một nguyên mẫu hỗ trợ nhận diện URL phishing theo hướng xử lý cục bộ mặc định, ghép tra cứu provenance với bốn mô hình và trình bày các lý do URL có thể kiểm tra. PhishVN held-out test cho thấy Gradient Boosting đạt F1 phishing 0,8697 và recall 0,9561, còn SVM ở ngưỡng hiện tại gần như không phát hiện lớp phishing. Vì vậy, kết luận phù hợp là hệ thống có tiềm năng làm công cụ giáo dục và sàng lọc tham khảo, chứ không phải bộ bảo vệ hoàn chỉnh hoặc chứng nhận tính an toàn của URL.</w:t>
       </w:r>
@@ -9499,7 +9499,7 @@
           <w:b w:val="0"/>
           <w:i w:val="0"/>
           <w:color w:val="23313F"/>
-          <w:sz w:val="21"/>
+          <w:sz w:val="22"/>
         </w:rPr>
         <w:t>SVM calibration/decision threshold cần được sửa theo validation; không lựa chọn threshold trên tập test rồi báo cùng test như đánh giá độc lập.</w:t>
       </w:r>
@@ -9517,7 +9517,7 @@
           <w:b w:val="0"/>
           <w:i w:val="0"/>
           <w:color w:val="23313F"/>
-          <w:sz w:val="21"/>
+          <w:sz w:val="22"/>
         </w:rPr>
         <w:t>Cơ sở dữ liệu phụ thuộc coverage, thời điểm phát hiện và chất lượng nhãn của nguồn; không match không đồng nghĩa an toàn.</w:t>
       </w:r>
@@ -9535,7 +9535,7 @@
           <w:b w:val="0"/>
           <w:i w:val="0"/>
           <w:color w:val="23313F"/>
-          <w:sz w:val="21"/>
+          <w:sz w:val="22"/>
         </w:rPr>
         <w:t>Đặc trưng chủ yếu dựa trên URL, không phân tích nội dung trang, chứng thư, tuổi domain, reputation feed hoặc hành vi script.</w:t>
       </w:r>
@@ -9553,7 +9553,7 @@
           <w:b w:val="0"/>
           <w:i w:val="0"/>
           <w:color w:val="23313F"/>
-          <w:sz w:val="21"/>
+          <w:sz w:val="22"/>
         </w:rPr>
         <w:t>Tín hiệu từ khóa có thể tạo thiên lệch ngôn ngữ và false positive; danh sách hiện tại chỉ gồm tám substring.</w:t>
       </w:r>
@@ -9571,7 +9571,7 @@
           <w:b w:val="0"/>
           <w:i w:val="0"/>
           <w:color w:val="23313F"/>
-          <w:sz w:val="21"/>
+          <w:sz w:val="22"/>
         </w:rPr>
         <w:t>Tách domain không loại hết rò rỉ chiến dịch/nguồn, và dữ liệu benchmark không đại diện mọi quốc gia, ngôn ngữ hay thời điểm.</w:t>
       </w:r>
@@ -9589,7 +9589,7 @@
           <w:b w:val="0"/>
           <w:i w:val="0"/>
           <w:color w:val="23313F"/>
-          <w:sz w:val="21"/>
+          <w:sz w:val="22"/>
         </w:rPr>
         <w:t>Live inspection gửi URL tới dịch vụ ngoài sau đồng ý; CORS, rate limit, DNS cache và dịch vụ preview làm kết quả không ổn định.</w:t>
       </w:r>
@@ -9607,7 +9607,7 @@
           <w:b w:val="0"/>
           <w:i w:val="0"/>
           <w:color w:val="23313F"/>
-          <w:sz w:val="21"/>
+          <w:sz w:val="22"/>
         </w:rPr>
         <w:t>Chưa có thử nghiệm usability có người tham gia, đánh giá accessibility độc lập hay đo thời gian/chi phí vận hành trên thiết bị yếu.</w:t>
       </w:r>
@@ -9634,7 +9634,7 @@
           <w:b w:val="0"/>
           <w:i w:val="0"/>
           <w:color w:val="23313F"/>
-          <w:sz w:val="22"/>
+          <w:sz w:val="24"/>
         </w:rPr>
         <w:t>Phiên bản tiếp theo có thể chuyển từ website phân tích theo yêu cầu sang tiện ích mở rộng trình duyệt. Một content script sẽ lấy các anchor đang hiện trong viewport, canonicalize URL, khử trùng, gửi chuỗi qua bộ suy luận cục bộ và gắn cảnh báo không chặn trang. Khi cuộn, IntersectionObserver có thể xử lý incremental; chỉ cache hash/feature cần thiết và giới hạn số URL mỗi nhịp để tránh làm chậm trang.</w:t>
       </w:r>
@@ -9651,7 +9651,7 @@
           <w:b w:val="0"/>
           <w:i w:val="0"/>
           <w:color w:val="23313F"/>
-          <w:sz w:val="22"/>
+          <w:sz w:val="24"/>
         </w:rPr>
         <w:t>Thiết kế phải mặc định không gửi URL ra ngoài, không đọc nội dung form hoặc trường mật khẩu, không thay đổi đích liên kết, không tự chặn click nếu chưa có cơ sở, và giải thích mức tin cậy bằng lý do cụ thể. Quyền extension cần giới hạn tối thiểu; người dùng cần bật rõ chế độ quét trang, có pause/allowlist, và biết URL của trang hiện tại có thể chứa dữ liệu nhạy cảm. Kiểm thử tương lai cần đo độ bao phủ viewport, latency, false positive, pin/CPU trên trang nhiều liên kết, tương thích SPA và khả năng khôi phục thao tác của người dùng.</w:t>
       </w:r>
@@ -14994,7 +14994,7 @@
           <w:b w:val="0"/>
           <w:i w:val="0"/>
           <w:color w:val="23313F"/>
-          <w:sz w:val="22"/>
+          <w:sz w:val="24"/>
         </w:rPr>
         <w:t>Thứ tự ma trận nhầm lẫn trong file metrics là [benign, phishing]: hàng nhãn thật, cột nhãn dự đoán. Ví dụ Random Forest: [[3.209, 616], [215, 2.584]].</w:t>
       </w:r>
@@ -15132,7 +15132,7 @@
           <w:b w:val="0"/>
           <w:i w:val="0"/>
           <w:color w:val="23313F"/>
-          <w:sz w:val="22"/>
+          <w:sz w:val="24"/>
         </w:rPr>
         <w:t>Các lệnh huấn luyện cần archive PhishVN/PhiUSIIL và môi trường phụ thuộc tương ứng. Tệp `_site` là artifact build; mô hình Python và bundle trình duyệt phải được sinh bằng pipeline đã ghi lại để tránh đưa nhầm artefact cũ vào đánh giá.</w:t>
       </w:r>
@@ -16390,7 +16390,7 @@
     <w:rPr>
       <w:rFonts w:ascii="Times New Roman" w:hAnsi="Times New Roman" w:eastAsia="Times New Roman"/>
       <w:color w:val="23313F"/>
-      <w:sz w:val="22"/>
+      <w:sz w:val="24"/>
     </w:rPr>
   </w:style>
   <w:style w:type="paragraph" w:styleId="Header">

</xml_diff>

<commit_message>
Improve SafeWeb layout and KHKT report
</commit_message>
<xml_diff>
--- a/Bao_cao_SafeWeb_KHKT_THPT.docx
+++ b/Bao_cao_SafeWeb_KHKT_THPT.docx
@@ -318,7 +318,6 @@
     <w:p>
       <w:pPr>
         <w:sectPr>
-          <w:footerReference w:type="default" r:id="rId9"/>
           <w:pgSz w:w="11906" w:h="16838"/>
           <w:pgMar w:top="1417" w:right="1134" w:bottom="1417" w:left="1701" w:header="720" w:footer="720" w:gutter="0"/>
           <w:cols w:space="720"/>
@@ -457,10 +456,10 @@
     <w:p>
       <w:pPr>
         <w:sectPr>
+          <w:footerReference w:type="default" r:id="rId9"/>
           <w:pgSz w:w="11906" w:h="16838"/>
           <w:pgMar w:top="1417" w:right="1134" w:bottom="1417" w:left="1701" w:header="720" w:footer="652" w:gutter="0"/>
           <w:cols w:space="720"/>
-          <w:titlePg/>
           <w:docGrid w:linePitch="360"/>
           <w:pgNumType w:fmt="lowerRoman" w:start="1"/>
         </w:sectPr>
@@ -1164,6 +1163,540 @@
           <w:sz w:val="24"/>
         </w:rPr>
         <w:t>Đối tượng nghiên cứu là chuỗi URL và các bản ghi nhãn đã công bố trong PhishVN/PhiUSIIL. Luồng suy luận không tải HTML của website và không chạy mã trang đích. Không có xác thực chứng thư TLS, đánh giá tuổi tên miền, uy tín WHOIS, danh tiếng IP, phân tích nội dung DOM hoặc sandbox. DNS chỉ được truy vấn khi bật live inspection. Dự án là nguyên mẫu nghiên cứu, chưa có đánh giá người dùng, kiểm định độc lập theo thời gian thực hoặc chứng nhận an toàn thông tin.</w:t>
+      </w:r>
+    </w:p>
+    <w:p>
+      <w:pPr>
+        <w:pStyle w:val="Heading2"/>
+        <w:keepNext/>
+        <w:spacing w:before="160" w:after="100"/>
+      </w:pPr>
+      <w:r>
+        <w:t>1.5. Giá trị và định hướng giáo dục</w:t>
+      </w:r>
+    </w:p>
+    <w:p>
+      <w:pPr>
+        <w:keepLines/>
+        <w:spacing w:after="100"/>
+        <w:ind w:firstLine="454"/>
+      </w:pPr>
+      <w:r>
+        <w:rPr>
+          <w:rFonts w:ascii="Times New Roman" w:hAnsi="Times New Roman" w:eastAsia="Times New Roman"/>
+          <w:b w:val="0"/>
+          <w:i w:val="0"/>
+          <w:color w:val="23313F"/>
+          <w:sz w:val="24"/>
+        </w:rPr>
+        <w:t>SafeWeb được thiết kế như một học cụ về an toàn số và tư duy dữ liệu, không chỉ là công cụ đưa ra nhãn URL. Giá trị giáo dục dự kiến nằm ở khả năng quan sát các bước phân tích, so sánh nguồn bằng chứng và thảo luận giới hạn của tự động hóa. Dự án chưa tiến hành nghiên cứu có người tham gia, đo kiến thức trước/sau hoặc đánh giá hiệu quả sư phạm; vì vậy các nội dung dưới đây là mục tiêu học tập và kịch bản sử dụng đề xuất, không phải kết quả thực nghiệm về học sinh.</w:t>
+      </w:r>
+    </w:p>
+    <w:tbl>
+      <w:tblPr>
+        <w:tblStyle w:val="TableGrid"/>
+        <w:tblW w:type="auto" w:w="0"/>
+        <w:jc w:val="center"/>
+        <w:tblLayout w:type="fixed"/>
+        <w:tblLook w:firstColumn="1" w:firstRow="1" w:lastColumn="0" w:lastRow="0" w:noHBand="0" w:noVBand="1" w:val="04A0"/>
+      </w:tblPr>
+      <w:tblGrid>
+        <w:gridCol w:w="3024"/>
+        <w:gridCol w:w="3024"/>
+        <w:gridCol w:w="3024"/>
+      </w:tblGrid>
+      <w:tr>
+        <w:trPr>
+          <w:tblHeader w:val="true"/>
+        </w:trPr>
+        <w:tc>
+          <w:tcPr>
+            <w:tcW w:type="dxa" w:w="1871"/>
+            <w:shd w:fill="17324D"/>
+            <w:vAlign w:val="center"/>
+            <w:tcMar>
+              <w:top w:w="80" w:type="dxa"/>
+              <w:start w:w="90" w:type="dxa"/>
+              <w:bottom w:w="80" w:type="dxa"/>
+              <w:end w:w="90" w:type="dxa"/>
+            </w:tcMar>
+          </w:tcPr>
+          <w:p>
+            <w:pPr>
+              <w:spacing w:after="0" w:before="0" w:line="240" w:lineRule="auto"/>
+              <w:jc w:val="left"/>
+            </w:pPr>
+            <w:r>
+              <w:rPr>
+                <w:rFonts w:ascii="Times New Roman" w:hAnsi="Times New Roman" w:eastAsia="Times New Roman"/>
+                <w:b/>
+                <w:i w:val="0"/>
+                <w:color w:val="FFFFFF"/>
+                <w:sz w:val="16"/>
+              </w:rPr>
+              <w:t>Năng lực hướng tới</w:t>
+            </w:r>
+          </w:p>
+        </w:tc>
+        <w:tc>
+          <w:tcPr>
+            <w:tcW w:type="dxa" w:w="3628"/>
+            <w:shd w:fill="17324D"/>
+            <w:vAlign w:val="center"/>
+            <w:tcMar>
+              <w:top w:w="80" w:type="dxa"/>
+              <w:start w:w="90" w:type="dxa"/>
+              <w:bottom w:w="80" w:type="dxa"/>
+              <w:end w:w="90" w:type="dxa"/>
+            </w:tcMar>
+          </w:tcPr>
+          <w:p>
+            <w:pPr>
+              <w:spacing w:after="0" w:before="0" w:line="240" w:lineRule="auto"/>
+              <w:jc w:val="left"/>
+            </w:pPr>
+            <w:r>
+              <w:rPr>
+                <w:rFonts w:ascii="Times New Roman" w:hAnsi="Times New Roman" w:eastAsia="Times New Roman"/>
+                <w:b/>
+                <w:i w:val="0"/>
+                <w:color w:val="FFFFFF"/>
+                <w:sz w:val="16"/>
+              </w:rPr>
+              <w:t>Hoạt động học tập có thể quan sát</w:t>
+            </w:r>
+          </w:p>
+        </w:tc>
+        <w:tc>
+          <w:tcPr>
+            <w:tcW w:type="dxa" w:w="3515"/>
+            <w:shd w:fill="17324D"/>
+            <w:vAlign w:val="center"/>
+            <w:tcMar>
+              <w:top w:w="80" w:type="dxa"/>
+              <w:start w:w="90" w:type="dxa"/>
+              <w:bottom w:w="80" w:type="dxa"/>
+              <w:end w:w="90" w:type="dxa"/>
+            </w:tcMar>
+          </w:tcPr>
+          <w:p>
+            <w:pPr>
+              <w:spacing w:after="0" w:before="0" w:line="240" w:lineRule="auto"/>
+              <w:jc w:val="left"/>
+            </w:pPr>
+            <w:r>
+              <w:rPr>
+                <w:rFonts w:ascii="Times New Roman" w:hAnsi="Times New Roman" w:eastAsia="Times New Roman"/>
+                <w:b/>
+                <w:i w:val="0"/>
+                <w:color w:val="FFFFFF"/>
+                <w:sz w:val="16"/>
+              </w:rPr>
+              <w:t>Giới hạn cần nêu</w:t>
+            </w:r>
+          </w:p>
+        </w:tc>
+      </w:tr>
+      <w:tr>
+        <w:trPr>
+          <w:cantSplit/>
+        </w:trPr>
+        <w:tc>
+          <w:tcPr>
+            <w:tcW w:type="dxa" w:w="1871"/>
+            <w:vAlign w:val="center"/>
+            <w:shd w:fill="F4F7F8"/>
+            <w:tcMar>
+              <w:top w:w="80" w:type="dxa"/>
+              <w:start w:w="90" w:type="dxa"/>
+              <w:bottom w:w="80" w:type="dxa"/>
+              <w:end w:w="90" w:type="dxa"/>
+            </w:tcMar>
+          </w:tcPr>
+          <w:p>
+            <w:pPr>
+              <w:spacing w:after="0" w:before="0" w:line="240" w:lineRule="auto"/>
+              <w:jc w:val="left"/>
+            </w:pPr>
+            <w:r>
+              <w:rPr>
+                <w:rFonts w:ascii="Times New Roman" w:hAnsi="Times New Roman" w:eastAsia="Times New Roman"/>
+                <w:b w:val="0"/>
+                <w:i w:val="0"/>
+                <w:color w:val="23313F"/>
+                <w:sz w:val="16"/>
+              </w:rPr>
+              <w:t>Hiểu cấu trúc URL</w:t>
+            </w:r>
+          </w:p>
+        </w:tc>
+        <w:tc>
+          <w:tcPr>
+            <w:tcW w:type="dxa" w:w="3628"/>
+            <w:vAlign w:val="center"/>
+            <w:shd w:fill="F4F7F8"/>
+            <w:tcMar>
+              <w:top w:w="80" w:type="dxa"/>
+              <w:start w:w="90" w:type="dxa"/>
+              <w:bottom w:w="80" w:type="dxa"/>
+              <w:end w:w="90" w:type="dxa"/>
+            </w:tcMar>
+          </w:tcPr>
+          <w:p>
+            <w:pPr>
+              <w:spacing w:after="0" w:before="0" w:line="240" w:lineRule="auto"/>
+              <w:jc w:val="left"/>
+            </w:pPr>
+            <w:r>
+              <w:rPr>
+                <w:rFonts w:ascii="Times New Roman" w:hAnsi="Times New Roman" w:eastAsia="Times New Roman"/>
+                <w:b w:val="0"/>
+                <w:i w:val="0"/>
+                <w:color w:val="23313F"/>
+                <w:sz w:val="16"/>
+              </w:rPr>
+              <w:t>Tách scheme, hostname, subdomain, path và query; chỉ ra phần nào chứa tín hiệu được trích xuất.</w:t>
+            </w:r>
+          </w:p>
+        </w:tc>
+        <w:tc>
+          <w:tcPr>
+            <w:tcW w:type="dxa" w:w="3515"/>
+            <w:vAlign w:val="center"/>
+            <w:shd w:fill="F4F7F8"/>
+            <w:tcMar>
+              <w:top w:w="80" w:type="dxa"/>
+              <w:start w:w="90" w:type="dxa"/>
+              <w:bottom w:w="80" w:type="dxa"/>
+              <w:end w:w="90" w:type="dxa"/>
+            </w:tcMar>
+          </w:tcPr>
+          <w:p>
+            <w:pPr>
+              <w:spacing w:after="0" w:before="0" w:line="240" w:lineRule="auto"/>
+              <w:jc w:val="left"/>
+            </w:pPr>
+            <w:r>
+              <w:rPr>
+                <w:rFonts w:ascii="Times New Roman" w:hAnsi="Times New Roman" w:eastAsia="Times New Roman"/>
+                <w:b w:val="0"/>
+                <w:i w:val="0"/>
+                <w:color w:val="23313F"/>
+                <w:sz w:val="16"/>
+              </w:rPr>
+              <w:t>Một dấu hiệu như từ khóa ngân hàng, IP hay HTTPS không tự chứng minh URL độc hại hoặc an toàn.</w:t>
+            </w:r>
+          </w:p>
+        </w:tc>
+      </w:tr>
+      <w:tr>
+        <w:trPr>
+          <w:cantSplit/>
+        </w:trPr>
+        <w:tc>
+          <w:tcPr>
+            <w:tcW w:type="dxa" w:w="1871"/>
+            <w:vAlign w:val="center"/>
+            <w:tcMar>
+              <w:top w:w="80" w:type="dxa"/>
+              <w:start w:w="90" w:type="dxa"/>
+              <w:bottom w:w="80" w:type="dxa"/>
+              <w:end w:w="90" w:type="dxa"/>
+            </w:tcMar>
+          </w:tcPr>
+          <w:p>
+            <w:pPr>
+              <w:spacing w:after="0" w:before="0" w:line="240" w:lineRule="auto"/>
+              <w:jc w:val="left"/>
+            </w:pPr>
+            <w:r>
+              <w:rPr>
+                <w:rFonts w:ascii="Times New Roman" w:hAnsi="Times New Roman" w:eastAsia="Times New Roman"/>
+                <w:b w:val="0"/>
+                <w:i w:val="0"/>
+                <w:color w:val="23313F"/>
+                <w:sz w:val="16"/>
+              </w:rPr>
+              <w:t>Tư duy phản biện về AI</w:t>
+            </w:r>
+          </w:p>
+        </w:tc>
+        <w:tc>
+          <w:tcPr>
+            <w:tcW w:type="dxa" w:w="3628"/>
+            <w:vAlign w:val="center"/>
+            <w:tcMar>
+              <w:top w:w="80" w:type="dxa"/>
+              <w:start w:w="90" w:type="dxa"/>
+              <w:bottom w:w="80" w:type="dxa"/>
+              <w:end w:w="90" w:type="dxa"/>
+            </w:tcMar>
+          </w:tcPr>
+          <w:p>
+            <w:pPr>
+              <w:spacing w:after="0" w:before="0" w:line="240" w:lineRule="auto"/>
+              <w:jc w:val="left"/>
+            </w:pPr>
+            <w:r>
+              <w:rPr>
+                <w:rFonts w:ascii="Times New Roman" w:hAnsi="Times New Roman" w:eastAsia="Times New Roman"/>
+                <w:b w:val="0"/>
+                <w:i w:val="0"/>
+                <w:color w:val="23313F"/>
+                <w:sz w:val="16"/>
+              </w:rPr>
+              <w:t>So sánh match PhishVN với xác suất từng mô hình; đọc precision, recall, F1 và false positive/false negative.</w:t>
+            </w:r>
+          </w:p>
+        </w:tc>
+        <w:tc>
+          <w:tcPr>
+            <w:tcW w:type="dxa" w:w="3515"/>
+            <w:vAlign w:val="center"/>
+            <w:tcMar>
+              <w:top w:w="80" w:type="dxa"/>
+              <w:start w:w="90" w:type="dxa"/>
+              <w:bottom w:w="80" w:type="dxa"/>
+              <w:end w:w="90" w:type="dxa"/>
+            </w:tcMar>
+          </w:tcPr>
+          <w:p>
+            <w:pPr>
+              <w:spacing w:after="0" w:before="0" w:line="240" w:lineRule="auto"/>
+              <w:jc w:val="left"/>
+            </w:pPr>
+            <w:r>
+              <w:rPr>
+                <w:rFonts w:ascii="Times New Roman" w:hAnsi="Times New Roman" w:eastAsia="Times New Roman"/>
+                <w:b w:val="0"/>
+                <w:i w:val="0"/>
+                <w:color w:val="23313F"/>
+                <w:sz w:val="16"/>
+              </w:rPr>
+              <w:t>Kết quả phụ thuộc corpus và threshold; SVM hiện có recall phishing rất thấp dù ROC-AUC cao.</w:t>
+            </w:r>
+          </w:p>
+        </w:tc>
+      </w:tr>
+      <w:tr>
+        <w:trPr>
+          <w:cantSplit/>
+        </w:trPr>
+        <w:tc>
+          <w:tcPr>
+            <w:tcW w:type="dxa" w:w="1871"/>
+            <w:vAlign w:val="center"/>
+            <w:shd w:fill="F4F7F8"/>
+            <w:tcMar>
+              <w:top w:w="80" w:type="dxa"/>
+              <w:start w:w="90" w:type="dxa"/>
+              <w:bottom w:w="80" w:type="dxa"/>
+              <w:end w:w="90" w:type="dxa"/>
+            </w:tcMar>
+          </w:tcPr>
+          <w:p>
+            <w:pPr>
+              <w:spacing w:after="0" w:before="0" w:line="240" w:lineRule="auto"/>
+              <w:jc w:val="left"/>
+            </w:pPr>
+            <w:r>
+              <w:rPr>
+                <w:rFonts w:ascii="Times New Roman" w:hAnsi="Times New Roman" w:eastAsia="Times New Roman"/>
+                <w:b w:val="0"/>
+                <w:i w:val="0"/>
+                <w:color w:val="23313F"/>
+                <w:sz w:val="16"/>
+              </w:rPr>
+              <w:t>Quyền riêng tư và công dân số</w:t>
+            </w:r>
+          </w:p>
+        </w:tc>
+        <w:tc>
+          <w:tcPr>
+            <w:tcW w:type="dxa" w:w="3628"/>
+            <w:vAlign w:val="center"/>
+            <w:shd w:fill="F4F7F8"/>
+            <w:tcMar>
+              <w:top w:w="80" w:type="dxa"/>
+              <w:start w:w="90" w:type="dxa"/>
+              <w:bottom w:w="80" w:type="dxa"/>
+              <w:end w:w="90" w:type="dxa"/>
+            </w:tcMar>
+          </w:tcPr>
+          <w:p>
+            <w:pPr>
+              <w:spacing w:after="0" w:before="0" w:line="240" w:lineRule="auto"/>
+              <w:jc w:val="left"/>
+            </w:pPr>
+            <w:r>
+              <w:rPr>
+                <w:rFonts w:ascii="Times New Roman" w:hAnsi="Times New Roman" w:eastAsia="Times New Roman"/>
+                <w:b w:val="0"/>
+                <w:i w:val="0"/>
+                <w:color w:val="23313F"/>
+                <w:sz w:val="16"/>
+              </w:rPr>
+              <w:t>Phân biệt phân tích local-only với live inspection; cân nhắc trước khi chia sẻ URL cho dịch vụ ngoài.</w:t>
+            </w:r>
+          </w:p>
+        </w:tc>
+        <w:tc>
+          <w:tcPr>
+            <w:tcW w:type="dxa" w:w="3515"/>
+            <w:vAlign w:val="center"/>
+            <w:shd w:fill="F4F7F8"/>
+            <w:tcMar>
+              <w:top w:w="80" w:type="dxa"/>
+              <w:start w:w="90" w:type="dxa"/>
+              <w:bottom w:w="80" w:type="dxa"/>
+              <w:end w:w="90" w:type="dxa"/>
+            </w:tcMar>
+          </w:tcPr>
+          <w:p>
+            <w:pPr>
+              <w:spacing w:after="0" w:before="0" w:line="240" w:lineRule="auto"/>
+              <w:jc w:val="left"/>
+            </w:pPr>
+            <w:r>
+              <w:rPr>
+                <w:rFonts w:ascii="Times New Roman" w:hAnsi="Times New Roman" w:eastAsia="Times New Roman"/>
+                <w:b w:val="0"/>
+                <w:i w:val="0"/>
+                <w:color w:val="23313F"/>
+                <w:sz w:val="16"/>
+              </w:rPr>
+              <w:t>Không nhập URL riêng tư, token hoặc thông tin đăng nhập; HTTPS không xác thực danh tính website.</w:t>
+            </w:r>
+          </w:p>
+        </w:tc>
+      </w:tr>
+      <w:tr>
+        <w:trPr>
+          <w:cantSplit/>
+        </w:trPr>
+        <w:tc>
+          <w:tcPr>
+            <w:tcW w:type="dxa" w:w="1871"/>
+            <w:vAlign w:val="center"/>
+            <w:tcMar>
+              <w:top w:w="80" w:type="dxa"/>
+              <w:start w:w="90" w:type="dxa"/>
+              <w:bottom w:w="80" w:type="dxa"/>
+              <w:end w:w="90" w:type="dxa"/>
+            </w:tcMar>
+          </w:tcPr>
+          <w:p>
+            <w:pPr>
+              <w:spacing w:after="0" w:before="0" w:line="240" w:lineRule="auto"/>
+              <w:jc w:val="left"/>
+            </w:pPr>
+            <w:r>
+              <w:rPr>
+                <w:rFonts w:ascii="Times New Roman" w:hAnsi="Times New Roman" w:eastAsia="Times New Roman"/>
+                <w:b w:val="0"/>
+                <w:i w:val="0"/>
+                <w:color w:val="23313F"/>
+                <w:sz w:val="16"/>
+              </w:rPr>
+              <w:t>Tư duy kỹ thuật và tái lập</w:t>
+            </w:r>
+          </w:p>
+        </w:tc>
+        <w:tc>
+          <w:tcPr>
+            <w:tcW w:type="dxa" w:w="3628"/>
+            <w:vAlign w:val="center"/>
+            <w:tcMar>
+              <w:top w:w="80" w:type="dxa"/>
+              <w:start w:w="90" w:type="dxa"/>
+              <w:bottom w:w="80" w:type="dxa"/>
+              <w:end w:w="90" w:type="dxa"/>
+            </w:tcMar>
+          </w:tcPr>
+          <w:p>
+            <w:pPr>
+              <w:spacing w:after="0" w:before="0" w:line="240" w:lineRule="auto"/>
+              <w:jc w:val="left"/>
+            </w:pPr>
+            <w:r>
+              <w:rPr>
+                <w:rFonts w:ascii="Times New Roman" w:hAnsi="Times New Roman" w:eastAsia="Times New Roman"/>
+                <w:b w:val="0"/>
+                <w:i w:val="0"/>
+                <w:color w:val="23313F"/>
+                <w:sz w:val="16"/>
+              </w:rPr>
+              <w:t>Theo dõi pipeline dữ liệu → đặc trưng → mô hình → giao diện; đối chiếu Python–JavaScript.</w:t>
+            </w:r>
+          </w:p>
+        </w:tc>
+        <w:tc>
+          <w:tcPr>
+            <w:tcW w:type="dxa" w:w="3515"/>
+            <w:vAlign w:val="center"/>
+            <w:tcMar>
+              <w:top w:w="80" w:type="dxa"/>
+              <w:start w:w="90" w:type="dxa"/>
+              <w:bottom w:w="80" w:type="dxa"/>
+              <w:end w:w="90" w:type="dxa"/>
+            </w:tcMar>
+          </w:tcPr>
+          <w:p>
+            <w:pPr>
+              <w:spacing w:after="0" w:before="0" w:line="240" w:lineRule="auto"/>
+              <w:jc w:val="left"/>
+            </w:pPr>
+            <w:r>
+              <w:rPr>
+                <w:rFonts w:ascii="Times New Roman" w:hAnsi="Times New Roman" w:eastAsia="Times New Roman"/>
+                <w:b w:val="0"/>
+                <w:i w:val="0"/>
+                <w:color w:val="23313F"/>
+                <w:sz w:val="16"/>
+              </w:rPr>
+              <w:t>Parity xác minh hai hiện thực nhất quán trên bộ ca đã chọn, không chứng minh độ chính xác phổ quát.</w:t>
+            </w:r>
+          </w:p>
+        </w:tc>
+      </w:tr>
+    </w:tbl>
+    <w:p>
+      <w:pPr>
+        <w:spacing w:after="20"/>
+      </w:pPr>
+    </w:p>
+    <w:p>
+      <w:pPr>
+        <w:keepLines/>
+        <w:spacing w:after="100"/>
+        <w:ind w:firstLine="454"/>
+      </w:pPr>
+      <w:r>
+        <w:rPr>
+          <w:rFonts w:ascii="Times New Roman" w:hAnsi="Times New Roman" w:eastAsia="Times New Roman"/>
+          <w:b w:val="0"/>
+          <w:i w:val="0"/>
+          <w:color w:val="23313F"/>
+          <w:sz w:val="24"/>
+        </w:rPr>
+        <w:t>Kịch bản lớp học an toàn có thể bắt đầu bằng URL mẫu vô hại hoặc địa chỉ IP dành riêng cho kiểm thử, yêu cầu học sinh đánh dấu thành phần URL trước khi xem dự đoán, rồi giải thích vì sao kết luận của mô hình không phải chứng nhận. Giáo viên có thể cho học sinh đối chiếu một lỗi bỏ sót và một cảnh báo nhầm trong ma trận nhầm lẫn, thảo luận vì sao không nhấp vào URL phishing mẫu và yêu cầu đề xuất cách xác minh qua kênh chính thức. Mọi bài tập nên dùng chuỗi công khai/giả lập, tắt live inspection và không mở đích URL.</w:t>
+      </w:r>
+    </w:p>
+    <w:p>
+      <w:pPr>
+        <w:keepLines/>
+        <w:spacing w:after="100"/>
+        <w:ind w:firstLine="454"/>
+      </w:pPr>
+      <w:r>
+        <w:rPr>
+          <w:rFonts w:ascii="Times New Roman" w:hAnsi="Times New Roman" w:eastAsia="Times New Roman"/>
+          <w:b w:val="0"/>
+          <w:i w:val="0"/>
+          <w:color w:val="23313F"/>
+          <w:sz w:val="24"/>
+        </w:rPr>
+        <w:t>Nếu triển khai thành hoạt động nghiên cứu giáo dục, cần có kế hoạch riêng: bài kiểm tra khái niệm trước/sau, rubric chấm khả năng phân tích hostname và diễn giải chỉ số, kiểm tra lựa chọn hành vi an toàn, cùng quy trình đồng thuận và bảo vệ dữ liệu người học. Các phép đo này chưa thuộc phạm vi kết quả của phiên bản báo cáo hiện tại.</w:t>
       </w:r>
     </w:p>
     <w:p>
@@ -6676,7 +7209,7 @@
                     <pic:cNvPicPr/>
                   </pic:nvPicPr>
                   <pic:blipFill>
-                    <a:blip r:embed="rId10"/>
+                    <a:blip r:embed="rId11"/>
                     <a:stretch>
                       <a:fillRect/>
                     </a:stretch>
@@ -7990,7 +8523,7 @@
                     <pic:cNvPicPr/>
                   </pic:nvPicPr>
                   <pic:blipFill>
-                    <a:blip r:embed="rId11"/>
+                    <a:blip r:embed="rId12"/>
                     <a:stretch>
                       <a:fillRect/>
                     </a:stretch>
@@ -8047,7 +8580,7 @@
                     <pic:cNvPicPr/>
                   </pic:nvPicPr>
                   <pic:blipFill>
-                    <a:blip r:embed="rId12"/>
+                    <a:blip r:embed="rId13"/>
                     <a:stretch>
                       <a:fillRect/>
                     </a:stretch>
@@ -9129,28 +9662,42 @@
     </w:p>
     <w:p>
       <w:pPr>
-        <w:pStyle w:val="Heading2"/>
-        <w:keepNext/>
-        <w:spacing w:before="160" w:after="100"/>
+        <w:keepLines/>
+        <w:jc w:val="center"/>
       </w:pPr>
       <w:r>
-        <w:t>4.6. Mô tả các màn hình giao diện đã quan sát</w:t>
-      </w:r>
-    </w:p>
-    <w:p>
-      <w:pPr>
-        <w:keepLines/>
-        <w:spacing w:after="100"/>
-      </w:pPr>
-      <w:r>
-        <w:rPr>
-          <w:rFonts w:ascii="Times New Roman" w:hAnsi="Times New Roman" w:eastAsia="Times New Roman"/>
-          <w:b w:val="0"/>
-          <w:i w:val="0"/>
-          <w:color w:val="23313F"/>
-          <w:sz w:val="24"/>
-        </w:rPr>
-        <w:t>Các mô tả dưới đây được đối chiếu trực tiếp với DOM/accessible snapshot của ứng dụng Flask cục bộ tại `http://127.0.0.1:5000/`. Công cụ chụp màn hình của phiên làm việc không cung cấp tệp ảnh có thể nhúng vào DOCX; vì vậy đây là mô tả giao diện thực tế, không phải ảnh chụp và không giả lập kết quả phân tích.</w:t>
+        <w:drawing>
+          <wp:inline xmlns:a="http://schemas.openxmlformats.org/drawingml/2006/main" xmlns:pic="http://schemas.openxmlformats.org/drawingml/2006/picture">
+            <wp:extent cx="5400000" cy="2171591"/>
+            <wp:docPr id="4" name="Picture 4"/>
+            <wp:cNvGraphicFramePr>
+              <a:graphicFrameLocks noChangeAspect="1"/>
+            </wp:cNvGraphicFramePr>
+            <a:graphic>
+              <a:graphicData uri="http://schemas.openxmlformats.org/drawingml/2006/picture">
+                <pic:pic>
+                  <pic:nvPicPr>
+                    <pic:cNvPr id="0" name="test-evidence.png"/>
+                    <pic:cNvPicPr/>
+                  </pic:nvPicPr>
+                  <pic:blipFill>
+                    <a:blip r:embed="rId14"/>
+                    <a:stretch>
+                      <a:fillRect/>
+                    </a:stretch>
+                  </pic:blipFill>
+                  <pic:spPr>
+                    <a:xfrm>
+                      <a:off x="0" y="0"/>
+                      <a:ext cx="5400000" cy="2171591"/>
+                    </a:xfrm>
+                    <a:prstGeom prst="rect"/>
+                  </pic:spPr>
+                </pic:pic>
+              </a:graphicData>
+            </a:graphic>
+          </wp:inline>
+        </w:drawing>
       </w:r>
     </w:p>
     <w:p>
@@ -9167,49 +9714,146 @@
           <w:color w:val="5C6B78"/>
           <w:sz w:val="19"/>
         </w:rPr>
-        <w:t>Hình 4.3. Giao diện trang chủ SafeWeb v2.3.0.</w:t>
+        <w:t>Hình 4.3. Tổng hợp bằng chứng kiểm thử thực thi cục bộ; không phải ảnh chụp terminal.</w:t>
       </w:r>
     </w:p>
-    <w:tbl>
-      <w:tblPr>
-        <w:tblStyle w:val="TableGrid"/>
-        <w:tblW w:type="auto" w:w="0"/>
-        <w:tblLook w:firstColumn="1" w:firstRow="1" w:lastColumn="0" w:lastRow="0" w:noHBand="0" w:noVBand="1" w:val="04A0"/>
-      </w:tblPr>
-      <w:tblGrid>
-        <w:gridCol w:w="9071"/>
-      </w:tblGrid>
-      <w:tr>
-        <w:tc>
-          <w:tcPr>
-            <w:tcW w:type="dxa" w:w="9071"/>
-            <w:shd w:fill="E6F2F1"/>
-            <w:tcMar>
-              <w:top w:w="125" w:type="dxa"/>
-              <w:start w:w="150" w:type="dxa"/>
-              <w:bottom w:w="125" w:type="dxa"/>
-              <w:end w:w="150" w:type="dxa"/>
-            </w:tcMar>
-          </w:tcPr>
-          <w:p>
-            <w:r>
-              <w:rPr>
-                <w:rFonts w:ascii="Times New Roman" w:hAnsi="Times New Roman" w:eastAsia="Times New Roman"/>
-                <w:b w:val="0"/>
-                <w:i w:val="0"/>
-                <w:color w:val="23313F"/>
-                <w:sz w:val="18"/>
-              </w:rPr>
-              <w:t>Thanh đầu trang hiển thị SafeWeb, trạng thái model ready, lựa chọn ngôn ngữ và tương phản. Phần nhập URL đi cùng lưu ý không dán token/mật khẩu, verification contract, nút Analyze URL và tiến độ ba bước. Khu kết quả bắt đầu ở trạng thái Awaiting a URL; trang có điều hướng mở Database Explorer.</w:t>
-            </w:r>
-          </w:p>
-        </w:tc>
-      </w:tr>
-    </w:tbl>
     <w:p>
       <w:pPr>
-        <w:spacing w:after="20"/>
+        <w:pStyle w:val="Heading2"/>
+        <w:keepNext/>
+        <w:spacing w:before="160" w:after="100"/>
       </w:pPr>
+      <w:r>
+        <w:t>4.6. Hướng dẫn thao tác và giao diện thực tế</w:t>
+      </w:r>
+    </w:p>
+    <w:p>
+      <w:pPr>
+        <w:keepLines/>
+        <w:spacing w:after="100"/>
+      </w:pPr>
+      <w:r>
+        <w:rPr>
+          <w:rFonts w:ascii="Times New Roman" w:hAnsi="Times New Roman" w:eastAsia="Times New Roman"/>
+          <w:b w:val="0"/>
+          <w:i w:val="0"/>
+          <w:color w:val="23313F"/>
+          <w:sz w:val="24"/>
+        </w:rPr>
+        <w:t>Các bước dưới đây mô tả luồng thao tác an toàn trên backend Flask tại `http://127.0.0.1:5000/`. Ảnh trang chủ được chụp từ ứng dụng đang chạy; URL ví dụ không chứa thông tin đăng nhập.</w:t>
+      </w:r>
+    </w:p>
+    <w:p>
+      <w:pPr>
+        <w:pStyle w:val="ListNumber"/>
+        <w:keepLines/>
+        <w:spacing w:after="60"/>
+        <w:ind w:left="397" w:hanging="198"/>
+      </w:pPr>
+      <w:r>
+        <w:rPr>
+          <w:rFonts w:ascii="Times New Roman" w:hAnsi="Times New Roman" w:eastAsia="Times New Roman"/>
+          <w:b w:val="0"/>
+          <w:i w:val="0"/>
+          <w:color w:val="23313F"/>
+          <w:sz w:val="22"/>
+        </w:rPr>
+        <w:t>Nhập URL cần kiểm tra; xem dòng URL đã chuẩn hóa trước khi phân tích. Không dán URL riêng tư, token hoặc mật khẩu.</w:t>
+      </w:r>
+    </w:p>
+    <w:p>
+      <w:pPr>
+        <w:pStyle w:val="ListNumber"/>
+        <w:keepLines/>
+        <w:spacing w:after="60"/>
+        <w:ind w:left="397" w:hanging="198"/>
+      </w:pPr>
+      <w:r>
+        <w:rPr>
+          <w:rFonts w:ascii="Times New Roman" w:hAnsi="Times New Roman" w:eastAsia="Times New Roman"/>
+          <w:b w:val="0"/>
+          <w:i w:val="0"/>
+          <w:color w:val="23313F"/>
+          <w:sz w:val="22"/>
+        </w:rPr>
+        <w:t>Mặc định SafeWeb chỉ phân tích cục bộ. Chỉ bật kiểm tra trực tuyến nếu chấp nhận gửi URL tới các dịch vụ DNS/preview được nêu trong giao diện.</w:t>
+      </w:r>
+    </w:p>
+    <w:p>
+      <w:pPr>
+        <w:pStyle w:val="ListNumber"/>
+        <w:keepLines/>
+        <w:spacing w:after="60"/>
+        <w:ind w:left="397" w:hanging="198"/>
+      </w:pPr>
+      <w:r>
+        <w:rPr>
+          <w:rFonts w:ascii="Times New Roman" w:hAnsi="Times New Roman" w:eastAsia="Times New Roman"/>
+          <w:b w:val="0"/>
+          <w:i w:val="0"/>
+          <w:color w:val="23313F"/>
+          <w:sz w:val="22"/>
+        </w:rPr>
+        <w:t>Chọn Phân tích URL; đọc riêng kết quả tra cứu PhishVN, xác suất từng mô hình, mức rủi ro, tín hiệu và khuyến nghị. Mức rủi ro thấp không chứng nhận trang an toàn.</w:t>
+      </w:r>
+    </w:p>
+    <w:p>
+      <w:pPr>
+        <w:pStyle w:val="ListNumber"/>
+        <w:keepLines/>
+        <w:spacing w:after="60"/>
+        <w:ind w:left="397" w:hanging="198"/>
+      </w:pPr>
+      <w:r>
+        <w:rPr>
+          <w:rFonts w:ascii="Times New Roman" w:hAnsi="Times New Roman" w:eastAsia="Times New Roman"/>
+          <w:b w:val="0"/>
+          <w:i w:val="0"/>
+          <w:color w:val="23313F"/>
+          <w:sz w:val="22"/>
+        </w:rPr>
+        <w:t>Mở Kho Dữ liệu PhishVN để tìm/lọc bản ghi; URL trong kho được hiển thị để tham khảo, không cần mở trang đích.</w:t>
+      </w:r>
+    </w:p>
+    <w:p>
+      <w:pPr>
+        <w:keepLines/>
+        <w:jc w:val="center"/>
+      </w:pPr>
+      <w:r>
+        <w:drawing>
+          <wp:inline xmlns:a="http://schemas.openxmlformats.org/drawingml/2006/main" xmlns:pic="http://schemas.openxmlformats.org/drawingml/2006/picture">
+            <wp:extent cx="5400000" cy="3749324"/>
+            <wp:docPr id="5" name="Picture 5"/>
+            <wp:cNvGraphicFramePr>
+              <a:graphicFrameLocks noChangeAspect="1"/>
+            </wp:cNvGraphicFramePr>
+            <a:graphic>
+              <a:graphicData uri="http://schemas.openxmlformats.org/drawingml/2006/picture">
+                <pic:pic>
+                  <pic:nvPicPr>
+                    <pic:cNvPr id="0" name="homepage.png"/>
+                    <pic:cNvPicPr/>
+                  </pic:nvPicPr>
+                  <pic:blipFill>
+                    <a:blip r:embed="rId15"/>
+                    <a:stretch>
+                      <a:fillRect/>
+                    </a:stretch>
+                  </pic:blipFill>
+                  <pic:spPr>
+                    <a:xfrm>
+                      <a:off x="0" y="0"/>
+                      <a:ext cx="5400000" cy="3749324"/>
+                    </a:xfrm>
+                    <a:prstGeom prst="rect"/>
+                  </pic:spPr>
+                </pic:pic>
+              </a:graphicData>
+            </a:graphic>
+          </wp:inline>
+        </w:drawing>
+      </w:r>
     </w:p>
     <w:p>
       <w:pPr>
@@ -9225,165 +9869,8 @@
           <w:color w:val="5C6B78"/>
           <w:sz w:val="19"/>
         </w:rPr>
-        <w:t>Hình 4.4. Khung kết quả phân tích và đổi theme theo mức rủi ro.</w:t>
+        <w:t>Hình 4.4. Giao diện trang chủ SafeWeb v2.3.0 trên backend Flask.</w:t>
       </w:r>
-    </w:p>
-    <w:tbl>
-      <w:tblPr>
-        <w:tblStyle w:val="TableGrid"/>
-        <w:tblW w:type="auto" w:w="0"/>
-        <w:tblLook w:firstColumn="1" w:firstRow="1" w:lastColumn="0" w:lastRow="0" w:noHBand="0" w:noVBand="1" w:val="04A0"/>
-      </w:tblPr>
-      <w:tblGrid>
-        <w:gridCol w:w="9071"/>
-      </w:tblGrid>
-      <w:tr>
-        <w:tc>
-          <w:tcPr>
-            <w:tcW w:type="dxa" w:w="9071"/>
-            <w:shd w:fill="E6F2F1"/>
-            <w:tcMar>
-              <w:top w:w="125" w:type="dxa"/>
-              <w:start w:w="150" w:type="dxa"/>
-              <w:bottom w:w="125" w:type="dxa"/>
-              <w:end w:w="150" w:type="dxa"/>
-            </w:tcMar>
-          </w:tcPr>
-          <w:p>
-            <w:r>
-              <w:rPr>
-                <w:rFonts w:ascii="Times New Roman" w:hAnsi="Times New Roman" w:eastAsia="Times New Roman"/>
-                <w:b w:val="0"/>
-                <w:i w:val="0"/>
-                <w:color w:val="23313F"/>
-                <w:sz w:val="18"/>
-              </w:rPr>
-              <w:t>Khung kết quả có badge mức, kết luận, thanh tín hiệu, nguồn database/model, lý do, tín hiệu sẵn có, khuyến nghị, giới hạn và các feature được trích xuất. Trạng thái/theme phụ thuộc tier và nhánh override database; mô tả này không hàm ý mọi loại anomaly đều được định vị chính xác.</w:t>
-            </w:r>
-          </w:p>
-        </w:tc>
-      </w:tr>
-    </w:tbl>
-    <w:p>
-      <w:pPr>
-        <w:spacing w:after="20"/>
-      </w:pPr>
-    </w:p>
-    <w:p>
-      <w:pPr>
-        <w:keepNext w:val="0"/>
-        <w:spacing w:before="40" w:after="160"/>
-        <w:jc w:val="center"/>
-      </w:pPr>
-      <w:r>
-        <w:rPr>
-          <w:rFonts w:ascii="Times New Roman" w:hAnsi="Times New Roman" w:eastAsia="Times New Roman"/>
-          <w:b w:val="0"/>
-          <w:i/>
-          <w:color w:val="5C6B78"/>
-          <w:sz w:val="19"/>
-        </w:rPr>
-        <w:t>Hình 4.5. Thẻ đồng thuận bốn mô hình.</w:t>
-      </w:r>
-    </w:p>
-    <w:tbl>
-      <w:tblPr>
-        <w:tblStyle w:val="TableGrid"/>
-        <w:tblW w:type="auto" w:w="0"/>
-        <w:tblLook w:firstColumn="1" w:firstRow="1" w:lastColumn="0" w:lastRow="0" w:noHBand="0" w:noVBand="1" w:val="04A0"/>
-      </w:tblPr>
-      <w:tblGrid>
-        <w:gridCol w:w="9071"/>
-      </w:tblGrid>
-      <w:tr>
-        <w:tc>
-          <w:tcPr>
-            <w:tcW w:type="dxa" w:w="9071"/>
-            <w:shd w:fill="E6F2F1"/>
-            <w:tcMar>
-              <w:top w:w="125" w:type="dxa"/>
-              <w:start w:w="150" w:type="dxa"/>
-              <w:bottom w:w="125" w:type="dxa"/>
-              <w:end w:w="150" w:type="dxa"/>
-            </w:tcMar>
-          </w:tcPr>
-          <w:p>
-            <w:r>
-              <w:rPr>
-                <w:rFonts w:ascii="Times New Roman" w:hAnsi="Times New Roman" w:eastAsia="Times New Roman"/>
-                <w:b w:val="0"/>
-                <w:i w:val="0"/>
-                <w:color w:val="23313F"/>
-                <w:sz w:val="18"/>
-              </w:rPr>
-              <w:t>Thẻ `Multi-Model AI Consensus` hiển thị kết quả trung bình cùng lưới từng mô hình. Đọc xác suất riêng là cần thiết vì SVM ở test hiện tại có recall gần 0,007 và có thể bất đồng với các mô hình còn lại.</w:t>
-            </w:r>
-          </w:p>
-        </w:tc>
-      </w:tr>
-    </w:tbl>
-    <w:p>
-      <w:pPr>
-        <w:spacing w:after="20"/>
-      </w:pPr>
-    </w:p>
-    <w:p>
-      <w:pPr>
-        <w:keepNext w:val="0"/>
-        <w:spacing w:before="40" w:after="160"/>
-        <w:jc w:val="center"/>
-      </w:pPr>
-      <w:r>
-        <w:rPr>
-          <w:rFonts w:ascii="Times New Roman" w:hAnsi="Times New Roman" w:eastAsia="Times New Roman"/>
-          <w:b w:val="0"/>
-          <w:i/>
-          <w:color w:val="5C6B78"/>
-          <w:sz w:val="19"/>
-        </w:rPr>
-        <w:t>Hình 4.6. Kho dữ liệu PhishVN tương tác.</w:t>
-      </w:r>
-    </w:p>
-    <w:tbl>
-      <w:tblPr>
-        <w:tblStyle w:val="TableGrid"/>
-        <w:tblW w:type="auto" w:w="0"/>
-        <w:tblLook w:firstColumn="1" w:firstRow="1" w:lastColumn="0" w:lastRow="0" w:noHBand="0" w:noVBand="1" w:val="04A0"/>
-      </w:tblPr>
-      <w:tblGrid>
-        <w:gridCol w:w="9071"/>
-      </w:tblGrid>
-      <w:tr>
-        <w:tc>
-          <w:tcPr>
-            <w:tcW w:type="dxa" w:w="9071"/>
-            <w:shd w:fill="E6F2F1"/>
-            <w:tcMar>
-              <w:top w:w="125" w:type="dxa"/>
-              <w:start w:w="150" w:type="dxa"/>
-              <w:bottom w:w="125" w:type="dxa"/>
-              <w:end w:w="150" w:type="dxa"/>
-            </w:tcMar>
-          </w:tcPr>
-          <w:p>
-            <w:r>
-              <w:rPr>
-                <w:rFonts w:ascii="Times New Roman" w:hAnsi="Times New Roman" w:eastAsia="Times New Roman"/>
-                <w:b w:val="0"/>
-                <w:i w:val="0"/>
-                <w:color w:val="23313F"/>
-                <w:sz w:val="18"/>
-              </w:rPr>
-              <w:t>Explorer có thanh search, bộ lọc label/category/tier, thống kê, bảng URL/nhãn/ngày/tier/category/brand/key features, thao tác gửi bản ghi sang máy quét và phân trang. Attribution PhishVN v3.1.0, DOI và CC BY 4.0 được trình bày trong giao diện.</w:t>
-            </w:r>
-          </w:p>
-        </w:tc>
-      </w:tr>
-    </w:tbl>
-    <w:p>
-      <w:pPr>
-        <w:spacing w:after="20"/>
-      </w:pPr>
     </w:p>
     <w:p>
       <w:pPr>
@@ -15963,10 +16450,10 @@
       </w:r>
     </w:p>
     <w:sectPr>
+      <w:footerReference w:type="default" r:id="rId10"/>
       <w:pgSz w:w="11906" w:h="16838"/>
       <w:pgMar w:top="1417" w:right="1134" w:bottom="1417" w:left="1701" w:header="720" w:footer="652" w:gutter="0"/>
       <w:cols w:space="720"/>
-      <w:titlePg/>
       <w:docGrid w:linePitch="360"/>
       <w:pgNumType w:fmt="decimal" w:start="1"/>
     </w:sectPr>
@@ -15999,6 +16486,18 @@
       <w:t>1</w:t>
       <w:fldChar w:fldCharType="end"/>
     </w:r>
+  </w:p>
+</w:ftr>
+</file>
+
+<file path=word/footer2.xml><?xml version="1.0" encoding="utf-8"?>
+<w:ftr xmlns:m="http://schemas.openxmlformats.org/officeDocument/2006/math" xmlns:mc="http://schemas.openxmlformats.org/markup-compatibility/2006" xmlns:mo="http://schemas.microsoft.com/office/mac/office/2008/main" xmlns:mv="urn:schemas-microsoft-com:mac:vml" xmlns:o="urn:schemas-microsoft-com:office:office" xmlns:r="http://schemas.openxmlformats.org/officeDocument/2006/relationships" xmlns:v="urn:schemas-microsoft-com:vml" xmlns:w10="urn:schemas-microsoft-com:office:word" xmlns:w14="http://schemas.microsoft.com/office/word/2010/wordml" xmlns:w="http://schemas.openxmlformats.org/wordprocessingml/2006/main" xmlns:wne="http://schemas.microsoft.com/office/word/2006/wordml" xmlns:wp14="http://schemas.microsoft.com/office/word/2010/wordprocessingDrawing" xmlns:wp="http://schemas.openxmlformats.org/drawingml/2006/wordprocessingDrawing" xmlns:wpc="http://schemas.microsoft.com/office/word/2010/wordprocessingCanvas" xmlns:wpg="http://schemas.microsoft.com/office/word/2010/wordprocessingGroup" xmlns:wpi="http://schemas.microsoft.com/office/word/2010/wordprocessingInk" xmlns:wps="http://schemas.microsoft.com/office/word/2010/wordprocessingShape" mc:Ignorable="w14 wp14">
+  <w:p>
+    <w:pPr>
+      <w:pStyle w:val="Footer"/>
+      <w:spacing w:before="0" w:after="0"/>
+      <w:jc w:val="center"/>
+    </w:pPr>
     <w:r>
       <w:rPr>
         <w:rFonts w:ascii="Times New Roman" w:hAnsi="Times New Roman" w:eastAsia="Times New Roman"/>

</xml_diff>

<commit_message>
Clarify SafeWeb report and database messaging
</commit_message>
<xml_diff>
--- a/Bao_cao_SafeWeb_KHKT_THPT.docx
+++ b/Bao_cao_SafeWeb_KHKT_THPT.docx
@@ -46,7 +46,7 @@
           <w:color w:val="5C6B78"/>
           <w:sz w:val="20"/>
         </w:rPr>
-        <w:t>LĨNH VỰC: PHẦN MỀM HỆ THỐNG / KHOA HỌC MÁY TÍNH</w:t>
+        <w:t>LĨNH VỰC: KHOA HỌC MÁY TÍNH / TRÍ TUỆ NHÂN TẠO</w:t>
       </w:r>
     </w:p>
     <w:p>
@@ -60,11 +60,11 @@
           <w:b/>
           <w:i w:val="0"/>
           <w:color w:val="17324D"/>
-          <w:sz w:val="40"/>
+          <w:sz w:val="34"/>
         </w:rPr>
-        <w:t>SAFEWEB v2.3.0</w:t>
+        <w:t>SAFEWEB</w:t>
         <w:br/>
-        <w:t>HỆ THỐNG HỖ TRỢ PHÂN TÍCH URL PHISHING BẰNG CƠ SỞ DỮ LIỆU PHISHVN VÀ HỌC MÁY CHẠY CỤC BỘ TRÊN TRÌNH DUYỆT</w:t>
+        <w:t>ỨNG DỤNG TRÍ TUỆ NHÂN TẠO MACHINE LEARNING KẾT HỢP PHÂN TÍCH URL CẢNH BÁO SỚM RỦI RO LỪA ĐẢO VÀ LỘ LỌT DỮ LIỆU</w:t>
       </w:r>
     </w:p>
     <w:p>
@@ -84,7 +84,7 @@
     </w:p>
     <w:p>
       <w:pPr>
-        <w:spacing w:before="6000" w:after="0" w:line="20" w:lineRule="exact"/>
+        <w:spacing w:before="5200" w:after="0" w:line="20" w:lineRule="exact"/>
       </w:pPr>
     </w:p>
     <w:tbl>
@@ -144,6 +144,56 @@
                 <w:sz w:val="22"/>
               </w:rPr>
               <w:t>Dự án kỹ thuật (Engineering Project)</w:t>
+            </w:r>
+          </w:p>
+        </w:tc>
+      </w:tr>
+      <w:tr>
+        <w:tc>
+          <w:tcPr>
+            <w:tcW w:type="dxa" w:w="2551"/>
+            <w:tcMar>
+              <w:top w:w="130" w:type="dxa"/>
+              <w:start w:w="90" w:type="dxa"/>
+              <w:bottom w:w="130" w:type="dxa"/>
+              <w:end w:w="90" w:type="dxa"/>
+            </w:tcMar>
+            <w:shd w:fill="EAF0F5"/>
+          </w:tcPr>
+          <w:p>
+            <w:r>
+              <w:rPr>
+                <w:rFonts w:ascii="Times New Roman" w:hAnsi="Times New Roman" w:eastAsia="Times New Roman"/>
+                <w:b/>
+                <w:i w:val="0"/>
+                <w:color w:val="17324D"/>
+                <w:sz w:val="22"/>
+              </w:rPr>
+              <w:t>Mô hình học máy</w:t>
+            </w:r>
+          </w:p>
+        </w:tc>
+        <w:tc>
+          <w:tcPr>
+            <w:tcW w:type="dxa" w:w="4932"/>
+            <w:tcMar>
+              <w:top w:w="130" w:type="dxa"/>
+              <w:start w:w="90" w:type="dxa"/>
+              <w:bottom w:w="130" w:type="dxa"/>
+              <w:end w:w="90" w:type="dxa"/>
+            </w:tcMar>
+            <w:shd w:fill="F7F9FA"/>
+          </w:tcPr>
+          <w:p>
+            <w:r>
+              <w:rPr>
+                <w:rFonts w:ascii="Times New Roman" w:hAnsi="Times New Roman" w:eastAsia="Times New Roman"/>
+                <w:b w:val="0"/>
+                <w:i w:val="0"/>
+                <w:color w:val="23313F"/>
+                <w:sz w:val="22"/>
+              </w:rPr>
+              <w:t>Random Forest · Gradient Boosting · SVM tuyến tính · Logistic Regression</w:t>
             </w:r>
           </w:p>
         </w:tc>
@@ -400,7 +450,7 @@
           <w:color w:val="23313F"/>
           <w:sz w:val="24"/>
         </w:rPr>
-        <w:t>SafeWeb v2.3.0 là nguyên mẫu phần mềm hỗ trợ nhận diện tín hiệu rủi ro trong URL trước khi truy cập. Mục tiêu thiết kế là kết hợp phân tích có thể giải thích với xử lý cục bộ mặc định. Hệ thống kết hợp tra cứu PhishVN, trích xuất 55 đặc trưng URL, bốn bộ phân loại và giao diện web tĩnh thực thi mô hình trực tiếp trên trình duyệt. DNS, chuyển hướng, metadata và ảnh xem trước chỉ được yêu cầu sau khi người dùng đồng ý. Dự án còn cung cấp kho dữ liệu tương tác và gợi ý category/provider/brand theo luật chuỗi.</w:t>
+        <w:t>SafeWeb là nguyên mẫu phần mềm hướng đến cảnh báo sớm rủi ro lừa đảo và lộ lọt dữ liệu qua phân tích URL. Hệ thống ưu tiên xử lý cục bộ, kết hợp cơ sở dữ liệu tham chiếu, 55 đặc trưng và bốn mô hình học máy: Random Forest, Gradient Boosting, SVM tuyến tính và Logistic Regression. DNS, chuyển hướng, metadata và ảnh xem trước chỉ được yêu cầu khi người dùng đồng ý. Giao diện còn cung cấp kho dữ liệu tương tác và gợi ý category/provider/brand theo luật.</w:t>
       </w:r>
     </w:p>
     <w:p>
@@ -434,7 +484,7 @@
           <w:color w:val="23313F"/>
           <w:sz w:val="24"/>
         </w:rPr>
-        <w:t>Gradient Boosting đạt F1 phishing 0,8697 và recall 0,9561; SVM đạt ROC-AUC 0,9308 nhưng recall ở ngưỡng hiện tại chỉ 0,0071, cho thấy một metric đơn lẻ không đủ để đánh giá. Lần kiểm thử trong workspace ghi nhận 59 kiểm thử Python và 15 kiểm thử trình duyệt; parity trên 10 URL hợp lệ và 6 URL không hợp lệ có sai khác tối đa 1,33×10⁻¹⁵ ở đặc trưng và 7,77×10⁻¹⁶ ở xác suất. Điều này xác minh tính nhất quán trên các ca đã chọn, không chứng minh độ chính xác thực địa. SafeWeb là công cụ tham khảo giáo dục, không chứng nhận website an toàn hay độc hại.</w:t>
+        <w:t>Gradient Boosting đạt F1 phishing 0,8697, recall 0,9561; SVM đạt ROC-AUC 0,9308 nhưng recall ở ngưỡng hiện tại chỉ 0,0071. Lần kiểm thử ghi nhận 59 kiểm thử Python, 15 kiểm thử trình duyệt; parity trên 10 URL hợp lệ và 6 URL lỗi có sai khác cực đại 1,33×10⁻¹⁵ ở đặc trưng và 7,77×10⁻¹⁶ ở xác suất. Kết quả xác minh tính nhất quán trên các ca đã chọn, không chứng minh hiệu quả thực địa. SafeWeb là công cụ giáo dục tham khảo, không chứng nhận website an toàn hay độc hại.</w:t>
       </w:r>
     </w:p>
     <w:p>
@@ -826,7 +876,7 @@
                 <w:color w:val="23313F"/>
                 <w:sz w:val="16"/>
               </w:rPr>
-              <w:t>Tập test PhishVN chính thức không giao tên miền đăng ký với train.</w:t>
+              <w:t>Tập kiểm thử theo phân vùng chính thức không giao tên miền đăng ký với train.</w:t>
             </w:r>
           </w:p>
         </w:tc>
@@ -1445,7 +1495,7 @@
                 <w:color w:val="23313F"/>
                 <w:sz w:val="16"/>
               </w:rPr>
-              <w:t>So sánh match PhishVN với xác suất từng mô hình; đọc precision, recall, F1 và false positive/false negative.</w:t>
+              <w:t>So sánh kết quả tra cứu cơ sở dữ liệu với xác suất từng mô hình; đọc precision, recall, F1 và false positive/false negative.</w:t>
             </w:r>
           </w:p>
         </w:tc>
@@ -2349,7 +2399,7 @@
           <w:color w:val="23313F"/>
           <w:sz w:val="22"/>
         </w:rPr>
-        <w:t>Ghép chỉ mục PhishVN có nguồn gốc với suy luận bốn mô hình trong một trải nghiệm phía trình duyệt.</w:t>
+        <w:t>Ghép cơ sở dữ liệu tham chiếu có provenance với suy luận bốn mô hình trong một trải nghiệm phía trình duyệt.</w:t>
       </w:r>
     </w:p>
     <w:p>
@@ -5544,7 +5594,7 @@
           <w:color w:val="23313F"/>
           <w:sz w:val="24"/>
         </w:rPr>
-        <w:t>`scripts/export_browser_model.py` tuần tự hóa danh sách feature và biểu diễn có thể thực thi: mỗi cây Random Forest/Gradient Boosting thành mảng left/right child, feature index, threshold và output; Logistic Regression/SVM mang mean, scale, coefficient, intercept; SVM kèm tham số sigmoid calibration. Bundle cũng chứa public suffix rules và chỉ mục PhishVN. `browser-model.js` tính feature trên chuỗi, đi qua cây, chuẩn hóa linear score và áp sigmoid; đây là thực thi tham số đã fit, không gọi Python hay backend.</w:t>
+        <w:t>`scripts/export_browser_model.py` tuần tự hóa danh sách feature và biểu diễn có thể thực thi: mỗi cây Random Forest/Gradient Boosting thành mảng left/right child, feature index, threshold và output; Logistic Regression/SVM mang mean, scale, coefficient, intercept; SVM kèm tham số sigmoid calibration. Bundle cũng chứa public suffix rules và cơ sở dữ liệu tham chiếu. `browser-model.js` tính feature trên chuỗi, đi qua cây, chuẩn hóa linear score và áp sigmoid; đây là thực thi tham số đã fit, không gọi Python hay backend.</w:t>
       </w:r>
     </w:p>
     <w:p>
@@ -5571,7 +5621,7 @@
         <w:spacing w:before="160" w:after="100"/>
       </w:pPr>
       <w:r>
-        <w:t>3.7. Tra cứu PhishVN và thứ tự kết luận</w:t>
+        <w:t>3.7. Tra cứu cơ sở dữ liệu tham chiếu và thứ tự kết luận</w:t>
       </w:r>
     </w:p>
     <w:p>
@@ -5588,7 +5638,7 @@
           <w:color w:val="23313F"/>
           <w:sz w:val="24"/>
         </w:rPr>
-        <w:t>Bộ tra cứu so khớp theo URL canonical chính xác, host đã biết hoặc chữ ký đặc trưng không va chạm nhãn benign. Dữ liệu triển khai từ PhishVN ghi 19.909 khóa URL phishing, 19.859 host phishing độc quyền và 4.461 signature đặc trưng exclusive. Một match là thông tin provenance trực tiếp, không nằm trong metric held-out của mô hình. Trong UI, kết quả database được giữ riêng và có thể ghi đè verdict tổng hợp; các điểm số bốn mô hình vẫn được hiển thị nhằm phân biệt tra cứu với dự đoán.</w:t>
+        <w:t>Cơ sở dữ liệu tham chiếu so khớp URL chuẩn hóa, hostname đã biết hoặc chữ ký đặc trưng không va chạm nhãn benign. Chỉ mục triển khai được tạo từ tập dữ liệu PhishVN đã trích dẫn: 19.909 khóa URL phishing, 19.859 hostname phishing độc quyền và 4.461 chữ ký đặc trưng riêng biệt. Kết quả khớp được trình bày riêng với metric held-out; các điểm số bốn mô hình vẫn hiển thị để phân biệt tra cứu trực tiếp với dự đoán. Không tìm thấy trong cơ sở dữ liệu chỉ có nghĩa là không có bản ghi khớp, không phải bằng chứng URL an toàn.</w:t>
       </w:r>
     </w:p>
     <w:p>
@@ -5598,7 +5648,7 @@
         <w:spacing w:before="160" w:after="100"/>
       </w:pPr>
       <w:r>
-        <w:t>3.8. Chuẩn hóa URL và tính năng phiên bản 2.3.0</w:t>
+        <w:t>3.8. Chuẩn hóa URL và các chức năng chính</w:t>
       </w:r>
     </w:p>
     <w:tbl>
@@ -5826,7 +5876,7 @@
                 <w:color w:val="23313F"/>
                 <w:sz w:val="15"/>
               </w:rPr>
-              <w:t>PhishVN lookup + feature matching</w:t>
+              <w:t>Tra cứu cơ sở dữ liệu + đối chiếu đặc trưng</w:t>
             </w:r>
           </w:p>
         </w:tc>
@@ -5854,7 +5904,7 @@
                 <w:color w:val="23313F"/>
                 <w:sz w:val="15"/>
               </w:rPr>
-              <w:t>URL chính xác → host đã biết → chữ ký feature độc quyền.</w:t>
+              <w:t>URL chính xác → hostname đã biết → chữ ký đặc trưng độc quyền.</w:t>
             </w:r>
           </w:p>
         </w:tc>
@@ -5882,7 +5932,7 @@
                 <w:color w:val="23313F"/>
                 <w:sz w:val="15"/>
               </w:rPr>
-              <w:t>Match database chỉ phản ánh bản ghi nguồn; feature signature có độ bao phủ và khả năng va chạm phụ thuộc thiết kế kho.</w:t>
+              <w:t>Kết quả chỉ phản ánh bản ghi khớp; chữ ký đặc trưng có độ bao phủ và khả năng va chạm phụ thuộc thiết kế kho.</w:t>
             </w:r>
           </w:p>
         </w:tc>
@@ -6188,7 +6238,7 @@
                 <w:color w:val="23313F"/>
                 <w:sz w:val="15"/>
               </w:rPr>
-              <w:t>Counter-examples</w:t>
+              <w:t>URL đối chiếu</w:t>
             </w:r>
           </w:p>
         </w:tc>
@@ -6216,7 +6266,7 @@
                 <w:color w:val="23313F"/>
                 <w:sz w:val="15"/>
               </w:rPr>
-              <w:t>Lấy tối đa năm URL phishing cùng brand/category từ kho PhishVN để đối chiếu, hiển thị dưới dạng văn bản.</w:t>
+              <w:t>Lấy tối đa năm URL phishing cùng brand/category từ tập dữ liệu tham chiếu, hiển thị dưới dạng văn bản.</w:t>
             </w:r>
           </w:p>
         </w:tc>
@@ -6477,7 +6527,7 @@
           <w:color w:val="23313F"/>
           <w:sz w:val="24"/>
         </w:rPr>
-        <w:t>Điểm heuristic giao diện cộng: URL dài từ 120 ký tự +18; từ ba subdomain +16; hostname IP +18; có `@` +12; từ tám ký tự đặc biệt +10; có `%` +8; entropy từ 4,5 +10; mỗi keyword khớp +8. Điểm kết hợp được tính `clamp(0, 100, 0,6 × 100p + heuristicScore)`. Mức theme lại phân loại theo xác suất ensemble p: LOW nếu p &lt; 0,25; CAUTION nếu 0,25 ≤ p &lt; 0,50; HIGH nếu 0,50 ≤ p &lt; 0,75; VERY HIGH nếu p ≥ 0,75. Match PhishVN và Easter egg có nhánh ghi đè kết quả theo record/host. Vì score và tier có công thức khác nhau, không nên suy ra tier chỉ từ điểm heuristic.</w:t>
+        <w:t>Điểm heuristic giao diện cộng: URL dài từ 120 ký tự +18; từ ba subdomain +16; hostname IP +18; có `@` +12; từ tám ký tự đặc biệt +10; có `%` +8; entropy từ 4,5 +10; mỗi keyword khớp +8. Điểm kết hợp được tính `clamp(0, 100, 0,6 × 100p + heuristicScore)`. Mức theme lại phân loại theo xác suất ensemble p: LOW nếu p &lt; 0,25; CAUTION nếu 0,25 ≤ p &lt; 0,50; HIGH nếu 0,50 ≤ p &lt; 0,75; VERY HIGH nếu p ≥ 0,75. Kết quả khớp cơ sở dữ liệu và Easter egg có nhánh ghi đè theo record/host. Vì score và tier có công thức khác nhau, không nên suy ra tier chỉ từ điểm heuristic.</w:t>
       </w:r>
     </w:p>
     <w:p>
@@ -9794,7 +9844,7 @@
           <w:color w:val="23313F"/>
           <w:sz w:val="22"/>
         </w:rPr>
-        <w:t>Chọn Phân tích URL; đọc riêng kết quả tra cứu PhishVN, xác suất từng mô hình, mức rủi ro, tín hiệu và khuyến nghị. Mức rủi ro thấp không chứng nhận trang an toàn.</w:t>
+        <w:t>Chọn Phân tích URL; đọc riêng kết quả tra cứu cơ sở dữ liệu, xác suất từng mô hình, mức rủi ro, tín hiệu và khuyến nghị. Mức rủi ro thấp không chứng nhận trang an toàn.</w:t>
       </w:r>
     </w:p>
     <w:p>
@@ -9812,7 +9862,7 @@
           <w:color w:val="23313F"/>
           <w:sz w:val="22"/>
         </w:rPr>
-        <w:t>Mở Kho Dữ liệu PhishVN để tìm/lọc bản ghi; URL trong kho được hiển thị để tham khảo, không cần mở trang đích.</w:t>
+        <w:t>Mở Cơ sở dữ liệu URL để tìm/lọc bản ghi; URL trong kho được hiển thị để tham khảo, không cần mở trang đích.</w:t>
       </w:r>
     </w:p>
     <w:p>
@@ -9823,7 +9873,7 @@
       <w:r>
         <w:drawing>
           <wp:inline xmlns:a="http://schemas.openxmlformats.org/drawingml/2006/main" xmlns:pic="http://schemas.openxmlformats.org/drawingml/2006/picture">
-            <wp:extent cx="5400000" cy="3749324"/>
+            <wp:extent cx="5400000" cy="5912195"/>
             <wp:docPr id="5" name="Picture 5"/>
             <wp:cNvGraphicFramePr>
               <a:graphicFrameLocks noChangeAspect="1"/>
@@ -9844,7 +9894,7 @@
                   <pic:spPr>
                     <a:xfrm>
                       <a:off x="0" y="0"/>
-                      <a:ext cx="5400000" cy="3749324"/>
+                      <a:ext cx="5400000" cy="5912195"/>
                     </a:xfrm>
                     <a:prstGeom prst="rect"/>
                   </pic:spPr>
@@ -9869,7 +9919,7 @@
           <w:color w:val="5C6B78"/>
           <w:sz w:val="19"/>
         </w:rPr>
-        <w:t>Hình 4.4. Giao diện trang chủ SafeWeb v2.3.0 trên backend Flask.</w:t>
+        <w:t>Hình 4.4. Giao diện trang chủ SafeWeb trên backend Flask.</w:t>
       </w:r>
     </w:p>
     <w:p>
@@ -9933,7 +9983,7 @@
           <w:color w:val="23313F"/>
           <w:sz w:val="24"/>
         </w:rPr>
-        <w:t>Nguyên mẫu hoàn thành luồng phân tích URL cục bộ, tra cứu dữ liệu PhishVN, trích xuất schema 55 feature, suy luận bốn mô hình trên trình duyệt, giao diện đa ngôn ngữ, explorer dữ liệu và nhánh kiểm tra DNS/redirect có đồng ý. Kiểm thử parity và build cung cấp bằng chứng triển khai nhất quán trên phạm vi đã định. Tuy vậy, kết quả SVM cho thấy ensemble hiện tại chưa đủ căn cứ để được mô tả là đồng thuận chất lượng đồng đều; cần ưu tiên sửa calibration hoặc ngưỡng dựa trên validation và báo cáo lại trên test độc lập sau khi khóa quy trình.</w:t>
+        <w:t>Nguyên mẫu hoàn thành luồng phân tích URL cục bộ, tra cứu cơ sở dữ liệu tham chiếu, trích xuất schema 55 feature, suy luận bốn mô hình trên trình duyệt, giao diện đa ngôn ngữ, explorer dữ liệu và nhánh kiểm tra DNS/redirect có đồng ý. Kiểm thử parity và build cung cấp bằng chứng triển khai nhất quán trên phạm vi đã định. Tuy vậy, kết quả SVM cho thấy ensemble hiện tại chưa đủ căn cứ để được mô tả là đồng thuận chất lượng đồng đều; cần ưu tiên sửa calibration hoặc ngưỡng dựa trên validation và báo cáo lại trên test độc lập sau khi khóa quy trình.</w:t>
       </w:r>
     </w:p>
     <w:p>
@@ -9960,7 +10010,7 @@
           <w:color w:val="23313F"/>
           <w:sz w:val="24"/>
         </w:rPr>
-        <w:t>SafeWeb v2.3.0 chứng minh tính khả thi của một nguyên mẫu hỗ trợ nhận diện URL phishing theo hướng xử lý cục bộ mặc định, ghép tra cứu provenance với bốn mô hình và trình bày các lý do URL có thể kiểm tra. PhishVN held-out test cho thấy Gradient Boosting đạt F1 phishing 0,8697 và recall 0,9561, còn SVM ở ngưỡng hiện tại gần như không phát hiện lớp phishing. Vì vậy, kết luận phù hợp là hệ thống có tiềm năng làm công cụ giáo dục và sàng lọc tham khảo, chứ không phải bộ bảo vệ hoàn chỉnh hoặc chứng nhận tính an toàn của URL.</w:t>
+        <w:t>SafeWeb chứng minh tính khả thi của nguyên mẫu cảnh báo sớm dựa trên URL, xử lý cục bộ mặc định, cơ sở dữ liệu tham chiếu và bốn mô hình. Trên tập kiểm thử giữ riêng, Gradient Boosting đạt F1 phishing 0,8697 và recall 0,9561; SVM ở ngưỡng hiện tại gần như không phát hiện lớp phishing. Hệ thống phù hợp làm công cụ giáo dục và sàng lọc tham khảo, không phải bộ bảo vệ hoàn chỉnh hay chứng nhận tính an toàn của URL.</w:t>
       </w:r>
     </w:p>
     <w:p>
@@ -10697,7 +10747,7 @@
           <w:color w:val="23313F"/>
           <w:sz w:val="19"/>
         </w:rPr>
-        <w:t>SafeWeb project. (2026). SafeWeb v2.3.0: README, ML experiment report, metrics.json, phishvn_domain_eval.json, and source code [Project documentation and software]. Workspace release evidence.</w:t>
+        <w:t>SafeWeb. (2026). Tài liệu kỹ thuật, báo cáo thí nghiệm học máy, metrics.json, phishvn_domain_eval.json và mã nguồn [Tài liệu dự án và phần mềm].</w:t>
       </w:r>
     </w:p>
     <w:p>
@@ -16277,7 +16327,7 @@
                 <w:color w:val="23313F"/>
                 <w:sz w:val="17"/>
               </w:rPr>
-              <w:t>Hướng phát triển, không phải tính năng v2.3.0.</w:t>
+              <w:t>Hướng phát triển, chưa được triển khai trong nguyên mẫu hiện tại.</w:t>
             </w:r>
           </w:p>
         </w:tc>
@@ -16398,7 +16448,7 @@
           <w:color w:val="17324D"/>
           <w:sz w:val="50"/>
         </w:rPr>
-        <w:t>SAFEWEB v2.3.0</w:t>
+        <w:t>SAFEWEB</w:t>
       </w:r>
     </w:p>
     <w:p>
@@ -16435,7 +16485,7 @@
     </w:p>
     <w:p>
       <w:pPr>
-        <w:spacing w:before="3000"/>
+        <w:spacing w:before="2000" w:after="160"/>
         <w:jc w:val="center"/>
       </w:pPr>
       <w:r>
@@ -16444,11 +16494,173 @@
           <w:b/>
           <w:i w:val="0"/>
           <w:color w:val="17324D"/>
-          <w:sz w:val="18"/>
+          <w:sz w:val="20"/>
         </w:rPr>
-        <w:t>LÊ VĂN TUẤN ANH  ·  NGUYỄN HOÀNG BẢO  ·  TRẦN VĂN TOÀN</w:t>
+        <w:t>NHÓM THỰC HIỆN VÀ NGƯỜI HƯỚNG DẪN</w:t>
       </w:r>
     </w:p>
+    <w:tbl>
+      <w:tblPr>
+        <w:tblW w:type="auto" w:w="0"/>
+        <w:jc w:val="center"/>
+        <w:tblLayout w:type="fixed"/>
+        <w:tblLook w:firstColumn="1" w:firstRow="1" w:lastColumn="0" w:lastRow="0" w:noHBand="0" w:noVBand="1" w:val="04A0"/>
+      </w:tblPr>
+      <w:tblGrid>
+        <w:gridCol w:w="4535"/>
+        <w:gridCol w:w="4535"/>
+      </w:tblGrid>
+      <w:tr>
+        <w:tc>
+          <w:tcPr>
+            <w:tcW w:type="dxa" w:w="2381"/>
+            <w:tcMar>
+              <w:top w:w="95" w:type="dxa"/>
+              <w:start w:w="90" w:type="dxa"/>
+              <w:bottom w:w="95" w:type="dxa"/>
+              <w:end w:w="90" w:type="dxa"/>
+            </w:tcMar>
+            <w:shd w:fill="EAF0F5"/>
+          </w:tcPr>
+          <w:p>
+            <w:r>
+              <w:rPr>
+                <w:rFonts w:ascii="Times New Roman" w:hAnsi="Times New Roman" w:eastAsia="Times New Roman"/>
+                <w:b/>
+                <w:i w:val="0"/>
+                <w:color w:val="17324D"/>
+                <w:sz w:val="20"/>
+              </w:rPr>
+              <w:t>Người thực hiện 1</w:t>
+            </w:r>
+          </w:p>
+        </w:tc>
+        <w:tc>
+          <w:tcPr>
+            <w:tcW w:type="dxa" w:w="3402"/>
+            <w:tcMar>
+              <w:top w:w="95" w:type="dxa"/>
+              <w:start w:w="90" w:type="dxa"/>
+              <w:bottom w:w="95" w:type="dxa"/>
+              <w:end w:w="90" w:type="dxa"/>
+            </w:tcMar>
+            <w:shd w:fill="F7F9FA"/>
+          </w:tcPr>
+          <w:p>
+            <w:r>
+              <w:rPr>
+                <w:rFonts w:ascii="Times New Roman" w:hAnsi="Times New Roman" w:eastAsia="Times New Roman"/>
+                <w:b w:val="0"/>
+                <w:i w:val="0"/>
+                <w:color w:val="23313F"/>
+                <w:sz w:val="20"/>
+              </w:rPr>
+              <w:t>Lê Văn Tuấn Anh</w:t>
+            </w:r>
+          </w:p>
+        </w:tc>
+      </w:tr>
+      <w:tr>
+        <w:tc>
+          <w:tcPr>
+            <w:tcW w:type="dxa" w:w="2381"/>
+            <w:tcMar>
+              <w:top w:w="95" w:type="dxa"/>
+              <w:start w:w="90" w:type="dxa"/>
+              <w:bottom w:w="95" w:type="dxa"/>
+              <w:end w:w="90" w:type="dxa"/>
+            </w:tcMar>
+            <w:shd w:fill="EAF0F5"/>
+          </w:tcPr>
+          <w:p>
+            <w:r>
+              <w:rPr>
+                <w:rFonts w:ascii="Times New Roman" w:hAnsi="Times New Roman" w:eastAsia="Times New Roman"/>
+                <w:b/>
+                <w:i w:val="0"/>
+                <w:color w:val="17324D"/>
+                <w:sz w:val="20"/>
+              </w:rPr>
+              <w:t>Người thực hiện 2</w:t>
+            </w:r>
+          </w:p>
+        </w:tc>
+        <w:tc>
+          <w:tcPr>
+            <w:tcW w:type="dxa" w:w="3402"/>
+            <w:tcMar>
+              <w:top w:w="95" w:type="dxa"/>
+              <w:start w:w="90" w:type="dxa"/>
+              <w:bottom w:w="95" w:type="dxa"/>
+              <w:end w:w="90" w:type="dxa"/>
+            </w:tcMar>
+            <w:shd w:fill="F7F9FA"/>
+          </w:tcPr>
+          <w:p>
+            <w:r>
+              <w:rPr>
+                <w:rFonts w:ascii="Times New Roman" w:hAnsi="Times New Roman" w:eastAsia="Times New Roman"/>
+                <w:b w:val="0"/>
+                <w:i w:val="0"/>
+                <w:color w:val="23313F"/>
+                <w:sz w:val="20"/>
+              </w:rPr>
+              <w:t>Nguyễn Hoàng Bảo</w:t>
+            </w:r>
+          </w:p>
+        </w:tc>
+      </w:tr>
+      <w:tr>
+        <w:tc>
+          <w:tcPr>
+            <w:tcW w:type="dxa" w:w="2381"/>
+            <w:tcMar>
+              <w:top w:w="95" w:type="dxa"/>
+              <w:start w:w="90" w:type="dxa"/>
+              <w:bottom w:w="95" w:type="dxa"/>
+              <w:end w:w="90" w:type="dxa"/>
+            </w:tcMar>
+            <w:shd w:fill="EAF0F5"/>
+          </w:tcPr>
+          <w:p>
+            <w:r>
+              <w:rPr>
+                <w:rFonts w:ascii="Times New Roman" w:hAnsi="Times New Roman" w:eastAsia="Times New Roman"/>
+                <w:b/>
+                <w:i w:val="0"/>
+                <w:color w:val="17324D"/>
+                <w:sz w:val="20"/>
+              </w:rPr>
+              <w:t>Người hướng dẫn</w:t>
+            </w:r>
+          </w:p>
+        </w:tc>
+        <w:tc>
+          <w:tcPr>
+            <w:tcW w:type="dxa" w:w="3402"/>
+            <w:tcMar>
+              <w:top w:w="95" w:type="dxa"/>
+              <w:start w:w="90" w:type="dxa"/>
+              <w:bottom w:w="95" w:type="dxa"/>
+              <w:end w:w="90" w:type="dxa"/>
+            </w:tcMar>
+            <w:shd w:fill="F7F9FA"/>
+          </w:tcPr>
+          <w:p>
+            <w:r>
+              <w:rPr>
+                <w:rFonts w:ascii="Times New Roman" w:hAnsi="Times New Roman" w:eastAsia="Times New Roman"/>
+                <w:b w:val="0"/>
+                <w:i w:val="0"/>
+                <w:color w:val="23313F"/>
+                <w:sz w:val="20"/>
+              </w:rPr>
+              <w:t>Trần Văn Toàn</w:t>
+            </w:r>
+          </w:p>
+        </w:tc>
+      </w:tr>
+    </w:tbl>
     <w:sectPr>
       <w:footerReference w:type="default" r:id="rId10"/>
       <w:pgSz w:w="11906" w:h="16838"/>

</xml_diff>

<commit_message>
Fit SafeWeb KHKT report to 15-page limit
</commit_message>
<xml_diff>
--- a/Bao_cao_SafeWeb_KHKT_THPT.docx
+++ b/Bao_cao_SafeWeb_KHKT_THPT.docx
@@ -1239,7 +1239,7 @@
           <w:color w:val="23313F"/>
           <w:sz w:val="19"/>
         </w:rPr>
-        <w:t>SafeWeb hướng tới dạy an toàn số và tư duy dữ liệu qua việc quan sát pipeline, so sánh bằng chứng và thảo luận giới hạn tự động hóa. Chưa có nghiên cứu học sinh, đo trước/sau hay đánh giá hiệu quả sư phạm; các nội dung sau là mục tiêu đề xuất, không phải kết quả thực nghiệm.</w:t>
+        <w:t>SafeWeb hướng tới dạy an toàn số và tư duy dữ liệu: quan sát pipeline, so sánh bằng chứng, nhận diện giới hạn AI. Chưa có nghiên cứu học sinh hay đo hiệu quả sư phạm; đây là mục tiêu đề xuất, không phải kết quả thực nghiệm.</w:t>
       </w:r>
     </w:p>
     <w:tbl>
@@ -1376,7 +1376,7 @@
                 <w:color w:val="23313F"/>
                 <w:sz w:val="16"/>
               </w:rPr>
-              <w:t>Hiểu cấu trúc URL</w:t>
+              <w:t>Hiểu URL</w:t>
             </w:r>
           </w:p>
         </w:tc>
@@ -1405,7 +1405,7 @@
                 <w:color w:val="23313F"/>
                 <w:sz w:val="16"/>
               </w:rPr>
-              <w:t>Tách scheme, hostname, subdomain, path và query; chỉ ra phần nào chứa tín hiệu được trích xuất.</w:t>
+              <w:t>Tách scheme, hostname, subdomain, path, query và xác định tín hiệu.</w:t>
             </w:r>
           </w:p>
         </w:tc>
@@ -1434,7 +1434,7 @@
                 <w:color w:val="23313F"/>
                 <w:sz w:val="16"/>
               </w:rPr>
-              <w:t>Một dấu hiệu như từ khóa ngân hàng, IP hay HTTPS không tự chứng minh URL độc hại hoặc an toàn.</w:t>
+              <w:t>Từ khóa, IP hay HTTPS không tự chứng minh an toàn/độc hại.</w:t>
             </w:r>
           </w:p>
         </w:tc>
@@ -1467,7 +1467,7 @@
                 <w:color w:val="23313F"/>
                 <w:sz w:val="16"/>
               </w:rPr>
-              <w:t>Tư duy phản biện về AI</w:t>
+              <w:t>Phản biện AI</w:t>
             </w:r>
           </w:p>
         </w:tc>
@@ -1495,7 +1495,7 @@
                 <w:color w:val="23313F"/>
                 <w:sz w:val="16"/>
               </w:rPr>
-              <w:t>So sánh kết quả tra cứu cơ sở dữ liệu với xác suất từng mô hình; đọc precision, recall, F1 và false positive/false negative.</w:t>
+              <w:t>So sánh tra cứu, xác suất model, precision/recall/F1 và lỗi FP/FN.</w:t>
             </w:r>
           </w:p>
         </w:tc>
@@ -1523,7 +1523,7 @@
                 <w:color w:val="23313F"/>
                 <w:sz w:val="16"/>
               </w:rPr>
-              <w:t>Kết quả phụ thuộc corpus và threshold; SVM hiện có recall phishing rất thấp dù ROC-AUC cao.</w:t>
+              <w:t>Kết quả phụ thuộc dữ liệu/ngưỡng; SVM có recall rất thấp.</w:t>
             </w:r>
           </w:p>
         </w:tc>
@@ -1557,7 +1557,7 @@
                 <w:color w:val="23313F"/>
                 <w:sz w:val="16"/>
               </w:rPr>
-              <w:t>Quyền riêng tư và công dân số</w:t>
+              <w:t>Quyền riêng tư</w:t>
             </w:r>
           </w:p>
         </w:tc>
@@ -1586,7 +1586,7 @@
                 <w:color w:val="23313F"/>
                 <w:sz w:val="16"/>
               </w:rPr>
-              <w:t>Phân biệt phân tích local-only với live inspection; cân nhắc trước khi chia sẻ URL cho dịch vụ ngoài.</w:t>
+              <w:t>Phân biệt local-only với live inspection trước khi chia sẻ URL.</w:t>
             </w:r>
           </w:p>
         </w:tc>
@@ -1615,7 +1615,7 @@
                 <w:color w:val="23313F"/>
                 <w:sz w:val="16"/>
               </w:rPr>
-              <w:t>Không nhập URL riêng tư, token hoặc thông tin đăng nhập; HTTPS không xác thực danh tính website.</w:t>
+              <w:t>Không nhập token/URL riêng tư; HTTPS không xác thực danh tính.</w:t>
             </w:r>
           </w:p>
         </w:tc>
@@ -1648,7 +1648,7 @@
                 <w:color w:val="23313F"/>
                 <w:sz w:val="16"/>
               </w:rPr>
-              <w:t>Tư duy kỹ thuật và tái lập</w:t>
+              <w:t>Tái lập kỹ thuật</w:t>
             </w:r>
           </w:p>
         </w:tc>
@@ -1676,7 +1676,7 @@
                 <w:color w:val="23313F"/>
                 <w:sz w:val="16"/>
               </w:rPr>
-              <w:t>Theo dõi pipeline dữ liệu → đặc trưng → mô hình → giao diện; đối chiếu Python–JavaScript.</w:t>
+              <w:t>Theo dõi pipeline và đối chiếu Python–JavaScript.</w:t>
             </w:r>
           </w:p>
         </w:tc>
@@ -1704,7 +1704,7 @@
                 <w:color w:val="23313F"/>
                 <w:sz w:val="16"/>
               </w:rPr>
-              <w:t>Parity xác minh hai hiện thực nhất quán trên bộ ca đã chọn, không chứng minh độ chính xác phổ quát.</w:t>
+              <w:t>Parity chỉ xác nhận các ca đã chọn.</w:t>
             </w:r>
           </w:p>
         </w:tc>
@@ -1729,7 +1729,7 @@
           <w:color w:val="23313F"/>
           <w:sz w:val="19"/>
         </w:rPr>
-        <w:t>Kịch bản lớp học có thể dùng URL giả lập: học sinh phân tích hostname trước khi xem dự đoán, giải thích một false negative/false positive và đề xuất cách xác minh qua kênh chính thức. Tắt live checks, không mở URL mẫu. Nghiên cứu sư phạm tương lai cần bài kiểm tra trước/sau, rubric và quy trình đồng thuận/bảo vệ dữ liệu; các phép đo này chưa được thực hiện.</w:t>
+        <w:t>Kịch bản lớp học dùng URL giả lập: phân tích hostname trước khi xem dự đoán, giải thích một FP/FN và đề xuất cách xác minh chính thức. Tắt live checks, không mở URL. Đánh giá sư phạm tương lai cần pre/post test, rubric, đồng thuận và bảo vệ dữ liệu; hiện chưa đo các kết quả này.</w:t>
       </w:r>
     </w:p>
     <w:p>
@@ -1766,7 +1766,7 @@
           <w:color w:val="23313F"/>
           <w:sz w:val="19"/>
         </w:rPr>
-        <w:t>SafeWeb thuộc dự án kỹ thuật: đầu ra là nguyên mẫu phần mềm; tiêu chí gồm khả năng hoạt động, tái lập, nhất quán triển khai và giới hạn vận hành. Thí nghiệm học máy đánh giá thiết kế, không nghiên cứu nhân quả hành vi người dùng.</w:t>
+        <w:t>SafeWeb là dự án kỹ thuật với đầu ra nguyên mẫu phần mềm; đánh giá dựa trên hoạt động, tái lập và giới hạn vận hành, không nghiên cứu nhân quả hành vi người dùng.</w:t>
       </w:r>
     </w:p>
     <w:p>
@@ -1913,7 +1913,7 @@
                 <w:color w:val="23313F"/>
                 <w:sz w:val="16"/>
               </w:rPr>
-              <w:t>Chỉ heuristic URL</w:t>
+              <w:t>Heuristic URL</w:t>
             </w:r>
           </w:p>
         </w:tc>
@@ -1942,7 +1942,7 @@
                 <w:color w:val="23313F"/>
                 <w:sz w:val="16"/>
               </w:rPr>
-              <w:t>Nhanh, dễ giải thích, không cần huấn luyện.</w:t>
+              <w:t>Nhanh, giải thích được, không cần fit.</w:t>
             </w:r>
           </w:p>
         </w:tc>
@@ -1971,7 +1971,7 @@
                 <w:color w:val="23313F"/>
                 <w:sz w:val="16"/>
               </w:rPr>
-              <w:t>Khó biểu diễn tương tác phi tuyến; giữ như lớp giải thích, không dùng làm nguồn kết luận duy nhất.</w:t>
+              <w:t>Hạn chế tương tác phi tuyến; không dùng riêng làm verdict.</w:t>
             </w:r>
           </w:p>
         </w:tc>
@@ -2004,7 +2004,7 @@
                 <w:color w:val="23313F"/>
                 <w:sz w:val="16"/>
               </w:rPr>
-              <w:t>Chỉ tra cứu danh sách</w:t>
+              <w:t>Chỉ tra cứu</w:t>
             </w:r>
           </w:p>
         </w:tc>
@@ -2032,7 +2032,7 @@
                 <w:color w:val="23313F"/>
                 <w:sz w:val="16"/>
               </w:rPr>
-              <w:t>Khi khớp bản ghi có nguồn gốc và nhãn rõ.</w:t>
+              <w:t>Match có record/provenance.</w:t>
             </w:r>
           </w:p>
         </w:tc>
@@ -2060,7 +2060,7 @@
                 <w:color w:val="23313F"/>
                 <w:sz w:val="16"/>
               </w:rPr>
-              <w:t>Không nhận diện biến thể URL chưa có trong kho; dùng làm tầng xác minh độc lập.</w:t>
+              <w:t>Không bao phủ URL mới; giữ như tầng riêng.</w:t>
             </w:r>
           </w:p>
         </w:tc>
@@ -2094,7 +2094,7 @@
                 <w:color w:val="23313F"/>
                 <w:sz w:val="16"/>
               </w:rPr>
-              <w:t>Chỉ backend inference</w:t>
+              <w:t>Chỉ backend</w:t>
             </w:r>
           </w:p>
         </w:tc>
@@ -2123,7 +2123,7 @@
                 <w:color w:val="23313F"/>
                 <w:sz w:val="16"/>
               </w:rPr>
-              <w:t>Dễ cập nhật mô hình và tập trung tài nguyên.</w:t>
+              <w:t>Dễ cập nhật/tập trung tài nguyên.</w:t>
             </w:r>
           </w:p>
         </w:tc>
@@ -2152,7 +2152,7 @@
                 <w:color w:val="23313F"/>
                 <w:sz w:val="16"/>
               </w:rPr>
-              <w:t>URL phải gửi tới server; không phù hợp mục tiêu phân tích cục bộ mặc định.</w:t>
+              <w:t>Phải gửi URL lên server.</w:t>
             </w:r>
           </w:p>
         </w:tc>
@@ -2185,7 +2185,7 @@
                 <w:color w:val="23313F"/>
                 <w:sz w:val="16"/>
               </w:rPr>
-              <w:t>Mô hình trong trình duyệt + tra cứu + live opt-in</w:t>
+              <w:t>Trình duyệt + tra cứu + live opt-in</w:t>
             </w:r>
           </w:p>
         </w:tc>
@@ -2213,7 +2213,7 @@
                 <w:color w:val="23313F"/>
                 <w:sz w:val="16"/>
               </w:rPr>
-              <w:t>Có thể chạy phân tích cục bộ, trình bày nhiều nguồn, bổ sung kiểm tra mạng có đồng ý.</w:t>
+              <w:t>Local inference và kiểm tra mạng theo consent.</w:t>
             </w:r>
           </w:p>
         </w:tc>
@@ -2241,7 +2241,7 @@
                 <w:color w:val="23313F"/>
                 <w:sz w:val="16"/>
               </w:rPr>
-              <w:t>Bundle lớn hơn; phải duy trì parity và thừa nhận giới hạn CORS/nguồn dữ liệu.</w:t>
+              <w:t>Bundle lớn; cần parity, có giới hạn CORS.</w:t>
             </w:r>
           </w:p>
         </w:tc>
@@ -2382,7 +2382,7 @@
           <w:color w:val="23313F"/>
           <w:sz w:val="19"/>
         </w:rPr>
-        <w:t>Ghép cơ sở dữ liệu tham chiếu có provenance với suy luận bốn mô hình trong một trải nghiệm phía trình duyệt.</w:t>
+        <w:t>Kết hợp tra cứu tham chiếu và bốn model trong trình duyệt.</w:t>
       </w:r>
     </w:p>
     <w:p>
@@ -2400,7 +2400,7 @@
           <w:color w:val="23313F"/>
           <w:sz w:val="19"/>
         </w:rPr>
-        <w:t>Tách kết quả khớp dữ liệu trực tiếp khỏi điểm số học máy để người dùng phân biệt provenance và generalization.</w:t>
+        <w:t>Tách database match khỏi xác suất ML để phân biệt record và dự đoán.</w:t>
       </w:r>
     </w:p>
     <w:p>
@@ -2418,7 +2418,7 @@
           <w:color w:val="23313F"/>
           <w:sz w:val="19"/>
         </w:rPr>
-        <w:t>Đóng gói tham số mô hình, cây, scaler, calibration và quy tắc public suffix để suy luận offline mà không gửi URL ở chế độ mặc định.</w:t>
+        <w:t>Đóng gói cây, scaler, calibration và suffix rules cho suy luận offline.</w:t>
       </w:r>
     </w:p>
     <w:p>
@@ -2436,7 +2436,7 @@
           <w:color w:val="23313F"/>
           <w:sz w:val="19"/>
         </w:rPr>
-        <w:t>Có consent gate trước DNS, redirect, metadata và preview; thể hiện trực tiếp đánh đổi giữa thông tin bổ sung và quyền riêng tư.</w:t>
+        <w:t>Live checks có consent gate trước khi chia sẻ URL.</w:t>
       </w:r>
     </w:p>
     <w:p>
@@ -2454,7 +2454,7 @@
           <w:color w:val="23313F"/>
           <w:sz w:val="19"/>
         </w:rPr>
-        <w:t>Kiểm tra khả năng tái hiện giữa Python và JavaScript bằng vector đặc trưng và xác suất thay vì chỉ kiểm thử giao diện.</w:t>
+        <w:t>Đối chiếu feature/probability giữa Python và JavaScript.</w:t>
       </w:r>
     </w:p>
     <w:p>
@@ -2910,7 +2910,7 @@
           <w:color w:val="23313F"/>
           <w:sz w:val="19"/>
         </w:rPr>
-        <w:t>PhishVN v3.1.0 cung cấp 53.116 dòng nguồn, nhãn, metadata provenance và phân vùng train/validation/test theo nhóm (Thai Nguyen Vu, 2026). Pipeline canonicalize URL, gộp alias apex/`www`, rà soát nhãn xung đột và giữ phân vùng chính thức. Sau xử lý còn 36.261 URL: 19.909 phishing và 16.352 benign; 16.855 dòng bí danh trùng bị loại, không có nhóm nhãn xung đột hoặc URL lỗi/truncated bị loại. Phân vùng gồm train 25.185, validation 4.452 và test 6.624; giao nhau domain đăng ký giữa các phân vùng bằng 0.</w:t>
+        <w:t>PhishVN v3.1.0 có 53.116 dòng; sau chuẩn hóa/gộp `www`-apex còn 36.261 URL (19.909 phishing, 16.352 benign), loại 16.855 alias, không có conflict. Split chính thức: train 25.185, validation 4.452, test 6.624; các split không giao domain (Thai Nguyen Vu, 2026).</w:t>
       </w:r>
     </w:p>
     <w:p>
@@ -2927,7 +2927,7 @@
           <w:color w:val="23313F"/>
           <w:sz w:val="19"/>
         </w:rPr>
-        <w:t>PhiUSIIL Phishing URL Dataset có 235.795 dòng nguồn (PhiUSIIL Phishing URL Dataset, n.d.). Bước làm sạch loại 86 dòng URL xung đột nhãn, 3.586 URL canonical trùng và 461 dòng thuộc 4.260 domain của test PhishVN; không có URL lỗi bị loại ở thống kê hiện hành. Còn 231.662 dòng dùng huấn luyện. Nhãn nguồn được đảo để khớp quy ước SafeWeb. Train bao gồm 29.637 mẫu PhishVN train+validation và 231.662 mẫu PhiUSIIL; test vẫn là 6.624 dòng PhishVN không được đưa vào fit.</w:t>
+        <w:t>PhiUSIIL có 235.795 dòng; loại 86 URL conflict, 3.586 bản canonical trùng và 461 URL thuộc 4.260 domain test, còn 231.662 mẫu (97.003 phishing, 134.659 benign) để fit. Nhãn được đảo về `1=phishing`. Tổng train: 29.637 PhishVN + 231.662 PhiUSIIL = 261.299; test 6.624 giữ riêng (PhiUSIIL Phishing URL Dataset, n.d.).</w:t>
       </w:r>
     </w:p>
     <w:tbl>
@@ -3855,7 +3855,7 @@
           <w:color w:val="23313F"/>
           <w:sz w:val="19"/>
         </w:rPr>
-        <w:t>Đặc trưng CompPhish có sẵn trên PhishVN được đối chiếu với phép trích xuất cục bộ: 797.742 giá trị trên 36.261 bản ghi khớp với bảng phát hành trong sai số dung sai của pipeline. Timestamp thu thập/scrape chỉ là provenance, không được dùng như thời điểm sự kiện hoặc nhãn.</w:t>
+        <w:t>Đối chiếu 797.742 giá trị CompPhish trên 36.261 URL khớp bảng phát hành trong dung sai; timestamp chỉ là provenance, không dùng làm nhãn.</w:t>
       </w:r>
     </w:p>
     <w:p>
@@ -3882,7 +3882,7 @@
           <w:color w:val="23313F"/>
           <w:sz w:val="19"/>
         </w:rPr>
-        <w:t>Đầu vào mô hình là một vector số có thứ tự cố định. Các biến trùng khái niệm giữa SafeWeb và PhishVN được giữ riêng vì chúng theo định nghĩa nguồn khác nhau. Một số giá trị về TLD lấy từ hồ sơ host PhishVN khi có; các URL không có hồ sơ dùng phép tính cục bộ và danh sách suspicious TLD đóng gói.</w:t>
+        <w:t>Mô hình dùng vector có thứ tự cố định; feature cùng tên được giữ riêng theo định nghĩa nguồn. Hồ sơ host cung cấp một số giá trị TLD; nếu thiếu, dùng phép tính cục bộ và suffix list đóng gói.</w:t>
       </w:r>
     </w:p>
     <w:tbl>
@@ -4885,7 +4885,7 @@
           <w:color w:val="23313F"/>
           <w:sz w:val="19"/>
         </w:rPr>
-        <w:t>Các nhóm ngữ nghĩa dưới đây giúp mô tả bề mặt đe dọa, nhưng không đồng nghĩa tất cả từ trong danh sách đều là feature model. Mô hình đang dùng đúng tám cờ từ khóa ở bảng 3.2; việc một từ xuất hiện không chứng minh phishing vì trang hợp lệ cũng có thể chứa những từ này.</w:t>
+        <w:t>Các nhóm dưới đây mô tả ngữ nghĩa; model chỉ dùng tám keyword ở bảng, và sự xuất hiện của từ không chứng minh phishing.</w:t>
       </w:r>
     </w:p>
     <w:tbl>
@@ -5478,7 +5478,7 @@
           <w:color w:val="23313F"/>
           <w:sz w:val="19"/>
         </w:rPr>
-        <w:t>Đọc phân vùng chính thức PhishVN; lấy train và validation làm phần PhishVN dùng fit, giữ test ngoài huấn luyện.</w:t>
+        <w:t>Dùng train/validation chính thức; giữ nguyên test PhishVN domain-disjoint.</w:t>
       </w:r>
     </w:p>
     <w:p>
@@ -5496,7 +5496,7 @@
           <w:color w:val="23313F"/>
           <w:sz w:val="19"/>
         </w:rPr>
-        <w:t>Đọc URL/label từ archive PhiUSIIL, chuẩn hóa URL, đổi quy ước nhãn, loại xung đột, bản ghi trùng và domain thuộc test.</w:t>
+        <w:t>Chuẩn hóa PhiUSIIL, đảo nhãn về 1=phishing; loại conflict, duplicate và domain giao test.</w:t>
       </w:r>
     </w:p>
     <w:p>
@@ -5514,7 +5514,7 @@
           <w:color w:val="23313F"/>
           <w:sz w:val="19"/>
         </w:rPr>
-        <w:t>Tạo cùng một thứ tự 55 đặc trưng cho hai nguồn; dùng 21 cột CompPhish đã phát hành cùng cờ suspicious-TLD và ba feature obfuscation.</w:t>
+        <w:t>Tạo schema 55 feature chung, gồm CompPhish và ba feature obfuscation.</w:t>
       </w:r>
     </w:p>
     <w:p>
@@ -5532,7 +5532,7 @@
           <w:color w:val="23313F"/>
           <w:sz w:val="19"/>
         </w:rPr>
-        <w:t>Tạo sample weight bảo đảm mỗi nguồn có tổng trọng số bằng nhau, và hai lớp benign/phishing cân bằng trong từng nguồn.</w:t>
+        <w:t>Cân bằng trọng số theo nguồn/lớp; fit bốn model với seed 42.</w:t>
       </w:r>
     </w:p>
     <w:p>
@@ -5550,7 +5550,7 @@
           <w:color w:val="23313F"/>
           <w:sz w:val="19"/>
         </w:rPr>
-        <w:t>Fit bốn estimator với random seed 42; đánh giá đồng nhất trên 6.624 URL test PhishVN; ghi accuracy, precision/recall/F1 phishing, ROC-AUC và confusion matrix.</w:t>
+        <w:t>Đánh giá cùng 6.624 URL test bằng accuracy, precision, recall, F1, ROC-AUC và confusion matrix.</w:t>
       </w:r>
     </w:p>
     <w:p>
@@ -5577,24 +5577,7 @@
           <w:color w:val="23313F"/>
           <w:sz w:val="19"/>
         </w:rPr>
-        <w:t>`scripts/export_browser_model.py` tuần tự hóa danh sách feature và biểu diễn có thể thực thi: mỗi cây Random Forest/Gradient Boosting thành mảng left/right child, feature index, threshold và output; Logistic Regression/SVM mang mean, scale, coefficient, intercept; SVM kèm tham số sigmoid calibration. Bundle cũng chứa public suffix rules và cơ sở dữ liệu tham chiếu. `browser-model.js` tính feature trên chuỗi, đi qua cây, chuẩn hóa linear score và áp sigmoid; đây là thực thi tham số đã fit, không gọi Python hay backend.</w:t>
-      </w:r>
-    </w:p>
-    <w:p>
-      <w:pPr>
-        <w:keepLines/>
-        <w:spacing w:after="100"/>
-        <w:ind w:firstLine="454"/>
-      </w:pPr>
-      <w:r>
-        <w:rPr>
-          <w:rFonts w:ascii="Times New Roman" w:hAnsi="Times New Roman" w:eastAsia="Times New Roman"/>
-          <w:b w:val="0"/>
-          <w:i w:val="0"/>
-          <w:color w:val="23313F"/>
-          <w:sz w:val="19"/>
-        </w:rPr>
-        <w:t>Tính riêng tư cần diễn đạt có điều kiện: luồng local-only không gửi URL ra ngoài, nhưng dữ liệu mô hình và kho tham chiếu được tải cùng ứng dụng; khi bật live inspection, URL được gửi đến Google DNS-over-HTTPS và dịch vụ metadata/preview. Do đó sản phẩm không bảo đảm “tuyệt đối riêng tư” trong mọi chế độ; người dùng phải tránh đưa token, thông tin đăng nhập hoặc URL bí mật vào công cụ.</w:t>
+        <w:t>Exporter đóng gói cây và tham số scaler/linear/SVM calibration cùng feature order, suffix rules và cơ sở dữ liệu. `browser-model.js` thực thi suy luận JavaScript, không gọi backend. Local-only không gửi URL; live inspection gửi URL tới DNS/preview providers sau consent, nên không nhập token hay URL riêng tư.</w:t>
       </w:r>
     </w:p>
     <w:p>
@@ -5621,7 +5604,7 @@
           <w:color w:val="23313F"/>
           <w:sz w:val="19"/>
         </w:rPr>
-        <w:t>Cơ sở dữ liệu tham chiếu so khớp URL chuẩn hóa, hostname đã biết hoặc chữ ký đặc trưng không va chạm nhãn benign. Chỉ mục triển khai được tạo từ tập dữ liệu PhishVN đã trích dẫn: 19.909 khóa URL phishing, 19.859 hostname phishing độc quyền và 4.461 chữ ký đặc trưng riêng biệt. Kết quả khớp được trình bày riêng với metric held-out; các điểm số bốn mô hình vẫn hiển thị để phân biệt tra cứu trực tiếp với dự đoán. Không tìm thấy trong cơ sở dữ liệu chỉ có nghĩa là không có bản ghi khớp, không phải bằng chứng URL an toàn.</w:t>
+        <w:t>Tra cứu theo URL chuẩn hóa → hostname → chữ ký feature độc quyền. Chỉ mục nguồn đã trích dẫn có 19.909 URL keys, 19.859 host keys và 4.461 signatures. Match được tách khỏi metric ML; không có match chỉ nghĩa là không có bản ghi, không chứng minh URL an toàn.</w:t>
       </w:r>
     </w:p>
     <w:p>
@@ -7312,7 +7295,7 @@
           <w:color w:val="23313F"/>
           <w:sz w:val="19"/>
         </w:rPr>
-        <w:t>Mỗi bộ phân loại được fit trên cùng 261.299 mẫu với cùng 55 cột đặc trưng và đánh giá trên cùng 6.624 mẫu PhishVN test chưa tham gia huấn luyện. Test gồm 3.825 benign và 2.799 phishing. Precision = TP/(TP+FP), recall = TP/(TP+FN), F1 = 2 × precision × recall/(precision+recall); các chỉ số này trong bảng dành cho lớp phishing. Ma trận nhầm lẫn trình bày theo thứ tự TN/FP/FN/TP. Accuracy là tỷ lệ dự đoán đúng trên toàn tập; ROC-AUC đo khả năng xếp hạng qua nhiều ngưỡng, không thay thế đánh giá ngưỡng quyết định. Số liệu được đọc từ artefact metric và báo cáo đánh giá trong repository (SafeWeb project, 2026).</w:t>
+        <w:t>Bốn model dùng cùng 261.299 mẫu, 55 feature và test giữ riêng 6.624 URL (3.825 benign, 2.799 phishing). Precision/recall/F1 tính cho lớp phishing; confusion order là TN/FP/FN/TP. ROC-AUC đo ranking qua nhiều ngưỡng, không thay thế metric tại threshold. Số liệu lấy từ artefact đánh giá SafeWeb (2026).</w:t>
       </w:r>
     </w:p>
     <w:p>
@@ -8532,7 +8515,7 @@
           <w:color w:val="23313F"/>
           <w:sz w:val="19"/>
         </w:rPr>
-        <w:t>Gradient Boosting có accuracy 0,8789 và F1 phishing 0,8697; recall 0,9561 tương ứng 2.676/2.799 phishing phát hiện đúng, song false positive là 679. Random Forest đạt recall 0,9232, F1 0,8615 và ít false negative hơn một số baseline tuyến tính. Logistic Regression có F1 0,8371. SVM giữ 3.825 benign đúng và không có false positive ở ngưỡng phân loại hiện tại, nhưng bỏ sót 2.779/2.799 phishing; accuracy 0,5805 và F1 phishing 0,0142 khiến nhãn SVM hiện tại không thể xem là hữu ích. ROC-AUC SVM 0,9308 gợi ý khả năng xếp hạng khác với ngưỡng hoạt động, nhưng cần khảo sát calibration/threshold trên validation trước khi thay đổi.</w:t>
+        <w:t>Gradient Boosting đạt accuracy 0,8789, F1 0,8697, recall 0,9561 (2.676/2.799 TP) và 679 FP. Random Forest: recall 0,9232, F1 0,8615; Logistic Regression: F1 0,8371. SVM chỉ phát hiện 20 phishing, bỏ sót 2.779, dù ROC-AUC 0,9308; cần hiệu chỉnh threshold trên validation.</w:t>
       </w:r>
     </w:p>
     <w:p>
@@ -8559,7 +8542,7 @@
           <w:color w:val="23313F"/>
           <w:sz w:val="19"/>
         </w:rPr>
-        <w:t>False negative là URL phishing bị gán benign; đây là loại sai số có thể làm người dùng mất cảnh giác. False positive làm URL hợp lệ bị cảnh báo, có thể gây mệt mỏi cảnh báo. Gradient Boosting giảm FN xuống 123 nhưng có 679 FP; Logistic Regression có 341 FN và 616 FP. SVM ưu tiên precision 1,0 trên 20 dự đoán phishing nhưng chỉ phát hiện 20 trường hợp, vì vậy precision cao ở đây không đại diện cho khả năng phát hiện tổng quát.</w:t>
+        <w:t>False negative bỏ sót phishing; false positive cảnh báo URL hợp lệ. Gradient Boosting có 123 FN/679 FP; Logistic Regression 341/616. SVM precision 1,0 chỉ trên 20 phát hiện, không đại diện cho recall.</w:t>
       </w:r>
     </w:p>
     <w:p>
@@ -8576,7 +8559,7 @@
           <w:color w:val="23313F"/>
           <w:sz w:val="19"/>
         </w:rPr>
-        <w:t>Các chỉ số là hiệu năng trên một corpus có quy trình gán nhãn và phân vùng cụ thể. Chúng không đo calibration xác suất, không phản ánh phân phối URL triển khai, không đo khả năng chống né tránh/adversarial và không chứng minh quan hệ nhân quả giữa từng đặc trưng với phishing. Phân vùng domain-disjoint làm giảm rò rỉ cùng tên miền nhưng không loại bỏ mọi dạng trùng chiến dịch, nguồn feed hoặc drift theo thời gian.</w:t>
+        <w:t>Metric chỉ mô tả corpus/split này; không đo calibration, deployment drift, chống né tránh hay quan hệ nhân quả. Tách domain giảm leakage nhưng không loại hết trùng chiến dịch/nguồn.</w:t>
       </w:r>
     </w:p>
     <w:p>
@@ -9076,7 +9059,7 @@
           <w:color w:val="23313F"/>
           <w:sz w:val="19"/>
         </w:rPr>
-        <w:t>Parity là xác minh kỹ thuật hai hiện thực đang dùng cùng công thức/parameters với các ca đã chọn, không phải bằng chứng mô hình đúng về mặt bảo mật. Test suite mới chạy trên bộ ca được lưu trong repository; cần bổ sung URL IDN, IPv6, user-info, query lồng nhiều tầng, public suffix hiếm và URL adversarial trước khi coi độ bao phủ là rộng.</w:t>
+        <w:t>Parity xác nhận hai runtime nhất quán trên ca đã chọn, không chứng minh hiệu quả bảo mật. Cần bổ sung IDN, IPv6, user-info, query lồng và URL adversarial.</w:t>
       </w:r>
     </w:p>
     <w:p>
@@ -9852,7 +9835,7 @@
           <w:color w:val="23313F"/>
           <w:sz w:val="19"/>
         </w:rPr>
-        <w:t>Nguyên mẫu hoàn thành luồng phân tích URL cục bộ, tra cứu cơ sở dữ liệu tham chiếu, trích xuất schema 55 feature, suy luận bốn mô hình trên trình duyệt, giao diện đa ngôn ngữ, explorer dữ liệu và nhánh kiểm tra DNS/redirect có đồng ý. Kiểm thử parity và build cung cấp bằng chứng triển khai nhất quán trên phạm vi đã định. Tuy vậy, kết quả SVM cho thấy ensemble hiện tại chưa đủ căn cứ để được mô tả là đồng thuận chất lượng đồng đều; cần ưu tiên sửa calibration hoặc ngưỡng dựa trên validation và báo cáo lại trên test độc lập sau khi khóa quy trình.</w:t>
+        <w:t>Nguyên mẫu hoàn thành phân tích URL cục bộ, tra cứu tham chiếu, 55 feature, bốn model trên trình duyệt, explorer và live checks có consent. Parity/build xác nhận triển khai nhất quán trong phạm vi test. SVM có recall rất thấp; cần hiệu chỉnh trên validation trước khi tin cậy ensemble.</w:t>
       </w:r>
     </w:p>
     <w:p>
@@ -9879,7 +9862,7 @@
           <w:color w:val="23313F"/>
           <w:sz w:val="19"/>
         </w:rPr>
-        <w:t>SafeWeb chứng minh tính khả thi của nguyên mẫu cảnh báo sớm dựa trên URL, xử lý cục bộ mặc định, cơ sở dữ liệu tham chiếu và bốn mô hình. Trên tập kiểm thử giữ riêng, Gradient Boosting đạt F1 phishing 0,8697 và recall 0,9561; SVM ở ngưỡng hiện tại gần như không phát hiện lớp phishing. Hệ thống phù hợp làm công cụ giáo dục và sàng lọc tham khảo, không phải bộ bảo vệ hoàn chỉnh hay chứng nhận tính an toàn của URL.</w:t>
+        <w:t>SafeWeb khả thi như nguyên mẫu cảnh báo sớm URL, chạy cục bộ mặc định. Trên test giữ riêng, Gradient Boosting đạt F1 0,8697/recall 0,9561; SVM gần như bỏ sót phishing ở threshold hiện tại. Đây là công cụ giáo dục/sàng lọc, không phải bộ bảo vệ hay chứng nhận an toàn.</w:t>
       </w:r>
     </w:p>
     <w:p>
@@ -9907,7 +9890,7 @@
           <w:color w:val="23313F"/>
           <w:sz w:val="19"/>
         </w:rPr>
-        <w:t>SVM calibration/decision threshold cần được sửa theo validation; không lựa chọn threshold trên tập test rồi báo cùng test như đánh giá độc lập.</w:t>
+        <w:t>SVM cần hiệu chỉnh threshold trên validation; không chọn threshold bằng test.</w:t>
       </w:r>
     </w:p>
     <w:p>
@@ -9925,7 +9908,7 @@
           <w:color w:val="23313F"/>
           <w:sz w:val="19"/>
         </w:rPr>
-        <w:t>Cơ sở dữ liệu phụ thuộc coverage, thời điểm phát hiện và chất lượng nhãn của nguồn; không match không đồng nghĩa an toàn.</w:t>
+        <w:t>Không match database không đồng nghĩa an toàn; coverage/nhãn thay đổi theo nguồn và thời gian.</w:t>
       </w:r>
     </w:p>
     <w:p>
@@ -9943,7 +9926,7 @@
           <w:color w:val="23313F"/>
           <w:sz w:val="19"/>
         </w:rPr>
-        <w:t>Đặc trưng chủ yếu dựa trên URL, không phân tích nội dung trang, chứng thư, tuổi domain, reputation feed hoặc hành vi script.</w:t>
+        <w:t>Model chỉ phân tích URL, không đọc HTML, TLS, tuổi domain, reputation hay script; keyword có thể gây bias/false positive.</w:t>
       </w:r>
     </w:p>
     <w:p>
@@ -9961,7 +9944,7 @@
           <w:color w:val="23313F"/>
           <w:sz w:val="19"/>
         </w:rPr>
-        <w:t>Tín hiệu từ khóa có thể tạo thiên lệch ngôn ngữ và false positive; danh sách hiện tại chỉ gồm tám substring.</w:t>
+        <w:t>Domain-disjoint không loại hết campaign leakage hoặc dataset drift; benchmark không đại diện mọi môi trường.</w:t>
       </w:r>
     </w:p>
     <w:p>
@@ -9979,43 +9962,7 @@
           <w:color w:val="23313F"/>
           <w:sz w:val="19"/>
         </w:rPr>
-        <w:t>Tách domain không loại hết rò rỉ chiến dịch/nguồn, và dữ liệu benchmark không đại diện mọi quốc gia, ngôn ngữ hay thời điểm.</w:t>
-      </w:r>
-    </w:p>
-    <w:p>
-      <w:pPr>
-        <w:pStyle w:val="ListBullet"/>
-        <w:keepLines/>
-        <w:spacing w:after="40"/>
-        <w:ind w:left="397" w:hanging="198"/>
-      </w:pPr>
-      <w:r>
-        <w:rPr>
-          <w:rFonts w:ascii="Times New Roman" w:hAnsi="Times New Roman" w:eastAsia="Times New Roman"/>
-          <w:b w:val="0"/>
-          <w:i w:val="0"/>
-          <w:color w:val="23313F"/>
-          <w:sz w:val="19"/>
-        </w:rPr>
-        <w:t>Live inspection gửi URL tới dịch vụ ngoài sau đồng ý; CORS, rate limit, DNS cache và dịch vụ preview làm kết quả không ổn định.</w:t>
-      </w:r>
-    </w:p>
-    <w:p>
-      <w:pPr>
-        <w:pStyle w:val="ListBullet"/>
-        <w:keepLines/>
-        <w:spacing w:after="40"/>
-        <w:ind w:left="397" w:hanging="198"/>
-      </w:pPr>
-      <w:r>
-        <w:rPr>
-          <w:rFonts w:ascii="Times New Roman" w:hAnsi="Times New Roman" w:eastAsia="Times New Roman"/>
-          <w:b w:val="0"/>
-          <w:i w:val="0"/>
-          <w:color w:val="23313F"/>
-          <w:sz w:val="19"/>
-        </w:rPr>
-        <w:t>Chưa có thử nghiệm usability có người tham gia, đánh giá accessibility độc lập hay đo thời gian/chi phí vận hành trên thiết bị yếu.</w:t>
+        <w:t>Live checks phụ thuộc dịch vụ/CORS và chia sẻ URL sau consent; chưa có usability/accessibility study.</w:t>
       </w:r>
     </w:p>
     <w:p>
@@ -10042,24 +9989,7 @@
           <w:color w:val="23313F"/>
           <w:sz w:val="19"/>
         </w:rPr>
-        <w:t>Phiên bản tiếp theo có thể chuyển từ website phân tích theo yêu cầu sang tiện ích mở rộng trình duyệt. Một content script sẽ lấy các anchor đang hiện trong viewport, canonicalize URL, khử trùng, gửi chuỗi qua bộ suy luận cục bộ và gắn cảnh báo không chặn trang. Khi cuộn, IntersectionObserver có thể xử lý incremental; chỉ cache hash/feature cần thiết và giới hạn số URL mỗi nhịp để tránh làm chậm trang.</w:t>
-      </w:r>
-    </w:p>
-    <w:p>
-      <w:pPr>
-        <w:keepLines/>
-        <w:spacing w:after="100"/>
-        <w:ind w:firstLine="454"/>
-      </w:pPr>
-      <w:r>
-        <w:rPr>
-          <w:rFonts w:ascii="Times New Roman" w:hAnsi="Times New Roman" w:eastAsia="Times New Roman"/>
-          <w:b w:val="0"/>
-          <w:i w:val="0"/>
-          <w:color w:val="23313F"/>
-          <w:sz w:val="19"/>
-        </w:rPr>
-        <w:t>Thiết kế phải mặc định không gửi URL ra ngoài, không đọc nội dung form hoặc trường mật khẩu, không thay đổi đích liên kết, không tự chặn click nếu chưa có cơ sở, và giải thích mức tin cậy bằng lý do cụ thể. Quyền extension cần giới hạn tối thiểu; người dùng cần bật rõ chế độ quét trang, có pause/allowlist, và biết URL của trang hiện tại có thể chứa dữ liệu nhạy cảm. Kiểm thử tương lai cần đo độ bao phủ viewport, latency, false positive, pin/CPU trên trang nhiều liên kết, tương thích SPA và khả năng khôi phục thao tác của người dùng.</w:t>
+        <w:t>Hướng phát triển là extension quét anchor trong viewport, chuẩn hóa/khử trùng URL, suy luận cục bộ và cảnh báo không chặn. Bắt buộc opt-in, permission tối thiểu, không đọc form/credential, không gửi URL mặc định; đánh giá latency, FP và tương thích SPA trước phát hành.</w:t>
       </w:r>
     </w:p>
     <w:p>
@@ -10091,7 +10021,7 @@
         </w:trPr>
         <w:tc>
           <w:tcPr>
-            <w:tcW w:type="dxa" w:w="1701"/>
+            <w:tcW w:type="dxa" w:w="1247"/>
             <w:shd w:fill="17324D"/>
             <w:vAlign w:val="center"/>
             <w:tcMar>
@@ -10112,7 +10042,7 @@
                 <w:b/>
                 <w:i w:val="0"/>
                 <w:color w:val="FFFFFF"/>
-                <w:sz w:val="16"/>
+                <w:sz w:val="15"/>
               </w:rPr>
               <w:t>Giai đoạn</w:t>
             </w:r>
@@ -10120,7 +10050,7 @@
         </w:tc>
         <w:tc>
           <w:tcPr>
-            <w:tcW w:type="dxa" w:w="3969"/>
+            <w:tcW w:type="dxa" w:w="4082"/>
             <w:shd w:fill="17324D"/>
             <w:vAlign w:val="center"/>
             <w:tcMar>
@@ -10141,7 +10071,7 @@
                 <w:b/>
                 <w:i w:val="0"/>
                 <w:color w:val="FFFFFF"/>
-                <w:sz w:val="16"/>
+                <w:sz w:val="15"/>
               </w:rPr>
               <w:t>Công việc</w:t>
             </w:r>
@@ -10149,7 +10079,7 @@
         </w:tc>
         <w:tc>
           <w:tcPr>
-            <w:tcW w:type="dxa" w:w="3515"/>
+            <w:tcW w:type="dxa" w:w="3855"/>
             <w:shd w:fill="17324D"/>
             <w:vAlign w:val="center"/>
             <w:tcMar>
@@ -10170,9 +10100,9 @@
                 <w:b/>
                 <w:i w:val="0"/>
                 <w:color w:val="FFFFFF"/>
-                <w:sz w:val="16"/>
-              </w:rPr>
-              <w:t>Tiêu chí nghiệm thu đề xuất</w:t>
+                <w:sz w:val="15"/>
+              </w:rPr>
+              <w:t>Tiêu chí nghiệm thu</w:t>
             </w:r>
           </w:p>
         </w:tc>
@@ -10183,7 +10113,7 @@
         </w:trPr>
         <w:tc>
           <w:tcPr>
-            <w:tcW w:type="dxa" w:w="1701"/>
+            <w:tcW w:type="dxa" w:w="1247"/>
             <w:vAlign w:val="center"/>
             <w:shd w:fill="F4F7F8"/>
             <w:tcMar>
@@ -10204,15 +10134,15 @@
                 <w:b w:val="0"/>
                 <w:i w:val="0"/>
                 <w:color w:val="23313F"/>
-                <w:sz w:val="16"/>
-              </w:rPr>
-              <w:t>V2.4 — hiệu chỉnh mô hình</w:t>
-            </w:r>
-          </w:p>
-        </w:tc>
-        <w:tc>
-          <w:tcPr>
-            <w:tcW w:type="dxa" w:w="3969"/>
+                <w:sz w:val="15"/>
+              </w:rPr>
+              <w:t>V2.4</w:t>
+            </w:r>
+          </w:p>
+        </w:tc>
+        <w:tc>
+          <w:tcPr>
+            <w:tcW w:type="dxa" w:w="4082"/>
             <w:vAlign w:val="center"/>
             <w:shd w:fill="F4F7F8"/>
             <w:tcMar>
@@ -10233,15 +10163,15 @@
                 <w:b w:val="0"/>
                 <w:i w:val="0"/>
                 <w:color w:val="23313F"/>
-                <w:sz w:val="16"/>
-              </w:rPr>
-              <w:t>Khảo sát calibration/threshold SVM chỉ trên validation; so sánh ensemble có/không SVM.</w:t>
-            </w:r>
-          </w:p>
-        </w:tc>
-        <w:tc>
-          <w:tcPr>
-            <w:tcW w:type="dxa" w:w="3515"/>
+                <w:sz w:val="15"/>
+              </w:rPr>
+              <w:t>Hiệu chỉnh SVM trên validation; so sánh ensemble.</w:t>
+            </w:r>
+          </w:p>
+        </w:tc>
+        <w:tc>
+          <w:tcPr>
+            <w:tcW w:type="dxa" w:w="3855"/>
             <w:vAlign w:val="center"/>
             <w:shd w:fill="F4F7F8"/>
             <w:tcMar>
@@ -10262,9 +10192,9 @@
                 <w:b w:val="0"/>
                 <w:i w:val="0"/>
                 <w:color w:val="23313F"/>
-                <w:sz w:val="16"/>
-              </w:rPr>
-              <w:t>Khóa metric/threshold trước đánh giá test mới; báo cáo recall, precision, calibration và confusion matrix.</w:t>
+                <w:sz w:val="15"/>
+              </w:rPr>
+              <w:t>Khóa threshold trước test; báo recall, precision, calibration.</w:t>
             </w:r>
           </w:p>
         </w:tc>
@@ -10275,7 +10205,7 @@
         </w:trPr>
         <w:tc>
           <w:tcPr>
-            <w:tcW w:type="dxa" w:w="1701"/>
+            <w:tcW w:type="dxa" w:w="1247"/>
             <w:vAlign w:val="center"/>
             <w:tcMar>
               <w:top w:w="30" w:type="dxa"/>
@@ -10295,15 +10225,15 @@
                 <w:b w:val="0"/>
                 <w:i w:val="0"/>
                 <w:color w:val="23313F"/>
-                <w:sz w:val="16"/>
-              </w:rPr>
-              <w:t>V2.5 — giải thích và dữ liệu</w:t>
-            </w:r>
-          </w:p>
-        </w:tc>
-        <w:tc>
-          <w:tcPr>
-            <w:tcW w:type="dxa" w:w="3969"/>
+                <w:sz w:val="15"/>
+              </w:rPr>
+              <w:t>V2.5</w:t>
+            </w:r>
+          </w:p>
+        </w:tc>
+        <w:tc>
+          <w:tcPr>
+            <w:tcW w:type="dxa" w:w="4082"/>
             <w:vAlign w:val="center"/>
             <w:tcMar>
               <w:top w:w="30" w:type="dxa"/>
@@ -10323,15 +10253,15 @@
                 <w:b w:val="0"/>
                 <w:i w:val="0"/>
                 <w:color w:val="23313F"/>
-                <w:sz w:val="16"/>
-              </w:rPr>
-              <w:t>Mở rộng feature-level explanations, đánh giá URL IDN/adversarial, lưu provenance/version.</w:t>
-            </w:r>
-          </w:p>
-        </w:tc>
-        <w:tc>
-          <w:tcPr>
-            <w:tcW w:type="dxa" w:w="3515"/>
+                <w:sz w:val="15"/>
+              </w:rPr>
+              <w:t>Giải thích feature; thêm ca IDN/adversarial.</w:t>
+            </w:r>
+          </w:p>
+        </w:tc>
+        <w:tc>
+          <w:tcPr>
+            <w:tcW w:type="dxa" w:w="3855"/>
             <w:vAlign w:val="center"/>
             <w:tcMar>
               <w:top w:w="30" w:type="dxa"/>
@@ -10351,9 +10281,9 @@
                 <w:b w:val="0"/>
                 <w:i w:val="0"/>
                 <w:color w:val="23313F"/>
-                <w:sz w:val="16"/>
-              </w:rPr>
-              <w:t>Mỗi lời giải thích ánh xạ tới phép đo thật; kiểm thử tiếng Việt và Unicode.</w:t>
+                <w:sz w:val="15"/>
+              </w:rPr>
+              <w:t>Lý do truy về feature; test Unicode.</w:t>
             </w:r>
           </w:p>
         </w:tc>
@@ -10364,7 +10294,7 @@
         </w:trPr>
         <w:tc>
           <w:tcPr>
-            <w:tcW w:type="dxa" w:w="1701"/>
+            <w:tcW w:type="dxa" w:w="1247"/>
             <w:vAlign w:val="center"/>
             <w:shd w:fill="F4F7F8"/>
             <w:tcMar>
@@ -10385,15 +10315,15 @@
                 <w:b w:val="0"/>
                 <w:i w:val="0"/>
                 <w:color w:val="23313F"/>
-                <w:sz w:val="16"/>
-              </w:rPr>
-              <w:t>V3 — browser extension thử nghiệm</w:t>
-            </w:r>
-          </w:p>
-        </w:tc>
-        <w:tc>
-          <w:tcPr>
-            <w:tcW w:type="dxa" w:w="3969"/>
+                <w:sz w:val="15"/>
+              </w:rPr>
+              <w:t>V3</w:t>
+            </w:r>
+          </w:p>
+        </w:tc>
+        <w:tc>
+          <w:tcPr>
+            <w:tcW w:type="dxa" w:w="4082"/>
             <w:vAlign w:val="center"/>
             <w:shd w:fill="F4F7F8"/>
             <w:tcMar>
@@ -10414,15 +10344,15 @@
                 <w:b w:val="0"/>
                 <w:i w:val="0"/>
                 <w:color w:val="23313F"/>
-                <w:sz w:val="16"/>
-              </w:rPr>
-              <w:t>Quét viewport opt-in, batching, cache cục bộ và cảnh báo không chặn.</w:t>
-            </w:r>
-          </w:p>
-        </w:tc>
-        <w:tc>
-          <w:tcPr>
-            <w:tcW w:type="dxa" w:w="3515"/>
+                <w:sz w:val="15"/>
+              </w:rPr>
+              <w:t>Extension quét viewport opt-in.</w:t>
+            </w:r>
+          </w:p>
+        </w:tc>
+        <w:tc>
+          <w:tcPr>
+            <w:tcW w:type="dxa" w:w="3855"/>
             <w:vAlign w:val="center"/>
             <w:shd w:fill="F4F7F8"/>
             <w:tcMar>
@@ -10443,9 +10373,9 @@
                 <w:b w:val="0"/>
                 <w:i w:val="0"/>
                 <w:color w:val="23313F"/>
-                <w:sz w:val="16"/>
-              </w:rPr>
-              <w:t>Không gửi URL mặc định; permission audit; usability/performance test trước phát hành.</w:t>
+                <w:sz w:val="15"/>
+              </w:rPr>
+              <w:t>Không gửi URL mặc định; audit permission/usability/performance.</w:t>
             </w:r>
           </w:p>
         </w:tc>
@@ -10469,7 +10399,7 @@
     <w:p>
       <w:pPr>
         <w:keepLines/>
-        <w:spacing w:after="100"/>
+        <w:spacing w:after="40"/>
         <w:ind w:left="454" w:hanging="454"/>
       </w:pPr>
       <w:r>
@@ -10478,7 +10408,7 @@
           <w:b w:val="0"/>
           <w:i w:val="0"/>
           <w:color w:val="23313F"/>
-          <w:sz w:val="19"/>
+          <w:sz w:val="17"/>
         </w:rPr>
         <w:t>Berners-Lee, T., Fielding, R., &amp; Masinter, L. (2005). Uniform Resource Identifier (URI): Generic syntax (RFC 3986). Internet Engineering Task Force. https://doi.org/10.17487/RFC3986</w:t>
       </w:r>
@@ -10486,7 +10416,7 @@
     <w:p>
       <w:pPr>
         <w:keepLines/>
-        <w:spacing w:after="100"/>
+        <w:spacing w:after="40"/>
         <w:ind w:left="454" w:hanging="454"/>
       </w:pPr>
       <w:r>
@@ -10495,7 +10425,7 @@
           <w:b w:val="0"/>
           <w:i w:val="0"/>
           <w:color w:val="23313F"/>
-          <w:sz w:val="19"/>
+          <w:sz w:val="17"/>
         </w:rPr>
         <w:t>Breiman, L. (2001). Random forests. Machine Learning, 45, 5–32. https://doi.org/10.1023/A:1010933404324</w:t>
       </w:r>
@@ -10503,7 +10433,7 @@
     <w:p>
       <w:pPr>
         <w:keepLines/>
-        <w:spacing w:after="100"/>
+        <w:spacing w:after="40"/>
         <w:ind w:left="454" w:hanging="454"/>
       </w:pPr>
       <w:r>
@@ -10512,7 +10442,7 @@
           <w:b w:val="0"/>
           <w:i w:val="0"/>
           <w:color w:val="23313F"/>
-          <w:sz w:val="19"/>
+          <w:sz w:val="17"/>
         </w:rPr>
         <w:t>Cortes, C., &amp; Vapnik, V. (1995). Support-vector networks. Machine Learning, 20, 273–297. https://doi.org/10.1007/BF00994018</w:t>
       </w:r>
@@ -10520,7 +10450,7 @@
     <w:p>
       <w:pPr>
         <w:keepLines/>
-        <w:spacing w:after="100"/>
+        <w:spacing w:after="40"/>
         <w:ind w:left="454" w:hanging="454"/>
       </w:pPr>
       <w:r>
@@ -10529,7 +10459,7 @@
           <w:b w:val="0"/>
           <w:i w:val="0"/>
           <w:color w:val="23313F"/>
-          <w:sz w:val="19"/>
+          <w:sz w:val="17"/>
         </w:rPr>
         <w:t>Fielding, R., Nottingham, M., &amp; Reschke, J. (Eds.). (2022). HTTP semantics (RFC 9110). Internet Engineering Task Force. https://doi.org/10.17487/RFC9110</w:t>
       </w:r>
@@ -10537,7 +10467,7 @@
     <w:p>
       <w:pPr>
         <w:keepLines/>
-        <w:spacing w:after="100"/>
+        <w:spacing w:after="40"/>
         <w:ind w:left="454" w:hanging="454"/>
       </w:pPr>
       <w:r>
@@ -10546,7 +10476,7 @@
           <w:b w:val="0"/>
           <w:i w:val="0"/>
           <w:color w:val="23313F"/>
-          <w:sz w:val="19"/>
+          <w:sz w:val="17"/>
         </w:rPr>
         <w:t>Friedman, J. H. (2001). Greedy function approximation: A gradient boosting machine. The Annals of Statistics, 29(5), 1189–1232. https://doi.org/10.1214/aos/1013203451</w:t>
       </w:r>
@@ -10554,7 +10484,7 @@
     <w:p>
       <w:pPr>
         <w:keepLines/>
-        <w:spacing w:after="100"/>
+        <w:spacing w:after="40"/>
         <w:ind w:left="454" w:hanging="454"/>
       </w:pPr>
       <w:r>
@@ -10563,7 +10493,7 @@
           <w:b w:val="0"/>
           <w:i w:val="0"/>
           <w:color w:val="23313F"/>
-          <w:sz w:val="19"/>
+          <w:sz w:val="17"/>
         </w:rPr>
         <w:t>Mockapetris, P. (1987). Domain names—Implementation and specification (RFC 1035). Internet Engineering Task Force. https://doi.org/10.17487/RFC1035</w:t>
       </w:r>
@@ -10571,7 +10501,7 @@
     <w:p>
       <w:pPr>
         <w:keepLines/>
-        <w:spacing w:after="100"/>
+        <w:spacing w:after="40"/>
         <w:ind w:left="454" w:hanging="454"/>
       </w:pPr>
       <w:r>
@@ -10580,7 +10510,7 @@
           <w:b w:val="0"/>
           <w:i w:val="0"/>
           <w:color w:val="23313F"/>
-          <w:sz w:val="19"/>
+          <w:sz w:val="17"/>
         </w:rPr>
         <w:t>Pedregosa, F., Varoquaux, G., Gramfort, A., Michel, V., Thirion, B., Grisel, O., Blondel, M., Prettenhofer, P., Weiss, R., Dubourg, V., Vanderplas, J., Passos, A., Cournapeau, D., Brucher, M., Perrot, M., &amp; Duchesnay, É. (2011). Scikit-learn: Machine learning in Python. Journal of Machine Learning Research, 12, 2825–2830.</w:t>
       </w:r>
@@ -10588,7 +10518,7 @@
     <w:p>
       <w:pPr>
         <w:keepLines/>
-        <w:spacing w:after="100"/>
+        <w:spacing w:after="40"/>
         <w:ind w:left="454" w:hanging="454"/>
       </w:pPr>
       <w:r>
@@ -10597,7 +10527,7 @@
           <w:b w:val="0"/>
           <w:i w:val="0"/>
           <w:color w:val="23313F"/>
-          <w:sz w:val="19"/>
+          <w:sz w:val="17"/>
         </w:rPr>
         <w:t>PhiUSIIL Phishing URL Dataset. (n.d.). URL and label archive used for source-balanced model fitting. Dataset attribution and audit recorded in SafeWeb ML Experiment Report.</w:t>
       </w:r>
@@ -10605,7 +10535,7 @@
     <w:p>
       <w:pPr>
         <w:keepLines/>
-        <w:spacing w:after="100"/>
+        <w:spacing w:after="40"/>
         <w:ind w:left="454" w:hanging="454"/>
       </w:pPr>
       <w:r>
@@ -10614,7 +10544,7 @@
           <w:b w:val="0"/>
           <w:i w:val="0"/>
           <w:color w:val="23313F"/>
-          <w:sz w:val="19"/>
+          <w:sz w:val="17"/>
         </w:rPr>
         <w:t>SafeWeb. (2026). Tài liệu kỹ thuật, báo cáo thí nghiệm học máy, metrics.json, phishvn_domain_eval.json và mã nguồn [Tài liệu dự án và phần mềm].</w:t>
       </w:r>
@@ -10622,7 +10552,7 @@
     <w:p>
       <w:pPr>
         <w:keepLines/>
-        <w:spacing w:after="100"/>
+        <w:spacing w:after="40"/>
         <w:ind w:left="454" w:hanging="454"/>
       </w:pPr>
       <w:r>
@@ -10631,7 +10561,7 @@
           <w:b w:val="0"/>
           <w:i w:val="0"/>
           <w:color w:val="23313F"/>
-          <w:sz w:val="19"/>
+          <w:sz w:val="17"/>
         </w:rPr>
         <w:t>Thai Nguyen Vu. (2026). PhishVN: A time-stamped Vietnamese URL phishing dataset with impersonation-scenario labels and confidence tiers (Version 3.1.0) [Data set]. Mendeley Data. https://doi.org/10.17632/b97hxbxtpd.4</w:t>
       </w:r>

</xml_diff>

<commit_message>
Update SafeWeb interface and report
</commit_message>
<xml_diff>
--- a/Bao_cao_SafeWeb_KHKT_THPT.docx
+++ b/Bao_cao_SafeWeb_KHKT_THPT.docx
@@ -4,7 +4,7 @@
   <w:body>
     <w:p>
       <w:pPr>
-        <w:spacing w:line="264" w:lineRule="auto" w:before="0" w:after="80"/>
+        <w:spacing w:line="276" w:lineRule="auto" w:before="0" w:after="80"/>
         <w:jc w:val="center"/>
       </w:pPr>
       <w:r>
@@ -20,7 +20,7 @@
     </w:p>
     <w:p>
       <w:pPr>
-        <w:spacing w:line="264" w:lineRule="auto" w:before="0" w:after="80"/>
+        <w:spacing w:line="276" w:lineRule="auto" w:before="0" w:after="80"/>
         <w:jc w:val="center"/>
       </w:pPr>
       <w:r>
@@ -36,7 +36,7 @@
     </w:p>
     <w:p>
       <w:pPr>
-        <w:spacing w:line="264" w:lineRule="auto" w:before="0" w:after="480"/>
+        <w:spacing w:line="276" w:lineRule="auto" w:before="0" w:after="480"/>
         <w:jc w:val="center"/>
       </w:pPr>
       <w:r>
@@ -47,12 +47,12 @@
           <w:color w:val="0F766E"/>
           <w:sz w:val="28"/>
         </w:rPr>
-        <w:t>LĨNH VỰC: PHẦN MỀM HỆ THỐNG VÀ AN TOÀN THÔNG TIN</w:t>
+        <w:t>LĨNH VỰC: PHẦN MỀM HỆ THỐNG / TRÍ TUỆ NHÂN TẠO</w:t>
       </w:r>
     </w:p>
     <w:p>
       <w:pPr>
-        <w:spacing w:line="264" w:lineRule="auto" w:before="0" w:after="200"/>
+        <w:spacing w:line="276" w:lineRule="auto" w:before="0" w:after="200"/>
         <w:jc w:val="center"/>
       </w:pPr>
       <w:r>
@@ -63,12 +63,12 @@
           <w:color w:val="0F4C5C"/>
           <w:sz w:val="28"/>
         </w:rPr>
-        <w:t>SAFEWEB (PHIÊN BẢN 2.3.5)</w:t>
+        <w:t>SAFEWEB</w:t>
       </w:r>
     </w:p>
     <w:p>
       <w:pPr>
-        <w:spacing w:line="264" w:lineRule="auto" w:before="0" w:after="400"/>
+        <w:spacing w:line="276" w:lineRule="auto" w:before="0" w:after="400"/>
         <w:jc w:val="center"/>
       </w:pPr>
       <w:r>
@@ -84,7 +84,7 @@
     </w:p>
     <w:p>
       <w:pPr>
-        <w:spacing w:line="264" w:lineRule="auto" w:before="0" w:after="480"/>
+        <w:spacing w:line="276" w:lineRule="auto" w:before="0" w:after="480"/>
         <w:jc w:val="center"/>
       </w:pPr>
       <w:r>
@@ -100,23 +100,39 @@
     </w:p>
     <w:p>
       <w:pPr>
-        <w:spacing w:line="264" w:lineRule="auto" w:before="0" w:after="100"/>
+        <w:spacing w:line="276" w:lineRule="auto" w:before="0" w:after="160"/>
+        <w:jc w:val="center"/>
+      </w:pPr>
+      <w:r>
+        <w:rPr>
+          <w:rFonts w:ascii="Times New Roman" w:hAnsi="Times New Roman" w:eastAsia="Times New Roman"/>
+          <w:b/>
+          <w:i w:val="0"/>
+          <w:color w:val="0F766E"/>
+          <w:sz w:val="28"/>
+        </w:rPr>
+        <w:t>DỰ ÁN KỸ THUẬT · PHẦN MỀM HỆ THỐNG VÀ AN TOÀN THÔNG TIN</w:t>
+      </w:r>
+    </w:p>
+    <w:p>
+      <w:pPr>
+        <w:spacing w:line="276" w:lineRule="auto" w:before="0" w:after="160"/>
         <w:jc w:val="center"/>
       </w:pPr>
       <w:r>
         <w:rPr>
           <w:rFonts w:ascii="Times New Roman" w:hAnsi="Times New Roman" w:eastAsia="Times New Roman"/>
           <w:b w:val="0"/>
-          <w:i w:val="0"/>
+          <w:i/>
           <w:color w:val="000000"/>
           <w:sz w:val="28"/>
         </w:rPr>
-        <w:t>Dự án thiết kế và xây dựng phần mềm hỗ trợ nhận biết đường dẫn trang web có nguy cơ lừa đảo.</w:t>
+        <w:t>Bốn mô hình cùng xem xét dấu hiệu, như bốn giám khảo đọc chung một hồ sơ.</w:t>
       </w:r>
     </w:p>
     <w:p>
       <w:pPr>
-        <w:spacing w:line="264" w:lineRule="auto" w:before="0" w:after="1000"/>
+        <w:spacing w:line="276" w:lineRule="auto" w:before="3000" w:after="100"/>
         <w:jc w:val="center"/>
       </w:pPr>
       <w:r>
@@ -127,55 +143,39 @@
           <w:color w:val="000000"/>
           <w:sz w:val="28"/>
         </w:rPr>
-        <w:t>NĂM 2026</w:t>
+        <w:t>Người thực hiện 1 : Lê Văn Tuấn Anh</w:t>
       </w:r>
     </w:p>
     <w:p>
       <w:pPr>
-        <w:spacing w:line="264" w:lineRule="auto" w:before="900" w:after="100"/>
+        <w:spacing w:line="276" w:lineRule="auto" w:before="0" w:after="100"/>
         <w:jc w:val="center"/>
       </w:pPr>
       <w:r>
         <w:rPr>
           <w:rFonts w:ascii="Times New Roman" w:hAnsi="Times New Roman" w:eastAsia="Times New Roman"/>
-          <w:b w:val="0"/>
+          <w:b/>
           <w:i w:val="0"/>
           <w:color w:val="000000"/>
           <w:sz w:val="28"/>
         </w:rPr>
-        <w:t>Người thực hiện 1: Lê Văn Tuấn Anh</w:t>
+        <w:t>Người thực hiện 2 : Nguyễn Hoàng Bảo</w:t>
       </w:r>
     </w:p>
     <w:p>
       <w:pPr>
-        <w:spacing w:line="264" w:lineRule="auto" w:before="0" w:after="100"/>
+        <w:spacing w:line="276" w:lineRule="auto" w:before="0" w:after="120"/>
         <w:jc w:val="center"/>
       </w:pPr>
       <w:r>
         <w:rPr>
           <w:rFonts w:ascii="Times New Roman" w:hAnsi="Times New Roman" w:eastAsia="Times New Roman"/>
-          <w:b w:val="0"/>
+          <w:b/>
           <w:i w:val="0"/>
           <w:color w:val="000000"/>
           <w:sz w:val="28"/>
         </w:rPr>
-        <w:t>Người thực hiện 2: Nguyễn Hoàng Bảo</w:t>
-      </w:r>
-    </w:p>
-    <w:p>
-      <w:pPr>
-        <w:spacing w:line="264" w:lineRule="auto" w:before="0" w:after="120"/>
-        <w:jc w:val="center"/>
-      </w:pPr>
-      <w:r>
-        <w:rPr>
-          <w:rFonts w:ascii="Times New Roman" w:hAnsi="Times New Roman" w:eastAsia="Times New Roman"/>
-          <w:b w:val="0"/>
-          <w:i w:val="0"/>
-          <w:color w:val="000000"/>
-          <w:sz w:val="28"/>
-        </w:rPr>
-        <w:t>Người hướng dẫn: Trần Văn Toàn</w:t>
+        <w:t>Người hướng dẫn : Trần Văn Toàn</w:t>
       </w:r>
     </w:p>
     <w:p>
@@ -185,8 +185,8 @@
     </w:p>
     <w:p>
       <w:pPr>
-        <w:spacing w:line="264" w:lineRule="auto" w:before="0" w:after="120"/>
-        <w:jc w:val="left"/>
+        <w:spacing w:line="276" w:lineRule="auto" w:before="0" w:after="160"/>
+        <w:jc w:val="center"/>
       </w:pPr>
       <w:r>
         <w:rPr>
@@ -201,7 +201,7 @@
     </w:p>
     <w:p>
       <w:pPr>
-        <w:spacing w:line="264" w:lineRule="auto" w:after="120"/>
+        <w:spacing w:line="259" w:lineRule="auto"/>
       </w:pPr>
       <w:r>
         <w:rPr>
@@ -211,10 +211,46 @@
           <w:color w:val="000000"/>
           <w:sz w:val="28"/>
         </w:rPr>
-        <w:fldChar w:fldCharType="begin"/>
-        <w:instrText xml:space="preserve"> TOC \o "1-1" \h \z \u </w:instrText>
+        <w:fldChar w:fldCharType="begin" w:dirty="true"/>
+      </w:r>
+      <w:r>
+        <w:rPr>
+          <w:rFonts w:ascii="Times New Roman" w:hAnsi="Times New Roman" w:eastAsia="Times New Roman"/>
+          <w:b w:val="0"/>
+          <w:i w:val="0"/>
+          <w:color w:val="000000"/>
+          <w:sz w:val="28"/>
+        </w:rPr>
+        <w:instrText xml:space="preserve"> TOC \o "1-2" \h \z \u </w:instrText>
+      </w:r>
+      <w:r>
+        <w:rPr>
+          <w:rFonts w:ascii="Times New Roman" w:hAnsi="Times New Roman" w:eastAsia="Times New Roman"/>
+          <w:b w:val="0"/>
+          <w:i w:val="0"/>
+          <w:color w:val="000000"/>
+          <w:sz w:val="28"/>
+        </w:rPr>
         <w:fldChar w:fldCharType="separate"/>
-        <w:t>Mục lục tự cập nhật khi mở tài liệu bằng Word hoặc LibreOffice.</w:t>
+      </w:r>
+      <w:r>
+        <w:rPr>
+          <w:rFonts w:ascii="Times New Roman" w:hAnsi="Times New Roman" w:eastAsia="Times New Roman"/>
+          <w:b w:val="0"/>
+          <w:i w:val="0"/>
+          <w:color w:val="000000"/>
+          <w:sz w:val="28"/>
+        </w:rPr>
+        <w:t>Mục lục sẽ được cập nhật khi mở tài liệu bằng Word.</w:t>
+      </w:r>
+      <w:r>
+        <w:rPr>
+          <w:rFonts w:ascii="Times New Roman" w:hAnsi="Times New Roman" w:eastAsia="Times New Roman"/>
+          <w:b w:val="0"/>
+          <w:i w:val="0"/>
+          <w:color w:val="000000"/>
+          <w:sz w:val="28"/>
+        </w:rPr>
         <w:fldChar w:fldCharType="end"/>
       </w:r>
     </w:p>
@@ -238,7 +274,7 @@
     </w:p>
     <w:p>
       <w:pPr>
-        <w:spacing w:line="264" w:lineRule="auto" w:before="0" w:after="120"/>
+        <w:spacing w:line="276" w:lineRule="auto" w:before="0" w:after="120"/>
         <w:jc w:val="both"/>
       </w:pPr>
       <w:r>
@@ -249,12 +285,12 @@
           <w:color w:val="000000"/>
           <w:sz w:val="28"/>
         </w:rPr>
-        <w:t>SafeWeb giúp người dùng xem xét đường dẫn trang web trước khi mở, giống như kiểm tra địa chỉ và biển hiệu trước khi bước vào một cửa hàng lạ. Hệ thống đo 55 dấu hiệu trong đường dẫn, đối chiếu với kho 36.261 địa chỉ đã ghi nhận và tham khảo bốn mô hình học máy. Phân tích thông thường diễn ra ngay trên thiết bị; kiểm tra tên miền, chuyển hướng và ảnh xem trước chỉ được thực hiện khi người dùng cho phép.</w:t>
+        <w:t>SafeWeb là phần mềm giúp người dùng phát hiện sớm các đường dẫn trang web lừa đảo và phòng tránh lộ lọt dữ liệu cá nhân. Thay vì phải mạo hiểm bấm vào đường dẫn lạ, phần mềm sẽ tự động khám xét địa chỉ trang web đó ngay trên máy của người dùng thông qua Kho dữ liệu tra cứu nhanh, 55 dấu hiệu nhận biết chữ viết và hội đồng gồm 4 mô hình Trí tuệ nhân tạo: Rừng Ngẫu Nhiên, Tăng Cường Độ Dốc, Máy Véc-tơ Hỗ Trợ và Hồi Quy Logic. Các tính năng kiểm tra tên miền, dò tìm chuyển hướng và chụp ảnh xem trước trang web chỉ hoạt động khi người dùng đồng ý cho phép.</w:t>
       </w:r>
     </w:p>
     <w:p>
       <w:pPr>
-        <w:spacing w:line="264" w:lineRule="auto" w:before="0" w:after="120"/>
+        <w:spacing w:line="276" w:lineRule="auto" w:before="0" w:after="120"/>
         <w:jc w:val="both"/>
       </w:pPr>
       <w:r>
@@ -265,12 +301,12 @@
           <w:color w:val="000000"/>
           <w:sz w:val="28"/>
         </w:rPr>
-        <w:t>Bốn mô hình được huấn luyện trên 261.299 mẫu và đánh giá bằng 6.624 địa chỉ chưa dùng khi huấn luyện. Trong phép thử này, mô hình Tăng Cường Độ Dốc phát hiện 2.676 trên 2.799 địa chỉ lừa đảo, tương đương 95,61%. Hệ thống vượt qua 59 bài kiểm tra Python, 16 bài kiểm tra trình duyệt và 16 trường hợp đối chiếu giữa hai cách tính.</w:t>
+        <w:t>Để dạy cho máy tính thông minh, nhóm sử dụng tổng cộng 261.299 địa chỉ trang web đã làm sạch (gồm 114.113 trang lừa đảo và 147.186 trang an toàn). Khi đem thi thử trên 6.624 địa chỉ trang web hoàn toàn mới chưa từng gặp trong lúc học, mô hình Tăng Cường Độ Dốc bắt trúng tới 95,61% trang web lừa đảo (phát hiện đúng 2.676 trên 2.799 trang lừa đảo), và mô hình Rừng Ngẫu Nhiên bắt trúng 92,32%. Phần mềm đã vượt qua 100% các bài kiểm tra chất lượng gồm 59 bài kiểm tra xử lý dữ liệu và 15 bài kiểm tra trình duyệt, giúp người dùng nhận biết rủi ro trực quan trước khi bấm vào đường dẫn.</w:t>
       </w:r>
     </w:p>
     <w:p>
       <w:pPr>
-        <w:spacing w:line="264" w:lineRule="auto" w:before="0" w:after="120"/>
+        <w:spacing w:line="276" w:lineRule="auto" w:before="0" w:after="120"/>
         <w:jc w:val="both"/>
       </w:pPr>
       <w:r>
@@ -285,6 +321,11 @@
       </w:r>
     </w:p>
     <w:p>
+      <w:r>
+        <w:br w:type="page"/>
+      </w:r>
+    </w:p>
+    <w:p>
       <w:pPr>
         <w:pStyle w:val="Heading1"/>
         <w:keepNext/>
@@ -322,7 +363,7 @@
     </w:p>
     <w:p>
       <w:pPr>
-        <w:spacing w:line="264" w:lineRule="auto" w:before="0" w:after="120"/>
+        <w:spacing w:line="276" w:lineRule="auto" w:before="0" w:after="120"/>
         <w:jc w:val="both"/>
       </w:pPr>
       <w:r>
@@ -338,7 +379,7 @@
     </w:p>
     <w:p>
       <w:pPr>
-        <w:spacing w:line="264" w:lineRule="auto" w:before="0" w:after="120"/>
+        <w:spacing w:line="276" w:lineRule="auto" w:before="0" w:after="120"/>
         <w:jc w:val="both"/>
       </w:pPr>
       <w:r>
@@ -372,7 +413,7 @@
     </w:p>
     <w:p>
       <w:pPr>
-        <w:spacing w:line="264" w:lineRule="auto" w:before="0" w:after="120"/>
+        <w:spacing w:line="276" w:lineRule="auto" w:before="0" w:after="120"/>
         <w:jc w:val="both"/>
       </w:pPr>
       <w:r>
@@ -383,7 +424,7 @@
           <w:color w:val="000000"/>
           <w:sz w:val="28"/>
         </w:rPr>
-        <w:t>Nhu cầu là có một công cụ tự hoàn thiện địa chỉ bị thiếu, tra cứu hồ sơ đã ghi nhận, chấm mức rủi ro và giải thích dấu hiệu bất thường. Việc tra cứu trực tuyến chỉ bắt đầu khi người dùng cho phép. Câu hỏi nghiên cứu là: Khi đưa 55 dấu hiệu và bốn mô hình vào trình duyệt, kết quả có khớp với phép tính trên máy huấn luyện hay không?</w:t>
+        <w:t>Nhu cầu thực tế đặt ra là chế tạo một công cụ tự động điền hoàn chỉnh địa chỉ trang web khi người dùng gõ thiếu, đối chiếu nhanh với kho dữ liệu có sẵn, chấm điểm nguy cơ bằng Trí tuệ nhân tạo, chỉ rõ lý do cảnh báo và chỉ kết nối mạng bên ngoài khi người dùng cho phép. Câu hỏi đặt ra là: Khi đóng gói toàn bộ 55 dấu hiệu đo đạc và 4 mô hình Trí tuệ nhân tạo vào thẳng trình duyệt web, kết quả tính toán trên máy người dùng có khớp tuyệt đối với máy tính huấn luyện trong phòng thí nghiệm hay không?</w:t>
       </w:r>
     </w:p>
     <w:p>
@@ -406,7 +447,7 @@
     </w:p>
     <w:p>
       <w:pPr>
-        <w:spacing w:line="264" w:lineRule="auto" w:before="0" w:after="100"/>
+        <w:spacing w:line="276" w:lineRule="auto" w:before="0" w:after="100"/>
         <w:ind w:left="340"/>
         <w:jc w:val="both"/>
       </w:pPr>
@@ -428,12 +469,12 @@
           <w:color w:val="000000"/>
           <w:sz w:val="28"/>
         </w:rPr>
-        <w:t>Xây dựng SafeWeb để người dùng xem xét đường dẫn trước khi mở, hiểu vì sao hệ thống cảnh báo và chủ động tránh nhập mật khẩu hoặc thông tin thanh toán vào trang đáng ngờ.</w:t>
+        <w:t>Xây dựng hoàn chỉnh phần mềm SafeWeb giúp người dùng kiểm tra nhanh một địa chỉ trang web là an toàn hay có nguy cơ lừa đảo ngay trên trình duyệt web, giải thích rõ vị trí bất thường bằng tiếng Việt dễ hiểu để người dùng chủ động phòng tránh trước khi bấm vào đường dẫn.</w:t>
       </w:r>
     </w:p>
     <w:p>
       <w:pPr>
-        <w:spacing w:line="264" w:lineRule="auto" w:before="0" w:after="100"/>
+        <w:spacing w:line="276" w:lineRule="auto" w:before="0" w:after="100"/>
         <w:ind w:left="340"/>
         <w:jc w:val="both"/>
       </w:pPr>
@@ -455,7 +496,7 @@
           <w:color w:val="000000"/>
           <w:sz w:val="28"/>
         </w:rPr>
-        <w:t>Hệ thống đo 55 dấu hiệu, trình bày ý kiến của bốn mô hình và tra cứu 36.261 địa chỉ; được đánh giá trên 6.624 địa chỉ có tên miền tách biệt với dữ liệu huấn luyện; mặc định phân tích ngay trên thiết bị; dùng màu Xanh, Vàng, Cam và Đỏ kèm lời giải thích.</w:t>
+        <w:t>Hệ thống phải đo đạc đồng thời 55 dấu hiệu nhận biết của đường dẫn kết hợp cùng lúc 4 mô hình Trí tuệ nhân tạo và kho dữ liệu 36.261 địa chỉ; bài kiểm tra đánh giá phải thực hiện trên các tên miền mới hoàn toàn không trùng với lúc học; chạy mặc định ngay trên máy người dùng không cần gửi đường dẫn đi nơi khác; và giao diện tự động đổi màu trực quan (Xanh - Vàng - Đỏ) kèm lời giải thích rõ ràng.</w:t>
       </w:r>
     </w:p>
     <w:p>
@@ -478,7 +519,7 @@
     </w:p>
     <w:p>
       <w:pPr>
-        <w:spacing w:line="264" w:lineRule="auto" w:before="0" w:after="120"/>
+        <w:spacing w:line="276" w:lineRule="auto" w:before="0" w:after="120"/>
         <w:jc w:val="both"/>
       </w:pPr>
       <w:r>
@@ -512,7 +553,7 @@
     </w:p>
     <w:p>
       <w:pPr>
-        <w:spacing w:line="264" w:lineRule="auto" w:before="0" w:after="120"/>
+        <w:spacing w:line="276" w:lineRule="auto" w:before="0" w:after="120"/>
         <w:jc w:val="both"/>
       </w:pPr>
       <w:r>
@@ -564,7 +605,7 @@
     </w:p>
     <w:p>
       <w:pPr>
-        <w:spacing w:line="264" w:lineRule="auto" w:before="0" w:after="120"/>
+        <w:spacing w:line="276" w:lineRule="auto" w:before="0" w:after="120"/>
         <w:jc w:val="both"/>
       </w:pPr>
       <w:r>
@@ -575,12 +616,12 @@
           <w:color w:val="000000"/>
           <w:sz w:val="28"/>
         </w:rPr>
-        <w:t>Thay vì chỉ dùng một thuật toán đơn lẻ dễ có điểm mù, SafeWeb kết hợp cùng lúc 4 mô hình Học máy (dạy máy tính tự học quy luật từ hàng trăm nghìn trang web mẫu). Có thể hình dung 4 mô hình này giống như 4 vị giám khảo có phương pháp làm việc khác nhau:</w:t>
+        <w:t>Thay vì chỉ nghe một ý kiến, SafeWeb dùng bốn mô hình học máy, tức là bốn cách để máy tính học dấu hiệu từ các trang web mẫu. Có thể hình dung chúng như bốn vị giám khảo cùng xem một hồ sơ nhưng mỗi người để ý một kiểu dấu hiệu khác nhau:</w:t>
       </w:r>
     </w:p>
     <w:p>
       <w:pPr>
-        <w:spacing w:line="264" w:lineRule="auto" w:before="0" w:after="100"/>
+        <w:spacing w:line="276" w:lineRule="auto" w:before="0" w:after="100"/>
         <w:ind w:left="340"/>
         <w:jc w:val="both"/>
       </w:pPr>
@@ -602,12 +643,12 @@
           <w:color w:val="000000"/>
           <w:sz w:val="28"/>
         </w:rPr>
-        <w:t>Tạo ra một hội đồng gồm 100 cây câu hỏi kiểm tra độc lập (mỗi cây hỏi tối đa 16 bước về độ dài, dấu chấm, dấu gạch ngang, từ khóa...). Giống như 100 người bảo vệ cùng khám xét một địa chỉ web rồi lấy kết quả trung bình chung, giúp phán đoán rất vững vàng và cân bằng.</w:t>
+        <w:t>Tạo ra 100 cây câu hỏi nhỏ. Mỗi cây lần lượt hỏi về độ dài, dấu chấm, dấu gạch ngang hay từ khóa. Có thể hình dung 100 giám khảo độc lập bỏ phiếu; kết quả chung dựa trên tiếng nói của cả nhóm, nên một dấu hiệu lạ đơn lẻ khó quyết định toàn bộ kết luận.</w:t>
       </w:r>
     </w:p>
     <w:p>
       <w:pPr>
-        <w:spacing w:line="264" w:lineRule="auto" w:before="0" w:after="100"/>
+        <w:spacing w:line="276" w:lineRule="auto" w:before="0" w:after="100"/>
         <w:ind w:left="340"/>
         <w:jc w:val="both"/>
       </w:pPr>
@@ -629,12 +670,12 @@
           <w:color w:val="000000"/>
           <w:sz w:val="28"/>
         </w:rPr>
-        <w:t>Cũng dùng 100 cây kiểm tra nhỏ (mỗi cây 3 bước hỏi) nhưng làm việc nối tiếp nhau theo kiểu 'người đi sau sửa sai cho người đi trước'. Những trang web lừa đảo tinh vi bị vòng trước đoán nhầm sẽ được vòng sau tập trung soi kỹ hơn để rút kinh nghiệm, nhờ đó đạt tỷ lệ bắt trúng trang lừa đảo cao nhất (95,61%).</w:t>
+        <w:t>Dùng nhiều cây hỏi nối tiếp nhau theo kiểu người sau xem lại chỗ người trước còn nhầm. Trong phép thử của dự án, mô hình này phát hiện 2.676 trên 2.799 trang lừa đảo, tương ứng 95,61%; con số này chỉ mô tả bộ thử đã dùng, không bảo đảm kết quả tương tự trên mọi trang ngoài đời.</w:t>
       </w:r>
     </w:p>
     <w:p>
       <w:pPr>
-        <w:spacing w:line="264" w:lineRule="auto" w:before="0" w:after="100"/>
+        <w:spacing w:line="276" w:lineRule="auto" w:before="0" w:after="100"/>
         <w:ind w:left="340"/>
         <w:jc w:val="both"/>
       </w:pPr>
@@ -656,12 +697,12 @@
           <w:color w:val="000000"/>
           <w:sz w:val="28"/>
         </w:rPr>
-        <w:t>Tưởng tượng xếp trang an toàn về một bên phòng, trang lừa đảo về bên kia rồi kẻ một vạch chia. Trong phép thử hiện tại, mô hình chỉ báo động 20 địa chỉ và cả 20 đều là lừa đảo, nhưng bỏ sót 2.779 địa chỉ lừa đảo khác; vì vậy không nên dùng riêng mô hình này để kết luận.</w:t>
+        <w:t>Tưởng tượng xếp hồ sơ an toàn về một phía, hồ sơ lừa đảo về phía còn lại rồi tìm đường ranh ngăn cách hai nhóm. Trong bộ thử, mô hình báo lừa đảo đúng 20 lần và không báo nhầm lần nào; nhưng nó bỏ sót 2.779 trong 2.799 trang lừa đảo. Vì vậy không nên dùng riêng mô hình này để bảo vệ người dùng.</w:t>
       </w:r>
     </w:p>
     <w:p>
       <w:pPr>
-        <w:spacing w:line="264" w:lineRule="auto" w:before="0" w:after="100"/>
+        <w:spacing w:line="276" w:lineRule="auto" w:before="0" w:after="100"/>
         <w:ind w:left="340"/>
         <w:jc w:val="both"/>
       </w:pPr>
@@ -683,7 +724,7 @@
           <w:color w:val="000000"/>
           <w:sz w:val="28"/>
         </w:rPr>
-        <w:t>Hoạt động giống như một bảng cộng trừ điểm trực tiếp. Mỗi dấu hiệu xấu trên đường dẫn sẽ bị cộng thêm điểm rủi ro, dấu hiệu tốt được trừ điểm, đóng vai trò làm thước đo chuẩn cơ bản nhanh gọn để đối chiếu với 3 mô hình trên.</w:t>
+        <w:t>Giống như một bảng cân có nhiều quả cân: mỗi đặc điểm làm thay đổi điểm nghiêng về một phía. Cách tính gọn và nhanh, giúp nhóm có thêm một ý kiến khác để so sánh với ba vị giám khảo còn lại.</w:t>
       </w:r>
     </w:p>
     <w:p>
@@ -706,7 +747,7 @@
     </w:p>
     <w:p>
       <w:pPr>
-        <w:spacing w:line="264" w:lineRule="auto" w:before="0" w:after="120"/>
+        <w:spacing w:line="276" w:lineRule="auto" w:before="0" w:after="120"/>
         <w:jc w:val="both"/>
       </w:pPr>
       <w:r>
@@ -722,7 +763,7 @@
     </w:p>
     <w:p>
       <w:pPr>
-        <w:spacing w:line="264" w:lineRule="auto" w:before="0" w:after="100"/>
+        <w:spacing w:line="276" w:lineRule="auto" w:before="0" w:after="100"/>
         <w:ind w:left="340"/>
         <w:jc w:val="both"/>
       </w:pPr>
@@ -749,7 +790,7 @@
     </w:p>
     <w:p>
       <w:pPr>
-        <w:spacing w:line="264" w:lineRule="auto" w:before="0" w:after="100"/>
+        <w:spacing w:line="276" w:lineRule="auto" w:before="0" w:after="100"/>
         <w:ind w:left="340"/>
         <w:jc w:val="both"/>
       </w:pPr>
@@ -776,7 +817,7 @@
     </w:p>
     <w:p>
       <w:pPr>
-        <w:spacing w:line="264" w:lineRule="auto" w:before="0" w:after="100"/>
+        <w:spacing w:line="276" w:lineRule="auto" w:before="0" w:after="100"/>
         <w:ind w:left="340"/>
         <w:jc w:val="both"/>
       </w:pPr>
@@ -788,7 +829,7 @@
           <w:color w:val="000000"/>
           <w:sz w:val="28"/>
         </w:rPr>
-        <w:t xml:space="preserve">• Bước 3 — Cộng điểm dấu hiệu trực tiếp và chỉ rõ bất thường ở đâu: </w:t>
+        <w:t xml:space="preserve">• Bước 3 — Cộng điểm các dấu hiệu nhìn thấy được: </w:t>
       </w:r>
       <w:r>
         <w:rPr>
@@ -798,12 +839,12 @@
           <w:color w:val="000000"/>
           <w:sz w:val="28"/>
         </w:rPr>
-        <w:t>Giao diện cộng thêm điểm phạt trực tiếp nếu phát hiện các bất thường cụ thể: địa chỉ dài từ 120 ký tự trở lên (+18 điểm); có từ 3 tên miền phụ trở lên (+16 điểm); dùng địa chỉ số IP (+18 điểm); có ký tự @ (+12 điểm); có từ 8 ký tự đặc biệt trở lên (+10 điểm); có ký hiệu % (+8 điểm); độ lộn xộn chữ cái từ 4,5 trở lên (+10 điểm); mỗi từ khóa nhạy cảm xuất hiện (+8 điểm). Điểm tổng hợp trên thanh đo (từ 0 đến 100) được tính bằng 60% điểm nghi ngờ AI cộng với điểm dấu hiệu trực tiếp.</w:t>
+        <w:t>Hệ thống cộng điểm riêng khi thấy địa chỉ quá dài, nhiều tầng tên phụ, dùng dãy số thay tên, có dấu @, nhiều ký tự lạ, có dấu mã hóa hoặc từ khóa nhạy cảm. Điểm này như các thẻ ghi chú để giải thích vì sao cần cẩn thận; nó làm thay đổi thanh điểm tổng hợp nhưng không tự đổi mức màu.</w:t>
       </w:r>
     </w:p>
     <w:p>
       <w:pPr>
-        <w:spacing w:line="264" w:lineRule="auto" w:before="0" w:after="100"/>
+        <w:spacing w:line="276" w:lineRule="auto" w:before="0" w:after="100"/>
         <w:ind w:left="340"/>
         <w:jc w:val="both"/>
       </w:pPr>
@@ -815,7 +856,7 @@
           <w:color w:val="000000"/>
           <w:sz w:val="28"/>
         </w:rPr>
-        <w:t xml:space="preserve">• Bước 4 — Quy đổi mức cảnh báo và đổi màu toàn trang web: </w:t>
+        <w:t xml:space="preserve">• Bước 4 — Xếp mức rủi ro và đổi màu: </w:t>
       </w:r>
       <w:r>
         <w:rPr>
@@ -825,7 +866,7 @@
           <w:color w:val="000000"/>
           <w:sz w:val="28"/>
         </w:rPr>
-        <w:t>Nếu mức nghi ngờ chung dưới 25% -&gt; Mức Rủi Ro Thấp (Đổi giao diện màu Xanh lá); từ 25% đến dưới 50% -&gt; Mức Cần Thận Trọng (Màu Vàng); từ 50% đến dưới 75% -&gt; Mức Nguy Cơ Cao (Màu Cam/Đỏ); từ 75% trở lên hoặc khớp danh sách đen -&gt; Mức Nguy Cơ Rất Cao (Báo động Đỏ rực kèm danh sách giải thích rõ đường dẫn bất thường ở vị trí nào).</w:t>
+        <w:t>Mức xác suất dưới 25% là rủi ro thấp (Xanh); từ 25% đến dưới 50% là cần thận trọng (Vàng); từ 50% đến dưới 75% là nguy cơ cao (Cam); từ 75% trở lên là nguy cơ rất cao (Đỏ). Nếu kho dữ liệu có hồ sơ khớp, kết quả hồ sơ được ưu tiên. Cách xếp này giống bốn vạch trên nhiệt kế: càng vượt vạch cao thì màu cảnh báo càng mạnh.</w:t>
       </w:r>
     </w:p>
     <w:p>
@@ -848,7 +889,7 @@
     </w:p>
     <w:p>
       <w:pPr>
-        <w:spacing w:line="264" w:lineRule="auto" w:before="0" w:after="120"/>
+        <w:spacing w:line="276" w:lineRule="auto" w:before="0" w:after="120"/>
         <w:jc w:val="both"/>
       </w:pPr>
       <w:r>
@@ -900,7 +941,7 @@
     </w:p>
     <w:p>
       <w:pPr>
-        <w:spacing w:line="264" w:lineRule="auto" w:before="0" w:after="100"/>
+        <w:spacing w:line="276" w:lineRule="auto" w:before="0" w:after="100"/>
         <w:ind w:left="340"/>
         <w:jc w:val="both"/>
       </w:pPr>
@@ -912,7 +953,7 @@
           <w:color w:val="000000"/>
           <w:sz w:val="28"/>
         </w:rPr>
-        <w:t xml:space="preserve">• 1. Ngôn ngữ lập trình Python và bộ công cụ Học máy (pandas, NumPy, scikit-learn, joblib): </w:t>
+        <w:t xml:space="preserve">• 1. Python, pandas và scikit-learn: </w:t>
       </w:r>
       <w:r>
         <w:rPr>
@@ -922,12 +963,12 @@
           <w:color w:val="000000"/>
           <w:sz w:val="28"/>
         </w:rPr>
-        <w:t>Dùng để đọc dữ liệu, đo đếm 55 dấu hiệu và huấn luyện 4 mô hình Trí tuệ nhân tạo. Lý do chọn là vì bộ công cụ này tính toán chuẩn xác, xử lý nhanh hàng trăm nghìn dòng dữ liệu và cho phép trích xuất toàn bộ thông số đã học ra tệp dữ liệu gọn nhẹ.</w:t>
+        <w:t>Python là ngôn ngữ dùng để viết phần xử lý; pandas giống như bảng tính lớn để đọc, lọc và đếm các dòng dữ liệu; scikit-learn cung cấp sẵn các cách huấn luyện bốn mô hình. Nhóm chọn chúng vì có thể xử lý hàng trăm nghìn địa chỉ và lặp lại phép thử theo cùng một quy trình.</w:t>
       </w:r>
     </w:p>
     <w:p>
       <w:pPr>
-        <w:spacing w:line="264" w:lineRule="auto" w:before="0" w:after="100"/>
+        <w:spacing w:line="276" w:lineRule="auto" w:before="0" w:after="100"/>
         <w:ind w:left="340"/>
         <w:jc w:val="both"/>
       </w:pPr>
@@ -939,7 +980,7 @@
           <w:color w:val="000000"/>
           <w:sz w:val="28"/>
         </w:rPr>
-        <w:t xml:space="preserve">• 2. Bộ công cụ giao diện Web (HTML, CSS, JavaScript) và máy chủ thử nghiệm (Flask): </w:t>
+        <w:t xml:space="preserve">• 2. HTML, CSS, JavaScript và Flask: </w:t>
       </w:r>
       <w:r>
         <w:rPr>
@@ -949,7 +990,7 @@
           <w:color w:val="000000"/>
           <w:sz w:val="28"/>
         </w:rPr>
-        <w:t>Dùng để xây dựng trang web SafeWeb với ô nhập địa chỉ, bảng đồng thuận 4 mô hình, kho dữ liệu tra cứu và hiệu ứng đổi màu toàn trang. Nhờ viết bộ máy suy luận bằng JavaScript (browser-model.js), người dùng mở trang web trên máy tính hay điện thoại là dùng được ngay trên GitHub Pages mà không cần cài đặt phần mềm.</w:t>
+        <w:t>HTML dựng khung trang như khung nhà; CSS tô màu và sắp xếp đồ đạc; JavaScript làm các nút và phép tính hoạt động; Flask là máy chủ phục vụ bản thử nghiệm. Khi đưa lên GitHub Pages, các tệp tĩnh và bộ tính toán JavaScript chạy ngay trong trình duyệt, không cần cài ứng dụng.</w:t>
       </w:r>
     </w:p>
     <w:p>
@@ -972,7 +1013,7 @@
     </w:p>
     <w:p>
       <w:pPr>
-        <w:spacing w:line="264" w:lineRule="auto" w:before="0" w:after="120"/>
+        <w:spacing w:line="276" w:lineRule="auto" w:before="0" w:after="120"/>
         <w:jc w:val="both"/>
       </w:pPr>
       <w:r>
@@ -983,12 +1024,12 @@
           <w:color w:val="000000"/>
           <w:sz w:val="28"/>
         </w:rPr>
-        <w:t>Để dạy cho máy tính phân biệt chính xác trang web thật và trang web giả, nhóm đã chuẩn bị và làm sạch một khối lượng dữ liệu thực tế lớn đưa vào hệ thống (quy ước thống nhất: nhãn 1 là trang lừa đảo, nhãn 0 là trang an toàn):</w:t>
+        <w:t>Nhóm chuẩn bị ba phần dữ liệu: mẫu để máy học, mẫu để thi thử và kho để tra cứu nhanh. Có thể hình dung đây lần lượt là bài học, đề kiểm tra để riêng và cuốn sổ tra cứu. Trong dữ liệu, số 1 chỉ trang lừa đảo, số 0 chỉ trang hợp lệ.</w:t>
       </w:r>
     </w:p>
     <w:p>
       <w:pPr>
-        <w:spacing w:line="264" w:lineRule="auto" w:before="0" w:after="100"/>
+        <w:spacing w:line="276" w:lineRule="auto" w:before="0" w:after="100"/>
         <w:ind w:left="340"/>
         <w:jc w:val="both"/>
       </w:pPr>
@@ -1010,12 +1051,12 @@
           <w:color w:val="000000"/>
           <w:sz w:val="28"/>
         </w:rPr>
-        <w:t>Kho gồm 36.261 địa chỉ riêng biệt: 19.909 địa chỉ lừa đảo và 16.352 địa chỉ hợp lệ. Có thể hình dung đây là cuốn sổ tra cứu những địa chỉ đã được ghi nhận; trùng khớp với một hồ sơ không có nghĩa mọi địa chỉ mới đều đã được kiểm tra.</w:t>
+        <w:t>Sau khi gộp các địa chỉ trùng nhau, kho tra cứu giữ 36.261 địa chỉ: 19.909 trang lừa đảo và 16.352 trang hợp lệ. Đây giống như cuốn sổ ghi những trường hợp đã biết; nếu địa chỉ mới trùng hồ sơ thì hệ thống có thể nhận ra ngay.</w:t>
       </w:r>
     </w:p>
     <w:p>
       <w:pPr>
-        <w:spacing w:line="264" w:lineRule="auto" w:before="0" w:after="100"/>
+        <w:spacing w:line="276" w:lineRule="auto" w:before="0" w:after="100"/>
         <w:ind w:left="340"/>
         <w:jc w:val="both"/>
       </w:pPr>
@@ -1037,12 +1078,12 @@
           <w:color w:val="000000"/>
           <w:sz w:val="28"/>
         </w:rPr>
-        <w:t>Bốn mô hình được dạy bằng tổng cộng 261.299 địa chỉ: 114.113 trang lừa đảo và 147.186 trang hợp lệ. Mỗi địa chỉ được quy về hai nhãn này để máy học phân biệt các dấu hiệu thường gặp. Tên và xuất xứ từng bộ dữ liệu được ghi ở phần tài liệu tham khảo, không lặp lại trong mô tả quy trình.</w:t>
+        <w:t>Tổng cộng có 261.299 địa chỉ dùng để huấn luyện bốn mô hình, gồm 114.113 trang lừa đảo và 147.186 trang hợp lệ. Đây là phần bài học; các địa chỉ dành cho thi thử được để riêng để đánh giá công bằng.</w:t>
       </w:r>
     </w:p>
     <w:p>
       <w:pPr>
-        <w:spacing w:line="264" w:lineRule="auto" w:before="0" w:after="100"/>
+        <w:spacing w:line="276" w:lineRule="auto" w:before="0" w:after="100"/>
         <w:ind w:left="340"/>
         <w:jc w:val="both"/>
       </w:pPr>
@@ -1064,7 +1105,7 @@
           <w:color w:val="000000"/>
           <w:sz w:val="28"/>
         </w:rPr>
-        <w:t>Gồm 6.624 địa chỉ chưa dùng khi huấn luyện: 2.799 trang lừa đảo và 3.825 trang hợp lệ. Tên miền trong phần kiểm thử không trùng với tên miền dùng để dạy máy, giúp phép thử bớt thiên lệch do máy đã gặp sẵn những địa chỉ đó.</w:t>
+        <w:t>Gồm 6.624 địa chỉ được để riêng, không dùng lúc huấn luyện: 2.799 trang lừa đảo và 3.825 trang hợp lệ. Tên miền của chúng không trùng phần dữ liệu học, nên phép thử gần với việc gặp một trang mới hơn là gặp lại bài cũ.</w:t>
       </w:r>
     </w:p>
     <w:p>
@@ -1087,7 +1128,7 @@
     </w:p>
     <w:p>
       <w:pPr>
-        <w:spacing w:line="264" w:lineRule="auto" w:before="0" w:after="120"/>
+        <w:spacing w:line="276" w:lineRule="auto" w:before="0" w:after="120"/>
         <w:jc w:val="both"/>
       </w:pPr>
       <w:r>
@@ -1098,12 +1139,12 @@
           <w:color w:val="000000"/>
           <w:sz w:val="28"/>
         </w:rPr>
-        <w:t>Mỗi địa chỉ được đo thành 55 con số theo cùng một thứ tự. Có thể hình dung đây là 55 câu hỏi kiểm tra giống nhau cho mọi địa chỉ, chia thành sáu nhóm sau:</w:t>
+        <w:t>Mỗi địa chỉ trang web đưa vào SafeWeb đều được khám xét qua đúng 55 biến số đo đạc theo thứ tự cố định. Ý nghĩa của 55 biến số này được giải thích đơn giản theo 6 nhóm sau:</w:t>
       </w:r>
     </w:p>
     <w:p>
       <w:pPr>
-        <w:spacing w:line="264" w:lineRule="auto" w:before="0" w:after="100"/>
+        <w:spacing w:line="276" w:lineRule="auto" w:before="0" w:after="100"/>
         <w:ind w:left="340"/>
         <w:jc w:val="both"/>
       </w:pPr>
@@ -1125,12 +1166,12 @@
           <w:color w:val="000000"/>
           <w:sz w:val="28"/>
         </w:rPr>
-        <w:t>Đếm độ dài cả địa chỉ, tên miền, phần đường dẫn và phần thông số; đồng thời đếm dấu chấm, gạch chéo, gạch ngang, gạch dưới, chữ số và chữ cái. Giống như đếm độ dài một địa chỉ nhà và số ký hiệu lạ trên biển hiệu.</w:t>
+        <w:t>Gồm url_length (tổng độ dài địa chỉ), domain_length (độ dài tên trang web), path_length (độ dài đường dẫn sau tên miền), query_length (độ dài tham số), num_dots (số dấu chấm), num_slashes (số dấu gạch chéo), num_hyphens (số dấu gạch ngang), num_underscores (số dấu gạch dưới), num_digits (số chữ số), num_letters (số chữ cái). Diễn giải: Trang thật thường ngắn gọn, trong khi trang lừa đảo thường ghép thêm nhiều chữ, số và dấu gạch ngang dài lê thê.</w:t>
       </w:r>
     </w:p>
     <w:p>
       <w:pPr>
-        <w:spacing w:line="264" w:lineRule="auto" w:before="0" w:after="100"/>
+        <w:spacing w:line="276" w:lineRule="auto" w:before="0" w:after="100"/>
         <w:ind w:left="340"/>
         <w:jc w:val="both"/>
       </w:pPr>
@@ -1152,12 +1193,12 @@
           <w:color w:val="000000"/>
           <w:sz w:val="28"/>
         </w:rPr>
-        <w:t>Đếm ký tự lạ, kiểm tra có kết nối HTTPS hay không, có dùng dãy số thay tên miền, có nhiều tầng tên phụ, có dấu @, ?, =, %, hai dấu gạch chéo hoặc phần thông số hay không. Đây là các dấu hiệu giúp phát hiện cách viết địa chỉ dễ gây nhầm lẫn.</w:t>
+        <w:t>Gồm num_special_chars (số ký tự đặc biệt), has_https (có chữ https không), has_ip (có dùng dãy số máy chủ thay tên chữ không), num_subdomains (số tầng tên miền phụ), has_at (có dấu @ đánh lừa mắt nhìn không), has_question_mark (dấu ?), has_equals (dấu =), has_percent (dấu %), has_double_slash (dấu // bất thường), has_query (có chuỗi truy vấn không). Diễn giải: Giúp phát hiện ngay các kiểu ngụy trang cấu trúc địa chỉ.</w:t>
       </w:r>
     </w:p>
     <w:p>
       <w:pPr>
-        <w:spacing w:line="264" w:lineRule="auto" w:before="0" w:after="100"/>
+        <w:spacing w:line="276" w:lineRule="auto" w:before="0" w:after="100"/>
         <w:ind w:left="340"/>
         <w:jc w:val="both"/>
       </w:pPr>
@@ -1179,12 +1220,12 @@
           <w:color w:val="000000"/>
           <w:sz w:val="28"/>
         </w:rPr>
-        <w:t>Đo mức đa dạng, khó đoán của ký tự trong địa chỉ và tên miền. Có thể hình dung như so sánh một cái tên đọc được với một chuỗi ký tự gõ ngẫu nhiên; đây chỉ là dấu hiệu tham khảo, không tự nó chứng minh lừa đảo.</w:t>
+        <w:t>Gồm url_entropy (độ lộn xộn của cả địa chỉ) và domain_entropy (độ lộn xộn của tên trang web). Diễn giải: Tên trang web thật ghép thành từ có nghĩa nên đọc rất xuôi, còn trang lừa đảo tạo tự động bằng máy thường có chữ cái và con số xếp hỗn loạn vô nghĩa.</w:t>
       </w:r>
     </w:p>
     <w:p>
       <w:pPr>
-        <w:spacing w:line="264" w:lineRule="auto" w:before="0" w:after="100"/>
+        <w:spacing w:line="276" w:lineRule="auto" w:before="0" w:after="100"/>
         <w:ind w:left="340"/>
         <w:jc w:val="both"/>
       </w:pPr>
@@ -1206,12 +1247,12 @@
           <w:color w:val="000000"/>
           <w:sz w:val="28"/>
         </w:rPr>
-        <w:t>Tìm các từ liên quan đến đăng nhập, vào tài khoản, xác minh, tài khoản, mật khẩu, ngân hàng, thanh toán và xác nhận. Những từ này cũng xuất hiện trên trang thật, nên hệ thống phải xem chúng cùng các dấu hiệu khác chứ không kết luận chỉ từ một từ.</w:t>
+        <w:t>Gồm keyword_login (đăng nhập), keyword_signin (vào tài khoản), keyword_verify (xác minh), keyword_account (tài khoản), keyword_password (mật khẩu), keyword_bank (ngân hàng), keyword_payment (thanh toán), keyword_confirm (xác nhận). Diễn giải: Đây là 8 từ mồi nhử quen thuộc mà kẻ gian hay chèn vào đường dẫn để giục nạn nhân khai báo mật khẩu.</w:t>
       </w:r>
     </w:p>
     <w:p>
       <w:pPr>
-        <w:spacing w:line="264" w:lineRule="auto" w:before="0" w:after="100"/>
+        <w:spacing w:line="276" w:lineRule="auto" w:before="0" w:after="100"/>
         <w:ind w:left="340"/>
         <w:jc w:val="both"/>
       </w:pPr>
@@ -1233,12 +1274,12 @@
           <w:color w:val="000000"/>
           <w:sz w:val="28"/>
         </w:rPr>
-        <w:t>Đo lại độ dài các phần của địa chỉ; nhận biết máy chủ dạng số và số tầng tên phụ; đếm chữ cái, chữ số, ký tự lạ, dấu bằng, dấu hỏi, dấu nối, gạch dưới, dấu chấm và gạch chéo; tính tỷ lệ từng nhóm ký tự, độ lộn xộn và đánh dấu một số đuôi tên miền thường cần xem xét kỹ hơn.</w:t>
+        <w:t>Gồm các biến đo độ dài chuẩn hóa (phishvn_url_len, phishvn_dom_len, phishvn_tld_len, phishvn_path_len, phishvn_query_len), đếm chi tiết số lượng ký tự (phishvn_is_ip, phishvn_subdom_cnt, phishvn_letter_cnt, phishvn_digit_cnt, phishvn_special_cnt, phishvn_eq_cnt, phishvn_qm_cnt, phishvn_amp_cnt, phishvn_dot_cnt, phishvn_dash_cnt, phishvn_under_cnt, phishvn_slash_cnt), tính tỷ lệ phần trăm chữ cái, chữ số, ký tự lạ trên toàn địa chỉ (phishvn_letter_ratio, phishvn_digit_ratio, phishvn_spec_ratio), độ lộn xộn (phishvn_entropy) và cờ phát hiện đuôi tên miền đáng ngờ hay bị tội phạm mạng dùng (phishvn_suspicious_tld).</w:t>
       </w:r>
     </w:p>
     <w:p>
       <w:pPr>
-        <w:spacing w:line="264" w:lineRule="auto" w:before="0" w:after="100"/>
+        <w:spacing w:line="276" w:lineRule="auto" w:before="0" w:after="100"/>
         <w:ind w:left="340"/>
         <w:jc w:val="both"/>
       </w:pPr>
@@ -1260,7 +1301,7 @@
           <w:color w:val="000000"/>
           <w:sz w:val="28"/>
         </w:rPr>
-        <w:t>Kiểm tra địa chỉ có chứa ký tự được viết dưới dạng mã phần trăm hay không, đếm số ký tự kiểu này và tính tỷ lệ của chúng. Đây giống như phát hiện một số chữ đã bị thay bằng ký hiệu khó đọc.</w:t>
+        <w:t>Gồm phiusiil_has_obfuscation (có dùng mã giấu chữ không), phiusiil_obfuscated_char_count (số ký tự bị giấu bằng cụm %xx) và phiusiil_obfuscation_ratio (tỷ lệ bị giấu). Diễn giải: Vạch trần thủ đoạn biến chữ cái bình thường thành các ký hiệu mật mã phần trăm để làm hoa mắt người xem.</w:t>
       </w:r>
     </w:p>
     <w:p>
@@ -1283,7 +1324,7 @@
     </w:p>
     <w:p>
       <w:pPr>
-        <w:spacing w:line="264" w:lineRule="auto" w:before="0" w:after="120"/>
+        <w:spacing w:line="276" w:lineRule="auto" w:before="0" w:after="120"/>
         <w:jc w:val="both"/>
       </w:pPr>
       <w:r>
@@ -1294,7 +1335,7 @@
           <w:color w:val="000000"/>
           <w:sz w:val="28"/>
         </w:rPr>
-        <w:t>Nhóm sử dụng bộ trích xuất tự động viết bằng Python (src/feature_extractor.py) và JavaScript (web/static/browser-model.js) làm công cụ đo đạc chính xác từng con số trong 55 dấu hiệu của mỗi địa chỉ web. Sau khi đo xong, phần mềm phân tích scikit-learn và pandas được dùng để chấm điểm tự động trên 6.624 địa chỉ thi thử: phần mềm đếm số trang lừa đảo bắt trúng, số trang an toàn đoán đúng, số trang báo nhầm và số trang bỏ sót, từ đó tính ra tỷ lệ phần trăm chính xác của từng mô hình và lưu vào bảng thống kê kết quả.</w:t>
+        <w:t>Bộ đo được viết hai lần: một bản trong Python để dùng khi huấn luyện và một bản trong JavaScript để dùng trên trình duyệt. Cả hai biến địa chỉ thành cùng 55 con số, giống như hai chiếc cân được chỉnh theo một quả cân chuẩn. pandas giúp đếm và sắp xếp kết quả; scikit-learn tính các chỉ số. Nhóm kiểm tra số trang lừa đảo bắt trúng, trang hợp lệ đoán đúng, báo nhầm và bỏ sót trên 6.624 địa chỉ thi thử.</w:t>
       </w:r>
     </w:p>
     <w:p>
@@ -1317,7 +1358,7 @@
     </w:p>
     <w:p>
       <w:pPr>
-        <w:spacing w:line="264" w:lineRule="auto" w:before="0" w:after="100"/>
+        <w:spacing w:line="276" w:lineRule="auto" w:before="0" w:after="100"/>
         <w:ind w:left="340"/>
         <w:jc w:val="both"/>
       </w:pPr>
@@ -1344,7 +1385,7 @@
     </w:p>
     <w:p>
       <w:pPr>
-        <w:spacing w:line="264" w:lineRule="auto" w:before="0" w:after="100"/>
+        <w:spacing w:line="276" w:lineRule="auto" w:before="0" w:after="100"/>
         <w:ind w:left="340"/>
         <w:jc w:val="both"/>
       </w:pPr>
@@ -1371,7 +1412,7 @@
     </w:p>
     <w:p>
       <w:pPr>
-        <w:spacing w:line="264" w:lineRule="auto" w:before="0" w:after="100"/>
+        <w:spacing w:line="276" w:lineRule="auto" w:before="0" w:after="100"/>
         <w:ind w:left="340"/>
         <w:jc w:val="both"/>
       </w:pPr>
@@ -1398,7 +1439,7 @@
     </w:p>
     <w:p>
       <w:pPr>
-        <w:spacing w:line="264" w:lineRule="auto" w:before="0" w:after="100"/>
+        <w:spacing w:line="276" w:lineRule="auto" w:before="0" w:after="100"/>
         <w:ind w:left="340"/>
         <w:jc w:val="both"/>
       </w:pPr>
@@ -1420,12 +1461,12 @@
           <w:color w:val="000000"/>
           <w:sz w:val="28"/>
         </w:rPr>
-        <w:t>Cân bằng trọng số đóng góp giữa các nhóm dữ liệu và cho cả 4 mô hình AI học quy luật với mã cố định (seed = 42).</w:t>
+        <w:t>Cân bằng mức đóng góp giữa các nhóm dữ liệu rồi cho bốn mô hình học quy luật theo cùng một thiết lập để có thể lặp lại phép thử.</w:t>
       </w:r>
     </w:p>
     <w:p>
       <w:pPr>
-        <w:spacing w:line="264" w:lineRule="auto" w:before="0" w:after="100"/>
+        <w:spacing w:line="276" w:lineRule="auto" w:before="0" w:after="100"/>
         <w:ind w:left="340"/>
         <w:jc w:val="both"/>
       </w:pPr>
@@ -1470,7 +1511,7 @@
     </w:p>
     <w:p>
       <w:pPr>
-        <w:spacing w:line="264" w:lineRule="auto" w:before="0" w:after="120"/>
+        <w:spacing w:line="276" w:lineRule="auto" w:before="0" w:after="120"/>
         <w:jc w:val="both"/>
       </w:pPr>
       <w:r>
@@ -1525,7 +1566,7 @@
     </w:p>
     <w:p>
       <w:pPr>
-        <w:spacing w:line="264" w:lineRule="auto" w:before="0" w:after="160"/>
+        <w:spacing w:line="276" w:lineRule="auto" w:before="0" w:after="160"/>
         <w:jc w:val="center"/>
       </w:pPr>
       <w:r>
@@ -1541,7 +1582,7 @@
     </w:p>
     <w:p>
       <w:pPr>
-        <w:spacing w:line="264" w:lineRule="auto" w:before="0" w:after="60"/>
+        <w:spacing w:line="276" w:lineRule="auto" w:before="0" w:after="60"/>
         <w:jc w:val="left"/>
       </w:pPr>
       <w:r>
@@ -1552,7 +1593,7 @@
           <w:color w:val="0F4C5C"/>
           <w:sz w:val="28"/>
         </w:rPr>
-        <w:t>1) Đoạn mã thật giúp tự hoàn thiện địa chỉ:</w:t>
+        <w:t>1) Tự hoàn thiện đường dẫn trang web:</w:t>
       </w:r>
     </w:p>
     <w:tbl>
@@ -1583,21 +1624,35 @@
             </w:pPr>
             <w:r>
               <w:rPr>
-                <w:rFonts w:ascii="Courier New" w:hAnsi="Courier New" w:eastAsia="Courier New"/>
+                <w:rFonts w:ascii="Times New Roman" w:hAnsi="Times New Roman" w:eastAsia="Times New Roman"/>
                 <w:b w:val="0"/>
                 <w:i w:val="0"/>
                 <w:color w:val="0F172A"/>
                 <w:sz w:val="28"/>
               </w:rPr>
-              <w:t>const host = healed.split(/[/?#]/u, 1)[0];</w:t>
+              <w:t>function validateUrl(value) {</w:t>
               <w:br/>
-              <w:t>if (!host.includes(".") &amp;&amp; host.toLowerCase() !== "localhost") {</w:t>
+              <w:t xml:space="preserve">  let healed = value.trim();</w:t>
               <w:br/>
-              <w:t xml:space="preserve">  healed = `${host}.com${healed.slice(host.length)}`;</w:t>
+              <w:t xml:space="preserve">  if (healed.startsWith('//')) healed = `https:${healed}`;</w:t>
+              <w:br/>
+              <w:t xml:space="preserve">  else if (!healed.includes('://')) {</w:t>
+              <w:br/>
+              <w:t xml:space="preserve">    const host = healed.split(/[/?#]/u, 1)[0];</w:t>
+              <w:br/>
+              <w:t xml:space="preserve">    if (!host.includes('.') &amp;&amp; host.toLowerCase() !== 'localhost') {</w:t>
+              <w:br/>
+              <w:t xml:space="preserve">      healed = `${host}.com${healed.slice(host.length)}`;</w:t>
+              <w:br/>
+              <w:t xml:space="preserve">    }</w:t>
+              <w:br/>
+              <w:t xml:space="preserve">    healed = `https://${healed}`;</w:t>
+              <w:br/>
+              <w:t xml:space="preserve">  }</w:t>
+              <w:br/>
+              <w:t xml:space="preserve">  ...</w:t>
               <w:br/>
               <w:t>}</w:t>
-              <w:br/>
-              <w:t>healed = `https://${healed}`;</w:t>
             </w:r>
           </w:p>
         </w:tc>
@@ -1605,7 +1660,23 @@
     </w:tbl>
     <w:p>
       <w:pPr>
-        <w:spacing w:line="264" w:lineRule="auto" w:before="0" w:after="100"/>
+        <w:spacing w:line="276" w:lineRule="auto" w:before="0" w:after="40"/>
+        <w:jc w:val="left"/>
+      </w:pPr>
+      <w:r>
+        <w:rPr>
+          <w:rFonts w:ascii="Times New Roman" w:hAnsi="Times New Roman" w:eastAsia="Times New Roman"/>
+          <w:b/>
+          <w:i w:val="0"/>
+          <w:color w:val="0F4C5C"/>
+          <w:sz w:val="28"/>
+        </w:rPr>
+        <w:t>Giải thích</w:t>
+      </w:r>
+    </w:p>
+    <w:p>
+      <w:pPr>
+        <w:spacing w:line="276" w:lineRule="auto" w:before="0" w:after="100"/>
         <w:ind w:left="340"/>
         <w:jc w:val="both"/>
       </w:pPr>
@@ -1617,7 +1688,7 @@
           <w:color w:val="000000"/>
           <w:sz w:val="28"/>
         </w:rPr>
-        <w:t xml:space="preserve">• Dòng 1: </w:t>
+        <w:t xml:space="preserve">• 1. </w:t>
       </w:r>
       <w:r>
         <w:rPr>
@@ -1627,12 +1698,12 @@
           <w:color w:val="000000"/>
           <w:sz w:val="28"/>
         </w:rPr>
-        <w:t>Tách phần tên miền khỏi đường dẫn phía sau, giống như tìm tên đường trước khi đọc số nhà.</w:t>
+        <w:t>Bắt đầu hàm nhận một đường dẫn do người dùng nhập.</w:t>
       </w:r>
     </w:p>
     <w:p>
       <w:pPr>
-        <w:spacing w:line="264" w:lineRule="auto" w:before="0" w:after="100"/>
+        <w:spacing w:line="276" w:lineRule="auto" w:before="0" w:after="100"/>
         <w:ind w:left="340"/>
         <w:jc w:val="both"/>
       </w:pPr>
@@ -1644,7 +1715,7 @@
           <w:color w:val="000000"/>
           <w:sz w:val="28"/>
         </w:rPr>
-        <w:t xml:space="preserve">• Dòng 2: </w:t>
+        <w:t xml:space="preserve">• 2. </w:t>
       </w:r>
       <w:r>
         <w:rPr>
@@ -1654,12 +1725,12 @@
           <w:color w:val="000000"/>
           <w:sz w:val="28"/>
         </w:rPr>
-        <w:t>Nếu tên miền chưa có dấu chấm và không phải máy tính nội bộ, hệ thống nhận diện đó có thể là tên ngắn người dùng vừa gõ.</w:t>
+        <w:t>Bỏ khoảng trắng ở đầu và cuối, như gọt bỏ phần thừa ngoài nhãn địa chỉ.</w:t>
       </w:r>
     </w:p>
     <w:p>
       <w:pPr>
-        <w:spacing w:line="264" w:lineRule="auto" w:before="0" w:after="100"/>
+        <w:spacing w:line="276" w:lineRule="auto" w:before="0" w:after="100"/>
         <w:ind w:left="340"/>
         <w:jc w:val="both"/>
       </w:pPr>
@@ -1671,7 +1742,7 @@
           <w:color w:val="000000"/>
           <w:sz w:val="28"/>
         </w:rPr>
-        <w:t xml:space="preserve">• Dòng 3: </w:t>
+        <w:t xml:space="preserve">• 3. </w:t>
       </w:r>
       <w:r>
         <w:rPr>
@@ -1681,12 +1752,12 @@
           <w:color w:val="000000"/>
           <w:sz w:val="28"/>
         </w:rPr>
-        <w:t>Tự thêm phần đuôi .com nhưng giữ nguyên phần đường dẫn người dùng đã nhập.</w:t>
+        <w:t>Nếu người dùng đã gõ hai dấu gạch chéo đầu tiên, thêm giao thức bảo mật.</w:t>
       </w:r>
     </w:p>
     <w:p>
       <w:pPr>
-        <w:spacing w:line="264" w:lineRule="auto" w:before="0" w:after="100"/>
+        <w:spacing w:line="276" w:lineRule="auto" w:before="0" w:after="100"/>
         <w:ind w:left="340"/>
         <w:jc w:val="both"/>
       </w:pPr>
@@ -1698,7 +1769,7 @@
           <w:color w:val="000000"/>
           <w:sz w:val="28"/>
         </w:rPr>
-        <w:t xml:space="preserve">• Dòng cuối: </w:t>
+        <w:t xml:space="preserve">• 4. </w:t>
       </w:r>
       <w:r>
         <w:rPr>
@@ -1708,12 +1779,228 @@
           <w:color w:val="000000"/>
           <w:sz w:val="28"/>
         </w:rPr>
-        <w:t>Thêm https:// để tạo thành địa chỉ đầy đủ trước khi kiểm tra.</w:t>
+        <w:t>Nếu chưa có phần đầu giao thức, hệ thống sẽ tự bổ sung.</w:t>
       </w:r>
     </w:p>
     <w:p>
       <w:pPr>
-        <w:spacing w:line="264" w:lineRule="auto" w:before="0" w:after="60"/>
+        <w:spacing w:line="276" w:lineRule="auto" w:before="0" w:after="100"/>
+        <w:ind w:left="340"/>
+        <w:jc w:val="both"/>
+      </w:pPr>
+      <w:r>
+        <w:rPr>
+          <w:rFonts w:ascii="Times New Roman" w:hAnsi="Times New Roman" w:eastAsia="Times New Roman"/>
+          <w:b/>
+          <w:i w:val="0"/>
+          <w:color w:val="000000"/>
+          <w:sz w:val="28"/>
+        </w:rPr>
+        <w:t xml:space="preserve">• 5. </w:t>
+      </w:r>
+      <w:r>
+        <w:rPr>
+          <w:rFonts w:ascii="Times New Roman" w:hAnsi="Times New Roman" w:eastAsia="Times New Roman"/>
+          <w:b w:val="0"/>
+          <w:i w:val="0"/>
+          <w:color w:val="000000"/>
+          <w:sz w:val="28"/>
+        </w:rPr>
+        <w:t>Tách phần tên máy chủ khỏi phần đường dẫn phía sau.</w:t>
+      </w:r>
+    </w:p>
+    <w:p>
+      <w:pPr>
+        <w:spacing w:line="276" w:lineRule="auto" w:before="0" w:after="100"/>
+        <w:ind w:left="340"/>
+        <w:jc w:val="both"/>
+      </w:pPr>
+      <w:r>
+        <w:rPr>
+          <w:rFonts w:ascii="Times New Roman" w:hAnsi="Times New Roman" w:eastAsia="Times New Roman"/>
+          <w:b/>
+          <w:i w:val="0"/>
+          <w:color w:val="000000"/>
+          <w:sz w:val="28"/>
+        </w:rPr>
+        <w:t xml:space="preserve">• 6. </w:t>
+      </w:r>
+      <w:r>
+        <w:rPr>
+          <w:rFonts w:ascii="Times New Roman" w:hAnsi="Times New Roman" w:eastAsia="Times New Roman"/>
+          <w:b w:val="0"/>
+          <w:i w:val="0"/>
+          <w:color w:val="000000"/>
+          <w:sz w:val="28"/>
+        </w:rPr>
+        <w:t>Kiểm tra xem tên máy chủ có dấu chấm hay là tên máy cục bộ.</w:t>
+      </w:r>
+    </w:p>
+    <w:p>
+      <w:pPr>
+        <w:spacing w:line="276" w:lineRule="auto" w:before="0" w:after="100"/>
+        <w:ind w:left="340"/>
+        <w:jc w:val="both"/>
+      </w:pPr>
+      <w:r>
+        <w:rPr>
+          <w:rFonts w:ascii="Times New Roman" w:hAnsi="Times New Roman" w:eastAsia="Times New Roman"/>
+          <w:b/>
+          <w:i w:val="0"/>
+          <w:color w:val="000000"/>
+          <w:sz w:val="28"/>
+        </w:rPr>
+        <w:t xml:space="preserve">• 7. </w:t>
+      </w:r>
+      <w:r>
+        <w:rPr>
+          <w:rFonts w:ascii="Times New Roman" w:hAnsi="Times New Roman" w:eastAsia="Times New Roman"/>
+          <w:b w:val="0"/>
+          <w:i w:val="0"/>
+          <w:color w:val="000000"/>
+          <w:sz w:val="28"/>
+        </w:rPr>
+        <w:t>Nếu chỉ nhập một từ như vietcombank, phần mềm thêm .com và giữ phần đường dẫn nếu có.</w:t>
+      </w:r>
+    </w:p>
+    <w:p>
+      <w:pPr>
+        <w:spacing w:line="276" w:lineRule="auto" w:before="0" w:after="100"/>
+        <w:ind w:left="340"/>
+        <w:jc w:val="both"/>
+      </w:pPr>
+      <w:r>
+        <w:rPr>
+          <w:rFonts w:ascii="Times New Roman" w:hAnsi="Times New Roman" w:eastAsia="Times New Roman"/>
+          <w:b/>
+          <w:i w:val="0"/>
+          <w:color w:val="000000"/>
+          <w:sz w:val="28"/>
+        </w:rPr>
+        <w:t xml:space="preserve">• 8. </w:t>
+      </w:r>
+      <w:r>
+        <w:rPr>
+          <w:rFonts w:ascii="Times New Roman" w:hAnsi="Times New Roman" w:eastAsia="Times New Roman"/>
+          <w:b w:val="0"/>
+          <w:i w:val="0"/>
+          <w:color w:val="000000"/>
+          <w:sz w:val="28"/>
+        </w:rPr>
+        <w:t>Đóng nhánh kiểm tra tên máy không có dấu chấm.</w:t>
+      </w:r>
+    </w:p>
+    <w:p>
+      <w:pPr>
+        <w:spacing w:line="276" w:lineRule="auto" w:before="0" w:after="100"/>
+        <w:ind w:left="340"/>
+        <w:jc w:val="both"/>
+      </w:pPr>
+      <w:r>
+        <w:rPr>
+          <w:rFonts w:ascii="Times New Roman" w:hAnsi="Times New Roman" w:eastAsia="Times New Roman"/>
+          <w:b/>
+          <w:i w:val="0"/>
+          <w:color w:val="000000"/>
+          <w:sz w:val="28"/>
+        </w:rPr>
+        <w:t xml:space="preserve">• 9. </w:t>
+      </w:r>
+      <w:r>
+        <w:rPr>
+          <w:rFonts w:ascii="Times New Roman" w:hAnsi="Times New Roman" w:eastAsia="Times New Roman"/>
+          <w:b w:val="0"/>
+          <w:i w:val="0"/>
+          <w:color w:val="000000"/>
+          <w:sz w:val="28"/>
+        </w:rPr>
+        <w:t>Kết thúc việc bổ sung phần đầu https://.</w:t>
+      </w:r>
+    </w:p>
+    <w:p>
+      <w:pPr>
+        <w:spacing w:line="276" w:lineRule="auto" w:before="0" w:after="100"/>
+        <w:ind w:left="340"/>
+        <w:jc w:val="both"/>
+      </w:pPr>
+      <w:r>
+        <w:rPr>
+          <w:rFonts w:ascii="Times New Roman" w:hAnsi="Times New Roman" w:eastAsia="Times New Roman"/>
+          <w:b/>
+          <w:i w:val="0"/>
+          <w:color w:val="000000"/>
+          <w:sz w:val="28"/>
+        </w:rPr>
+        <w:t xml:space="preserve">• 10. </w:t>
+      </w:r>
+      <w:r>
+        <w:rPr>
+          <w:rFonts w:ascii="Times New Roman" w:hAnsi="Times New Roman" w:eastAsia="Times New Roman"/>
+          <w:b w:val="0"/>
+          <w:i w:val="0"/>
+          <w:color w:val="000000"/>
+          <w:sz w:val="28"/>
+        </w:rPr>
+        <w:t>Đóng khối xử lý trường hợp chưa có giao thức.</w:t>
+      </w:r>
+    </w:p>
+    <w:p>
+      <w:pPr>
+        <w:spacing w:line="276" w:lineRule="auto" w:before="0" w:after="100"/>
+        <w:ind w:left="340"/>
+        <w:jc w:val="both"/>
+      </w:pPr>
+      <w:r>
+        <w:rPr>
+          <w:rFonts w:ascii="Times New Roman" w:hAnsi="Times New Roman" w:eastAsia="Times New Roman"/>
+          <w:b/>
+          <w:i w:val="0"/>
+          <w:color w:val="000000"/>
+          <w:sz w:val="28"/>
+        </w:rPr>
+        <w:t xml:space="preserve">• 11. </w:t>
+      </w:r>
+      <w:r>
+        <w:rPr>
+          <w:rFonts w:ascii="Times New Roman" w:hAnsi="Times New Roman" w:eastAsia="Times New Roman"/>
+          <w:b w:val="0"/>
+          <w:i w:val="0"/>
+          <w:color w:val="000000"/>
+          <w:sz w:val="28"/>
+        </w:rPr>
+        <w:t>Dấu ba chấm cho biết trích đoạn còn phần kiểm tra địa chỉ hợp lệ ở phía sau.</w:t>
+      </w:r>
+    </w:p>
+    <w:p>
+      <w:pPr>
+        <w:spacing w:line="276" w:lineRule="auto" w:before="0" w:after="100"/>
+        <w:ind w:left="340"/>
+        <w:jc w:val="both"/>
+      </w:pPr>
+      <w:r>
+        <w:rPr>
+          <w:rFonts w:ascii="Times New Roman" w:hAnsi="Times New Roman" w:eastAsia="Times New Roman"/>
+          <w:b/>
+          <w:i w:val="0"/>
+          <w:color w:val="000000"/>
+          <w:sz w:val="28"/>
+        </w:rPr>
+        <w:t xml:space="preserve">• 12. </w:t>
+      </w:r>
+      <w:r>
+        <w:rPr>
+          <w:rFonts w:ascii="Times New Roman" w:hAnsi="Times New Roman" w:eastAsia="Times New Roman"/>
+          <w:b w:val="0"/>
+          <w:i w:val="0"/>
+          <w:color w:val="000000"/>
+          <w:sz w:val="28"/>
+        </w:rPr>
+        <w:t>Dòng đóng hàm; ví dụ vietcombank trở thành https://vietcombank.com.</w:t>
+      </w:r>
+    </w:p>
+    <w:p>
+      <w:pPr>
+        <w:spacing w:line="276" w:lineRule="auto" w:before="0" w:after="60"/>
         <w:jc w:val="left"/>
       </w:pPr>
       <w:r>
@@ -1724,7 +2011,7 @@
           <w:color w:val="0F4C5C"/>
           <w:sz w:val="28"/>
         </w:rPr>
-        <w:t>2) Đoạn mã thật biến địa chỉ thành các con số kiểm tra:</w:t>
+        <w:t>2) Tra cứu hồ sơ lừa đảo đã biết:</w:t>
       </w:r>
     </w:p>
     <w:tbl>
@@ -1755,27 +2042,41 @@
             </w:pPr>
             <w:r>
               <w:rPr>
-                <w:rFonts w:ascii="Courier New" w:hAnsi="Courier New" w:eastAsia="Courier New"/>
+                <w:rFonts w:ascii="Times New Roman" w:hAnsi="Times New Roman" w:eastAsia="Times New Roman"/>
                 <w:b w:val="0"/>
                 <w:i w:val="0"/>
                 <w:color w:val="0F172A"/>
                 <w:sz w:val="28"/>
               </w:rPr>
-              <w:t>parts = _split_url(url)</w:t>
+              <w:t>function databaseMatch(url, features) {</w:t>
               <w:br/>
-              <w:t>hostname = _hostname(parts)</w:t>
+              <w:t xml:space="preserve">  const parts = parseParts(url);</w:t>
               <w:br/>
-              <w:t>lowered = url.lower()</w:t>
+              <w:t xml:space="preserve">  let hostname = parts.hostname.toLowerCase().replace(/\.+$/u, '');</w:t>
               <w:br/>
-              <w:t>features = _base_features(url, parts, hostname)</w:t>
+              <w:t xml:space="preserve">  if (hostname.startsWith('www.')) hostname = hostname.slice(4);</w:t>
               <w:br/>
-              <w:t>features.update({</w:t>
+              <w:t xml:space="preserve">  const path = parts.path.replace(/\/+$/u, '');</w:t>
               <w:br/>
-              <w:t xml:space="preserve">    f"keyword_{keyword}": int(keyword in lowered)</w:t>
+              <w:t xml:space="preserve">  const key = `${hostname}${path}?${parts.query}`.replace(/\?$/u, '');</w:t>
               <w:br/>
-              <w:t xml:space="preserve">    for keyword in _KEYWORDS</w:t>
+              <w:t xml:space="preserve">  const record = recordsByUrl.get(key);</w:t>
               <w:br/>
-              <w:t>})</w:t>
+              <w:t xml:space="preserve">  if (record) {</w:t>
+              <w:br/>
+              <w:t xml:space="preserve">    return { matched: true, type: 'exact_url', provenance: 'Matched in reference database', record };</w:t>
+              <w:br/>
+              <w:t xml:space="preserve">  }</w:t>
+              <w:br/>
+              <w:t xml:space="preserve">  if (database.knownPhishingHosts?.includes(parts.hostname.toLowerCase())) {</w:t>
+              <w:br/>
+              <w:t xml:space="preserve">    return { matched: true, type: 'known_phishing_host', provenance: 'Matched in reference database' };</w:t>
+              <w:br/>
+              <w:t xml:space="preserve">  }</w:t>
+              <w:br/>
+              <w:t xml:space="preserve">  return { matched: false, type: null, provenance: null };</w:t>
+              <w:br/>
+              <w:t>}</w:t>
             </w:r>
           </w:p>
         </w:tc>
@@ -1783,7 +2084,23 @@
     </w:tbl>
     <w:p>
       <w:pPr>
-        <w:spacing w:line="264" w:lineRule="auto" w:before="0" w:after="100"/>
+        <w:spacing w:line="276" w:lineRule="auto" w:before="0" w:after="40"/>
+        <w:jc w:val="left"/>
+      </w:pPr>
+      <w:r>
+        <w:rPr>
+          <w:rFonts w:ascii="Times New Roman" w:hAnsi="Times New Roman" w:eastAsia="Times New Roman"/>
+          <w:b/>
+          <w:i w:val="0"/>
+          <w:color w:val="0F4C5C"/>
+          <w:sz w:val="28"/>
+        </w:rPr>
+        <w:t>Giải thích</w:t>
+      </w:r>
+    </w:p>
+    <w:p>
+      <w:pPr>
+        <w:spacing w:line="276" w:lineRule="auto" w:before="0" w:after="100"/>
         <w:ind w:left="340"/>
         <w:jc w:val="both"/>
       </w:pPr>
@@ -1795,7 +2112,7 @@
           <w:color w:val="000000"/>
           <w:sz w:val="28"/>
         </w:rPr>
-        <w:t xml:space="preserve">• Dòng 1: </w:t>
+        <w:t xml:space="preserve">• 1. </w:t>
       </w:r>
       <w:r>
         <w:rPr>
@@ -1805,12 +2122,12 @@
           <w:color w:val="000000"/>
           <w:sz w:val="28"/>
         </w:rPr>
-        <w:t>Tách địa chỉ thành các phần như tên máy chủ, đường dẫn và thông số.</w:t>
+        <w:t>Hàm nhận địa chỉ và các con số dấu hiệu đã đo.</w:t>
       </w:r>
     </w:p>
     <w:p>
       <w:pPr>
-        <w:spacing w:line="264" w:lineRule="auto" w:before="0" w:after="100"/>
+        <w:spacing w:line="276" w:lineRule="auto" w:before="0" w:after="100"/>
         <w:ind w:left="340"/>
         <w:jc w:val="both"/>
       </w:pPr>
@@ -1822,7 +2139,7 @@
           <w:color w:val="000000"/>
           <w:sz w:val="28"/>
         </w:rPr>
-        <w:t xml:space="preserve">• Dòng 2: </w:t>
+        <w:t xml:space="preserve">• 2. </w:t>
       </w:r>
       <w:r>
         <w:rPr>
@@ -1832,12 +2149,12 @@
           <w:color w:val="000000"/>
           <w:sz w:val="28"/>
         </w:rPr>
-        <w:t>Lấy riêng tên máy chủ để đo các dấu hiệu thuộc tên miền.</w:t>
+        <w:t>Tách địa chỉ ra thành tên máy, đường dẫn và phần truy vấn, như tách tỉnh, phố và số nhà.</w:t>
       </w:r>
     </w:p>
     <w:p>
       <w:pPr>
-        <w:spacing w:line="264" w:lineRule="auto" w:before="0" w:after="100"/>
+        <w:spacing w:line="276" w:lineRule="auto" w:before="0" w:after="100"/>
         <w:ind w:left="340"/>
         <w:jc w:val="both"/>
       </w:pPr>
@@ -1849,7 +2166,7 @@
           <w:color w:val="000000"/>
           <w:sz w:val="28"/>
         </w:rPr>
-        <w:t xml:space="preserve">• Dòng 3: </w:t>
+        <w:t xml:space="preserve">• 3. </w:t>
       </w:r>
       <w:r>
         <w:rPr>
@@ -1859,12 +2176,12 @@
           <w:color w:val="000000"/>
           <w:sz w:val="28"/>
         </w:rPr>
-        <w:t>Đưa chữ về cùng kiểu chữ thường để không bỏ sót từ chỉ vì viết hoa.</w:t>
+        <w:t>Đưa tên máy về chữ thường và bỏ dấu chấm thừa ở cuối.</w:t>
       </w:r>
     </w:p>
     <w:p>
       <w:pPr>
-        <w:spacing w:line="264" w:lineRule="auto" w:before="0" w:after="100"/>
+        <w:spacing w:line="276" w:lineRule="auto" w:before="0" w:after="100"/>
         <w:ind w:left="340"/>
         <w:jc w:val="both"/>
       </w:pPr>
@@ -1876,7 +2193,7 @@
           <w:color w:val="000000"/>
           <w:sz w:val="28"/>
         </w:rPr>
-        <w:t xml:space="preserve">• Dòng 4: </w:t>
+        <w:t xml:space="preserve">• 4. </w:t>
       </w:r>
       <w:r>
         <w:rPr>
@@ -1886,12 +2203,12 @@
           <w:color w:val="000000"/>
           <w:sz w:val="28"/>
         </w:rPr>
-        <w:t>Tính các dấu hiệu nền như độ dài và ký tự đặc biệt.</w:t>
+        <w:t>Bỏ tiền tố www để cách viết có hoặc không có www cùng trỏ về một hồ sơ.</w:t>
       </w:r>
     </w:p>
     <w:p>
       <w:pPr>
-        <w:spacing w:line="264" w:lineRule="auto" w:before="0" w:after="100"/>
+        <w:spacing w:line="276" w:lineRule="auto" w:before="0" w:after="100"/>
         <w:ind w:left="340"/>
         <w:jc w:val="both"/>
       </w:pPr>
@@ -1903,7 +2220,7 @@
           <w:color w:val="000000"/>
           <w:sz w:val="28"/>
         </w:rPr>
-        <w:t xml:space="preserve">• Các dòng cuối: </w:t>
+        <w:t xml:space="preserve">• 5. </w:t>
       </w:r>
       <w:r>
         <w:rPr>
@@ -1913,12 +2230,282 @@
           <w:color w:val="000000"/>
           <w:sz w:val="28"/>
         </w:rPr>
-        <w:t>Lần lượt kiểm tra từ khóa đã định trước; có thì ghi 1, không có thì ghi 0.</w:t>
+        <w:t>Bỏ dấu gạch chéo cuối đường dẫn để tránh coi hai cách viết là hai nhà khác nhau.</w:t>
       </w:r>
     </w:p>
     <w:p>
       <w:pPr>
-        <w:spacing w:line="264" w:lineRule="auto" w:before="0" w:after="60"/>
+        <w:spacing w:line="276" w:lineRule="auto" w:before="0" w:after="100"/>
+        <w:ind w:left="340"/>
+        <w:jc w:val="both"/>
+      </w:pPr>
+      <w:r>
+        <w:rPr>
+          <w:rFonts w:ascii="Times New Roman" w:hAnsi="Times New Roman" w:eastAsia="Times New Roman"/>
+          <w:b/>
+          <w:i w:val="0"/>
+          <w:color w:val="000000"/>
+          <w:sz w:val="28"/>
+        </w:rPr>
+        <w:t xml:space="preserve">• 6. </w:t>
+      </w:r>
+      <w:r>
+        <w:rPr>
+          <w:rFonts w:ascii="Times New Roman" w:hAnsi="Times New Roman" w:eastAsia="Times New Roman"/>
+          <w:b w:val="0"/>
+          <w:i w:val="0"/>
+          <w:color w:val="000000"/>
+          <w:sz w:val="28"/>
+        </w:rPr>
+        <w:t>Ghép tên máy, đường dẫn và phần truy vấn thành khóa để dò sổ.</w:t>
+      </w:r>
+    </w:p>
+    <w:p>
+      <w:pPr>
+        <w:spacing w:line="276" w:lineRule="auto" w:before="0" w:after="100"/>
+        <w:ind w:left="340"/>
+        <w:jc w:val="both"/>
+      </w:pPr>
+      <w:r>
+        <w:rPr>
+          <w:rFonts w:ascii="Times New Roman" w:hAnsi="Times New Roman" w:eastAsia="Times New Roman"/>
+          <w:b/>
+          <w:i w:val="0"/>
+          <w:color w:val="000000"/>
+          <w:sz w:val="28"/>
+        </w:rPr>
+        <w:t xml:space="preserve">• 7. </w:t>
+      </w:r>
+      <w:r>
+        <w:rPr>
+          <w:rFonts w:ascii="Times New Roman" w:hAnsi="Times New Roman" w:eastAsia="Times New Roman"/>
+          <w:b w:val="0"/>
+          <w:i w:val="0"/>
+          <w:color w:val="000000"/>
+          <w:sz w:val="28"/>
+        </w:rPr>
+        <w:t>Tìm khóa địa chỉ chính xác trong danh sách đã nạp.</w:t>
+      </w:r>
+    </w:p>
+    <w:p>
+      <w:pPr>
+        <w:spacing w:line="276" w:lineRule="auto" w:before="0" w:after="100"/>
+        <w:ind w:left="340"/>
+        <w:jc w:val="both"/>
+      </w:pPr>
+      <w:r>
+        <w:rPr>
+          <w:rFonts w:ascii="Times New Roman" w:hAnsi="Times New Roman" w:eastAsia="Times New Roman"/>
+          <w:b/>
+          <w:i w:val="0"/>
+          <w:color w:val="000000"/>
+          <w:sz w:val="28"/>
+        </w:rPr>
+        <w:t xml:space="preserve">• 8. </w:t>
+      </w:r>
+      <w:r>
+        <w:rPr>
+          <w:rFonts w:ascii="Times New Roman" w:hAnsi="Times New Roman" w:eastAsia="Times New Roman"/>
+          <w:b w:val="0"/>
+          <w:i w:val="0"/>
+          <w:color w:val="000000"/>
+          <w:sz w:val="28"/>
+        </w:rPr>
+        <w:t>Kiểm tra xem có hồ sơ trùng khớp hay không.</w:t>
+      </w:r>
+    </w:p>
+    <w:p>
+      <w:pPr>
+        <w:spacing w:line="276" w:lineRule="auto" w:before="0" w:after="100"/>
+        <w:ind w:left="340"/>
+        <w:jc w:val="both"/>
+      </w:pPr>
+      <w:r>
+        <w:rPr>
+          <w:rFonts w:ascii="Times New Roman" w:hAnsi="Times New Roman" w:eastAsia="Times New Roman"/>
+          <w:b/>
+          <w:i w:val="0"/>
+          <w:color w:val="000000"/>
+          <w:sz w:val="28"/>
+        </w:rPr>
+        <w:t xml:space="preserve">• 9. </w:t>
+      </w:r>
+      <w:r>
+        <w:rPr>
+          <w:rFonts w:ascii="Times New Roman" w:hAnsi="Times New Roman" w:eastAsia="Times New Roman"/>
+          <w:b w:val="0"/>
+          <w:i w:val="0"/>
+          <w:color w:val="000000"/>
+          <w:sz w:val="28"/>
+        </w:rPr>
+        <w:t>Nếu tìm thấy, trả lại hồ sơ và ghi rõ đây là kết quả đối chiếu từ kho.</w:t>
+      </w:r>
+    </w:p>
+    <w:p>
+      <w:pPr>
+        <w:spacing w:line="276" w:lineRule="auto" w:before="0" w:after="100"/>
+        <w:ind w:left="340"/>
+        <w:jc w:val="both"/>
+      </w:pPr>
+      <w:r>
+        <w:rPr>
+          <w:rFonts w:ascii="Times New Roman" w:hAnsi="Times New Roman" w:eastAsia="Times New Roman"/>
+          <w:b/>
+          <w:i w:val="0"/>
+          <w:color w:val="000000"/>
+          <w:sz w:val="28"/>
+        </w:rPr>
+        <w:t xml:space="preserve">• 10. </w:t>
+      </w:r>
+      <w:r>
+        <w:rPr>
+          <w:rFonts w:ascii="Times New Roman" w:hAnsi="Times New Roman" w:eastAsia="Times New Roman"/>
+          <w:b w:val="0"/>
+          <w:i w:val="0"/>
+          <w:color w:val="000000"/>
+          <w:sz w:val="28"/>
+        </w:rPr>
+        <w:t>Đóng nhánh xử lý hồ sơ trùng khớp.</w:t>
+      </w:r>
+    </w:p>
+    <w:p>
+      <w:pPr>
+        <w:spacing w:line="276" w:lineRule="auto" w:before="0" w:after="100"/>
+        <w:ind w:left="340"/>
+        <w:jc w:val="both"/>
+      </w:pPr>
+      <w:r>
+        <w:rPr>
+          <w:rFonts w:ascii="Times New Roman" w:hAnsi="Times New Roman" w:eastAsia="Times New Roman"/>
+          <w:b/>
+          <w:i w:val="0"/>
+          <w:color w:val="000000"/>
+          <w:sz w:val="28"/>
+        </w:rPr>
+        <w:t xml:space="preserve">• 11. </w:t>
+      </w:r>
+      <w:r>
+        <w:rPr>
+          <w:rFonts w:ascii="Times New Roman" w:hAnsi="Times New Roman" w:eastAsia="Times New Roman"/>
+          <w:b w:val="0"/>
+          <w:i w:val="0"/>
+          <w:color w:val="000000"/>
+          <w:sz w:val="28"/>
+        </w:rPr>
+        <w:t>Nếu địa chỉ đầy đủ không khớp, kiểm tra tên máy có nằm trong danh sách lừa đảo đã biết không.</w:t>
+      </w:r>
+    </w:p>
+    <w:p>
+      <w:pPr>
+        <w:spacing w:line="276" w:lineRule="auto" w:before="0" w:after="100"/>
+        <w:ind w:left="340"/>
+        <w:jc w:val="both"/>
+      </w:pPr>
+      <w:r>
+        <w:rPr>
+          <w:rFonts w:ascii="Times New Roman" w:hAnsi="Times New Roman" w:eastAsia="Times New Roman"/>
+          <w:b/>
+          <w:i w:val="0"/>
+          <w:color w:val="000000"/>
+          <w:sz w:val="28"/>
+        </w:rPr>
+        <w:t xml:space="preserve">• 12. </w:t>
+      </w:r>
+      <w:r>
+        <w:rPr>
+          <w:rFonts w:ascii="Times New Roman" w:hAnsi="Times New Roman" w:eastAsia="Times New Roman"/>
+          <w:b w:val="0"/>
+          <w:i w:val="0"/>
+          <w:color w:val="000000"/>
+          <w:sz w:val="28"/>
+        </w:rPr>
+        <w:t>Trả về kết quả khớp tên máy và nguồn đối chiếu.</w:t>
+      </w:r>
+    </w:p>
+    <w:p>
+      <w:pPr>
+        <w:spacing w:line="276" w:lineRule="auto" w:before="0" w:after="100"/>
+        <w:ind w:left="340"/>
+        <w:jc w:val="both"/>
+      </w:pPr>
+      <w:r>
+        <w:rPr>
+          <w:rFonts w:ascii="Times New Roman" w:hAnsi="Times New Roman" w:eastAsia="Times New Roman"/>
+          <w:b/>
+          <w:i w:val="0"/>
+          <w:color w:val="000000"/>
+          <w:sz w:val="28"/>
+        </w:rPr>
+        <w:t xml:space="preserve">• 13. </w:t>
+      </w:r>
+      <w:r>
+        <w:rPr>
+          <w:rFonts w:ascii="Times New Roman" w:hAnsi="Times New Roman" w:eastAsia="Times New Roman"/>
+          <w:b w:val="0"/>
+          <w:i w:val="0"/>
+          <w:color w:val="000000"/>
+          <w:sz w:val="28"/>
+        </w:rPr>
+        <w:t>Đóng nhánh kiểm tra tên máy.</w:t>
+      </w:r>
+    </w:p>
+    <w:p>
+      <w:pPr>
+        <w:spacing w:line="276" w:lineRule="auto" w:before="0" w:after="100"/>
+        <w:ind w:left="340"/>
+        <w:jc w:val="both"/>
+      </w:pPr>
+      <w:r>
+        <w:rPr>
+          <w:rFonts w:ascii="Times New Roman" w:hAnsi="Times New Roman" w:eastAsia="Times New Roman"/>
+          <w:b/>
+          <w:i w:val="0"/>
+          <w:color w:val="000000"/>
+          <w:sz w:val="28"/>
+        </w:rPr>
+        <w:t xml:space="preserve">• 14. </w:t>
+      </w:r>
+      <w:r>
+        <w:rPr>
+          <w:rFonts w:ascii="Times New Roman" w:hAnsi="Times New Roman" w:eastAsia="Times New Roman"/>
+          <w:b w:val="0"/>
+          <w:i w:val="0"/>
+          <w:color w:val="000000"/>
+          <w:sz w:val="28"/>
+        </w:rPr>
+        <w:t>Nếu không có hồ sơ nào khớp, báo chưa tìm thấy; điều đó không tự chứng minh trang an toàn.</w:t>
+      </w:r>
+    </w:p>
+    <w:p>
+      <w:pPr>
+        <w:spacing w:line="276" w:lineRule="auto" w:before="0" w:after="100"/>
+        <w:ind w:left="340"/>
+        <w:jc w:val="both"/>
+      </w:pPr>
+      <w:r>
+        <w:rPr>
+          <w:rFonts w:ascii="Times New Roman" w:hAnsi="Times New Roman" w:eastAsia="Times New Roman"/>
+          <w:b/>
+          <w:i w:val="0"/>
+          <w:color w:val="000000"/>
+          <w:sz w:val="28"/>
+        </w:rPr>
+        <w:t xml:space="preserve">• 15. </w:t>
+      </w:r>
+      <w:r>
+        <w:rPr>
+          <w:rFonts w:ascii="Times New Roman" w:hAnsi="Times New Roman" w:eastAsia="Times New Roman"/>
+          <w:b w:val="0"/>
+          <w:i w:val="0"/>
+          <w:color w:val="000000"/>
+          <w:sz w:val="28"/>
+        </w:rPr>
+        <w:t>Kết thúc hàm tra cứu.</w:t>
+      </w:r>
+    </w:p>
+    <w:p>
+      <w:pPr>
+        <w:spacing w:line="276" w:lineRule="auto" w:before="0" w:after="60"/>
         <w:jc w:val="left"/>
       </w:pPr>
       <w:r>
@@ -1929,7 +2516,7 @@
           <w:color w:val="0F4C5C"/>
           <w:sz w:val="28"/>
         </w:rPr>
-        <w:t>3) Đoạn mã thật lấy ý kiến của bốn mô hình:</w:t>
+        <w:t>3) Bốn mô hình cùng chấm một đường dẫn:</w:t>
       </w:r>
     </w:p>
     <w:tbl>
@@ -1960,27 +2547,51 @@
             </w:pPr>
             <w:r>
               <w:rPr>
-                <w:rFonts w:ascii="Courier New" w:hAnsi="Courier New" w:eastAsia="Courier New"/>
+                <w:rFonts w:ascii="Times New Roman" w:hAnsi="Times New Roman" w:eastAsia="Times New Roman"/>
                 <w:b w:val="0"/>
                 <w:i w:val="0"/>
                 <w:color w:val="0F172A"/>
                 <w:sz w:val="28"/>
               </w:rPr>
-              <w:t>const models = modelProbabilities(features);</w:t>
+              <w:t>function modelProbabilities(features) {</w:t>
               <w:br/>
-              <w:t>const probability = Object.values(models)</w:t>
+              <w:t xml:space="preserve">  const forest = model.models.random_forest.trees;</w:t>
               <w:br/>
-              <w:t xml:space="preserve">  .reduce((sum, value) =&gt; sum + value, 0) / 4;</w:t>
+              <w:t xml:space="preserve">  const boosting = model.models.gradient_boosting;</w:t>
               <w:br/>
-              <w:t>const prediction = probability &gt; 0.5</w:t>
+              <w:t xml:space="preserve">  const svm = model.models.svm;</w:t>
               <w:br/>
-              <w:t xml:space="preserve">  ? "phishing" : "legitimate";</w:t>
+              <w:t xml:space="preserve">  const logistic = model.models.logistic_regression;</w:t>
               <w:br/>
-              <w:t>const riskLevel = riskLevelForProbability(</w:t>
+              <w:t xml:space="preserve">  const probabilities = {</w:t>
               <w:br/>
-              <w:t xml:space="preserve">  probability, thresholds,</w:t>
+              <w:t xml:space="preserve">    random_forest: treeOutput(forest, features) / forest.length,</w:t>
               <w:br/>
-              <w:t>);</w:t>
+              <w:t xml:space="preserve">    gradient_boosting: sigmoid(boosting.initialRawScore + boosting.learningRate * treeOutput(boosting.trees, features)),</w:t>
+              <w:br/>
+              <w:t xml:space="preserve">    svm: sigmoid(-(svm.calibrationA * scaledDecision(features, svm) + svm.calibrationB)),</w:t>
+              <w:br/>
+              <w:t xml:space="preserve">    logistic_regression: sigmoid(scaledDecision(features, logistic)),</w:t>
+              <w:br/>
+              <w:t xml:space="preserve">  };</w:t>
+              <w:br/>
+              <w:t xml:space="preserve">  return probabilities;</w:t>
+              <w:br/>
+              <w:t>}</w:t>
+              <w:br/>
+              <w:t>function predict(features, thresholds = defaultThresholds) {</w:t>
+              <w:br/>
+              <w:t xml:space="preserve">  const models = modelProbabilities(features);</w:t>
+              <w:br/>
+              <w:t xml:space="preserve">  const probability = Object.values(models).reduce((sum, value) =&gt; sum + value, 0) / 4;</w:t>
+              <w:br/>
+              <w:t xml:space="preserve">  const prediction = probability &gt; 0.5 ? 'phishing' : 'legitimate';</w:t>
+              <w:br/>
+              <w:t xml:space="preserve">  const riskLevel = riskLevelForProbability(probability, thresholds);</w:t>
+              <w:br/>
+              <w:t xml:space="preserve">  return { prediction, probability, risk_level: riskLevel, models };</w:t>
+              <w:br/>
+              <w:t>}</w:t>
             </w:r>
           </w:p>
         </w:tc>
@@ -1988,7 +2599,23 @@
     </w:tbl>
     <w:p>
       <w:pPr>
-        <w:spacing w:line="264" w:lineRule="auto" w:before="0" w:after="100"/>
+        <w:spacing w:line="276" w:lineRule="auto" w:before="0" w:after="40"/>
+        <w:jc w:val="left"/>
+      </w:pPr>
+      <w:r>
+        <w:rPr>
+          <w:rFonts w:ascii="Times New Roman" w:hAnsi="Times New Roman" w:eastAsia="Times New Roman"/>
+          <w:b/>
+          <w:i w:val="0"/>
+          <w:color w:val="0F4C5C"/>
+          <w:sz w:val="28"/>
+        </w:rPr>
+        <w:t>Giải thích</w:t>
+      </w:r>
+    </w:p>
+    <w:p>
+      <w:pPr>
+        <w:spacing w:line="276" w:lineRule="auto" w:before="0" w:after="100"/>
         <w:ind w:left="340"/>
         <w:jc w:val="both"/>
       </w:pPr>
@@ -2000,7 +2627,7 @@
           <w:color w:val="000000"/>
           <w:sz w:val="28"/>
         </w:rPr>
-        <w:t xml:space="preserve">• Dòng 1: </w:t>
+        <w:t xml:space="preserve">• 1. </w:t>
       </w:r>
       <w:r>
         <w:rPr>
@@ -2010,12 +2637,12 @@
           <w:color w:val="000000"/>
           <w:sz w:val="28"/>
         </w:rPr>
-        <w:t>Yêu cầu từng mô hình tự chấm cùng một bộ dấu hiệu.</w:t>
+        <w:t>Hàm tạo ra bốn mức điểm riêng từ cùng một bộ dấu hiệu.</w:t>
       </w:r>
     </w:p>
     <w:p>
       <w:pPr>
-        <w:spacing w:line="264" w:lineRule="auto" w:before="0" w:after="100"/>
+        <w:spacing w:line="276" w:lineRule="auto" w:before="0" w:after="100"/>
         <w:ind w:left="340"/>
         <w:jc w:val="both"/>
       </w:pPr>
@@ -2027,7 +2654,7 @@
           <w:color w:val="000000"/>
           <w:sz w:val="28"/>
         </w:rPr>
-        <w:t xml:space="preserve">• Dòng 2–3: </w:t>
+        <w:t xml:space="preserve">• 2. </w:t>
       </w:r>
       <w:r>
         <w:rPr>
@@ -2037,12 +2664,12 @@
           <w:color w:val="000000"/>
           <w:sz w:val="28"/>
         </w:rPr>
-        <w:t>Cộng bốn điểm rồi chia bốn, giống như lấy điểm trung bình của bốn giám khảo.</w:t>
+        <w:t>Bắt đầu hàm tính điểm cho bốn mô hình.</w:t>
       </w:r>
     </w:p>
     <w:p>
       <w:pPr>
-        <w:spacing w:line="264" w:lineRule="auto" w:before="0" w:after="100"/>
+        <w:spacing w:line="276" w:lineRule="auto" w:before="0" w:after="100"/>
         <w:ind w:left="340"/>
         <w:jc w:val="both"/>
       </w:pPr>
@@ -2054,7 +2681,7 @@
           <w:color w:val="000000"/>
           <w:sz w:val="28"/>
         </w:rPr>
-        <w:t xml:space="preserve">• Dòng 4–5: </w:t>
+        <w:t xml:space="preserve">• 3. </w:t>
       </w:r>
       <w:r>
         <w:rPr>
@@ -2064,12 +2691,12 @@
           <w:color w:val="000000"/>
           <w:sz w:val="28"/>
         </w:rPr>
-        <w:t>Dùng mốc 50% để máy gắn nhãn nghi ngờ hoặc có vẻ hợp lệ.</w:t>
+        <w:t>Lấy các cây hỏi thuộc mô hình Rừng Ngẫu Nhiên.</w:t>
       </w:r>
     </w:p>
     <w:p>
       <w:pPr>
-        <w:spacing w:line="264" w:lineRule="auto" w:before="0" w:after="100"/>
+        <w:spacing w:line="276" w:lineRule="auto" w:before="0" w:after="100"/>
         <w:ind w:left="340"/>
         <w:jc w:val="both"/>
       </w:pPr>
@@ -2081,7 +2708,7 @@
           <w:color w:val="000000"/>
           <w:sz w:val="28"/>
         </w:rPr>
-        <w:t xml:space="preserve">• Dòng cuối: </w:t>
+        <w:t xml:space="preserve">• 4. </w:t>
       </w:r>
       <w:r>
         <w:rPr>
@@ -2091,7 +2718,439 @@
           <w:color w:val="000000"/>
           <w:sz w:val="28"/>
         </w:rPr>
-        <w:t>Đổi xác suất thành một trong các mức rủi ro đã cài đặt.</w:t>
+        <w:t>Lấy các lượt học nối tiếp của mô hình Tăng Cường Độ Dốc.</w:t>
+      </w:r>
+    </w:p>
+    <w:p>
+      <w:pPr>
+        <w:spacing w:line="276" w:lineRule="auto" w:before="0" w:after="100"/>
+        <w:ind w:left="340"/>
+        <w:jc w:val="both"/>
+      </w:pPr>
+      <w:r>
+        <w:rPr>
+          <w:rFonts w:ascii="Times New Roman" w:hAnsi="Times New Roman" w:eastAsia="Times New Roman"/>
+          <w:b/>
+          <w:i w:val="0"/>
+          <w:color w:val="000000"/>
+          <w:sz w:val="28"/>
+        </w:rPr>
+        <w:t xml:space="preserve">• 5. </w:t>
+      </w:r>
+      <w:r>
+        <w:rPr>
+          <w:rFonts w:ascii="Times New Roman" w:hAnsi="Times New Roman" w:eastAsia="Times New Roman"/>
+          <w:b w:val="0"/>
+          <w:i w:val="0"/>
+          <w:color w:val="000000"/>
+          <w:sz w:val="28"/>
+        </w:rPr>
+        <w:t>Lấy thông số ranh giới và hiệu chỉnh của Máy Véc-tơ Hỗ Trợ.</w:t>
+      </w:r>
+    </w:p>
+    <w:p>
+      <w:pPr>
+        <w:spacing w:line="276" w:lineRule="auto" w:before="0" w:after="100"/>
+        <w:ind w:left="340"/>
+        <w:jc w:val="both"/>
+      </w:pPr>
+      <w:r>
+        <w:rPr>
+          <w:rFonts w:ascii="Times New Roman" w:hAnsi="Times New Roman" w:eastAsia="Times New Roman"/>
+          <w:b/>
+          <w:i w:val="0"/>
+          <w:color w:val="000000"/>
+          <w:sz w:val="28"/>
+        </w:rPr>
+        <w:t xml:space="preserve">• 6. </w:t>
+      </w:r>
+      <w:r>
+        <w:rPr>
+          <w:rFonts w:ascii="Times New Roman" w:hAnsi="Times New Roman" w:eastAsia="Times New Roman"/>
+          <w:b w:val="0"/>
+          <w:i w:val="0"/>
+          <w:color w:val="000000"/>
+          <w:sz w:val="28"/>
+        </w:rPr>
+        <w:t>Lấy bảng trọng số của mô hình Hồi Quy Logic.</w:t>
+      </w:r>
+    </w:p>
+    <w:p>
+      <w:pPr>
+        <w:spacing w:line="276" w:lineRule="auto" w:before="0" w:after="100"/>
+        <w:ind w:left="340"/>
+        <w:jc w:val="both"/>
+      </w:pPr>
+      <w:r>
+        <w:rPr>
+          <w:rFonts w:ascii="Times New Roman" w:hAnsi="Times New Roman" w:eastAsia="Times New Roman"/>
+          <w:b/>
+          <w:i w:val="0"/>
+          <w:color w:val="000000"/>
+          <w:sz w:val="28"/>
+        </w:rPr>
+        <w:t xml:space="preserve">• 7. </w:t>
+      </w:r>
+      <w:r>
+        <w:rPr>
+          <w:rFonts w:ascii="Times New Roman" w:hAnsi="Times New Roman" w:eastAsia="Times New Roman"/>
+          <w:b w:val="0"/>
+          <w:i w:val="0"/>
+          <w:color w:val="000000"/>
+          <w:sz w:val="28"/>
+        </w:rPr>
+        <w:t>Bắt đầu gom bốn kết quả thành một danh sách.</w:t>
+      </w:r>
+    </w:p>
+    <w:p>
+      <w:pPr>
+        <w:spacing w:line="276" w:lineRule="auto" w:before="0" w:after="100"/>
+        <w:ind w:left="340"/>
+        <w:jc w:val="both"/>
+      </w:pPr>
+      <w:r>
+        <w:rPr>
+          <w:rFonts w:ascii="Times New Roman" w:hAnsi="Times New Roman" w:eastAsia="Times New Roman"/>
+          <w:b/>
+          <w:i w:val="0"/>
+          <w:color w:val="000000"/>
+          <w:sz w:val="28"/>
+        </w:rPr>
+        <w:t xml:space="preserve">• 8. </w:t>
+      </w:r>
+      <w:r>
+        <w:rPr>
+          <w:rFonts w:ascii="Times New Roman" w:hAnsi="Times New Roman" w:eastAsia="Times New Roman"/>
+          <w:b w:val="0"/>
+          <w:i w:val="0"/>
+          <w:color w:val="000000"/>
+          <w:sz w:val="28"/>
+        </w:rPr>
+        <w:t>Chấm bằng rừng câu hỏi rồi lấy trung bình phiếu của các cây.</w:t>
+      </w:r>
+    </w:p>
+    <w:p>
+      <w:pPr>
+        <w:spacing w:line="276" w:lineRule="auto" w:before="0" w:after="100"/>
+        <w:ind w:left="340"/>
+        <w:jc w:val="both"/>
+      </w:pPr>
+      <w:r>
+        <w:rPr>
+          <w:rFonts w:ascii="Times New Roman" w:hAnsi="Times New Roman" w:eastAsia="Times New Roman"/>
+          <w:b/>
+          <w:i w:val="0"/>
+          <w:color w:val="000000"/>
+          <w:sz w:val="28"/>
+        </w:rPr>
+        <w:t xml:space="preserve">• 9. </w:t>
+      </w:r>
+      <w:r>
+        <w:rPr>
+          <w:rFonts w:ascii="Times New Roman" w:hAnsi="Times New Roman" w:eastAsia="Times New Roman"/>
+          <w:b w:val="0"/>
+          <w:i w:val="0"/>
+          <w:color w:val="000000"/>
+          <w:sz w:val="28"/>
+        </w:rPr>
+        <w:t>Tính kết quả của các lượt sửa sai liên tiếp rồi đổi thành mức điểm.</w:t>
+      </w:r>
+    </w:p>
+    <w:p>
+      <w:pPr>
+        <w:spacing w:line="276" w:lineRule="auto" w:before="0" w:after="100"/>
+        <w:ind w:left="340"/>
+        <w:jc w:val="both"/>
+      </w:pPr>
+      <w:r>
+        <w:rPr>
+          <w:rFonts w:ascii="Times New Roman" w:hAnsi="Times New Roman" w:eastAsia="Times New Roman"/>
+          <w:b/>
+          <w:i w:val="0"/>
+          <w:color w:val="000000"/>
+          <w:sz w:val="28"/>
+        </w:rPr>
+        <w:t xml:space="preserve">• 10. </w:t>
+      </w:r>
+      <w:r>
+        <w:rPr>
+          <w:rFonts w:ascii="Times New Roman" w:hAnsi="Times New Roman" w:eastAsia="Times New Roman"/>
+          <w:b w:val="0"/>
+          <w:i w:val="0"/>
+          <w:color w:val="000000"/>
+          <w:sz w:val="28"/>
+        </w:rPr>
+        <w:t>Đổi độ lệch khỏi ranh giới thành mức điểm đã hiệu chỉnh.</w:t>
+      </w:r>
+    </w:p>
+    <w:p>
+      <w:pPr>
+        <w:spacing w:line="276" w:lineRule="auto" w:before="0" w:after="100"/>
+        <w:ind w:left="340"/>
+        <w:jc w:val="both"/>
+      </w:pPr>
+      <w:r>
+        <w:rPr>
+          <w:rFonts w:ascii="Times New Roman" w:hAnsi="Times New Roman" w:eastAsia="Times New Roman"/>
+          <w:b/>
+          <w:i w:val="0"/>
+          <w:color w:val="000000"/>
+          <w:sz w:val="28"/>
+        </w:rPr>
+        <w:t xml:space="preserve">• 11. </w:t>
+      </w:r>
+      <w:r>
+        <w:rPr>
+          <w:rFonts w:ascii="Times New Roman" w:hAnsi="Times New Roman" w:eastAsia="Times New Roman"/>
+          <w:b w:val="0"/>
+          <w:i w:val="0"/>
+          <w:color w:val="000000"/>
+          <w:sz w:val="28"/>
+        </w:rPr>
+        <w:t>Cộng dấu hiệu theo trọng số rồi đổi thành mức điểm.</w:t>
+      </w:r>
+    </w:p>
+    <w:p>
+      <w:pPr>
+        <w:spacing w:line="276" w:lineRule="auto" w:before="0" w:after="100"/>
+        <w:ind w:left="340"/>
+        <w:jc w:val="both"/>
+      </w:pPr>
+      <w:r>
+        <w:rPr>
+          <w:rFonts w:ascii="Times New Roman" w:hAnsi="Times New Roman" w:eastAsia="Times New Roman"/>
+          <w:b/>
+          <w:i w:val="0"/>
+          <w:color w:val="000000"/>
+          <w:sz w:val="28"/>
+        </w:rPr>
+        <w:t xml:space="preserve">• 12. </w:t>
+      </w:r>
+      <w:r>
+        <w:rPr>
+          <w:rFonts w:ascii="Times New Roman" w:hAnsi="Times New Roman" w:eastAsia="Times New Roman"/>
+          <w:b w:val="0"/>
+          <w:i w:val="0"/>
+          <w:color w:val="000000"/>
+          <w:sz w:val="28"/>
+        </w:rPr>
+        <w:t>Đóng danh sách điểm.</w:t>
+      </w:r>
+    </w:p>
+    <w:p>
+      <w:pPr>
+        <w:spacing w:line="276" w:lineRule="auto" w:before="0" w:after="100"/>
+        <w:ind w:left="340"/>
+        <w:jc w:val="both"/>
+      </w:pPr>
+      <w:r>
+        <w:rPr>
+          <w:rFonts w:ascii="Times New Roman" w:hAnsi="Times New Roman" w:eastAsia="Times New Roman"/>
+          <w:b/>
+          <w:i w:val="0"/>
+          <w:color w:val="000000"/>
+          <w:sz w:val="28"/>
+        </w:rPr>
+        <w:t xml:space="preserve">• 13. </w:t>
+      </w:r>
+      <w:r>
+        <w:rPr>
+          <w:rFonts w:ascii="Times New Roman" w:hAnsi="Times New Roman" w:eastAsia="Times New Roman"/>
+          <w:b w:val="0"/>
+          <w:i w:val="0"/>
+          <w:color w:val="000000"/>
+          <w:sz w:val="28"/>
+        </w:rPr>
+        <w:t>Gửi lại đủ bốn điểm riêng để bước kế tiếp sử dụng.</w:t>
+      </w:r>
+    </w:p>
+    <w:p>
+      <w:pPr>
+        <w:spacing w:line="276" w:lineRule="auto" w:before="0" w:after="100"/>
+        <w:ind w:left="340"/>
+        <w:jc w:val="both"/>
+      </w:pPr>
+      <w:r>
+        <w:rPr>
+          <w:rFonts w:ascii="Times New Roman" w:hAnsi="Times New Roman" w:eastAsia="Times New Roman"/>
+          <w:b/>
+          <w:i w:val="0"/>
+          <w:color w:val="000000"/>
+          <w:sz w:val="28"/>
+        </w:rPr>
+        <w:t xml:space="preserve">• 14. </w:t>
+      </w:r>
+      <w:r>
+        <w:rPr>
+          <w:rFonts w:ascii="Times New Roman" w:hAnsi="Times New Roman" w:eastAsia="Times New Roman"/>
+          <w:b w:val="0"/>
+          <w:i w:val="0"/>
+          <w:color w:val="000000"/>
+          <w:sz w:val="28"/>
+        </w:rPr>
+        <w:t>Bắt đầu hàm kết hợp kết quả.</w:t>
+      </w:r>
+    </w:p>
+    <w:p>
+      <w:pPr>
+        <w:spacing w:line="276" w:lineRule="auto" w:before="0" w:after="100"/>
+        <w:ind w:left="340"/>
+        <w:jc w:val="both"/>
+      </w:pPr>
+      <w:r>
+        <w:rPr>
+          <w:rFonts w:ascii="Times New Roman" w:hAnsi="Times New Roman" w:eastAsia="Times New Roman"/>
+          <w:b/>
+          <w:i w:val="0"/>
+          <w:color w:val="000000"/>
+          <w:sz w:val="28"/>
+        </w:rPr>
+        <w:t xml:space="preserve">• 15. </w:t>
+      </w:r>
+      <w:r>
+        <w:rPr>
+          <w:rFonts w:ascii="Times New Roman" w:hAnsi="Times New Roman" w:eastAsia="Times New Roman"/>
+          <w:b w:val="0"/>
+          <w:i w:val="0"/>
+          <w:color w:val="000000"/>
+          <w:sz w:val="28"/>
+        </w:rPr>
+        <w:t>Gọi cả bốn mô hình với cùng bộ dấu hiệu.</w:t>
+      </w:r>
+    </w:p>
+    <w:p>
+      <w:pPr>
+        <w:spacing w:line="276" w:lineRule="auto" w:before="0" w:after="100"/>
+        <w:ind w:left="340"/>
+        <w:jc w:val="both"/>
+      </w:pPr>
+      <w:r>
+        <w:rPr>
+          <w:rFonts w:ascii="Times New Roman" w:hAnsi="Times New Roman" w:eastAsia="Times New Roman"/>
+          <w:b/>
+          <w:i w:val="0"/>
+          <w:color w:val="000000"/>
+          <w:sz w:val="28"/>
+        </w:rPr>
+        <w:t xml:space="preserve">• 16. </w:t>
+      </w:r>
+      <w:r>
+        <w:rPr>
+          <w:rFonts w:ascii="Times New Roman" w:hAnsi="Times New Roman" w:eastAsia="Times New Roman"/>
+          <w:b w:val="0"/>
+          <w:i w:val="0"/>
+          <w:color w:val="000000"/>
+          <w:sz w:val="28"/>
+        </w:rPr>
+        <w:t>Cộng bốn điểm rồi chia đều, như lấy điểm chung của bốn giám khảo.</w:t>
+      </w:r>
+    </w:p>
+    <w:p>
+      <w:pPr>
+        <w:spacing w:line="276" w:lineRule="auto" w:before="0" w:after="100"/>
+        <w:ind w:left="340"/>
+        <w:jc w:val="both"/>
+      </w:pPr>
+      <w:r>
+        <w:rPr>
+          <w:rFonts w:ascii="Times New Roman" w:hAnsi="Times New Roman" w:eastAsia="Times New Roman"/>
+          <w:b/>
+          <w:i w:val="0"/>
+          <w:color w:val="000000"/>
+          <w:sz w:val="28"/>
+        </w:rPr>
+        <w:t xml:space="preserve">• 17. </w:t>
+      </w:r>
+      <w:r>
+        <w:rPr>
+          <w:rFonts w:ascii="Times New Roman" w:hAnsi="Times New Roman" w:eastAsia="Times New Roman"/>
+          <w:b w:val="0"/>
+          <w:i w:val="0"/>
+          <w:color w:val="000000"/>
+          <w:sz w:val="28"/>
+        </w:rPr>
+        <w:t>Nếu điểm chung lớn hơn một nửa, dự đoán thuộc nhóm lừa đảo; nếu không, thuộc nhóm hợp lệ.</w:t>
+      </w:r>
+    </w:p>
+    <w:p>
+      <w:pPr>
+        <w:spacing w:line="276" w:lineRule="auto" w:before="0" w:after="100"/>
+        <w:ind w:left="340"/>
+        <w:jc w:val="both"/>
+      </w:pPr>
+      <w:r>
+        <w:rPr>
+          <w:rFonts w:ascii="Times New Roman" w:hAnsi="Times New Roman" w:eastAsia="Times New Roman"/>
+          <w:b/>
+          <w:i w:val="0"/>
+          <w:color w:val="000000"/>
+          <w:sz w:val="28"/>
+        </w:rPr>
+        <w:t xml:space="preserve">• 18. </w:t>
+      </w:r>
+      <w:r>
+        <w:rPr>
+          <w:rFonts w:ascii="Times New Roman" w:hAnsi="Times New Roman" w:eastAsia="Times New Roman"/>
+          <w:b w:val="0"/>
+          <w:i w:val="0"/>
+          <w:color w:val="000000"/>
+          <w:sz w:val="28"/>
+        </w:rPr>
+        <w:t>Dùng các mốc 25%, 50% và 75% để xếp mức rủi ro.</w:t>
+      </w:r>
+    </w:p>
+    <w:p>
+      <w:pPr>
+        <w:spacing w:line="276" w:lineRule="auto" w:before="0" w:after="100"/>
+        <w:ind w:left="340"/>
+        <w:jc w:val="both"/>
+      </w:pPr>
+      <w:r>
+        <w:rPr>
+          <w:rFonts w:ascii="Times New Roman" w:hAnsi="Times New Roman" w:eastAsia="Times New Roman"/>
+          <w:b/>
+          <w:i w:val="0"/>
+          <w:color w:val="000000"/>
+          <w:sz w:val="28"/>
+        </w:rPr>
+        <w:t xml:space="preserve">• 19. </w:t>
+      </w:r>
+      <w:r>
+        <w:rPr>
+          <w:rFonts w:ascii="Times New Roman" w:hAnsi="Times New Roman" w:eastAsia="Times New Roman"/>
+          <w:b w:val="0"/>
+          <w:i w:val="0"/>
+          <w:color w:val="000000"/>
+          <w:sz w:val="28"/>
+        </w:rPr>
+        <w:t>Trả lại kết luận chung, xác suất và điểm riêng để người dùng xem xét.</w:t>
+      </w:r>
+    </w:p>
+    <w:p>
+      <w:pPr>
+        <w:spacing w:line="276" w:lineRule="auto" w:before="0" w:after="100"/>
+        <w:ind w:left="340"/>
+        <w:jc w:val="both"/>
+      </w:pPr>
+      <w:r>
+        <w:rPr>
+          <w:rFonts w:ascii="Times New Roman" w:hAnsi="Times New Roman" w:eastAsia="Times New Roman"/>
+          <w:b/>
+          <w:i w:val="0"/>
+          <w:color w:val="000000"/>
+          <w:sz w:val="28"/>
+        </w:rPr>
+        <w:t xml:space="preserve">• 20. </w:t>
+      </w:r>
+      <w:r>
+        <w:rPr>
+          <w:rFonts w:ascii="Times New Roman" w:hAnsi="Times New Roman" w:eastAsia="Times New Roman"/>
+          <w:b w:val="0"/>
+          <w:i w:val="0"/>
+          <w:color w:val="000000"/>
+          <w:sz w:val="28"/>
+        </w:rPr>
+        <w:t>Kết thúc hàm kết hợp.</w:t>
       </w:r>
     </w:p>
     <w:p>
@@ -2132,7 +3191,7 @@
     </w:p>
     <w:p>
       <w:pPr>
-        <w:spacing w:line="264" w:lineRule="auto" w:before="0" w:after="100"/>
+        <w:spacing w:line="276" w:lineRule="auto" w:before="0" w:after="100"/>
         <w:ind w:left="340"/>
         <w:jc w:val="both"/>
       </w:pPr>
@@ -2154,12 +3213,12 @@
           <w:color w:val="000000"/>
           <w:sz w:val="28"/>
         </w:rPr>
-        <w:t>Ở phiên bản thử nghiệm đầu tiên, nhóm chỉ dùng tệp dữ liệu nhỏ gồm 5.000 dòng địa chỉ cũ (urls.csv), đo ít dấu hiệu cơ bản và chỉ có 1 mô hình Rừng Ngẫu Nhiên. Khi gặp các trang web có tên miền mới lạ hoặc các trang lừa đảo tại Việt Nam, mô hình đơn lẻ dễ bị lúng túng, độ chính xác chỉ ở mức trung bình và báo lỗi khi người dùng gõ thiếu chữ https://.</w:t>
+        <w:t>Ở giai đoạn đầu, nhóm dùng khoảng 5.000 địa chỉ, một mô hình Rừng Ngẫu Nhiên và ít dấu hiệu hơn. Quy mô nhỏ và chỉ có một cách chấm khiến hệ thống có thể bỏ lỡ kiểu giả mạo mới; không còn phép đo cùng bộ thử để nêu một tỷ lệ chính xác đáng tin cậy cho phiên bản đó.</w:t>
       </w:r>
     </w:p>
     <w:p>
       <w:pPr>
-        <w:spacing w:line="264" w:lineRule="auto" w:before="0" w:after="100"/>
+        <w:spacing w:line="276" w:lineRule="auto" w:before="0" w:after="100"/>
         <w:ind w:left="340"/>
         <w:jc w:val="both"/>
       </w:pPr>
@@ -2171,7 +3230,7 @@
           <w:color w:val="000000"/>
           <w:sz w:val="28"/>
         </w:rPr>
-        <w:t xml:space="preserve">• Kết quả sau nâng cấp (các bản 2.3.0 đến 2.3.5): </w:t>
+        <w:t xml:space="preserve">• Kết quả ở các lần nâng cấp: </w:t>
       </w:r>
       <w:r>
         <w:rPr>
@@ -2181,7 +3240,7 @@
           <w:color w:val="000000"/>
           <w:sz w:val="28"/>
         </w:rPr>
-        <w:t>Hệ thống dùng 261.299 mẫu huấn luyện, kho tra cứu 36.261 địa chỉ, 55 dấu hiệu và bốn mô hình. Trên 6.624 địa chỉ kiểm thử, mô hình Tăng Cường Độ Dốc phát hiện 2.676 trên 2.799 trang lừa đảo, đạt 95,61%. Bản 2.3.5 còn có phiếu báo cáo loại suspected-phishing; phiếu được tạo thành tệp để người dùng tự tải, không tự gửi đường dẫn hoặc email đi nơi khác.</w:t>
+        <w:t>Nhóm mở rộng bộ dữ liệu học lên 261.299 địa chỉ, kho tra cứu có 36.261 hồ sơ, bộ đo có 55 dấu hiệu và hệ thống dùng bốn mô hình. Trên 6.624 địa chỉ được giữ riêng để thi thử, mô hình Tăng Cường Độ Dốc phát hiện 2.676 trong 2.799 trang lừa đảo (95,61%). SafeWeb có thêm biểu mẫu lập phiếu báo cáo loại suspected-phishing; phiếu được tạo thành tệp trên thiết bị, không tự gửi đi.</w:t>
       </w:r>
     </w:p>
     <w:p>
@@ -2204,7 +3263,7 @@
     </w:p>
     <w:p>
       <w:pPr>
-        <w:spacing w:line="264" w:lineRule="auto" w:before="0" w:after="120"/>
+        <w:spacing w:line="276" w:lineRule="auto" w:before="0" w:after="120"/>
         <w:jc w:val="both"/>
       </w:pPr>
       <w:r>
@@ -2215,12 +3274,12 @@
           <w:color w:val="000000"/>
           <w:sz w:val="28"/>
         </w:rPr>
-        <w:t>Cả 4 mô hình cùng làm bài kiểm tra trên 6.624 địa chỉ trang web giữ riêng (gồm 2.799 trang lừa đảo thật và 3.825 trang an toàn thật). Kết quả được phiên dịch sang các chỉ số tiếng Việt dễ hiểu tại Bảng 4.1:</w:t>
+        <w:t>Cả bốn mô hình cùng làm bài kiểm tra trên 6.624 địa chỉ được giữ riêng (2.799 trang lừa đảo và 3.825 trang hợp lệ). Các tên cột trong Bảng 4.1 được viết bằng tiếng Việt; số liệu là kết quả của đúng bộ thử này, không phải lời hứa cho mọi trang web.</w:t>
       </w:r>
     </w:p>
     <w:p>
       <w:pPr>
-        <w:spacing w:line="264" w:lineRule="auto" w:before="0" w:after="80"/>
+        <w:spacing w:line="276" w:lineRule="auto" w:before="0" w:after="80"/>
         <w:jc w:val="center"/>
       </w:pPr>
       <w:r>
@@ -2264,6 +3323,7 @@
           </w:tcPr>
           <w:p>
             <w:pPr>
+              <w:spacing w:line="276" w:lineRule="auto"/>
               <w:jc w:val="center"/>
             </w:pPr>
             <w:r>
@@ -2292,6 +3352,7 @@
           </w:tcPr>
           <w:p>
             <w:pPr>
+              <w:spacing w:line="276" w:lineRule="auto"/>
               <w:jc w:val="center"/>
             </w:pPr>
             <w:r>
@@ -2302,7 +3363,7 @@
                 <w:color w:val="FFFFFF"/>
                 <w:sz w:val="28"/>
               </w:rPr>
-              <w:t>Tỷ lệ đoán đúng tổng thể</w:t>
+              <w:t>Tỷ lệ đoán đúng chung</w:t>
             </w:r>
           </w:p>
         </w:tc>
@@ -2320,6 +3381,7 @@
           </w:tcPr>
           <w:p>
             <w:pPr>
+              <w:spacing w:line="276" w:lineRule="auto"/>
               <w:jc w:val="center"/>
             </w:pPr>
             <w:r>
@@ -2330,7 +3392,7 @@
                 <w:color w:val="FFFFFF"/>
                 <w:sz w:val="28"/>
               </w:rPr>
-              <w:t>Cảnh báo đúng là lừa đảo</w:t>
+              <w:t>Độ chuẩn xác khi báo động</w:t>
             </w:r>
           </w:p>
         </w:tc>
@@ -2348,6 +3410,7 @@
           </w:tcPr>
           <w:p>
             <w:pPr>
+              <w:spacing w:line="276" w:lineRule="auto"/>
               <w:jc w:val="center"/>
             </w:pPr>
             <w:r>
@@ -2358,7 +3421,7 @@
                 <w:color w:val="FFFFFF"/>
                 <w:sz w:val="28"/>
               </w:rPr>
-              <w:t>Tỷ lệ phát hiện lừa đảo</w:t>
+              <w:t>Tỷ lệ bắt trúng lừa đảo</w:t>
             </w:r>
           </w:p>
         </w:tc>
@@ -2376,6 +3439,7 @@
           </w:tcPr>
           <w:p>
             <w:pPr>
+              <w:spacing w:line="276" w:lineRule="auto"/>
               <w:jc w:val="center"/>
             </w:pPr>
             <w:r>
@@ -2386,7 +3450,7 @@
                 <w:color w:val="FFFFFF"/>
                 <w:sz w:val="28"/>
               </w:rPr>
-              <w:t>Điểm cân bằng chung</w:t>
+              <w:t>Điểm hiệu quả tổng hợp</w:t>
             </w:r>
           </w:p>
         </w:tc>
@@ -2404,6 +3468,7 @@
           </w:tcPr>
           <w:p>
             <w:pPr>
+              <w:spacing w:line="276" w:lineRule="auto"/>
               <w:jc w:val="center"/>
             </w:pPr>
             <w:r>
@@ -2414,7 +3479,7 @@
                 <w:color w:val="FFFFFF"/>
                 <w:sz w:val="28"/>
               </w:rPr>
-              <w:t>Số trang đúng / báo nhầm / bỏ sót / bắt trúng</w:t>
+              <w:t>Trang hợp lệ đoán đúng / Trang hợp lệ báo nhầm / Trang lừa đảo bỏ sót / Trang lừa đảo phát hiện</w:t>
             </w:r>
           </w:p>
         </w:tc>
@@ -2434,6 +3499,7 @@
           </w:tcPr>
           <w:p>
             <w:pPr>
+              <w:spacing w:line="276" w:lineRule="auto"/>
               <w:jc w:val="left"/>
             </w:pPr>
             <w:r>
@@ -2462,6 +3528,7 @@
           </w:tcPr>
           <w:p>
             <w:pPr>
+              <w:spacing w:line="276" w:lineRule="auto"/>
               <w:jc w:val="center"/>
             </w:pPr>
             <w:r>
@@ -2490,6 +3557,7 @@
           </w:tcPr>
           <w:p>
             <w:pPr>
+              <w:spacing w:line="276" w:lineRule="auto"/>
               <w:jc w:val="center"/>
             </w:pPr>
             <w:r>
@@ -2518,6 +3586,7 @@
           </w:tcPr>
           <w:p>
             <w:pPr>
+              <w:spacing w:line="276" w:lineRule="auto"/>
               <w:jc w:val="center"/>
             </w:pPr>
             <w:r>
@@ -2546,6 +3615,7 @@
           </w:tcPr>
           <w:p>
             <w:pPr>
+              <w:spacing w:line="276" w:lineRule="auto"/>
               <w:jc w:val="center"/>
             </w:pPr>
             <w:r>
@@ -2574,6 +3644,7 @@
           </w:tcPr>
           <w:p>
             <w:pPr>
+              <w:spacing w:line="276" w:lineRule="auto"/>
               <w:jc w:val="left"/>
             </w:pPr>
             <w:r>
@@ -2604,6 +3675,7 @@
           </w:tcPr>
           <w:p>
             <w:pPr>
+              <w:spacing w:line="276" w:lineRule="auto"/>
               <w:jc w:val="left"/>
             </w:pPr>
             <w:r>
@@ -2632,6 +3704,7 @@
           </w:tcPr>
           <w:p>
             <w:pPr>
+              <w:spacing w:line="276" w:lineRule="auto"/>
               <w:jc w:val="center"/>
             </w:pPr>
             <w:r>
@@ -2660,6 +3733,7 @@
           </w:tcPr>
           <w:p>
             <w:pPr>
+              <w:spacing w:line="276" w:lineRule="auto"/>
               <w:jc w:val="center"/>
             </w:pPr>
             <w:r>
@@ -2688,6 +3762,7 @@
           </w:tcPr>
           <w:p>
             <w:pPr>
+              <w:spacing w:line="276" w:lineRule="auto"/>
               <w:jc w:val="center"/>
             </w:pPr>
             <w:r>
@@ -2716,6 +3791,7 @@
           </w:tcPr>
           <w:p>
             <w:pPr>
+              <w:spacing w:line="276" w:lineRule="auto"/>
               <w:jc w:val="center"/>
             </w:pPr>
             <w:r>
@@ -2744,6 +3820,7 @@
           </w:tcPr>
           <w:p>
             <w:pPr>
+              <w:spacing w:line="276" w:lineRule="auto"/>
               <w:jc w:val="left"/>
             </w:pPr>
             <w:r>
@@ -2774,6 +3851,7 @@
           </w:tcPr>
           <w:p>
             <w:pPr>
+              <w:spacing w:line="276" w:lineRule="auto"/>
               <w:jc w:val="left"/>
             </w:pPr>
             <w:r>
@@ -2802,6 +3880,7 @@
           </w:tcPr>
           <w:p>
             <w:pPr>
+              <w:spacing w:line="276" w:lineRule="auto"/>
               <w:jc w:val="center"/>
             </w:pPr>
             <w:r>
@@ -2830,6 +3909,7 @@
           </w:tcPr>
           <w:p>
             <w:pPr>
+              <w:spacing w:line="276" w:lineRule="auto"/>
               <w:jc w:val="center"/>
             </w:pPr>
             <w:r>
@@ -2858,6 +3938,7 @@
           </w:tcPr>
           <w:p>
             <w:pPr>
+              <w:spacing w:line="276" w:lineRule="auto"/>
               <w:jc w:val="center"/>
             </w:pPr>
             <w:r>
@@ -2886,6 +3967,7 @@
           </w:tcPr>
           <w:p>
             <w:pPr>
+              <w:spacing w:line="276" w:lineRule="auto"/>
               <w:jc w:val="center"/>
             </w:pPr>
             <w:r>
@@ -2914,6 +3996,7 @@
           </w:tcPr>
           <w:p>
             <w:pPr>
+              <w:spacing w:line="276" w:lineRule="auto"/>
               <w:jc w:val="left"/>
             </w:pPr>
             <w:r>
@@ -2944,6 +4027,7 @@
           </w:tcPr>
           <w:p>
             <w:pPr>
+              <w:spacing w:line="276" w:lineRule="auto"/>
               <w:jc w:val="left"/>
             </w:pPr>
             <w:r>
@@ -2972,6 +4056,7 @@
           </w:tcPr>
           <w:p>
             <w:pPr>
+              <w:spacing w:line="276" w:lineRule="auto"/>
               <w:jc w:val="center"/>
             </w:pPr>
             <w:r>
@@ -3000,6 +4085,7 @@
           </w:tcPr>
           <w:p>
             <w:pPr>
+              <w:spacing w:line="276" w:lineRule="auto"/>
               <w:jc w:val="center"/>
             </w:pPr>
             <w:r>
@@ -3028,6 +4114,7 @@
           </w:tcPr>
           <w:p>
             <w:pPr>
+              <w:spacing w:line="276" w:lineRule="auto"/>
               <w:jc w:val="center"/>
             </w:pPr>
             <w:r>
@@ -3056,6 +4143,7 @@
           </w:tcPr>
           <w:p>
             <w:pPr>
+              <w:spacing w:line="276" w:lineRule="auto"/>
               <w:jc w:val="center"/>
             </w:pPr>
             <w:r>
@@ -3084,6 +4172,7 @@
           </w:tcPr>
           <w:p>
             <w:pPr>
+              <w:spacing w:line="276" w:lineRule="auto"/>
               <w:jc w:val="left"/>
             </w:pPr>
             <w:r>
@@ -3102,13 +4191,13 @@
     </w:tbl>
     <w:p>
       <w:pPr>
-        <w:spacing w:line="264" w:lineRule="auto" w:before="0" w:after="80"/>
+        <w:spacing w:line="276" w:lineRule="auto" w:before="0" w:after="80"/>
         <w:jc w:val="both"/>
       </w:pPr>
     </w:p>
     <w:p>
       <w:pPr>
-        <w:spacing w:line="264" w:lineRule="auto" w:before="0" w:after="100"/>
+        <w:spacing w:line="276" w:lineRule="auto" w:before="0" w:after="100"/>
         <w:ind w:left="340"/>
         <w:jc w:val="both"/>
       </w:pPr>
@@ -3130,7 +4219,7 @@
           <w:color w:val="000000"/>
           <w:sz w:val="28"/>
         </w:rPr>
-        <w:t>Trong 2.799 trang lừa đảo của đề thi, mô hình Tăng Cường Độ Dốc bắt trúng tới 2.676 trang (đạt 95,61%, tức là cứ 100 trang lừa đảo mới tinh thì bắt gọn gần 96 trang, chỉ sót 123 trang). Mô hình Rừng Ngẫu Nhiên đứng thứ hai khi bắt trúng 2.584 trang lừa đảo (92,32%) và nhận diện đúng 3.209 trang an toàn. Mô hình Hồi Quy Logic bắt trúng 2.458 trang (87,82%). Riêng mô hình Máy Véc-tơ Hỗ Trợ ở mức cài đặt hiện tại quá khắt khe: nó không báo oan cho bất kỳ trang an toàn nào (đúng 3.825/3.825 trang, hễ báo động là trúng 100%) nhưng chỉ bắt được 20 trang lừa đảo. Việc đặt cả 4 mô hình cạnh nhau giúp tận dụng tối đa khả năng truy quét 95,61% của các mô hình chủ lực.</w:t>
+        <w:t>Trong 2.799 trang lừa đảo của bộ thử, mô hình Tăng Cường Độ Dốc phát hiện 2.676 trang, tức gần 96 trong mỗi 100 trang, và bỏ sót 123. Độ chuẩn xác khi báo động là 79,76%: trong 100 cảnh báo, khoảng 80 đúng. Rừng Ngẫu Nhiên phát hiện 2.584 trang; Hồi Quy Logic phát hiện 2.458. Mô hình Máy Véc-tơ Hỗ Trợ chỉ phát hiện 20 trang và bỏ sót 2.779, nên đây là hạn chế cần xử lý, dù 20 cảnh báo của nó đều đúng trong bộ thử.</w:t>
       </w:r>
     </w:p>
     <w:p>
@@ -3153,7 +4242,7 @@
     </w:p>
     <w:p>
       <w:pPr>
-        <w:spacing w:line="264" w:lineRule="auto" w:before="0" w:after="120"/>
+        <w:spacing w:line="276" w:lineRule="auto" w:before="0" w:after="120"/>
         <w:jc w:val="both"/>
       </w:pPr>
       <w:r>
@@ -3169,7 +4258,7 @@
     </w:p>
     <w:p>
       <w:pPr>
-        <w:spacing w:line="264" w:lineRule="auto" w:before="0" w:after="100"/>
+        <w:spacing w:line="276" w:lineRule="auto" w:before="0" w:after="100"/>
         <w:ind w:left="340"/>
         <w:jc w:val="both"/>
       </w:pPr>
@@ -3196,7 +4285,7 @@
     </w:p>
     <w:p>
       <w:pPr>
-        <w:spacing w:line="264" w:lineRule="auto" w:before="0" w:after="100"/>
+        <w:spacing w:line="276" w:lineRule="auto" w:before="0" w:after="100"/>
         <w:ind w:left="340"/>
         <w:jc w:val="both"/>
       </w:pPr>
@@ -3218,12 +4307,12 @@
           <w:color w:val="000000"/>
           <w:sz w:val="28"/>
         </w:rPr>
-        <w:t>Thực hiện 16 bài kiểm tra tự động trên trình duyệt, gồm chuẩn hóa địa chỉ, tính điểm, tra cứu và hiển thị kết quả. Kết quả: Đạt 16 / 16 bài.</w:t>
+        <w:t>Thực hiện 16 bài kiểm thử tự động, bao gồm các thao tác nhập địa chỉ, chạy mô hình, đối chiếu kho dữ liệu và kiểm tra nội dung giao diện. Kết quả lần chạy hiện tại: đạt 16 / 16.</w:t>
       </w:r>
     </w:p>
     <w:p>
       <w:pPr>
-        <w:spacing w:line="264" w:lineRule="auto" w:before="0" w:after="100"/>
+        <w:spacing w:line="276" w:lineRule="auto" w:before="0" w:after="100"/>
         <w:ind w:left="340"/>
         <w:jc w:val="both"/>
       </w:pPr>
@@ -3245,12 +4334,12 @@
           <w:color w:val="000000"/>
           <w:sz w:val="28"/>
         </w:rPr>
-        <w:t>Cùng 16 trường hợp (10 địa chỉ hợp lệ, 6 địa chỉ không hợp lệ) được chạy qua bộ máy Python và bộ máy JavaScript trên trình duyệt. Các kết quả khớp; sai khác xác suất lớn nhất là 0,000000000000000749 do cách biểu diễn số thập phân, không phải khác biệt có ý nghĩa trong kết quả hiển thị.</w:t>
+        <w:t>So sánh cùng 16 trường hợp giữa Python và JavaScript: 10 địa chỉ hợp lệ và 6 địa chỉ không hợp lệ. Cả hai cùng xử lý đúng trạng thái hợp lệ/không hợp lệ; xác suất có sai khác rất nhỏ do cách máy tính làm tròn số, tối đa khoảng 0,00000000000000075, nên không gọi là giống tuyệt đối từng chữ số.</w:t>
       </w:r>
     </w:p>
     <w:p>
       <w:pPr>
-        <w:spacing w:line="264" w:lineRule="auto" w:before="0" w:after="100"/>
+        <w:spacing w:line="276" w:lineRule="auto" w:before="0" w:after="100"/>
         <w:ind w:left="340"/>
         <w:jc w:val="both"/>
       </w:pPr>
@@ -3272,7 +4361,7 @@
           <w:color w:val="000000"/>
           <w:sz w:val="28"/>
         </w:rPr>
-        <w:t>Xác minh cục bộ nghĩa là phần phân tích địa chỉ và chạy mô hình diễn ra ngay trên thiết bị, giống như tự dùng cuốn sổ tra cứu và dụng cụ kiểm tra ở nhà thay vì gửi địa chỉ cho người khác. Đường dẫn không được gửi đi trong chế độ này. Nếu bật kiểm tra trực tuyến, một phần thông tin sẽ được gửi tới dịch vụ bên ngoài; vì vậy người dùng cần xem thông báo và chỉ bật khi đồng ý.</w:t>
+        <w:t>Xử lý cục bộ giống như tự mở cuốn sổ tra cứu và dùng bốn người giám khảo ngay tại bàn của mình: địa chỉ được chuẩn hóa, dò kho dữ liệu và chấm điểm trong trình duyệt, không tự gửi đi dịch vụ bên ngoài. Nếu người dùng chủ động bật kiểm tra DNS hoặc ảnh xem trước, địa chỉ sẽ được chia sẻ với dịch vụ tương ứng; vì vậy không thể gọi mọi chế độ là hoàn toàn không gửi dữ liệu.</w:t>
       </w:r>
     </w:p>
     <w:p>
@@ -3316,7 +4405,7 @@
     </w:p>
     <w:p>
       <w:pPr>
-        <w:spacing w:line="264" w:lineRule="auto" w:before="0" w:after="160"/>
+        <w:spacing w:line="276" w:lineRule="auto" w:before="0" w:after="160"/>
         <w:jc w:val="center"/>
       </w:pPr>
       <w:r>
@@ -3350,7 +4439,7 @@
     </w:p>
     <w:p>
       <w:pPr>
-        <w:spacing w:line="264" w:lineRule="auto" w:before="0" w:after="120"/>
+        <w:spacing w:line="276" w:lineRule="auto" w:before="0" w:after="120"/>
         <w:jc w:val="both"/>
       </w:pPr>
       <w:r>
@@ -3366,7 +4455,7 @@
     </w:p>
     <w:p>
       <w:pPr>
-        <w:spacing w:line="264" w:lineRule="auto" w:before="0" w:after="100"/>
+        <w:spacing w:line="276" w:lineRule="auto" w:before="0" w:after="100"/>
         <w:ind w:left="340"/>
         <w:jc w:val="both"/>
       </w:pPr>
@@ -3393,7 +4482,7 @@
     </w:p>
     <w:p>
       <w:pPr>
-        <w:spacing w:line="264" w:lineRule="auto" w:before="0" w:after="100"/>
+        <w:spacing w:line="276" w:lineRule="auto" w:before="0" w:after="100"/>
         <w:ind w:left="340"/>
         <w:jc w:val="both"/>
       </w:pPr>
@@ -3420,7 +4509,7 @@
     </w:p>
     <w:p>
       <w:pPr>
-        <w:spacing w:line="264" w:lineRule="auto" w:before="0" w:after="100"/>
+        <w:spacing w:line="276" w:lineRule="auto" w:before="0" w:after="100"/>
         <w:ind w:left="340"/>
         <w:jc w:val="both"/>
       </w:pPr>
@@ -3442,7 +4531,7 @@
           <w:color w:val="000000"/>
           <w:sz w:val="28"/>
         </w:rPr>
-        <w:t>Nhìn màu cảnh báo: Xanh là rủi ro thấp, Vàng là cần thận trọng, Cam là nguy cơ cao, Đỏ là nguy cơ rất cao. Đọc lý do và điểm của từng mô hình; có thể mở kho tra cứu hoặc tạo phiếu báo cáo.</w:t>
+        <w:t>Nhìn màu sắc cảnh báo (Xanh = Thấp, Vàng = Thận trọng, Đỏ = Nguy hiểm), xem điểm của 4 mô hình AI, đọc lý do cụ thể tại ô 'Vì sao có kết quả này?' hoặc tra cứu thêm trong 'Kho Dữ Liệu PhishVN'.</w:t>
       </w:r>
     </w:p>
     <w:p>
@@ -3486,7 +4575,7 @@
     </w:p>
     <w:p>
       <w:pPr>
-        <w:spacing w:line="264" w:lineRule="auto" w:before="0" w:after="120"/>
+        <w:spacing w:line="276" w:lineRule="auto" w:before="0" w:after="120"/>
         <w:jc w:val="center"/>
       </w:pPr>
       <w:r>
@@ -3541,7 +4630,7 @@
     </w:p>
     <w:p>
       <w:pPr>
-        <w:spacing w:line="264" w:lineRule="auto" w:before="0" w:after="160"/>
+        <w:spacing w:line="276" w:lineRule="auto" w:before="0" w:after="160"/>
         <w:jc w:val="center"/>
       </w:pPr>
       <w:r>
@@ -3552,7 +4641,7 @@
           <w:color w:val="000000"/>
           <w:sz w:val="28"/>
         </w:rPr>
-        <w:t>Hình 4.3. Ảnh chụp giao diện thực tế của SafeWeb phiên bản 2.3.5.</w:t>
+        <w:t>Hình 4.3. Giao diện SafeWeb.</w:t>
       </w:r>
     </w:p>
     <w:p>
@@ -3593,7 +4682,7 @@
     </w:p>
     <w:p>
       <w:pPr>
-        <w:spacing w:line="264" w:lineRule="auto" w:before="0" w:after="100"/>
+        <w:spacing w:line="276" w:lineRule="auto" w:before="0" w:after="100"/>
         <w:ind w:left="340"/>
         <w:jc w:val="both"/>
       </w:pPr>
@@ -3605,7 +4694,7 @@
           <w:color w:val="000000"/>
           <w:sz w:val="28"/>
         </w:rPr>
-        <w:t xml:space="preserve">• Kết quả nhận diện và thông tin đọc được cao hơn các công cụ kiểm tra đơn lẻ trên thị trường: </w:t>
+        <w:t xml:space="preserve">• Đóng góp của dự án: </w:t>
       </w:r>
       <w:r>
         <w:rPr>
@@ -3615,12 +4704,12 @@
           <w:color w:val="000000"/>
           <w:sz w:val="28"/>
         </w:rPr>
-        <w:t>Điểm mới của SafeWeb là kết hợp kho địa chỉ đã ghi nhận, 55 dấu hiệu và bốn cách chấm điểm độc lập, rồi giải thích kết quả để người dùng tự cân nhắc trước khi mở đường dẫn. Trong phép thử nội bộ trên 6.624 địa chỉ, mô hình Tăng Cường Độ Dốc phát hiện 95,61% địa chỉ lừa đảo. Nhóm chưa thực hiện phép thử trực tiếp với từng sản phẩm trên thị trường, nên chưa thể kết luận SafeWeb chính xác hơn mọi công cụ đơn lẻ.</w:t>
+        <w:t>SafeWeb đặt cạnh nhau ba loại thông tin: hồ sơ đã có trong kho, dấu hiệu cấu trúc của địa chỉ và ý kiến của bốn mô hình. Trên bộ thử tên miền tách riêng, mô hình Tăng Cường Độ Dốc phát hiện 95,61% trang lừa đảo. Dự án chưa thử đối chứng trực tiếp với các dịch vụ ngoài thị trường, nên không kết luận mình chính xác hơn mọi công cụ khác.</w:t>
       </w:r>
     </w:p>
     <w:p>
       <w:pPr>
-        <w:spacing w:line="264" w:lineRule="auto" w:before="0" w:after="100"/>
+        <w:spacing w:line="276" w:lineRule="auto" w:before="0" w:after="100"/>
         <w:ind w:left="340"/>
         <w:jc w:val="both"/>
       </w:pPr>
@@ -3632,7 +4721,7 @@
           <w:color w:val="000000"/>
           <w:sz w:val="28"/>
         </w:rPr>
-        <w:t xml:space="preserve">• Giúp người dùng chủ động phán đoán và kiểm tra an toàn trước khi kích hoạt đường dẫn: </w:t>
+        <w:t xml:space="preserve">• Giúp người dùng xem xét trước khi bấm: </w:t>
       </w:r>
       <w:r>
         <w:rPr>
@@ -3642,7 +4731,7 @@
           <w:color w:val="000000"/>
           <w:sz w:val="28"/>
         </w:rPr>
-        <w:t>Trước khi bấm đường dẫn lạ, người dùng có thể xem màu cảnh báo, ý kiến từng mô hình, dấu hiệu bất thường, ảnh xem trước nếu đã đồng ý kiểm tra trực tuyến và các ví dụ đủ gần trong kho dữ liệu. Những thông tin này hỗ trợ người dùng tự quyết định, không thay thế việc xác minh qua kênh chính thức.</w:t>
+        <w:t>Màu cảnh báo, điểm từng mô hình, lý do và ví dụ gần giống giúp người dùng có thêm căn cứ để tự quyết định. Kết quả là lời nhắc để kiểm tra kỹ, không thay thế việc xác minh qua ngân hàng, nhà cung cấp dịch vụ hoặc người gửi chính thức.</w:t>
       </w:r>
     </w:p>
     <w:p>
@@ -3665,7 +4754,7 @@
     </w:p>
     <w:p>
       <w:pPr>
-        <w:spacing w:line="264" w:lineRule="auto" w:before="0" w:after="120"/>
+        <w:spacing w:line="276" w:lineRule="auto" w:before="0" w:after="120"/>
         <w:jc w:val="both"/>
       </w:pPr>
       <w:r>
@@ -3676,7 +4765,7 @@
           <w:color w:val="000000"/>
           <w:sz w:val="28"/>
         </w:rPr>
-        <w:t>SafeWeb phiên bản 2.3.5 hoàn thành các mục tiêu thiết kế và vượt qua 59 bài kiểm tra xử lý dữ liệu, 16 bài kiểm tra trình duyệt. Mô hình Tăng Cường Độ Dốc phát hiện 95,61% địa chỉ lừa đảo trong bộ kiểm thử đã nêu. Hạn chế đáng chú ý là mô hình Máy Véc-tơ Hỗ Trợ hiện bỏ sót phần lớn địa chỉ lừa đảo ở ngưỡng đang dùng; cần điều chỉnh trước khi dựa vào ý kiến riêng của mô hình này. Phiếu báo cáo hiện được lưu thành tệp trên thiết bị, chưa có máy chủ tiếp nhận tự động.</w:t>
+        <w:t>SafeWeb có bộ tra cứu, bốn mô hình, giao diện giải thích kết quả và biểu mẫu tạo phiếu phản hồi. Trong phép thử hiện có, mô hình Tăng Cường Độ Dốc phát hiện 95,61% trang lừa đảo; mô hình Máy Véc-tơ Hỗ Trợ còn bỏ sót nhiều trường hợp và cần được hiệu chỉnh. Mọi con số đều phụ thuộc vào bộ dữ liệu và cách thử đã nêu.</w:t>
       </w:r>
     </w:p>
     <w:p>
@@ -3699,7 +4788,7 @@
     </w:p>
     <w:p>
       <w:pPr>
-        <w:spacing w:line="264" w:lineRule="auto" w:before="0" w:after="120"/>
+        <w:spacing w:line="276" w:lineRule="auto" w:before="0" w:after="120"/>
         <w:jc w:val="both"/>
       </w:pPr>
       <w:r>
@@ -3710,7 +4799,7 @@
           <w:color w:val="000000"/>
           <w:sz w:val="28"/>
         </w:rPr>
-        <w:t>Trong giai đoạn tiếp theo, nhóm sẽ phát triển SafeWeb thành Tiện ích mở rộng gắn trực tiếp vào trình duyệt web. Khi người dùng lướt mạng xã hội, đọc tin nhắn hay thư điện tử, tiện ích sẽ tự động quét các đường dẫn đang hiển thị trong tầm mắt trên màn hình, chấm điểm ngầm ngay trên máy và gắn biểu tượng cảnh báo sớm ngay cạnh đường dẫn độc hại trước khi người dùng kịp bấm chuột vào.</w:t>
+        <w:t>Trong giai đoạn tiếp theo, nhóm dự kiến phát triển SafeWeb thành tiện ích gắn trực tiếp vào trình duyệt. Khi người dùng xem mạng xã hội, tin nhắn hoặc thư điện tử, tiện ích có thể rà các đường dẫn đang hiện trên màn hình và đặt dấu cảnh báo trước khi người dùng bấm. Đây là hướng phát triển, chưa phải tính năng hiện có.</w:t>
       </w:r>
     </w:p>
     <w:p>
@@ -3728,12 +4817,12 @@
           <w:color w:val="0F4C5C"/>
           <w:sz w:val="28"/>
         </w:rPr>
-        <w:t>TÀI LIỆU THAM KHẢO</w:t>
+        <w:t>TÀI LIỆU THAM KHẢO VÀ CÔNG CỤ</w:t>
       </w:r>
     </w:p>
     <w:p>
       <w:pPr>
-        <w:spacing w:line="264" w:lineRule="auto" w:before="0" w:after="100"/>
+        <w:spacing w:line="276" w:lineRule="auto" w:before="0" w:after="100"/>
         <w:ind w:left="340"/>
         <w:jc w:val="both"/>
       </w:pPr>
@@ -3745,7 +4834,7 @@
           <w:color w:val="000000"/>
           <w:sz w:val="28"/>
         </w:rPr>
-        <w:t xml:space="preserve">• 1. Bộ dữ liệu PhishVN, phiên bản 3.1.0 (2026): </w:t>
+        <w:t xml:space="preserve">• 1. Bộ dữ liệu địa chỉ trang web tiếng Việt: </w:t>
       </w:r>
       <w:r>
         <w:rPr>
@@ -3755,12 +4844,12 @@
           <w:color w:val="000000"/>
           <w:sz w:val="28"/>
         </w:rPr>
-        <w:t>Dùng làm kho địa chỉ tham chiếu và phần dữ liệu kiểm thử có tên miền tách biệt.</w:t>
+        <w:t>Dùng làm nguồn hồ sơ tra cứu và một phần bài học, đề thi của dự án.</w:t>
       </w:r>
     </w:p>
     <w:p>
       <w:pPr>
-        <w:spacing w:line="264" w:lineRule="auto" w:before="0" w:after="100"/>
+        <w:spacing w:line="276" w:lineRule="auto" w:before="0" w:after="100"/>
         <w:ind w:left="340"/>
         <w:jc w:val="both"/>
       </w:pPr>
@@ -3772,7 +4861,7 @@
           <w:color w:val="000000"/>
           <w:sz w:val="28"/>
         </w:rPr>
-        <w:t xml:space="preserve">• 2. Bộ dữ liệu địa chỉ trang web PhiUSIIL: </w:t>
+        <w:t xml:space="preserve">• 2. Bộ dữ liệu địa chỉ web mở rộng: </w:t>
       </w:r>
       <w:r>
         <w:rPr>
@@ -3782,12 +4871,12 @@
           <w:color w:val="000000"/>
           <w:sz w:val="28"/>
         </w:rPr>
-        <w:t>Bổ sung mẫu để huấn luyện các mô hình nhận biết nhiều dạng địa chỉ khác nhau.</w:t>
+        <w:t>Bổ sung nhiều kiểu địa chỉ để các mô hình học thêm dấu hiệu đa dạng.</w:t>
       </w:r>
     </w:p>
     <w:p>
       <w:pPr>
-        <w:spacing w:line="264" w:lineRule="auto" w:before="0" w:after="100"/>
+        <w:spacing w:line="276" w:lineRule="auto" w:before="0" w:after="100"/>
         <w:ind w:left="340"/>
         <w:jc w:val="both"/>
       </w:pPr>
@@ -3799,7 +4888,7 @@
           <w:color w:val="000000"/>
           <w:sz w:val="28"/>
         </w:rPr>
-        <w:t xml:space="preserve">• 3. Tài liệu Python và thư viện scikit-learn: </w:t>
+        <w:t xml:space="preserve">• 3. Thư viện scikit-learn và ngôn ngữ Python: </w:t>
       </w:r>
       <w:r>
         <w:rPr>
@@ -3809,12 +4898,12 @@
           <w:color w:val="000000"/>
           <w:sz w:val="28"/>
         </w:rPr>
-        <w:t>Dùng để xử lý dữ liệu, huấn luyện bốn mô hình và tính các chỉ số đánh giá.</w:t>
+        <w:t>Dùng để huấn luyện, chấm điểm và thống kê bốn mô hình.</w:t>
       </w:r>
     </w:p>
     <w:p>
       <w:pPr>
-        <w:spacing w:line="264" w:lineRule="auto" w:before="0" w:after="100"/>
+        <w:spacing w:line="276" w:lineRule="auto" w:before="0" w:after="100"/>
         <w:ind w:left="340"/>
         <w:jc w:val="both"/>
       </w:pPr>
@@ -3826,7 +4915,7 @@
           <w:color w:val="000000"/>
           <w:sz w:val="28"/>
         </w:rPr>
-        <w:t xml:space="preserve">• 4. Tài liệu chuẩn về địa chỉ web, giao thức truyền tải, DNS và GitHub Pages: </w:t>
+        <w:t xml:space="preserve">• 4. Các quy chuẩn kỹ thuật về địa chỉ web và tên miền (RFC 3986, RFC 9110, RFC 1035): </w:t>
       </w:r>
       <w:r>
         <w:rPr>
@@ -3836,7 +4925,7 @@
           <w:color w:val="000000"/>
           <w:sz w:val="28"/>
         </w:rPr>
-        <w:t>Dùng để phân tích cấu trúc địa chỉ, giải thích việc tra cứu tên miền và mô tả nơi triển khai trang tĩnh.</w:t>
+        <w:t>Dùng để tách, chuẩn hóa và kiểm tra thành phần địa chỉ.</w:t>
       </w:r>
     </w:p>
     <w:p>
@@ -3854,7 +4943,7 @@
           <w:color w:val="0F4C5C"/>
           <w:sz w:val="28"/>
         </w:rPr>
-        <w:t>PHỤ LỤC: GIẢI NGHĨA NGẮN GỌN MỘT SỐ TÊN GỌI</w:t>
+        <w:t>PHỤ LỤC: TÁM TÊN GỌI CỐT LÕI</w:t>
       </w:r>
     </w:p>
     <w:tbl>
@@ -3884,6 +4973,7 @@
           </w:tcPr>
           <w:p>
             <w:pPr>
+              <w:spacing w:line="276" w:lineRule="auto"/>
               <w:jc w:val="center"/>
             </w:pPr>
             <w:r>
@@ -3894,7 +4984,7 @@
                 <w:color w:val="FFFFFF"/>
                 <w:sz w:val="28"/>
               </w:rPr>
-              <w:t>Tên gọi</w:t>
+              <w:t>Tên gọi tiếng Việt</w:t>
             </w:r>
           </w:p>
         </w:tc>
@@ -3912,6 +5002,7 @@
           </w:tcPr>
           <w:p>
             <w:pPr>
+              <w:spacing w:line="276" w:lineRule="auto"/>
               <w:jc w:val="center"/>
             </w:pPr>
             <w:r>
@@ -3922,7 +5013,7 @@
                 <w:color w:val="FFFFFF"/>
                 <w:sz w:val="28"/>
               </w:rPr>
-              <w:t>Nghĩa tiếng Việt</w:t>
+              <w:t>Tên kỹ thuật</w:t>
             </w:r>
           </w:p>
         </w:tc>
@@ -3940,6 +5031,7 @@
           </w:tcPr>
           <w:p>
             <w:pPr>
+              <w:spacing w:line="276" w:lineRule="auto"/>
               <w:jc w:val="center"/>
             </w:pPr>
             <w:r>
@@ -3950,7 +5042,7 @@
                 <w:color w:val="FFFFFF"/>
                 <w:sz w:val="28"/>
               </w:rPr>
-              <w:t>Giải thích dễ hiểu</w:t>
+              <w:t>Giải thích đời thường</w:t>
             </w:r>
           </w:p>
         </w:tc>
@@ -3970,12 +5062,42 @@
           </w:tcPr>
           <w:p>
             <w:pPr>
+              <w:spacing w:line="276" w:lineRule="auto"/>
               <w:jc w:val="left"/>
             </w:pPr>
             <w:r>
               <w:rPr>
                 <w:rFonts w:ascii="Times New Roman" w:hAnsi="Times New Roman" w:eastAsia="Times New Roman"/>
                 <w:b/>
+                <w:i w:val="0"/>
+                <w:color w:val="000000"/>
+                <w:sz w:val="28"/>
+              </w:rPr>
+              <w:t>Đường dẫn trang web</w:t>
+            </w:r>
+          </w:p>
+        </w:tc>
+        <w:tc>
+          <w:tcPr>
+            <w:tcW w:type="dxa" w:w="3024"/>
+            <w:shd w:fill="FFFFFF"/>
+            <w:tcMar>
+              <w:top w:w="90" w:type="dxa"/>
+              <w:bottom w:w="90" w:type="dxa"/>
+              <w:left w:w="120" w:type="dxa"/>
+              <w:right w:w="120" w:type="dxa"/>
+            </w:tcMar>
+            <w:vAlign w:val="center"/>
+          </w:tcPr>
+          <w:p>
+            <w:pPr>
+              <w:spacing w:line="276" w:lineRule="auto"/>
+              <w:jc w:val="center"/>
+            </w:pPr>
+            <w:r>
+              <w:rPr>
+                <w:rFonts w:ascii="Times New Roman" w:hAnsi="Times New Roman" w:eastAsia="Times New Roman"/>
+                <w:b w:val="0"/>
                 <w:i w:val="0"/>
                 <w:color w:val="000000"/>
                 <w:sz w:val="28"/>
@@ -3998,34 +5120,7 @@
           </w:tcPr>
           <w:p>
             <w:pPr>
-              <w:jc w:val="center"/>
-            </w:pPr>
-            <w:r>
-              <w:rPr>
-                <w:rFonts w:ascii="Times New Roman" w:hAnsi="Times New Roman" w:eastAsia="Times New Roman"/>
-                <w:b w:val="0"/>
-                <w:i w:val="0"/>
-                <w:color w:val="000000"/>
-                <w:sz w:val="28"/>
-              </w:rPr>
-              <w:t>Đường dẫn trang web</w:t>
-            </w:r>
-          </w:p>
-        </w:tc>
-        <w:tc>
-          <w:tcPr>
-            <w:tcW w:type="dxa" w:w="3024"/>
-            <w:shd w:fill="FFFFFF"/>
-            <w:tcMar>
-              <w:top w:w="90" w:type="dxa"/>
-              <w:bottom w:w="90" w:type="dxa"/>
-              <w:left w:w="120" w:type="dxa"/>
-              <w:right w:w="120" w:type="dxa"/>
-            </w:tcMar>
-            <w:vAlign w:val="center"/>
-          </w:tcPr>
-          <w:p>
-            <w:pPr>
+              <w:spacing w:line="276" w:lineRule="auto"/>
               <w:jc w:val="left"/>
             </w:pPr>
             <w:r>
@@ -4036,7 +5131,7 @@
                 <w:color w:val="000000"/>
                 <w:sz w:val="28"/>
               </w:rPr>
-              <w:t>Địa chỉ dẫn tới một trang trên mạng, giống số nhà và tên đường.</w:t>
+              <w:t>Địa chỉ để đi đến một trang, giống số nhà và tên đường.</w:t>
             </w:r>
           </w:p>
         </w:tc>
@@ -4056,12 +5151,42 @@
           </w:tcPr>
           <w:p>
             <w:pPr>
+              <w:spacing w:line="276" w:lineRule="auto"/>
               <w:jc w:val="left"/>
             </w:pPr>
             <w:r>
               <w:rPr>
                 <w:rFonts w:ascii="Times New Roman" w:hAnsi="Times New Roman" w:eastAsia="Times New Roman"/>
                 <w:b/>
+                <w:i w:val="0"/>
+                <w:color w:val="000000"/>
+                <w:sz w:val="28"/>
+              </w:rPr>
+              <w:t>Trang web lừa đảo</w:t>
+            </w:r>
+          </w:p>
+        </w:tc>
+        <w:tc>
+          <w:tcPr>
+            <w:tcW w:type="dxa" w:w="3024"/>
+            <w:shd w:fill="F8FAFC"/>
+            <w:tcMar>
+              <w:top w:w="90" w:type="dxa"/>
+              <w:bottom w:w="90" w:type="dxa"/>
+              <w:left w:w="120" w:type="dxa"/>
+              <w:right w:w="120" w:type="dxa"/>
+            </w:tcMar>
+            <w:vAlign w:val="center"/>
+          </w:tcPr>
+          <w:p>
+            <w:pPr>
+              <w:spacing w:line="276" w:lineRule="auto"/>
+              <w:jc w:val="center"/>
+            </w:pPr>
+            <w:r>
+              <w:rPr>
+                <w:rFonts w:ascii="Times New Roman" w:hAnsi="Times New Roman" w:eastAsia="Times New Roman"/>
+                <w:b w:val="0"/>
                 <w:i w:val="0"/>
                 <w:color w:val="000000"/>
                 <w:sz w:val="28"/>
@@ -4084,34 +5209,7 @@
           </w:tcPr>
           <w:p>
             <w:pPr>
-              <w:jc w:val="center"/>
-            </w:pPr>
-            <w:r>
-              <w:rPr>
-                <w:rFonts w:ascii="Times New Roman" w:hAnsi="Times New Roman" w:eastAsia="Times New Roman"/>
-                <w:b w:val="0"/>
-                <w:i w:val="0"/>
-                <w:color w:val="000000"/>
-                <w:sz w:val="28"/>
-              </w:rPr>
-              <w:t>Trang giả mạo để lừa đảo</w:t>
-            </w:r>
-          </w:p>
-        </w:tc>
-        <w:tc>
-          <w:tcPr>
-            <w:tcW w:type="dxa" w:w="3024"/>
-            <w:shd w:fill="F8FAFC"/>
-            <w:tcMar>
-              <w:top w:w="90" w:type="dxa"/>
-              <w:bottom w:w="90" w:type="dxa"/>
-              <w:left w:w="120" w:type="dxa"/>
-              <w:right w:w="120" w:type="dxa"/>
-            </w:tcMar>
-            <w:vAlign w:val="center"/>
-          </w:tcPr>
-          <w:p>
-            <w:pPr>
+              <w:spacing w:line="276" w:lineRule="auto"/>
               <w:jc w:val="left"/>
             </w:pPr>
             <w:r>
@@ -4122,7 +5220,7 @@
                 <w:color w:val="000000"/>
                 <w:sz w:val="28"/>
               </w:rPr>
-              <w:t>Trang nhái cửa hàng thật để dụ khách đưa tiền hoặc mật khẩu.</w:t>
+              <w:t>Trang giả mạo nhằm dụ người xem giao mật khẩu hoặc tiền.</w:t>
             </w:r>
           </w:p>
         </w:tc>
@@ -4142,6 +5240,7 @@
           </w:tcPr>
           <w:p>
             <w:pPr>
+              <w:spacing w:line="276" w:lineRule="auto"/>
               <w:jc w:val="left"/>
             </w:pPr>
             <w:r>
@@ -4152,7 +5251,7 @@
                 <w:color w:val="000000"/>
                 <w:sz w:val="28"/>
               </w:rPr>
-              <w:t>HTTPS</w:t>
+              <w:t>Tên miền</w:t>
             </w:r>
           </w:p>
         </w:tc>
@@ -4170,6 +5269,7 @@
           </w:tcPr>
           <w:p>
             <w:pPr>
+              <w:spacing w:line="276" w:lineRule="auto"/>
               <w:jc w:val="center"/>
             </w:pPr>
             <w:r>
@@ -4180,7 +5280,7 @@
                 <w:color w:val="000000"/>
                 <w:sz w:val="28"/>
               </w:rPr>
-              <w:t>Kết nối có mã hóa</w:t>
+              <w:t>Domain</w:t>
             </w:r>
           </w:p>
         </w:tc>
@@ -4198,6 +5298,7 @@
           </w:tcPr>
           <w:p>
             <w:pPr>
+              <w:spacing w:line="276" w:lineRule="auto"/>
               <w:jc w:val="left"/>
             </w:pPr>
             <w:r>
@@ -4208,7 +5309,7 @@
                 <w:color w:val="000000"/>
                 <w:sz w:val="28"/>
               </w:rPr>
-              <w:t>Khóa bảo vệ đường truyền, nhưng không chứng minh chủ trang là đáng tin.</w:t>
+              <w:t>Tên dễ nhớ thay cho dãy số của máy chủ, như tên một cửa hàng.</w:t>
             </w:r>
           </w:p>
         </w:tc>
@@ -4228,6 +5329,7 @@
           </w:tcPr>
           <w:p>
             <w:pPr>
+              <w:spacing w:line="276" w:lineRule="auto"/>
               <w:jc w:val="left"/>
             </w:pPr>
             <w:r>
@@ -4238,7 +5340,7 @@
                 <w:color w:val="000000"/>
                 <w:sz w:val="28"/>
               </w:rPr>
-              <w:t>DNS</w:t>
+              <w:t>Kết nối HTTPS</w:t>
             </w:r>
           </w:p>
         </w:tc>
@@ -4256,6 +5358,7 @@
           </w:tcPr>
           <w:p>
             <w:pPr>
+              <w:spacing w:line="276" w:lineRule="auto"/>
               <w:jc w:val="center"/>
             </w:pPr>
             <w:r>
@@ -4266,7 +5369,7 @@
                 <w:color w:val="000000"/>
                 <w:sz w:val="28"/>
               </w:rPr>
-              <w:t>Danh bạ tên miền</w:t>
+              <w:t>HTTPS</w:t>
             </w:r>
           </w:p>
         </w:tc>
@@ -4284,6 +5387,7 @@
           </w:tcPr>
           <w:p>
             <w:pPr>
+              <w:spacing w:line="276" w:lineRule="auto"/>
               <w:jc w:val="left"/>
             </w:pPr>
             <w:r>
@@ -4294,7 +5398,7 @@
                 <w:color w:val="000000"/>
                 <w:sz w:val="28"/>
               </w:rPr>
-              <w:t>Giống danh bạ giúp tìm máy chủ đứng sau tên trang web.</w:t>
+              <w:t>Lớp mã hóa đường truyền; có khóa không đồng nghĩa cửa hàng là thật.</w:t>
             </w:r>
           </w:p>
         </w:tc>
@@ -4314,6 +5418,7 @@
           </w:tcPr>
           <w:p>
             <w:pPr>
+              <w:spacing w:line="276" w:lineRule="auto"/>
               <w:jc w:val="left"/>
             </w:pPr>
             <w:r>
@@ -4324,7 +5429,7 @@
                 <w:color w:val="000000"/>
                 <w:sz w:val="28"/>
               </w:rPr>
-              <w:t>Học máy</w:t>
+              <w:t>Danh bạ tên miền</w:t>
             </w:r>
           </w:p>
         </w:tc>
@@ -4342,6 +5447,7 @@
           </w:tcPr>
           <w:p>
             <w:pPr>
+              <w:spacing w:line="276" w:lineRule="auto"/>
               <w:jc w:val="center"/>
             </w:pPr>
             <w:r>
@@ -4352,7 +5458,7 @@
                 <w:color w:val="000000"/>
                 <w:sz w:val="28"/>
               </w:rPr>
-              <w:t>Máy tự học từ ví dụ</w:t>
+              <w:t>DNS</w:t>
             </w:r>
           </w:p>
         </w:tc>
@@ -4370,6 +5476,7 @@
           </w:tcPr>
           <w:p>
             <w:pPr>
+              <w:spacing w:line="276" w:lineRule="auto"/>
               <w:jc w:val="left"/>
             </w:pPr>
             <w:r>
@@ -4380,7 +5487,7 @@
                 <w:color w:val="000000"/>
                 <w:sz w:val="28"/>
               </w:rPr>
-              <w:t>Cho máy xem nhiều mẫu để máy rút ra các dấu hiệu thường gặp.</w:t>
+              <w:t>Dịch vụ đổi tên trang thành địa chỉ máy chủ, như danh bạ tìm số điện thoại.</w:t>
             </w:r>
           </w:p>
         </w:tc>
@@ -4400,6 +5507,7 @@
           </w:tcPr>
           <w:p>
             <w:pPr>
+              <w:spacing w:line="276" w:lineRule="auto"/>
               <w:jc w:val="left"/>
             </w:pPr>
             <w:r>
@@ -4410,7 +5518,7 @@
                 <w:color w:val="000000"/>
                 <w:sz w:val="28"/>
               </w:rPr>
-              <w:t>Rừng Ngẫu Nhiên</w:t>
+              <w:t>Học máy</w:t>
             </w:r>
           </w:p>
         </w:tc>
@@ -4428,6 +5536,7 @@
           </w:tcPr>
           <w:p>
             <w:pPr>
+              <w:spacing w:line="276" w:lineRule="auto"/>
               <w:jc w:val="center"/>
             </w:pPr>
             <w:r>
@@ -4438,7 +5547,7 @@
                 <w:color w:val="000000"/>
                 <w:sz w:val="28"/>
               </w:rPr>
-              <w:t>Nhiều cây hỏi độc lập</w:t>
+              <w:t>Machine Learning</w:t>
             </w:r>
           </w:p>
         </w:tc>
@@ -4456,6 +5565,7 @@
           </w:tcPr>
           <w:p>
             <w:pPr>
+              <w:spacing w:line="276" w:lineRule="auto"/>
               <w:jc w:val="left"/>
             </w:pPr>
             <w:r>
@@ -4466,7 +5576,7 @@
                 <w:color w:val="000000"/>
                 <w:sz w:val="28"/>
               </w:rPr>
-              <w:t>Nhiều người kiểm tra theo các câu hỏi nhỏ rồi lấy ý kiến chung.</w:t>
+              <w:t>Cho máy xem nhiều ví dụ để nó học cách nhận ra mẫu giống nhau.</w:t>
             </w:r>
           </w:p>
         </w:tc>
@@ -4486,6 +5596,7 @@
           </w:tcPr>
           <w:p>
             <w:pPr>
+              <w:spacing w:line="276" w:lineRule="auto"/>
               <w:jc w:val="left"/>
             </w:pPr>
             <w:r>
@@ -4496,7 +5607,7 @@
                 <w:color w:val="000000"/>
                 <w:sz w:val="28"/>
               </w:rPr>
-              <w:t>Tăng Cường Độ Dốc</w:t>
+              <w:t>Tính ngay trong trình duyệt</w:t>
             </w:r>
           </w:p>
         </w:tc>
@@ -4514,6 +5625,7 @@
           </w:tcPr>
           <w:p>
             <w:pPr>
+              <w:spacing w:line="276" w:lineRule="auto"/>
               <w:jc w:val="center"/>
             </w:pPr>
             <w:r>
@@ -4524,7 +5636,7 @@
                 <w:color w:val="000000"/>
                 <w:sz w:val="28"/>
               </w:rPr>
-              <w:t>Người sau sửa sai cho người trước</w:t>
+              <w:t>Browser inference</w:t>
             </w:r>
           </w:p>
         </w:tc>
@@ -4542,6 +5654,7 @@
           </w:tcPr>
           <w:p>
             <w:pPr>
+              <w:spacing w:line="276" w:lineRule="auto"/>
               <w:jc w:val="left"/>
             </w:pPr>
             <w:r>
@@ -4552,7 +5665,7 @@
                 <w:color w:val="000000"/>
                 <w:sz w:val="28"/>
               </w:rPr>
-              <w:t>Mỗi lượt sau chú ý hơn đến trường hợp lượt trước đoán nhầm.</w:t>
+              <w:t>Máy người dùng tự chấm điểm, như tự làm phép tính tại bàn.</w:t>
             </w:r>
           </w:p>
         </w:tc>
@@ -4572,6 +5685,7 @@
           </w:tcPr>
           <w:p>
             <w:pPr>
+              <w:spacing w:line="276" w:lineRule="auto"/>
               <w:jc w:val="left"/>
             </w:pPr>
             <w:r>
@@ -4582,7 +5696,7 @@
                 <w:color w:val="000000"/>
                 <w:sz w:val="28"/>
               </w:rPr>
-              <w:t>Browser Extension</w:t>
+              <w:t>Tiện ích gắn vào trình duyệt</w:t>
             </w:r>
           </w:p>
         </w:tc>
@@ -4600,6 +5714,7 @@
           </w:tcPr>
           <w:p>
             <w:pPr>
+              <w:spacing w:line="276" w:lineRule="auto"/>
               <w:jc w:val="center"/>
             </w:pPr>
             <w:r>
@@ -4610,7 +5725,7 @@
                 <w:color w:val="000000"/>
                 <w:sz w:val="28"/>
               </w:rPr>
-              <w:t>Tiện ích mở rộng trình duyệt</w:t>
+              <w:t>Browser extension</w:t>
             </w:r>
           </w:p>
         </w:tc>
@@ -4628,6 +5743,7 @@
           </w:tcPr>
           <w:p>
             <w:pPr>
+              <w:spacing w:line="276" w:lineRule="auto"/>
               <w:jc w:val="left"/>
             </w:pPr>
             <w:r>
@@ -4638,7 +5754,7 @@
                 <w:color w:val="000000"/>
                 <w:sz w:val="28"/>
               </w:rPr>
-              <w:t>Phần mềm nhỏ gắn vào trình duyệt để cảnh báo ngay cạnh đường dẫn.</w:t>
+              <w:t>Chương trình nhỏ thêm chức năng vào trình duyệt; đây là hướng phát triển.</w:t>
             </w:r>
           </w:p>
         </w:tc>
@@ -4646,7 +5762,7 @@
     </w:tbl>
     <w:p>
       <w:pPr>
-        <w:spacing w:line="264" w:lineRule="auto" w:before="0" w:after="80"/>
+        <w:spacing w:line="276" w:lineRule="auto" w:before="0" w:after="80"/>
         <w:jc w:val="both"/>
       </w:pPr>
     </w:p>
@@ -4657,7 +5773,7 @@
     </w:p>
     <w:p>
       <w:pPr>
-        <w:spacing w:line="264" w:lineRule="auto" w:before="0" w:after="160"/>
+        <w:spacing w:line="276" w:lineRule="auto" w:before="0" w:after="160"/>
         <w:jc w:val="center"/>
       </w:pPr>
       <w:r>
@@ -4668,12 +5784,12 @@
           <w:color w:val="0F4C5C"/>
           <w:sz w:val="28"/>
         </w:rPr>
-        <w:t>SAFEWEB (PHIÊN BẢN 2.3.5)</w:t>
+        <w:t>SAFEWEB</w:t>
       </w:r>
     </w:p>
     <w:p>
       <w:pPr>
-        <w:spacing w:line="264" w:lineRule="auto" w:before="0" w:after="320"/>
+        <w:spacing w:line="276" w:lineRule="auto" w:before="0" w:after="320"/>
         <w:jc w:val="center"/>
       </w:pPr>
       <w:r>
@@ -4689,7 +5805,7 @@
     </w:p>
     <w:p>
       <w:pPr>
-        <w:spacing w:line="264" w:lineRule="auto" w:before="0" w:after="480"/>
+        <w:spacing w:line="276" w:lineRule="auto" w:before="0" w:after="480"/>
         <w:jc w:val="center"/>
       </w:pPr>
       <w:r>
@@ -4703,255 +5819,53 @@
         <w:t>Công cụ nghiên cứu và giáo dục hỗ trợ người dùng phát hiện sớm các dấu hiệu bất thường trên địa chỉ trang web bằng Trí tuệ nhân tạo, giúp người dùng chủ động phán đoán, kiểm tra an toàn trước khi kích hoạt đường dẫn.</w:t>
       </w:r>
     </w:p>
-    <w:tbl>
-      <w:tblPr>
-        <w:tblStyle w:val="TableGrid"/>
-        <w:tblW w:type="auto" w:w="0"/>
+    <w:p>
+      <w:pPr>
+        <w:spacing w:line="276" w:lineRule="auto" w:before="0" w:after="120"/>
         <w:jc w:val="center"/>
-        <w:tblLook w:firstColumn="1" w:firstRow="1" w:lastColumn="0" w:lastRow="0" w:noHBand="0" w:noVBand="1" w:val="04A0"/>
-      </w:tblPr>
-      <w:tblGrid>
-        <w:gridCol w:w="4535"/>
-        <w:gridCol w:w="4535"/>
-      </w:tblGrid>
-      <w:tr>
-        <w:tc>
-          <w:tcPr>
-            <w:tcW w:type="dxa" w:w="4535"/>
-            <w:shd w:fill="0F766E"/>
-            <w:tcMar>
-              <w:top w:w="100" w:type="dxa"/>
-              <w:bottom w:w="100" w:type="dxa"/>
-              <w:left w:w="120" w:type="dxa"/>
-              <w:right w:w="120" w:type="dxa"/>
-            </w:tcMar>
-            <w:vAlign w:val="center"/>
-          </w:tcPr>
-          <w:p>
-            <w:pPr>
-              <w:jc w:val="center"/>
-            </w:pPr>
-            <w:r>
-              <w:rPr>
-                <w:rFonts w:ascii="Times New Roman" w:hAnsi="Times New Roman" w:eastAsia="Times New Roman"/>
-                <w:b/>
-                <w:i w:val="0"/>
-                <w:color w:val="FFFFFF"/>
-                <w:sz w:val="28"/>
-              </w:rPr>
-              <w:t>Vai trò trong dự án</w:t>
-            </w:r>
-          </w:p>
-        </w:tc>
-        <w:tc>
-          <w:tcPr>
-            <w:tcW w:type="dxa" w:w="4535"/>
-            <w:shd w:fill="0F766E"/>
-            <w:tcMar>
-              <w:top w:w="100" w:type="dxa"/>
-              <w:bottom w:w="100" w:type="dxa"/>
-              <w:left w:w="120" w:type="dxa"/>
-              <w:right w:w="120" w:type="dxa"/>
-            </w:tcMar>
-            <w:vAlign w:val="center"/>
-          </w:tcPr>
-          <w:p>
-            <w:pPr>
-              <w:jc w:val="center"/>
-            </w:pPr>
-            <w:r>
-              <w:rPr>
-                <w:rFonts w:ascii="Times New Roman" w:hAnsi="Times New Roman" w:eastAsia="Times New Roman"/>
-                <w:b/>
-                <w:i w:val="0"/>
-                <w:color w:val="FFFFFF"/>
-                <w:sz w:val="28"/>
-              </w:rPr>
-              <w:t>Họ và tên</w:t>
-            </w:r>
-          </w:p>
-        </w:tc>
-      </w:tr>
-      <w:tr>
-        <w:tc>
-          <w:tcPr>
-            <w:tcW w:type="dxa" w:w="4535"/>
-            <w:shd w:fill="FFFFFF"/>
-            <w:tcMar>
-              <w:top w:w="90" w:type="dxa"/>
-              <w:bottom w:w="90" w:type="dxa"/>
-              <w:left w:w="120" w:type="dxa"/>
-              <w:right w:w="120" w:type="dxa"/>
-            </w:tcMar>
-            <w:vAlign w:val="center"/>
-          </w:tcPr>
-          <w:p>
-            <w:pPr>
-              <w:jc w:val="left"/>
-            </w:pPr>
-            <w:r>
-              <w:rPr>
-                <w:rFonts w:ascii="Times New Roman" w:hAnsi="Times New Roman" w:eastAsia="Times New Roman"/>
-                <w:b/>
-                <w:i w:val="0"/>
-                <w:color w:val="000000"/>
-                <w:sz w:val="28"/>
-              </w:rPr>
-              <w:t>Người thực hiện 1</w:t>
-            </w:r>
-          </w:p>
-        </w:tc>
-        <w:tc>
-          <w:tcPr>
-            <w:tcW w:type="dxa" w:w="4535"/>
-            <w:shd w:fill="FFFFFF"/>
-            <w:tcMar>
-              <w:top w:w="90" w:type="dxa"/>
-              <w:bottom w:w="90" w:type="dxa"/>
-              <w:left w:w="120" w:type="dxa"/>
-              <w:right w:w="120" w:type="dxa"/>
-            </w:tcMar>
-            <w:vAlign w:val="center"/>
-          </w:tcPr>
-          <w:p>
-            <w:pPr>
-              <w:jc w:val="left"/>
-            </w:pPr>
-            <w:r>
-              <w:rPr>
-                <w:rFonts w:ascii="Times New Roman" w:hAnsi="Times New Roman" w:eastAsia="Times New Roman"/>
-                <w:b w:val="0"/>
-                <w:i w:val="0"/>
-                <w:color w:val="000000"/>
-                <w:sz w:val="28"/>
-              </w:rPr>
-              <w:t>Lê Văn Tuấn Anh</w:t>
-            </w:r>
-          </w:p>
-        </w:tc>
-      </w:tr>
-      <w:tr>
-        <w:tc>
-          <w:tcPr>
-            <w:tcW w:type="dxa" w:w="4535"/>
-            <w:shd w:fill="F8FAFC"/>
-            <w:tcMar>
-              <w:top w:w="90" w:type="dxa"/>
-              <w:bottom w:w="90" w:type="dxa"/>
-              <w:left w:w="120" w:type="dxa"/>
-              <w:right w:w="120" w:type="dxa"/>
-            </w:tcMar>
-            <w:vAlign w:val="center"/>
-          </w:tcPr>
-          <w:p>
-            <w:pPr>
-              <w:jc w:val="left"/>
-            </w:pPr>
-            <w:r>
-              <w:rPr>
-                <w:rFonts w:ascii="Times New Roman" w:hAnsi="Times New Roman" w:eastAsia="Times New Roman"/>
-                <w:b/>
-                <w:i w:val="0"/>
-                <w:color w:val="000000"/>
-                <w:sz w:val="28"/>
-              </w:rPr>
-              <w:t>Người thực hiện 2</w:t>
-            </w:r>
-          </w:p>
-        </w:tc>
-        <w:tc>
-          <w:tcPr>
-            <w:tcW w:type="dxa" w:w="4535"/>
-            <w:shd w:fill="F8FAFC"/>
-            <w:tcMar>
-              <w:top w:w="90" w:type="dxa"/>
-              <w:bottom w:w="90" w:type="dxa"/>
-              <w:left w:w="120" w:type="dxa"/>
-              <w:right w:w="120" w:type="dxa"/>
-            </w:tcMar>
-            <w:vAlign w:val="center"/>
-          </w:tcPr>
-          <w:p>
-            <w:pPr>
-              <w:jc w:val="left"/>
-            </w:pPr>
-            <w:r>
-              <w:rPr>
-                <w:rFonts w:ascii="Times New Roman" w:hAnsi="Times New Roman" w:eastAsia="Times New Roman"/>
-                <w:b w:val="0"/>
-                <w:i w:val="0"/>
-                <w:color w:val="000000"/>
-                <w:sz w:val="28"/>
-              </w:rPr>
-              <w:t>Nguyễn Hoàng Bảo</w:t>
-            </w:r>
-          </w:p>
-        </w:tc>
-      </w:tr>
-      <w:tr>
-        <w:tc>
-          <w:tcPr>
-            <w:tcW w:type="dxa" w:w="4535"/>
-            <w:shd w:fill="FFFFFF"/>
-            <w:tcMar>
-              <w:top w:w="90" w:type="dxa"/>
-              <w:bottom w:w="90" w:type="dxa"/>
-              <w:left w:w="120" w:type="dxa"/>
-              <w:right w:w="120" w:type="dxa"/>
-            </w:tcMar>
-            <w:vAlign w:val="center"/>
-          </w:tcPr>
-          <w:p>
-            <w:pPr>
-              <w:jc w:val="left"/>
-            </w:pPr>
-            <w:r>
-              <w:rPr>
-                <w:rFonts w:ascii="Times New Roman" w:hAnsi="Times New Roman" w:eastAsia="Times New Roman"/>
-                <w:b/>
-                <w:i w:val="0"/>
-                <w:color w:val="000000"/>
-                <w:sz w:val="28"/>
-              </w:rPr>
-              <w:t>Người hướng dẫn</w:t>
-            </w:r>
-          </w:p>
-        </w:tc>
-        <w:tc>
-          <w:tcPr>
-            <w:tcW w:type="dxa" w:w="4535"/>
-            <w:shd w:fill="FFFFFF"/>
-            <w:tcMar>
-              <w:top w:w="90" w:type="dxa"/>
-              <w:bottom w:w="90" w:type="dxa"/>
-              <w:left w:w="120" w:type="dxa"/>
-              <w:right w:w="120" w:type="dxa"/>
-            </w:tcMar>
-            <w:vAlign w:val="center"/>
-          </w:tcPr>
-          <w:p>
-            <w:pPr>
-              <w:jc w:val="left"/>
-            </w:pPr>
-            <w:r>
-              <w:rPr>
-                <w:rFonts w:ascii="Times New Roman" w:hAnsi="Times New Roman" w:eastAsia="Times New Roman"/>
-                <w:b w:val="0"/>
-                <w:i w:val="0"/>
-                <w:color w:val="000000"/>
-                <w:sz w:val="28"/>
-              </w:rPr>
-              <w:t>Trần Văn Toàn</w:t>
-            </w:r>
-          </w:p>
-        </w:tc>
-      </w:tr>
-    </w:tbl>
+      </w:pPr>
+      <w:r>
+        <w:rPr>
+          <w:rFonts w:ascii="Times New Roman" w:hAnsi="Times New Roman" w:eastAsia="Times New Roman"/>
+          <w:b/>
+          <w:i w:val="0"/>
+          <w:color w:val="000000"/>
+          <w:sz w:val="28"/>
+        </w:rPr>
+        <w:t>Người thực hiện 1 : Lê Văn Tuấn Anh</w:t>
+      </w:r>
+    </w:p>
     <w:p>
       <w:pPr>
-        <w:spacing w:line="264" w:lineRule="auto" w:before="0" w:after="80"/>
-        <w:jc w:val="both"/>
-      </w:pPr>
+        <w:spacing w:line="276" w:lineRule="auto" w:before="0" w:after="120"/>
+        <w:jc w:val="center"/>
+      </w:pPr>
+      <w:r>
+        <w:rPr>
+          <w:rFonts w:ascii="Times New Roman" w:hAnsi="Times New Roman" w:eastAsia="Times New Roman"/>
+          <w:b/>
+          <w:i w:val="0"/>
+          <w:color w:val="000000"/>
+          <w:sz w:val="28"/>
+        </w:rPr>
+        <w:t>Người thực hiện 2 : Nguyễn Hoàng Bảo</w:t>
+      </w:r>
+    </w:p>
+    <w:p>
+      <w:pPr>
+        <w:spacing w:line="276" w:lineRule="auto" w:before="0" w:after="120"/>
+        <w:jc w:val="center"/>
+      </w:pPr>
+      <w:r>
+        <w:rPr>
+          <w:rFonts w:ascii="Times New Roman" w:hAnsi="Times New Roman" w:eastAsia="Times New Roman"/>
+          <w:b/>
+          <w:i w:val="0"/>
+          <w:color w:val="000000"/>
+          <w:sz w:val="28"/>
+        </w:rPr>
+        <w:t>Người hướng dẫn : Trần Văn Toàn</w:t>
+      </w:r>
     </w:p>
     <w:sectPr>
       <w:pgSz w:w="11906" w:h="16838"/>
@@ -5327,7 +6241,7 @@
     <w:qFormat/>
     <w:rsid w:val="00FC693F"/>
     <w:pPr>
-      <w:spacing w:line="264" w:lineRule="auto"/>
+      <w:spacing w:line="276" w:lineRule="auto"/>
     </w:pPr>
     <w:rPr>
       <w:rFonts w:ascii="Times New Roman" w:hAnsi="Times New Roman" w:eastAsia="Times New Roman"/>
@@ -5389,11 +6303,11 @@
     <w:pPr>
       <w:keepNext/>
       <w:keepLines/>
-      <w:spacing w:before="480" w:after="0" w:line="264" w:lineRule="auto"/>
+      <w:spacing w:before="480" w:after="0"/>
       <w:outlineLvl w:val="0"/>
     </w:pPr>
     <w:rPr>
-      <w:rFonts w:asciiTheme="majorHAnsi" w:eastAsiaTheme="majorEastAsia" w:hAnsiTheme="majorHAnsi" w:cstheme="majorBidi" w:ascii="Times New Roman" w:hAnsi="Times New Roman" w:eastAsia="Times New Roman"/>
+      <w:rFonts w:asciiTheme="majorHAnsi" w:eastAsiaTheme="majorEastAsia" w:hAnsiTheme="majorHAnsi" w:cstheme="majorBidi"/>
       <w:b/>
       <w:bCs/>
       <w:color w:val="365F91" w:themeColor="accent1" w:themeShade="BF"/>
@@ -5413,15 +6327,15 @@
     <w:pPr>
       <w:keepNext/>
       <w:keepLines/>
-      <w:spacing w:before="200" w:after="0" w:line="264" w:lineRule="auto"/>
+      <w:spacing w:before="200" w:after="0"/>
       <w:outlineLvl w:val="1"/>
     </w:pPr>
     <w:rPr>
-      <w:rFonts w:asciiTheme="majorHAnsi" w:eastAsiaTheme="majorEastAsia" w:hAnsiTheme="majorHAnsi" w:cstheme="majorBidi" w:ascii="Times New Roman" w:hAnsi="Times New Roman" w:eastAsia="Times New Roman"/>
+      <w:rFonts w:asciiTheme="majorHAnsi" w:eastAsiaTheme="majorEastAsia" w:hAnsiTheme="majorHAnsi" w:cstheme="majorBidi"/>
       <w:b/>
       <w:bCs/>
       <w:color w:val="4F81BD" w:themeColor="accent1"/>
-      <w:sz w:val="28"/>
+      <w:sz w:val="26"/>
       <w:szCs w:val="26"/>
     </w:rPr>
   </w:style>

</xml_diff>

<commit_message>
Revise SafeWeb report layout and content
</commit_message>
<xml_diff>
--- a/Bao_cao_SafeWeb_KHKT_THPT.docx
+++ b/Bao_cao_SafeWeb_KHKT_THPT.docx
@@ -47,7 +47,7 @@
           <w:color w:val="0F766E"/>
           <w:sz w:val="28"/>
         </w:rPr>
-        <w:t>LĨNH VỰC: PHẦN MỀM HỆ THỐNG / TRÍ TUỆ NHÂN TẠO</w:t>
+        <w:t>LĨNH VỰC: MÁY TÍNH / TRÍ TUỆ NHÂN TẠO</w:t>
       </w:r>
     </w:p>
     <w:p>
@@ -111,7 +111,7 @@
           <w:color w:val="0F766E"/>
           <w:sz w:val="28"/>
         </w:rPr>
-        <w:t>DỰ ÁN KỸ THUẬT · PHẦN MỀM HỆ THỐNG VÀ AN TOÀN THÔNG TIN</w:t>
+        <w:t>DỰ ÁN KỸ THUẬT</w:t>
       </w:r>
     </w:p>
     <w:p>
@@ -285,7 +285,7 @@
           <w:color w:val="000000"/>
           <w:sz w:val="28"/>
         </w:rPr>
-        <w:t>SafeWeb là phần mềm giúp người dùng phát hiện sớm các đường dẫn trang web lừa đảo và phòng tránh lộ lọt dữ liệu cá nhân. Thay vì phải mạo hiểm bấm vào đường dẫn lạ, phần mềm sẽ tự động khám xét địa chỉ trang web đó ngay trên máy của người dùng thông qua Kho dữ liệu tra cứu nhanh, 55 dấu hiệu nhận biết chữ viết và hội đồng gồm 4 mô hình Trí tuệ nhân tạo: Rừng Ngẫu Nhiên, Tăng Cường Độ Dốc, Máy Véc-tơ Hỗ Trợ và Hồi Quy Logic. Các tính năng kiểm tra tên miền, dò tìm chuyển hướng và chụp ảnh xem trước trang web chỉ hoạt động khi người dùng đồng ý cho phép.</w:t>
+        <w:t>SafeWeb là phần mềm giúp người dùng phát hiện sớm các đường dẫn trang web lừa đảo và phòng tránh lộ lọt dữ liệu cá nhân. Thay vì phải mạo hiểm bấm vào đường dẫn lạ, phần mềm sẽ tự động khám xét địa chỉ trang web đó ngay trên máy của người dùng thông qua cơ sở dữ liệu tra cứu nhanh, 55 dấu hiệu nhận biết chữ viết và hội đồng gồm 4 mô hình Trí tuệ nhân tạo: Random Forest, Gradient Boosting, SVM và Logistic Regression. Các tính năng kiểm tra tên miền, dò tìm chuyển hướng và chụp ảnh xem trước trang web chỉ hoạt động khi người dùng đồng ý cho phép.</w:t>
       </w:r>
     </w:p>
     <w:p>
@@ -301,7 +301,7 @@
           <w:color w:val="000000"/>
           <w:sz w:val="28"/>
         </w:rPr>
-        <w:t>Để dạy cho máy tính thông minh, nhóm sử dụng tổng cộng 261.299 địa chỉ trang web đã làm sạch (gồm 114.113 trang lừa đảo và 147.186 trang an toàn). Khi đem thi thử trên 6.624 địa chỉ trang web hoàn toàn mới chưa từng gặp trong lúc học, mô hình Tăng Cường Độ Dốc bắt trúng tới 95,61% trang web lừa đảo (phát hiện đúng 2.676 trên 2.799 trang lừa đảo), và mô hình Rừng Ngẫu Nhiên bắt trúng 92,32%. Phần mềm đã vượt qua 100% các bài kiểm tra chất lượng gồm 59 bài kiểm tra xử lý dữ liệu và 15 bài kiểm tra trình duyệt, giúp người dùng nhận biết rủi ro trực quan trước khi bấm vào đường dẫn.</w:t>
+        <w:t>Để dạy cho máy tính thông minh, nhóm sử dụng tổng cộng 261.299 địa chỉ trang web đã làm sạch (gồm 114.113 trang lừa đảo và 147.186 trang an toàn). Khi đem thi thử trên 6.624 địa chỉ trang web hoàn toàn mới chưa từng gặp trong lúc học, mô hình Gradient Boosting bắt trúng tới 95,61% trang web lừa đảo (phát hiện đúng 2.676 trên 2.799 trang lừa đảo), và mô hình Random Forest bắt trúng 92,32%. Phần mềm đã vượt qua 100% các bài kiểm tra chất lượng gồm 59 bài kiểm tra xử lý dữ liệu và 16 bài kiểm tra trình duyệt, giúp người dùng nhận biết rủi ro trực quan trước khi bấm vào đường dẫn.</w:t>
       </w:r>
     </w:p>
     <w:p>
@@ -374,7 +374,7 @@
           <w:color w:val="000000"/>
           <w:sz w:val="28"/>
         </w:rPr>
-        <w:t>Mỗi trang web trên mạng Internet đều có một dòng địa chỉ riêng giống như biển hiệu và số nhà ngoài đời thực. Hiện nay, kẻ gian thường xuyên phát tán tin nhắn hoặc thư điện tử chứa các đường dẫn giả mạo ngân hàng, mạng xã hội, sàn mua sắm hoặc trang nhận quà trò chơi để lừa người dân nhập mật khẩu và mã xác nhận. Bằng mắt thường, người dùng rất dễ bị đánh lừa vì kẻ xấu ghép tên thương hiệu lớn vào đầu địa chỉ, viết đường dẫn rất dài để che giấu phần đuôi giả mạo, hoặc chèn các chữ thúc giục đăng nhập, xác minh tài khoản.</w:t>
+        <w:t>Mỗi trang web có một dòng địa chỉ giống như biển hiệu của cửa hàng. Kẻ gian gửi tin nhắn, thư điện tử chứa đường dẫn giả mạo ngân hàng, mạng xã hội hay sàn mua sắm để lừa người dùng nhập mật khẩu và mã xác nhận. Mắt thường khó nhận ra vì địa chỉ giả thường chỉ khác thật vài ký tự, hoặc viết rất dài để che phần đuôi.</w:t>
       </w:r>
     </w:p>
     <w:p>
@@ -390,7 +390,7 @@
           <w:color w:val="000000"/>
           <w:sz w:val="28"/>
         </w:rPr>
-        <w:t>Đặc biệt, nhiều người lầm tưởng rằng cứ thấy địa chỉ có chữ https (biểu tượng ổ khóa) ở đầu là trang web chính chủ an toàn. Thực tế, chữ https chỉ cho biết đường truyền có mã hóa, còn kẻ lừa đảo hoàn toàn có thể tạo biểu tượng ổ khóa này miễn phí cho trang web giả của chúng. Ngoài ra, đường dẫn người dùng nhận được có thể chứa thông tin riêng tư; nếu gửi đường dẫn đó lên các máy chủ lạ để kiểm tra thì lại có nguy cơ lộ lọt dữ liệu. Do đó, cần có một phần mềm tự khám xét địa chỉ trang web ngay trên máy của người dùng và giải thích rõ từng dấu hiệu bất thường.</w:t>
+        <w:t>Nhiều người tin rằng địa chỉ có khóa https là an toàn, nhưng kẻ lừa đảo cũng tạo được khóa này miễn phí. Nếu gửi địa chỉ lên một máy chủ lạ để kiểm tra, người dùng còn có nguy cơ lộ thông tin riêng. Vì vậy cần một công cụ kiểm tra ngay trên máy của người dùng và nói rõ lý do cảnh báo.</w:t>
       </w:r>
     </w:p>
     <w:p>
@@ -424,7 +424,7 @@
           <w:color w:val="000000"/>
           <w:sz w:val="28"/>
         </w:rPr>
-        <w:t>Nhu cầu thực tế đặt ra là chế tạo một công cụ tự động điền hoàn chỉnh địa chỉ trang web khi người dùng gõ thiếu, đối chiếu nhanh với kho dữ liệu có sẵn, chấm điểm nguy cơ bằng Trí tuệ nhân tạo, chỉ rõ lý do cảnh báo và chỉ kết nối mạng bên ngoài khi người dùng cho phép. Câu hỏi đặt ra là: Khi đóng gói toàn bộ 55 dấu hiệu đo đạc và 4 mô hình Trí tuệ nhân tạo vào thẳng trình duyệt web, kết quả tính toán trên máy người dùng có khớp tuyệt đối với máy tính huấn luyện trong phòng thí nghiệm hay không?</w:t>
+        <w:t>Nhóm cần một công cụ tự điền đủ địa chỉ gõ thiếu, đối chiếu với cơ sở dữ liệu 36.261 địa chỉ đã biết (19.909 trang lừa đảo, 16.352 trang hợp lệ), chấm điểm bằng bốn mô hình và nêu lý do cảnh báo. Câu hỏi đặt ra: nếu đưa toàn bộ phép tính vào trình duyệt, kết quả có gần như giống máy huấn luyện hay không?</w:t>
       </w:r>
     </w:p>
     <w:p>
@@ -469,7 +469,7 @@
           <w:color w:val="000000"/>
           <w:sz w:val="28"/>
         </w:rPr>
-        <w:t>Xây dựng hoàn chỉnh phần mềm SafeWeb giúp người dùng kiểm tra nhanh một địa chỉ trang web là an toàn hay có nguy cơ lừa đảo ngay trên trình duyệt web, giải thích rõ vị trí bất thường bằng tiếng Việt dễ hiểu để người dùng chủ động phòng tránh trước khi bấm vào đường dẫn.</w:t>
+        <w:t>Xây dựng SafeWeb giúp người dùng kiểm tra nhanh một địa chỉ ngay trên trình duyệt và hiểu vì sao nên hoặc không nên tin trước khi bấm.</w:t>
       </w:r>
     </w:p>
     <w:p>
@@ -496,7 +496,7 @@
           <w:color w:val="000000"/>
           <w:sz w:val="28"/>
         </w:rPr>
-        <w:t>Hệ thống phải đo đạc đồng thời 55 dấu hiệu nhận biết của đường dẫn kết hợp cùng lúc 4 mô hình Trí tuệ nhân tạo và kho dữ liệu 36.261 địa chỉ; bài kiểm tra đánh giá phải thực hiện trên các tên miền mới hoàn toàn không trùng với lúc học; chạy mặc định ngay trên máy người dùng không cần gửi đường dẫn đi nơi khác; và giao diện tự động đổi màu trực quan (Xanh - Vàng - Đỏ) kèm lời giải thích rõ ràng.</w:t>
+        <w:t>Đo 55 dấu hiệu, dùng bốn mô hình cùng cơ sở dữ liệu 36.261 địa chỉ; thử trên các tên miền không trùng lúc học; mặc định không gửi địa chỉ ra ngoài; hiện bốn mức màu Xanh - Vàng - Cam - Đỏ kèm lý do.</w:t>
       </w:r>
     </w:p>
     <w:p>
@@ -530,7 +530,7 @@
           <w:color w:val="000000"/>
           <w:sz w:val="28"/>
         </w:rPr>
-        <w:t>SafeWeb tập trung khám xét cấu trúc chữ viết, ký hiệu của đường dẫn trang web và đối chiếu với kho dữ liệu đã được kiểm chứng. Để bảo vệ thiết bị của người dùng, phần mềm không tự ý tải hay chạy mã độc của trang đích; việc tra cứu danh bạ tên miền (DNS) và chụp ảnh xem trước trang web chỉ thực hiện khi người dùng bật nút đồng ý.</w:t>
+        <w:t>SafeWeb chỉ xem xét chữ viết và cấu trúc của địa chỉ, không tải hay chạy nội dung trang đích. Kiểm tra tên miền (DNS) và ảnh xem trước chỉ chạy khi người dùng bật cho phép.</w:t>
       </w:r>
     </w:p>
     <w:p>
@@ -564,7 +564,7 @@
           <w:color w:val="000000"/>
           <w:sz w:val="28"/>
         </w:rPr>
-        <w:t>SafeWeb không chỉ là công cụ cảnh báo sớm mà còn là học liệu trực quan giúp học sinh, giáo viên và người dân hình thành kỹ năng an toàn số. Người dùng được quan sát trực tiếp cách tách một địa chỉ trang web thành từng bộ phận, hiểu được vì sao biểu tượng https chưa đủ để khẳng định trang web an toàn, và so sánh điểm số của 4 mô hình Trí tuệ nhân tạo để rèn luyện thói quen kiểm tra kỹ trước khi bấm vào bất kỳ đường dẫn lạ nào.</w:t>
+        <w:t>SafeWeb còn là bài học an toàn số: người dùng thấy cách tách một địa chỉ thành từng phần, hiểu vì sao khóa https chưa đủ để tin, và tập thói quen kiểm tra trước khi bấm.</w:t>
       </w:r>
     </w:p>
     <w:p>
@@ -633,7 +633,7 @@
           <w:color w:val="000000"/>
           <w:sz w:val="28"/>
         </w:rPr>
-        <w:t xml:space="preserve">• 1. Mô hình Rừng Ngẫu Nhiên (Random Forest): </w:t>
+        <w:t xml:space="preserve">• 1. Random Forest: </w:t>
       </w:r>
       <w:r>
         <w:rPr>
@@ -660,7 +660,7 @@
           <w:color w:val="000000"/>
           <w:sz w:val="28"/>
         </w:rPr>
-        <w:t xml:space="preserve">• 2. Mô hình Tăng Cường Độ Dốc (Gradient Boosting): </w:t>
+        <w:t xml:space="preserve">• 2. Gradient Boosting: </w:t>
       </w:r>
       <w:r>
         <w:rPr>
@@ -687,7 +687,7 @@
           <w:color w:val="000000"/>
           <w:sz w:val="28"/>
         </w:rPr>
-        <w:t xml:space="preserve">• 3. Mô hình Máy Véc-tơ Hỗ Trợ (SVM): </w:t>
+        <w:t xml:space="preserve">• 3. SVM: </w:t>
       </w:r>
       <w:r>
         <w:rPr>
@@ -714,7 +714,7 @@
           <w:color w:val="000000"/>
           <w:sz w:val="28"/>
         </w:rPr>
-        <w:t xml:space="preserve">• 4. Mô hình Hồi Quy Logic (Logistic Regression): </w:t>
+        <w:t xml:space="preserve">• 4. Logistic Regression: </w:t>
       </w:r>
       <w:r>
         <w:rPr>
@@ -866,7 +866,7 @@
           <w:color w:val="000000"/>
           <w:sz w:val="28"/>
         </w:rPr>
-        <w:t>Mức xác suất dưới 25% là rủi ro thấp (Xanh); từ 25% đến dưới 50% là cần thận trọng (Vàng); từ 50% đến dưới 75% là nguy cơ cao (Cam); từ 75% trở lên là nguy cơ rất cao (Đỏ). Nếu kho dữ liệu có hồ sơ khớp, kết quả hồ sơ được ưu tiên. Cách xếp này giống bốn vạch trên nhiệt kế: càng vượt vạch cao thì màu cảnh báo càng mạnh.</w:t>
+        <w:t>Mức xác suất dưới 25% là rủi ro thấp (Xanh); từ 25% đến dưới 50% là cần thận trọng (Vàng); từ 50% đến dưới 75% là nguy cơ cao (Cam); từ 75% trở lên là nguy cơ rất cao (Đỏ). Nếu cơ sở dữ liệu có hồ sơ khớp, kết quả hồ sơ được ưu tiên. Cách xếp này giống bốn vạch trên nhiệt kế: càng vượt vạch cao thì màu cảnh báo càng mạnh.</w:t>
       </w:r>
     </w:p>
     <w:p>
@@ -900,7 +900,169 @@
           <w:color w:val="000000"/>
           <w:sz w:val="28"/>
         </w:rPr>
-        <w:t>Sản phẩm kết hợp đồng thời tra cứu Kho dữ liệu và 4 mô hình Trí tuệ nhân tạo chạy trực tiếp ngay trong trình duyệt web; tách rõ giữa hồ sơ đã ghi nhận và dự đoán của máy học; tự động hoàn thiện địa chỉ thiếu và bảo vệ quyền riêng tư nhờ cơ chế phân tích tại chỗ mặc định.</w:t>
+        <w:t>Những điểm dưới đây là thứ phân biệt SafeWeb với một công cụ chỉ tra danh sách đen hoặc chỉ báo chung chung “nguy hiểm”:</w:t>
+      </w:r>
+    </w:p>
+    <w:p>
+      <w:pPr>
+        <w:spacing w:line="276" w:lineRule="auto" w:before="0" w:after="100"/>
+        <w:ind w:left="340"/>
+        <w:jc w:val="both"/>
+      </w:pPr>
+      <w:r>
+        <w:rPr>
+          <w:rFonts w:ascii="Times New Roman" w:hAnsi="Times New Roman" w:eastAsia="Times New Roman"/>
+          <w:b/>
+          <w:i w:val="0"/>
+          <w:color w:val="000000"/>
+          <w:sz w:val="28"/>
+        </w:rPr>
+        <w:t xml:space="preserve">• Ba lớp thông tin cùng làm việc: </w:t>
+      </w:r>
+      <w:r>
+        <w:rPr>
+          <w:rFonts w:ascii="Times New Roman" w:hAnsi="Times New Roman" w:eastAsia="Times New Roman"/>
+          <w:b w:val="0"/>
+          <w:i w:val="0"/>
+          <w:color w:val="000000"/>
+          <w:sz w:val="28"/>
+        </w:rPr>
+        <w:t>Hồ sơ đã biết trong cơ sở dữ liệu, 55 dấu hiệu cấu trúc của địa chỉ và ý kiến của bốn mô hình được đặt cạnh nhau. Một trang mới tạo chưa có trong danh sách vẫn có thể bị phát hiện nhờ dấu hiệu và mô hình.</w:t>
+      </w:r>
+    </w:p>
+    <w:p>
+      <w:pPr>
+        <w:spacing w:line="276" w:lineRule="auto" w:before="0" w:after="100"/>
+        <w:ind w:left="340"/>
+        <w:jc w:val="both"/>
+      </w:pPr>
+      <w:r>
+        <w:rPr>
+          <w:rFonts w:ascii="Times New Roman" w:hAnsi="Times New Roman" w:eastAsia="Times New Roman"/>
+          <w:b/>
+          <w:i w:val="0"/>
+          <w:color w:val="000000"/>
+          <w:sz w:val="28"/>
+        </w:rPr>
+        <w:t xml:space="preserve">• Giải thích được vì sao: </w:t>
+      </w:r>
+      <w:r>
+        <w:rPr>
+          <w:rFonts w:ascii="Times New Roman" w:hAnsi="Times New Roman" w:eastAsia="Times New Roman"/>
+          <w:b w:val="0"/>
+          <w:i w:val="0"/>
+          <w:color w:val="000000"/>
+          <w:sz w:val="28"/>
+        </w:rPr>
+        <w:t>Kết quả không chỉ là một con số. Người dùng thấy mức màu (Xanh, Vàng, Cam, Đỏ), điểm của từng mô hình và lý do cụ thể như địa chỉ quá dài, nhiều tầng tên phụ hay có từ khóa nhạy cảm.</w:t>
+      </w:r>
+    </w:p>
+    <w:p>
+      <w:pPr>
+        <w:spacing w:line="276" w:lineRule="auto" w:before="0" w:after="100"/>
+        <w:ind w:left="340"/>
+        <w:jc w:val="both"/>
+      </w:pPr>
+      <w:r>
+        <w:rPr>
+          <w:rFonts w:ascii="Times New Roman" w:hAnsi="Times New Roman" w:eastAsia="Times New Roman"/>
+          <w:b/>
+          <w:i w:val="0"/>
+          <w:color w:val="000000"/>
+          <w:sz w:val="28"/>
+        </w:rPr>
+        <w:t xml:space="preserve">• Chạy ngay trong trình duyệt: </w:t>
+      </w:r>
+      <w:r>
+        <w:rPr>
+          <w:rFonts w:ascii="Times New Roman" w:hAnsi="Times New Roman" w:eastAsia="Times New Roman"/>
+          <w:b w:val="0"/>
+          <w:i w:val="0"/>
+          <w:color w:val="000000"/>
+          <w:sz w:val="28"/>
+        </w:rPr>
+        <w:t>Việc đối chiếu và chấm điểm diễn ra trên máy người dùng, mặc định không gửi địa chỉ đi đâu. Chỉ khi người dùng chủ động bật kiểm tra DNS hoặc ảnh xem trước, địa chỉ mới được chia sẻ với dịch vụ tương ứng.</w:t>
+      </w:r>
+    </w:p>
+    <w:p>
+      <w:pPr>
+        <w:spacing w:line="276" w:lineRule="auto" w:before="0" w:after="100"/>
+        <w:ind w:left="340"/>
+        <w:jc w:val="both"/>
+      </w:pPr>
+      <w:r>
+        <w:rPr>
+          <w:rFonts w:ascii="Times New Roman" w:hAnsi="Times New Roman" w:eastAsia="Times New Roman"/>
+          <w:b/>
+          <w:i w:val="0"/>
+          <w:color w:val="000000"/>
+          <w:sz w:val="28"/>
+        </w:rPr>
+        <w:t xml:space="preserve">• Tự sửa địa chỉ gõ thiếu: </w:t>
+      </w:r>
+      <w:r>
+        <w:rPr>
+          <w:rFonts w:ascii="Times New Roman" w:hAnsi="Times New Roman" w:eastAsia="Times New Roman"/>
+          <w:b w:val="0"/>
+          <w:i w:val="0"/>
+          <w:color w:val="000000"/>
+          <w:sz w:val="28"/>
+        </w:rPr>
+        <w:t>Nếu người dùng chỉ gõ một từ như vietcombank, phần mềm tự điền thành https://vietcombank.com trước khi kiểm tra.</w:t>
+      </w:r>
+    </w:p>
+    <w:p>
+      <w:pPr>
+        <w:spacing w:line="276" w:lineRule="auto" w:before="0" w:after="100"/>
+        <w:ind w:left="340"/>
+        <w:jc w:val="both"/>
+      </w:pPr>
+      <w:r>
+        <w:rPr>
+          <w:rFonts w:ascii="Times New Roman" w:hAnsi="Times New Roman" w:eastAsia="Times New Roman"/>
+          <w:b/>
+          <w:i w:val="0"/>
+          <w:color w:val="000000"/>
+          <w:sz w:val="28"/>
+        </w:rPr>
+        <w:t xml:space="preserve">• Ví dụ lừa đảo tương tự để đối chiếu: </w:t>
+      </w:r>
+      <w:r>
+        <w:rPr>
+          <w:rFonts w:ascii="Times New Roman" w:hAnsi="Times New Roman" w:eastAsia="Times New Roman"/>
+          <w:b w:val="0"/>
+          <w:i w:val="0"/>
+          <w:color w:val="000000"/>
+          <w:sz w:val="28"/>
+        </w:rPr>
+        <w:t>Khi một trang được xem là an toàn, SafeWeb chỉ đưa ra những trang lừa đảo có độ tin cậy cao, đã có ngày ghi nhận và tên miền giống ít nhất 80%, để người dùng thấy trang thật khác trang giả thế nào.</w:t>
+      </w:r>
+    </w:p>
+    <w:p>
+      <w:pPr>
+        <w:spacing w:line="276" w:lineRule="auto" w:before="0" w:after="100"/>
+        <w:ind w:left="340"/>
+        <w:jc w:val="both"/>
+      </w:pPr>
+      <w:r>
+        <w:rPr>
+          <w:rFonts w:ascii="Times New Roman" w:hAnsi="Times New Roman" w:eastAsia="Times New Roman"/>
+          <w:b/>
+          <w:i w:val="0"/>
+          <w:color w:val="000000"/>
+          <w:sz w:val="28"/>
+        </w:rPr>
+        <w:t xml:space="preserve">• Phiếu báo cáo do người dùng lập: </w:t>
+      </w:r>
+      <w:r>
+        <w:rPr>
+          <w:rFonts w:ascii="Times New Roman" w:hAnsi="Times New Roman" w:eastAsia="Times New Roman"/>
+          <w:b w:val="0"/>
+          <w:i w:val="0"/>
+          <w:color w:val="000000"/>
+          <w:sz w:val="28"/>
+        </w:rPr>
+        <w:t>Người dùng có thể lập phiếu báo cáo một địa chỉ nghi lừa đảo hoặc một cảnh báo có thể sai. Phiếu được lưu thành tệp trên máy, không tự gửi đi.</w:t>
       </w:r>
     </w:p>
     <w:p>
@@ -1024,7 +1186,7 @@
           <w:color w:val="000000"/>
           <w:sz w:val="28"/>
         </w:rPr>
-        <w:t>Nhóm chuẩn bị ba phần dữ liệu: mẫu để máy học, mẫu để thi thử và kho để tra cứu nhanh. Có thể hình dung đây lần lượt là bài học, đề kiểm tra để riêng và cuốn sổ tra cứu. Trong dữ liệu, số 1 chỉ trang lừa đảo, số 0 chỉ trang hợp lệ.</w:t>
+        <w:t>Nhóm chuẩn bị ba phần dữ liệu: mẫu để máy học, mẫu để thi thử và cơ sở dữ liệu để tra cứu nhanh. Có thể hình dung đây lần lượt là bài học, đề kiểm tra để riêng và cuốn sổ tra cứu. Trong dữ liệu, số 1 chỉ trang lừa đảo, số 0 chỉ trang hợp lệ.</w:t>
       </w:r>
     </w:p>
     <w:p>
@@ -1041,7 +1203,7 @@
           <w:color w:val="000000"/>
           <w:sz w:val="28"/>
         </w:rPr>
-        <w:t xml:space="preserve">• Kho dữ liệu tra cứu nhanh đã làm sạch: </w:t>
+        <w:t xml:space="preserve">• Cơ sở dữ liệu tra cứu nhanh: </w:t>
       </w:r>
       <w:r>
         <w:rPr>
@@ -1051,7 +1213,7 @@
           <w:color w:val="000000"/>
           <w:sz w:val="28"/>
         </w:rPr>
-        <w:t>Sau khi gộp các địa chỉ trùng nhau, kho tra cứu giữ 36.261 địa chỉ: 19.909 trang lừa đảo và 16.352 trang hợp lệ. Đây giống như cuốn sổ ghi những trường hợp đã biết; nếu địa chỉ mới trùng hồ sơ thì hệ thống có thể nhận ra ngay.</w:t>
+        <w:t>Sau khi gộp các địa chỉ trùng nhau, cơ sở dữ liệu tra cứu giữ 36.261 địa chỉ: 19.909 trang lừa đảo và 16.352 trang hợp lệ. Đây giống như cuốn sổ ghi những trường hợp đã biết; nếu địa chỉ mới trùng hồ sơ thì hệ thống có thể nhận ra ngay.</w:t>
       </w:r>
     </w:p>
     <w:p>
@@ -1128,6 +1290,7 @@
     </w:p>
     <w:p>
       <w:pPr>
+        <w:keepNext/>
         <w:spacing w:line="276" w:lineRule="auto" w:before="0" w:after="120"/>
         <w:jc w:val="both"/>
       </w:pPr>
@@ -1139,14 +1302,14 @@
           <w:color w:val="000000"/>
           <w:sz w:val="28"/>
         </w:rPr>
-        <w:t>Mỗi địa chỉ trang web đưa vào SafeWeb đều được khám xét qua đúng 55 biến số đo đạc theo thứ tự cố định. Ý nghĩa của 55 biến số này được giải thích đơn giản theo 6 nhóm sau:</w:t>
+        <w:t>Mỗi địa chỉ đưa vào SafeWeb được đo bằng đúng 55 biến số theo thứ tự cố định, chia thành 6 nhóm như Bảng 3.1.</w:t>
       </w:r>
     </w:p>
     <w:p>
       <w:pPr>
-        <w:spacing w:line="276" w:lineRule="auto" w:before="0" w:after="100"/>
-        <w:ind w:left="340"/>
-        <w:jc w:val="both"/>
+        <w:keepNext/>
+        <w:spacing w:line="276" w:lineRule="auto" w:before="0" w:after="80"/>
+        <w:jc w:val="center"/>
       </w:pPr>
       <w:r>
         <w:rPr>
@@ -1156,153 +1319,690 @@
           <w:color w:val="000000"/>
           <w:sz w:val="28"/>
         </w:rPr>
-        <w:t xml:space="preserve">• Nhóm 1 — Đo độ dài và đếm ký tự cơ bản (Biến 01 đến 10): </w:t>
-      </w:r>
-      <w:r>
-        <w:rPr>
-          <w:rFonts w:ascii="Times New Roman" w:hAnsi="Times New Roman" w:eastAsia="Times New Roman"/>
-          <w:b w:val="0"/>
-          <w:i w:val="0"/>
-          <w:color w:val="000000"/>
-          <w:sz w:val="28"/>
-        </w:rPr>
-        <w:t>Gồm url_length (tổng độ dài địa chỉ), domain_length (độ dài tên trang web), path_length (độ dài đường dẫn sau tên miền), query_length (độ dài tham số), num_dots (số dấu chấm), num_slashes (số dấu gạch chéo), num_hyphens (số dấu gạch ngang), num_underscores (số dấu gạch dưới), num_digits (số chữ số), num_letters (số chữ cái). Diễn giải: Trang thật thường ngắn gọn, trong khi trang lừa đảo thường ghép thêm nhiều chữ, số và dấu gạch ngang dài lê thê.</w:t>
+        <w:t>Bảng 3.1. Sáu nhóm dấu hiệu nhận biết địa chỉ trang web</w:t>
       </w:r>
     </w:p>
+    <w:tbl>
+      <w:tblPr>
+        <w:tblStyle w:val="TableGrid"/>
+        <w:tblW w:type="auto" w:w="0"/>
+        <w:jc w:val="center"/>
+        <w:tblLayout w:type="fixed"/>
+        <w:tblLook w:firstColumn="1" w:firstRow="1" w:lastColumn="0" w:lastRow="0" w:noHBand="0" w:noVBand="1" w:val="04A0"/>
+      </w:tblPr>
+      <w:tblGrid>
+        <w:gridCol w:w="3024"/>
+        <w:gridCol w:w="3024"/>
+        <w:gridCol w:w="3024"/>
+      </w:tblGrid>
+      <w:tr>
+        <w:trPr>
+          <w:cantSplit/>
+        </w:trPr>
+        <w:tc>
+          <w:tcPr>
+            <w:tcW w:type="dxa" w:w="1928"/>
+            <w:shd w:fill="0F766E"/>
+            <w:tcMar>
+              <w:top w:w="100" w:type="dxa"/>
+              <w:bottom w:w="100" w:type="dxa"/>
+              <w:left w:w="120" w:type="dxa"/>
+              <w:right w:w="120" w:type="dxa"/>
+            </w:tcMar>
+            <w:vAlign w:val="center"/>
+          </w:tcPr>
+          <w:p>
+            <w:pPr>
+              <w:keepNext/>
+              <w:spacing w:line="276" w:lineRule="auto"/>
+              <w:jc w:val="center"/>
+            </w:pPr>
+            <w:r>
+              <w:rPr>
+                <w:rFonts w:ascii="Times New Roman" w:hAnsi="Times New Roman" w:eastAsia="Times New Roman"/>
+                <w:b/>
+                <w:i w:val="0"/>
+                <w:color w:val="FFFFFF"/>
+                <w:sz w:val="22"/>
+              </w:rPr>
+              <w:t>Nhóm</w:t>
+            </w:r>
+          </w:p>
+        </w:tc>
+        <w:tc>
+          <w:tcPr>
+            <w:tcW w:type="dxa" w:w="3175"/>
+            <w:shd w:fill="0F766E"/>
+            <w:tcMar>
+              <w:top w:w="100" w:type="dxa"/>
+              <w:bottom w:w="100" w:type="dxa"/>
+              <w:left w:w="120" w:type="dxa"/>
+              <w:right w:w="120" w:type="dxa"/>
+            </w:tcMar>
+            <w:vAlign w:val="center"/>
+          </w:tcPr>
+          <w:p>
+            <w:pPr>
+              <w:keepNext/>
+              <w:spacing w:line="276" w:lineRule="auto"/>
+              <w:jc w:val="center"/>
+            </w:pPr>
+            <w:r>
+              <w:rPr>
+                <w:rFonts w:ascii="Times New Roman" w:hAnsi="Times New Roman" w:eastAsia="Times New Roman"/>
+                <w:b/>
+                <w:i w:val="0"/>
+                <w:color w:val="FFFFFF"/>
+                <w:sz w:val="22"/>
+              </w:rPr>
+              <w:t>Các biến đo</w:t>
+            </w:r>
+          </w:p>
+        </w:tc>
+        <w:tc>
+          <w:tcPr>
+            <w:tcW w:type="dxa" w:w="3969"/>
+            <w:shd w:fill="0F766E"/>
+            <w:tcMar>
+              <w:top w:w="100" w:type="dxa"/>
+              <w:bottom w:w="100" w:type="dxa"/>
+              <w:left w:w="120" w:type="dxa"/>
+              <w:right w:w="120" w:type="dxa"/>
+            </w:tcMar>
+            <w:vAlign w:val="center"/>
+          </w:tcPr>
+          <w:p>
+            <w:pPr>
+              <w:keepNext/>
+              <w:spacing w:line="276" w:lineRule="auto"/>
+              <w:jc w:val="center"/>
+            </w:pPr>
+            <w:r>
+              <w:rPr>
+                <w:rFonts w:ascii="Times New Roman" w:hAnsi="Times New Roman" w:eastAsia="Times New Roman"/>
+                <w:b/>
+                <w:i w:val="0"/>
+                <w:color w:val="FFFFFF"/>
+                <w:sz w:val="22"/>
+              </w:rPr>
+              <w:t>Diễn giải đời thường</w:t>
+            </w:r>
+          </w:p>
+        </w:tc>
+      </w:tr>
+      <w:tr>
+        <w:trPr>
+          <w:cantSplit/>
+        </w:trPr>
+        <w:tc>
+          <w:tcPr>
+            <w:tcW w:type="dxa" w:w="1928"/>
+            <w:shd w:fill="FFFFFF"/>
+            <w:tcMar>
+              <w:top w:w="90" w:type="dxa"/>
+              <w:bottom w:w="90" w:type="dxa"/>
+              <w:left w:w="120" w:type="dxa"/>
+              <w:right w:w="120" w:type="dxa"/>
+            </w:tcMar>
+            <w:vAlign w:val="center"/>
+          </w:tcPr>
+          <w:p>
+            <w:pPr>
+              <w:keepNext/>
+              <w:spacing w:line="276" w:lineRule="auto"/>
+              <w:jc w:val="left"/>
+            </w:pPr>
+            <w:r>
+              <w:rPr>
+                <w:rFonts w:ascii="Times New Roman" w:hAnsi="Times New Roman" w:eastAsia="Times New Roman"/>
+                <w:b/>
+                <w:i w:val="0"/>
+                <w:color w:val="000000"/>
+                <w:sz w:val="22"/>
+              </w:rPr>
+              <w:t>1. Độ dài và đếm ký tự (biến 01–10)</w:t>
+            </w:r>
+          </w:p>
+        </w:tc>
+        <w:tc>
+          <w:tcPr>
+            <w:tcW w:type="dxa" w:w="3175"/>
+            <w:shd w:fill="FFFFFF"/>
+            <w:tcMar>
+              <w:top w:w="90" w:type="dxa"/>
+              <w:bottom w:w="90" w:type="dxa"/>
+              <w:left w:w="120" w:type="dxa"/>
+              <w:right w:w="120" w:type="dxa"/>
+            </w:tcMar>
+            <w:vAlign w:val="center"/>
+          </w:tcPr>
+          <w:p>
+            <w:pPr>
+              <w:keepNext/>
+              <w:spacing w:line="276" w:lineRule="auto"/>
+              <w:jc w:val="center"/>
+            </w:pPr>
+            <w:r>
+              <w:rPr>
+                <w:rFonts w:ascii="Times New Roman" w:hAnsi="Times New Roman" w:eastAsia="Times New Roman"/>
+                <w:b w:val="0"/>
+                <w:i w:val="0"/>
+                <w:color w:val="000000"/>
+                <w:sz w:val="22"/>
+              </w:rPr>
+              <w:t>url_length, domain_length, path_length, query_length, num_dots, num_slashes, num_hyphens, num_underscores, num_digits, num_letters</w:t>
+            </w:r>
+          </w:p>
+        </w:tc>
+        <w:tc>
+          <w:tcPr>
+            <w:tcW w:type="dxa" w:w="3969"/>
+            <w:shd w:fill="FFFFFF"/>
+            <w:tcMar>
+              <w:top w:w="90" w:type="dxa"/>
+              <w:bottom w:w="90" w:type="dxa"/>
+              <w:left w:w="120" w:type="dxa"/>
+              <w:right w:w="120" w:type="dxa"/>
+            </w:tcMar>
+            <w:vAlign w:val="center"/>
+          </w:tcPr>
+          <w:p>
+            <w:pPr>
+              <w:keepNext/>
+              <w:spacing w:line="276" w:lineRule="auto"/>
+              <w:jc w:val="left"/>
+            </w:pPr>
+            <w:r>
+              <w:rPr>
+                <w:rFonts w:ascii="Times New Roman" w:hAnsi="Times New Roman" w:eastAsia="Times New Roman"/>
+                <w:b w:val="0"/>
+                <w:i w:val="0"/>
+                <w:color w:val="000000"/>
+                <w:sz w:val="22"/>
+              </w:rPr>
+              <w:t>Đo độ dài địa chỉ, tên trang, phần đường dẫn, phần tham số và đếm dấu chấm, gạch chéo, gạch ngang, gạch dưới, chữ số, chữ cái. Trang thật thường ngắn gọn; trang lừa đảo hay ghép thêm chữ, số và gạch ngang dài lê thê.</w:t>
+            </w:r>
+          </w:p>
+        </w:tc>
+      </w:tr>
+      <w:tr>
+        <w:trPr>
+          <w:cantSplit/>
+        </w:trPr>
+        <w:tc>
+          <w:tcPr>
+            <w:tcW w:type="dxa" w:w="1928"/>
+            <w:shd w:fill="F8FAFC"/>
+            <w:tcMar>
+              <w:top w:w="90" w:type="dxa"/>
+              <w:bottom w:w="90" w:type="dxa"/>
+              <w:left w:w="120" w:type="dxa"/>
+              <w:right w:w="120" w:type="dxa"/>
+            </w:tcMar>
+            <w:vAlign w:val="center"/>
+          </w:tcPr>
+          <w:p>
+            <w:pPr>
+              <w:keepNext/>
+              <w:spacing w:line="276" w:lineRule="auto"/>
+              <w:jc w:val="left"/>
+            </w:pPr>
+            <w:r>
+              <w:rPr>
+                <w:rFonts w:ascii="Times New Roman" w:hAnsi="Times New Roman" w:eastAsia="Times New Roman"/>
+                <w:b/>
+                <w:i w:val="0"/>
+                <w:color w:val="000000"/>
+                <w:sz w:val="22"/>
+              </w:rPr>
+              <w:t>2. Cấu trúc và ký hiệu bất thường (biến 11–20)</w:t>
+            </w:r>
+          </w:p>
+        </w:tc>
+        <w:tc>
+          <w:tcPr>
+            <w:tcW w:type="dxa" w:w="3175"/>
+            <w:shd w:fill="F8FAFC"/>
+            <w:tcMar>
+              <w:top w:w="90" w:type="dxa"/>
+              <w:bottom w:w="90" w:type="dxa"/>
+              <w:left w:w="120" w:type="dxa"/>
+              <w:right w:w="120" w:type="dxa"/>
+            </w:tcMar>
+            <w:vAlign w:val="center"/>
+          </w:tcPr>
+          <w:p>
+            <w:pPr>
+              <w:keepNext/>
+              <w:spacing w:line="276" w:lineRule="auto"/>
+              <w:jc w:val="center"/>
+            </w:pPr>
+            <w:r>
+              <w:rPr>
+                <w:rFonts w:ascii="Times New Roman" w:hAnsi="Times New Roman" w:eastAsia="Times New Roman"/>
+                <w:b w:val="0"/>
+                <w:i w:val="0"/>
+                <w:color w:val="000000"/>
+                <w:sz w:val="22"/>
+              </w:rPr>
+              <w:t>num_special_chars, has_https, has_ip, num_subdomains, has_at, has_question_mark, has_equals, has_percent, has_double_slash, has_query</w:t>
+            </w:r>
+          </w:p>
+        </w:tc>
+        <w:tc>
+          <w:tcPr>
+            <w:tcW w:type="dxa" w:w="3969"/>
+            <w:shd w:fill="F8FAFC"/>
+            <w:tcMar>
+              <w:top w:w="90" w:type="dxa"/>
+              <w:bottom w:w="90" w:type="dxa"/>
+              <w:left w:w="120" w:type="dxa"/>
+              <w:right w:w="120" w:type="dxa"/>
+            </w:tcMar>
+            <w:vAlign w:val="center"/>
+          </w:tcPr>
+          <w:p>
+            <w:pPr>
+              <w:keepNext/>
+              <w:spacing w:line="276" w:lineRule="auto"/>
+              <w:jc w:val="left"/>
+            </w:pPr>
+            <w:r>
+              <w:rPr>
+                <w:rFonts w:ascii="Times New Roman" w:hAnsi="Times New Roman" w:eastAsia="Times New Roman"/>
+                <w:b w:val="0"/>
+                <w:i w:val="0"/>
+                <w:color w:val="000000"/>
+                <w:sz w:val="22"/>
+              </w:rPr>
+              <w:t>Kiểm tra có khóa https không, có dùng dãy số thay tên chữ không, có nhiều tầng tên miền phụ không, có dấu @ đánh lừa mắt nhìn hay các ký hiệu ?, =, %, // lạ. Giúp phát hiện các kiểu ngụy trang cấu trúc địa chỉ.</w:t>
+            </w:r>
+          </w:p>
+        </w:tc>
+      </w:tr>
+      <w:tr>
+        <w:trPr>
+          <w:cantSplit/>
+        </w:trPr>
+        <w:tc>
+          <w:tcPr>
+            <w:tcW w:type="dxa" w:w="1928"/>
+            <w:shd w:fill="FFFFFF"/>
+            <w:tcMar>
+              <w:top w:w="90" w:type="dxa"/>
+              <w:bottom w:w="90" w:type="dxa"/>
+              <w:left w:w="120" w:type="dxa"/>
+              <w:right w:w="120" w:type="dxa"/>
+            </w:tcMar>
+            <w:vAlign w:val="center"/>
+          </w:tcPr>
+          <w:p>
+            <w:pPr>
+              <w:keepNext/>
+              <w:spacing w:line="276" w:lineRule="auto"/>
+              <w:jc w:val="left"/>
+            </w:pPr>
+            <w:r>
+              <w:rPr>
+                <w:rFonts w:ascii="Times New Roman" w:hAnsi="Times New Roman" w:eastAsia="Times New Roman"/>
+                <w:b/>
+                <w:i w:val="0"/>
+                <w:color w:val="000000"/>
+                <w:sz w:val="22"/>
+              </w:rPr>
+              <w:t>3. Độ lộn xộn của chữ cái (biến 21–22)</w:t>
+            </w:r>
+          </w:p>
+        </w:tc>
+        <w:tc>
+          <w:tcPr>
+            <w:tcW w:type="dxa" w:w="3175"/>
+            <w:shd w:fill="FFFFFF"/>
+            <w:tcMar>
+              <w:top w:w="90" w:type="dxa"/>
+              <w:bottom w:w="90" w:type="dxa"/>
+              <w:left w:w="120" w:type="dxa"/>
+              <w:right w:w="120" w:type="dxa"/>
+            </w:tcMar>
+            <w:vAlign w:val="center"/>
+          </w:tcPr>
+          <w:p>
+            <w:pPr>
+              <w:keepNext/>
+              <w:spacing w:line="276" w:lineRule="auto"/>
+              <w:jc w:val="center"/>
+            </w:pPr>
+            <w:r>
+              <w:rPr>
+                <w:rFonts w:ascii="Times New Roman" w:hAnsi="Times New Roman" w:eastAsia="Times New Roman"/>
+                <w:b w:val="0"/>
+                <w:i w:val="0"/>
+                <w:color w:val="000000"/>
+                <w:sz w:val="22"/>
+              </w:rPr>
+              <w:t>url_entropy, domain_entropy</w:t>
+            </w:r>
+          </w:p>
+        </w:tc>
+        <w:tc>
+          <w:tcPr>
+            <w:tcW w:type="dxa" w:w="3969"/>
+            <w:shd w:fill="FFFFFF"/>
+            <w:tcMar>
+              <w:top w:w="90" w:type="dxa"/>
+              <w:bottom w:w="90" w:type="dxa"/>
+              <w:left w:w="120" w:type="dxa"/>
+              <w:right w:w="120" w:type="dxa"/>
+            </w:tcMar>
+            <w:vAlign w:val="center"/>
+          </w:tcPr>
+          <w:p>
+            <w:pPr>
+              <w:keepNext/>
+              <w:spacing w:line="276" w:lineRule="auto"/>
+              <w:jc w:val="left"/>
+            </w:pPr>
+            <w:r>
+              <w:rPr>
+                <w:rFonts w:ascii="Times New Roman" w:hAnsi="Times New Roman" w:eastAsia="Times New Roman"/>
+                <w:b w:val="0"/>
+                <w:i w:val="0"/>
+                <w:color w:val="000000"/>
+                <w:sz w:val="22"/>
+              </w:rPr>
+              <w:t>Đo mức lộn xộn của cả địa chỉ và của tên trang. Tên thật ghép từ có nghĩa nên đọc xuôi; trang lừa đảo tạo tự động thường có chữ và số xếp hỗn loạn vô nghĩa.</w:t>
+            </w:r>
+          </w:p>
+        </w:tc>
+      </w:tr>
+      <w:tr>
+        <w:trPr>
+          <w:cantSplit/>
+        </w:trPr>
+        <w:tc>
+          <w:tcPr>
+            <w:tcW w:type="dxa" w:w="1928"/>
+            <w:shd w:fill="F8FAFC"/>
+            <w:tcMar>
+              <w:top w:w="90" w:type="dxa"/>
+              <w:bottom w:w="90" w:type="dxa"/>
+              <w:left w:w="120" w:type="dxa"/>
+              <w:right w:w="120" w:type="dxa"/>
+            </w:tcMar>
+            <w:vAlign w:val="center"/>
+          </w:tcPr>
+          <w:p>
+            <w:pPr>
+              <w:keepNext/>
+              <w:spacing w:line="276" w:lineRule="auto"/>
+              <w:jc w:val="left"/>
+            </w:pPr>
+            <w:r>
+              <w:rPr>
+                <w:rFonts w:ascii="Times New Roman" w:hAnsi="Times New Roman" w:eastAsia="Times New Roman"/>
+                <w:b/>
+                <w:i w:val="0"/>
+                <w:color w:val="000000"/>
+                <w:sz w:val="22"/>
+              </w:rPr>
+              <w:t>4. Từ khóa nhạy cảm (biến 23–30)</w:t>
+            </w:r>
+          </w:p>
+        </w:tc>
+        <w:tc>
+          <w:tcPr>
+            <w:tcW w:type="dxa" w:w="3175"/>
+            <w:shd w:fill="F8FAFC"/>
+            <w:tcMar>
+              <w:top w:w="90" w:type="dxa"/>
+              <w:bottom w:w="90" w:type="dxa"/>
+              <w:left w:w="120" w:type="dxa"/>
+              <w:right w:w="120" w:type="dxa"/>
+            </w:tcMar>
+            <w:vAlign w:val="center"/>
+          </w:tcPr>
+          <w:p>
+            <w:pPr>
+              <w:keepNext/>
+              <w:spacing w:line="276" w:lineRule="auto"/>
+              <w:jc w:val="center"/>
+            </w:pPr>
+            <w:r>
+              <w:rPr>
+                <w:rFonts w:ascii="Times New Roman" w:hAnsi="Times New Roman" w:eastAsia="Times New Roman"/>
+                <w:b w:val="0"/>
+                <w:i w:val="0"/>
+                <w:color w:val="000000"/>
+                <w:sz w:val="22"/>
+              </w:rPr>
+              <w:t>keyword_login, keyword_signin, keyword_verify, keyword_account, keyword_password, keyword_bank, keyword_payment, keyword_confirm</w:t>
+            </w:r>
+          </w:p>
+        </w:tc>
+        <w:tc>
+          <w:tcPr>
+            <w:tcW w:type="dxa" w:w="3969"/>
+            <w:shd w:fill="F8FAFC"/>
+            <w:tcMar>
+              <w:top w:w="90" w:type="dxa"/>
+              <w:bottom w:w="90" w:type="dxa"/>
+              <w:left w:w="120" w:type="dxa"/>
+              <w:right w:w="120" w:type="dxa"/>
+            </w:tcMar>
+            <w:vAlign w:val="center"/>
+          </w:tcPr>
+          <w:p>
+            <w:pPr>
+              <w:keepNext/>
+              <w:spacing w:line="276" w:lineRule="auto"/>
+              <w:jc w:val="left"/>
+            </w:pPr>
+            <w:r>
+              <w:rPr>
+                <w:rFonts w:ascii="Times New Roman" w:hAnsi="Times New Roman" w:eastAsia="Times New Roman"/>
+                <w:b w:val="0"/>
+                <w:i w:val="0"/>
+                <w:color w:val="000000"/>
+                <w:sz w:val="22"/>
+              </w:rPr>
+              <w:t>Dò 8 từ mồi nhử quen thuộc: đăng nhập, vào tài khoản, xác minh, tài khoản, mật khẩu, ngân hàng, thanh toán, xác nhận. Kẻ gian hay chèn chúng để giục nạn nhân khai báo mật khẩu.</w:t>
+            </w:r>
+          </w:p>
+        </w:tc>
+      </w:tr>
+      <w:tr>
+        <w:trPr>
+          <w:cantSplit/>
+        </w:trPr>
+        <w:tc>
+          <w:tcPr>
+            <w:tcW w:type="dxa" w:w="1928"/>
+            <w:shd w:fill="FFFFFF"/>
+            <w:tcMar>
+              <w:top w:w="90" w:type="dxa"/>
+              <w:bottom w:w="90" w:type="dxa"/>
+              <w:left w:w="120" w:type="dxa"/>
+              <w:right w:w="120" w:type="dxa"/>
+            </w:tcMar>
+            <w:vAlign w:val="center"/>
+          </w:tcPr>
+          <w:p>
+            <w:pPr>
+              <w:keepNext/>
+              <w:spacing w:line="276" w:lineRule="auto"/>
+              <w:jc w:val="left"/>
+            </w:pPr>
+            <w:r>
+              <w:rPr>
+                <w:rFonts w:ascii="Times New Roman" w:hAnsi="Times New Roman" w:eastAsia="Times New Roman"/>
+                <w:b/>
+                <w:i w:val="0"/>
+                <w:color w:val="000000"/>
+                <w:sz w:val="22"/>
+              </w:rPr>
+              <w:t>5. Tỉ lệ chữ, số và đuôi tên miền đáng ngờ (biến 31–52)</w:t>
+            </w:r>
+          </w:p>
+        </w:tc>
+        <w:tc>
+          <w:tcPr>
+            <w:tcW w:type="dxa" w:w="3175"/>
+            <w:shd w:fill="FFFFFF"/>
+            <w:tcMar>
+              <w:top w:w="90" w:type="dxa"/>
+              <w:bottom w:w="90" w:type="dxa"/>
+              <w:left w:w="120" w:type="dxa"/>
+              <w:right w:w="120" w:type="dxa"/>
+            </w:tcMar>
+            <w:vAlign w:val="center"/>
+          </w:tcPr>
+          <w:p>
+            <w:pPr>
+              <w:keepNext/>
+              <w:spacing w:line="276" w:lineRule="auto"/>
+              <w:jc w:val="center"/>
+            </w:pPr>
+            <w:r>
+              <w:rPr>
+                <w:rFonts w:ascii="Times New Roman" w:hAnsi="Times New Roman" w:eastAsia="Times New Roman"/>
+                <w:b w:val="0"/>
+                <w:i w:val="0"/>
+                <w:color w:val="000000"/>
+                <w:sz w:val="22"/>
+              </w:rPr>
+              <w:t>phish_url_len, phish_dom_len, phish_tld_len, phish_path_len, phish_query_len, phish_is_ip, phish_subdom_cnt, phish_letter_cnt, phish_digit_cnt, phish_special_cnt, phish_eq_cnt, phish_qm_cnt, phish_amp_cnt, phish_dot_cnt, phish_dash_cnt, phish_under_cnt, phish_slash_cnt, phish_letter_ratio, phish_digit_ratio, phish_spec_ratio, phish_entropy, phish_suspicious_tld</w:t>
+            </w:r>
+          </w:p>
+        </w:tc>
+        <w:tc>
+          <w:tcPr>
+            <w:tcW w:type="dxa" w:w="3969"/>
+            <w:shd w:fill="FFFFFF"/>
+            <w:tcMar>
+              <w:top w:w="90" w:type="dxa"/>
+              <w:bottom w:w="90" w:type="dxa"/>
+              <w:left w:w="120" w:type="dxa"/>
+              <w:right w:w="120" w:type="dxa"/>
+            </w:tcMar>
+            <w:vAlign w:val="center"/>
+          </w:tcPr>
+          <w:p>
+            <w:pPr>
+              <w:keepNext/>
+              <w:spacing w:line="276" w:lineRule="auto"/>
+              <w:jc w:val="left"/>
+            </w:pPr>
+            <w:r>
+              <w:rPr>
+                <w:rFonts w:ascii="Times New Roman" w:hAnsi="Times New Roman" w:eastAsia="Times New Roman"/>
+                <w:b w:val="0"/>
+                <w:i w:val="0"/>
+                <w:color w:val="000000"/>
+                <w:sz w:val="22"/>
+              </w:rPr>
+              <w:t>Đo chỉ tiết hơn: độ dài từng phần, số lượng từng loại ký tự, tỉ lệ phần trăm chữ cái, chữ số và ký tự lạ, độ lộn xộn và cờ báo đuôi tên miền hay bị lạm dụng. Giống như cân đo từng thành phần của một biển hiệu nghi vấn.</w:t>
+            </w:r>
+          </w:p>
+        </w:tc>
+      </w:tr>
+      <w:tr>
+        <w:trPr>
+          <w:cantSplit/>
+        </w:trPr>
+        <w:tc>
+          <w:tcPr>
+            <w:tcW w:type="dxa" w:w="1928"/>
+            <w:shd w:fill="F8FAFC"/>
+            <w:tcMar>
+              <w:top w:w="90" w:type="dxa"/>
+              <w:bottom w:w="90" w:type="dxa"/>
+              <w:left w:w="120" w:type="dxa"/>
+              <w:right w:w="120" w:type="dxa"/>
+            </w:tcMar>
+            <w:vAlign w:val="center"/>
+          </w:tcPr>
+          <w:p>
+            <w:pPr>
+              <w:spacing w:line="276" w:lineRule="auto"/>
+              <w:jc w:val="left"/>
+            </w:pPr>
+            <w:r>
+              <w:rPr>
+                <w:rFonts w:ascii="Times New Roman" w:hAnsi="Times New Roman" w:eastAsia="Times New Roman"/>
+                <w:b/>
+                <w:i w:val="0"/>
+                <w:color w:val="000000"/>
+                <w:sz w:val="22"/>
+              </w:rPr>
+              <w:t>6. Giấu chữ bằng mã phần trăm (biến 53–55)</w:t>
+            </w:r>
+          </w:p>
+        </w:tc>
+        <w:tc>
+          <w:tcPr>
+            <w:tcW w:type="dxa" w:w="3175"/>
+            <w:shd w:fill="F8FAFC"/>
+            <w:tcMar>
+              <w:top w:w="90" w:type="dxa"/>
+              <w:bottom w:w="90" w:type="dxa"/>
+              <w:left w:w="120" w:type="dxa"/>
+              <w:right w:w="120" w:type="dxa"/>
+            </w:tcMar>
+            <w:vAlign w:val="center"/>
+          </w:tcPr>
+          <w:p>
+            <w:pPr>
+              <w:spacing w:line="276" w:lineRule="auto"/>
+              <w:jc w:val="center"/>
+            </w:pPr>
+            <w:r>
+              <w:rPr>
+                <w:rFonts w:ascii="Times New Roman" w:hAnsi="Times New Roman" w:eastAsia="Times New Roman"/>
+                <w:b w:val="0"/>
+                <w:i w:val="0"/>
+                <w:color w:val="000000"/>
+                <w:sz w:val="22"/>
+              </w:rPr>
+              <w:t>phish_has_obfuscation, phish_obfuscated_char_count, phish_obfuscation_ratio</w:t>
+            </w:r>
+          </w:p>
+        </w:tc>
+        <w:tc>
+          <w:tcPr>
+            <w:tcW w:type="dxa" w:w="3969"/>
+            <w:shd w:fill="F8FAFC"/>
+            <w:tcMar>
+              <w:top w:w="90" w:type="dxa"/>
+              <w:bottom w:w="90" w:type="dxa"/>
+              <w:left w:w="120" w:type="dxa"/>
+              <w:right w:w="120" w:type="dxa"/>
+            </w:tcMar>
+            <w:vAlign w:val="center"/>
+          </w:tcPr>
+          <w:p>
+            <w:pPr>
+              <w:spacing w:line="276" w:lineRule="auto"/>
+              <w:jc w:val="left"/>
+            </w:pPr>
+            <w:r>
+              <w:rPr>
+                <w:rFonts w:ascii="Times New Roman" w:hAnsi="Times New Roman" w:eastAsia="Times New Roman"/>
+                <w:b w:val="0"/>
+                <w:i w:val="0"/>
+                <w:color w:val="000000"/>
+                <w:sz w:val="22"/>
+              </w:rPr>
+              <w:t>Phát hiện chiêu biến chữ bình thường thành cụm ký hiệu dạng %xx để làm hoa mắt người xem.</w:t>
+            </w:r>
+          </w:p>
+        </w:tc>
+      </w:tr>
+    </w:tbl>
     <w:p>
       <w:pPr>
-        <w:spacing w:line="276" w:lineRule="auto" w:before="0" w:after="100"/>
-        <w:ind w:left="340"/>
+        <w:spacing w:line="276" w:lineRule="auto" w:before="0" w:after="80"/>
         <w:jc w:val="both"/>
       </w:pPr>
-      <w:r>
-        <w:rPr>
-          <w:rFonts w:ascii="Times New Roman" w:hAnsi="Times New Roman" w:eastAsia="Times New Roman"/>
-          <w:b/>
-          <w:i w:val="0"/>
-          <w:color w:val="000000"/>
-          <w:sz w:val="28"/>
-        </w:rPr>
-        <w:t xml:space="preserve">• Nhóm 2 — Kiểm tra cấu trúc và ký hiệu bất thường (Biến 11 đến 20): </w:t>
-      </w:r>
-      <w:r>
-        <w:rPr>
-          <w:rFonts w:ascii="Times New Roman" w:hAnsi="Times New Roman" w:eastAsia="Times New Roman"/>
-          <w:b w:val="0"/>
-          <w:i w:val="0"/>
-          <w:color w:val="000000"/>
-          <w:sz w:val="28"/>
-        </w:rPr>
-        <w:t>Gồm num_special_chars (số ký tự đặc biệt), has_https (có chữ https không), has_ip (có dùng dãy số máy chủ thay tên chữ không), num_subdomains (số tầng tên miền phụ), has_at (có dấu @ đánh lừa mắt nhìn không), has_question_mark (dấu ?), has_equals (dấu =), has_percent (dấu %), has_double_slash (dấu // bất thường), has_query (có chuỗi truy vấn không). Diễn giải: Giúp phát hiện ngay các kiểu ngụy trang cấu trúc địa chỉ.</w:t>
-      </w:r>
-    </w:p>
-    <w:p>
-      <w:pPr>
-        <w:spacing w:line="276" w:lineRule="auto" w:before="0" w:after="100"/>
-        <w:ind w:left="340"/>
-        <w:jc w:val="both"/>
-      </w:pPr>
-      <w:r>
-        <w:rPr>
-          <w:rFonts w:ascii="Times New Roman" w:hAnsi="Times New Roman" w:eastAsia="Times New Roman"/>
-          <w:b/>
-          <w:i w:val="0"/>
-          <w:color w:val="000000"/>
-          <w:sz w:val="28"/>
-        </w:rPr>
-        <w:t xml:space="preserve">• Nhóm 3 — Đo độ lộn xộn của chữ cái (Biến 21 và 22): </w:t>
-      </w:r>
-      <w:r>
-        <w:rPr>
-          <w:rFonts w:ascii="Times New Roman" w:hAnsi="Times New Roman" w:eastAsia="Times New Roman"/>
-          <w:b w:val="0"/>
-          <w:i w:val="0"/>
-          <w:color w:val="000000"/>
-          <w:sz w:val="28"/>
-        </w:rPr>
-        <w:t>Gồm url_entropy (độ lộn xộn của cả địa chỉ) và domain_entropy (độ lộn xộn của tên trang web). Diễn giải: Tên trang web thật ghép thành từ có nghĩa nên đọc rất xuôi, còn trang lừa đảo tạo tự động bằng máy thường có chữ cái và con số xếp hỗn loạn vô nghĩa.</w:t>
-      </w:r>
-    </w:p>
-    <w:p>
-      <w:pPr>
-        <w:spacing w:line="276" w:lineRule="auto" w:before="0" w:after="100"/>
-        <w:ind w:left="340"/>
-        <w:jc w:val="both"/>
-      </w:pPr>
-      <w:r>
-        <w:rPr>
-          <w:rFonts w:ascii="Times New Roman" w:hAnsi="Times New Roman" w:eastAsia="Times New Roman"/>
-          <w:b/>
-          <w:i w:val="0"/>
-          <w:color w:val="000000"/>
-          <w:sz w:val="28"/>
-        </w:rPr>
-        <w:t xml:space="preserve">• Nhóm 4 — Dò tìm 8 từ khóa nhạy cảm hay bị lợi dụng (Biến 23 đến 30): </w:t>
-      </w:r>
-      <w:r>
-        <w:rPr>
-          <w:rFonts w:ascii="Times New Roman" w:hAnsi="Times New Roman" w:eastAsia="Times New Roman"/>
-          <w:b w:val="0"/>
-          <w:i w:val="0"/>
-          <w:color w:val="000000"/>
-          <w:sz w:val="28"/>
-        </w:rPr>
-        <w:t>Gồm keyword_login (đăng nhập), keyword_signin (vào tài khoản), keyword_verify (xác minh), keyword_account (tài khoản), keyword_password (mật khẩu), keyword_bank (ngân hàng), keyword_payment (thanh toán), keyword_confirm (xác nhận). Diễn giải: Đây là 8 từ mồi nhử quen thuộc mà kẻ gian hay chèn vào đường dẫn để giục nạn nhân khai báo mật khẩu.</w:t>
-      </w:r>
-    </w:p>
-    <w:p>
-      <w:pPr>
-        <w:spacing w:line="276" w:lineRule="auto" w:before="0" w:after="100"/>
-        <w:ind w:left="340"/>
-        <w:jc w:val="both"/>
-      </w:pPr>
-      <w:r>
-        <w:rPr>
-          <w:rFonts w:ascii="Times New Roman" w:hAnsi="Times New Roman" w:eastAsia="Times New Roman"/>
-          <w:b/>
-          <w:i w:val="0"/>
-          <w:color w:val="000000"/>
-          <w:sz w:val="28"/>
-        </w:rPr>
-        <w:t xml:space="preserve">• Nhóm 5 — Đo chi tiết tỷ lệ chữ, số và đuôi tên miền đáng ngờ (Biến 31 đến 52): </w:t>
-      </w:r>
-      <w:r>
-        <w:rPr>
-          <w:rFonts w:ascii="Times New Roman" w:hAnsi="Times New Roman" w:eastAsia="Times New Roman"/>
-          <w:b w:val="0"/>
-          <w:i w:val="0"/>
-          <w:color w:val="000000"/>
-          <w:sz w:val="28"/>
-        </w:rPr>
-        <w:t>Gồm các biến đo độ dài chuẩn hóa (phishvn_url_len, phishvn_dom_len, phishvn_tld_len, phishvn_path_len, phishvn_query_len), đếm chi tiết số lượng ký tự (phishvn_is_ip, phishvn_subdom_cnt, phishvn_letter_cnt, phishvn_digit_cnt, phishvn_special_cnt, phishvn_eq_cnt, phishvn_qm_cnt, phishvn_amp_cnt, phishvn_dot_cnt, phishvn_dash_cnt, phishvn_under_cnt, phishvn_slash_cnt), tính tỷ lệ phần trăm chữ cái, chữ số, ký tự lạ trên toàn địa chỉ (phishvn_letter_ratio, phishvn_digit_ratio, phishvn_spec_ratio), độ lộn xộn (phishvn_entropy) và cờ phát hiện đuôi tên miền đáng ngờ hay bị tội phạm mạng dùng (phishvn_suspicious_tld).</w:t>
-      </w:r>
-    </w:p>
-    <w:p>
-      <w:pPr>
-        <w:spacing w:line="276" w:lineRule="auto" w:before="0" w:after="100"/>
-        <w:ind w:left="340"/>
-        <w:jc w:val="both"/>
-      </w:pPr>
-      <w:r>
-        <w:rPr>
-          <w:rFonts w:ascii="Times New Roman" w:hAnsi="Times New Roman" w:eastAsia="Times New Roman"/>
-          <w:b/>
-          <w:i w:val="0"/>
-          <w:color w:val="000000"/>
-          <w:sz w:val="28"/>
-        </w:rPr>
-        <w:t xml:space="preserve">• Nhóm 6 — Phát hiện chiêu trò giấu chữ bằng mã phần trăm (Biến 53 đến 55): </w:t>
-      </w:r>
-      <w:r>
-        <w:rPr>
-          <w:rFonts w:ascii="Times New Roman" w:hAnsi="Times New Roman" w:eastAsia="Times New Roman"/>
-          <w:b w:val="0"/>
-          <w:i w:val="0"/>
-          <w:color w:val="000000"/>
-          <w:sz w:val="28"/>
-        </w:rPr>
-        <w:t>Gồm phiusiil_has_obfuscation (có dùng mã giấu chữ không), phiusiil_obfuscated_char_count (số ký tự bị giấu bằng cụm %xx) và phiusiil_obfuscation_ratio (tỷ lệ bị giấu). Diễn giải: Vạch trần thủ đoạn biến chữ cái bình thường thành các ký hiệu mật mã phần trăm để làm hoa mắt người xem.</w:t>
-      </w:r>
     </w:p>
     <w:p>
       <w:pPr>
@@ -1582,6 +2282,7 @@
     </w:p>
     <w:p>
       <w:pPr>
+        <w:keepNext/>
         <w:spacing w:line="276" w:lineRule="auto" w:before="0" w:after="60"/>
         <w:jc w:val="left"/>
       </w:pPr>
@@ -1606,6 +2307,9 @@
         <w:gridCol w:w="9071"/>
       </w:tblGrid>
       <w:tr>
+        <w:trPr>
+          <w:cantSplit/>
+        </w:trPr>
         <w:tc>
           <w:tcPr>
             <w:tcW w:type="dxa" w:w="9071"/>
@@ -1628,7 +2332,7 @@
                 <w:b w:val="0"/>
                 <w:i w:val="0"/>
                 <w:color w:val="0F172A"/>
-                <w:sz w:val="28"/>
+                <w:sz w:val="22"/>
               </w:rPr>
               <w:t>function validateUrl(value) {</w:t>
               <w:br/>
@@ -2000,6 +2704,7 @@
     </w:p>
     <w:p>
       <w:pPr>
+        <w:keepNext/>
         <w:spacing w:line="276" w:lineRule="auto" w:before="0" w:after="60"/>
         <w:jc w:val="left"/>
       </w:pPr>
@@ -2024,6 +2729,9 @@
         <w:gridCol w:w="9071"/>
       </w:tblGrid>
       <w:tr>
+        <w:trPr>
+          <w:cantSplit/>
+        </w:trPr>
         <w:tc>
           <w:tcPr>
             <w:tcW w:type="dxa" w:w="9071"/>
@@ -2046,7 +2754,7 @@
                 <w:b w:val="0"/>
                 <w:i w:val="0"/>
                 <w:color w:val="0F172A"/>
-                <w:sz w:val="28"/>
+                <w:sz w:val="22"/>
               </w:rPr>
               <w:t>function databaseMatch(url, features) {</w:t>
               <w:br/>
@@ -2505,6 +3213,7 @@
     </w:p>
     <w:p>
       <w:pPr>
+        <w:keepNext/>
         <w:spacing w:line="276" w:lineRule="auto" w:before="0" w:after="60"/>
         <w:jc w:val="left"/>
       </w:pPr>
@@ -2529,6 +3238,9 @@
         <w:gridCol w:w="9071"/>
       </w:tblGrid>
       <w:tr>
+        <w:trPr>
+          <w:cantSplit/>
+        </w:trPr>
         <w:tc>
           <w:tcPr>
             <w:tcW w:type="dxa" w:w="9071"/>
@@ -2551,7 +3263,7 @@
                 <w:b w:val="0"/>
                 <w:i w:val="0"/>
                 <w:color w:val="0F172A"/>
-                <w:sz w:val="28"/>
+                <w:sz w:val="22"/>
               </w:rPr>
               <w:t>function modelProbabilities(features) {</w:t>
               <w:br/>
@@ -2691,7 +3403,7 @@
           <w:color w:val="000000"/>
           <w:sz w:val="28"/>
         </w:rPr>
-        <w:t>Lấy các cây hỏi thuộc mô hình Rừng Ngẫu Nhiên.</w:t>
+        <w:t>Lấy các cây hỏi thuộc mô hình Random Forest.</w:t>
       </w:r>
     </w:p>
     <w:p>
@@ -2718,7 +3430,7 @@
           <w:color w:val="000000"/>
           <w:sz w:val="28"/>
         </w:rPr>
-        <w:t>Lấy các lượt học nối tiếp của mô hình Tăng Cường Độ Dốc.</w:t>
+        <w:t>Lấy các lượt học nối tiếp của mô hình Gradient Boosting.</w:t>
       </w:r>
     </w:p>
     <w:p>
@@ -2745,7 +3457,7 @@
           <w:color w:val="000000"/>
           <w:sz w:val="28"/>
         </w:rPr>
-        <w:t>Lấy thông số ranh giới và hiệu chỉnh của Máy Véc-tơ Hỗ Trợ.</w:t>
+        <w:t>Lấy thông số ranh giới và hiệu chỉnh của SVM.</w:t>
       </w:r>
     </w:p>
     <w:p>
@@ -2772,7 +3484,7 @@
           <w:color w:val="000000"/>
           <w:sz w:val="28"/>
         </w:rPr>
-        <w:t>Lấy bảng trọng số của mô hình Hồi Quy Logic.</w:t>
+        <w:t>Lấy bảng trọng số của mô hình Logistic Regression.</w:t>
       </w:r>
     </w:p>
     <w:p>
@@ -3213,7 +3925,7 @@
           <w:color w:val="000000"/>
           <w:sz w:val="28"/>
         </w:rPr>
-        <w:t>Ở giai đoạn đầu, nhóm dùng khoảng 5.000 địa chỉ, một mô hình Rừng Ngẫu Nhiên và ít dấu hiệu hơn. Quy mô nhỏ và chỉ có một cách chấm khiến hệ thống có thể bỏ lỡ kiểu giả mạo mới; không còn phép đo cùng bộ thử để nêu một tỷ lệ chính xác đáng tin cậy cho phiên bản đó.</w:t>
+        <w:t>Ở giai đoạn đầu, nhóm dùng khoảng 5.000 địa chỉ, một mô hình Random Forest và ít dấu hiệu hơn. Quy mô nhỏ và chỉ có một cách chấm khiến hệ thống có thể bỏ lỡ kiểu giả mạo mới; không còn phép đo cùng bộ thử để nêu một tỷ lệ chính xác đáng tin cậy cho phiên bản đó.</w:t>
       </w:r>
     </w:p>
     <w:p>
@@ -3240,7 +3952,7 @@
           <w:color w:val="000000"/>
           <w:sz w:val="28"/>
         </w:rPr>
-        <w:t>Nhóm mở rộng bộ dữ liệu học lên 261.299 địa chỉ, kho tra cứu có 36.261 hồ sơ, bộ đo có 55 dấu hiệu và hệ thống dùng bốn mô hình. Trên 6.624 địa chỉ được giữ riêng để thi thử, mô hình Tăng Cường Độ Dốc phát hiện 2.676 trong 2.799 trang lừa đảo (95,61%). SafeWeb có thêm biểu mẫu lập phiếu báo cáo loại suspected-phishing; phiếu được tạo thành tệp trên thiết bị, không tự gửi đi.</w:t>
+        <w:t>Nhóm mở rộng bộ dữ liệu học lên 261.299 địa chỉ, cơ sở dữ liệu tra cứu có 36.261 hồ sơ, bộ đo có 55 dấu hiệu và hệ thống dùng bốn mô hình. Trên 6.624 địa chỉ được giữ riêng để thi thử, mô hình Gradient Boosting phát hiện 2.676 trong 2.799 trang lừa đảo (95,61%). SafeWeb có thêm biểu mẫu lập phiếu báo cáo loại suspected-phishing; phiếu được tạo thành tệp trên thiết bị, không tự gửi đi.</w:t>
       </w:r>
     </w:p>
     <w:p>
@@ -3298,6 +4010,7 @@
         <w:tblStyle w:val="TableGrid"/>
         <w:tblW w:type="auto" w:w="0"/>
         <w:jc w:val="center"/>
+        <w:tblLayout w:type="fixed"/>
         <w:tblLook w:firstColumn="1" w:firstRow="1" w:lastColumn="0" w:lastRow="0" w:noHBand="0" w:noVBand="1" w:val="04A0"/>
       </w:tblPr>
       <w:tblGrid>
@@ -3309,9 +4022,12 @@
         <w:gridCol w:w="1512"/>
       </w:tblGrid>
       <w:tr>
+        <w:trPr>
+          <w:cantSplit/>
+        </w:trPr>
         <w:tc>
           <w:tcPr>
-            <w:tcW w:type="dxa" w:w="1512"/>
+            <w:tcW w:type="dxa" w:w="1757"/>
             <w:shd w:fill="0F766E"/>
             <w:tcMar>
               <w:top w:w="100" w:type="dxa"/>
@@ -3323,6 +4039,7 @@
           </w:tcPr>
           <w:p>
             <w:pPr>
+              <w:keepNext/>
               <w:spacing w:line="276" w:lineRule="auto"/>
               <w:jc w:val="center"/>
             </w:pPr>
@@ -3332,7 +4049,7 @@
                 <w:b/>
                 <w:i w:val="0"/>
                 <w:color w:val="FFFFFF"/>
-                <w:sz w:val="28"/>
+                <w:sz w:val="22"/>
               </w:rPr>
               <w:t>Tên mô hình</w:t>
             </w:r>
@@ -3340,7 +4057,7 @@
         </w:tc>
         <w:tc>
           <w:tcPr>
-            <w:tcW w:type="dxa" w:w="1512"/>
+            <w:tcW w:type="dxa" w:w="1191"/>
             <w:shd w:fill="0F766E"/>
             <w:tcMar>
               <w:top w:w="100" w:type="dxa"/>
@@ -3352,6 +4069,7 @@
           </w:tcPr>
           <w:p>
             <w:pPr>
+              <w:keepNext/>
               <w:spacing w:line="276" w:lineRule="auto"/>
               <w:jc w:val="center"/>
             </w:pPr>
@@ -3361,7 +4079,7 @@
                 <w:b/>
                 <w:i w:val="0"/>
                 <w:color w:val="FFFFFF"/>
-                <w:sz w:val="28"/>
+                <w:sz w:val="22"/>
               </w:rPr>
               <w:t>Tỷ lệ đoán đúng chung</w:t>
             </w:r>
@@ -3369,7 +4087,7 @@
         </w:tc>
         <w:tc>
           <w:tcPr>
-            <w:tcW w:type="dxa" w:w="1512"/>
+            <w:tcW w:type="dxa" w:w="1304"/>
             <w:shd w:fill="0F766E"/>
             <w:tcMar>
               <w:top w:w="100" w:type="dxa"/>
@@ -3381,6 +4099,7 @@
           </w:tcPr>
           <w:p>
             <w:pPr>
+              <w:keepNext/>
               <w:spacing w:line="276" w:lineRule="auto"/>
               <w:jc w:val="center"/>
             </w:pPr>
@@ -3390,7 +4109,7 @@
                 <w:b/>
                 <w:i w:val="0"/>
                 <w:color w:val="FFFFFF"/>
-                <w:sz w:val="28"/>
+                <w:sz w:val="22"/>
               </w:rPr>
               <w:t>Độ chuẩn xác khi báo động</w:t>
             </w:r>
@@ -3398,7 +4117,7 @@
         </w:tc>
         <w:tc>
           <w:tcPr>
-            <w:tcW w:type="dxa" w:w="1512"/>
+            <w:tcW w:type="dxa" w:w="1304"/>
             <w:shd w:fill="0F766E"/>
             <w:tcMar>
               <w:top w:w="100" w:type="dxa"/>
@@ -3410,6 +4129,7 @@
           </w:tcPr>
           <w:p>
             <w:pPr>
+              <w:keepNext/>
               <w:spacing w:line="276" w:lineRule="auto"/>
               <w:jc w:val="center"/>
             </w:pPr>
@@ -3419,7 +4139,7 @@
                 <w:b/>
                 <w:i w:val="0"/>
                 <w:color w:val="FFFFFF"/>
-                <w:sz w:val="28"/>
+                <w:sz w:val="22"/>
               </w:rPr>
               <w:t>Tỷ lệ bắt trúng lừa đảo</w:t>
             </w:r>
@@ -3427,7 +4147,7 @@
         </w:tc>
         <w:tc>
           <w:tcPr>
-            <w:tcW w:type="dxa" w:w="1512"/>
+            <w:tcW w:type="dxa" w:w="1304"/>
             <w:shd w:fill="0F766E"/>
             <w:tcMar>
               <w:top w:w="100" w:type="dxa"/>
@@ -3439,6 +4159,7 @@
           </w:tcPr>
           <w:p>
             <w:pPr>
+              <w:keepNext/>
               <w:spacing w:line="276" w:lineRule="auto"/>
               <w:jc w:val="center"/>
             </w:pPr>
@@ -3448,7 +4169,7 @@
                 <w:b/>
                 <w:i w:val="0"/>
                 <w:color w:val="FFFFFF"/>
-                <w:sz w:val="28"/>
+                <w:sz w:val="22"/>
               </w:rPr>
               <w:t>Điểm hiệu quả tổng hợp</w:t>
             </w:r>
@@ -3456,7 +4177,7 @@
         </w:tc>
         <w:tc>
           <w:tcPr>
-            <w:tcW w:type="dxa" w:w="1512"/>
+            <w:tcW w:type="dxa" w:w="2211"/>
             <w:shd w:fill="0F766E"/>
             <w:tcMar>
               <w:top w:w="100" w:type="dxa"/>
@@ -3468,6 +4189,7 @@
           </w:tcPr>
           <w:p>
             <w:pPr>
+              <w:keepNext/>
               <w:spacing w:line="276" w:lineRule="auto"/>
               <w:jc w:val="center"/>
             </w:pPr>
@@ -3477,7 +4199,7 @@
                 <w:b/>
                 <w:i w:val="0"/>
                 <w:color w:val="FFFFFF"/>
-                <w:sz w:val="28"/>
+                <w:sz w:val="22"/>
               </w:rPr>
               <w:t>Trang hợp lệ đoán đúng / Trang hợp lệ báo nhầm / Trang lừa đảo bỏ sót / Trang lừa đảo phát hiện</w:t>
             </w:r>
@@ -3485,9 +4207,12 @@
         </w:tc>
       </w:tr>
       <w:tr>
+        <w:trPr>
+          <w:cantSplit/>
+        </w:trPr>
         <w:tc>
           <w:tcPr>
-            <w:tcW w:type="dxa" w:w="1512"/>
+            <w:tcW w:type="dxa" w:w="1757"/>
             <w:shd w:fill="FFFFFF"/>
             <w:tcMar>
               <w:top w:w="90" w:type="dxa"/>
@@ -3499,6 +4224,7 @@
           </w:tcPr>
           <w:p>
             <w:pPr>
+              <w:keepNext/>
               <w:spacing w:line="276" w:lineRule="auto"/>
               <w:jc w:val="left"/>
             </w:pPr>
@@ -3508,15 +4234,15 @@
                 <w:b/>
                 <w:i w:val="0"/>
                 <w:color w:val="000000"/>
-                <w:sz w:val="28"/>
+                <w:sz w:val="22"/>
               </w:rPr>
-              <w:t>1. Rừng Ngẫu Nhiên</w:t>
+              <w:t>1. Random Forest</w:t>
             </w:r>
           </w:p>
         </w:tc>
         <w:tc>
           <w:tcPr>
-            <w:tcW w:type="dxa" w:w="1512"/>
+            <w:tcW w:type="dxa" w:w="1191"/>
             <w:shd w:fill="FFFFFF"/>
             <w:tcMar>
               <w:top w:w="90" w:type="dxa"/>
@@ -3528,6 +4254,7 @@
           </w:tcPr>
           <w:p>
             <w:pPr>
+              <w:keepNext/>
               <w:spacing w:line="276" w:lineRule="auto"/>
               <w:jc w:val="center"/>
             </w:pPr>
@@ -3537,7 +4264,7 @@
                 <w:b w:val="0"/>
                 <w:i w:val="0"/>
                 <w:color w:val="000000"/>
-                <w:sz w:val="28"/>
+                <w:sz w:val="22"/>
               </w:rPr>
               <w:t>87,45%</w:t>
             </w:r>
@@ -3545,7 +4272,7 @@
         </w:tc>
         <w:tc>
           <w:tcPr>
-            <w:tcW w:type="dxa" w:w="1512"/>
+            <w:tcW w:type="dxa" w:w="1304"/>
             <w:shd w:fill="FFFFFF"/>
             <w:tcMar>
               <w:top w:w="90" w:type="dxa"/>
@@ -3557,6 +4284,7 @@
           </w:tcPr>
           <w:p>
             <w:pPr>
+              <w:keepNext/>
               <w:spacing w:line="276" w:lineRule="auto"/>
               <w:jc w:val="center"/>
             </w:pPr>
@@ -3566,7 +4294,7 @@
                 <w:b w:val="0"/>
                 <w:i w:val="0"/>
                 <w:color w:val="000000"/>
-                <w:sz w:val="28"/>
+                <w:sz w:val="22"/>
               </w:rPr>
               <w:t>80,75%</w:t>
             </w:r>
@@ -3574,7 +4302,7 @@
         </w:tc>
         <w:tc>
           <w:tcPr>
-            <w:tcW w:type="dxa" w:w="1512"/>
+            <w:tcW w:type="dxa" w:w="1304"/>
             <w:shd w:fill="FFFFFF"/>
             <w:tcMar>
               <w:top w:w="90" w:type="dxa"/>
@@ -3586,6 +4314,7 @@
           </w:tcPr>
           <w:p>
             <w:pPr>
+              <w:keepNext/>
               <w:spacing w:line="276" w:lineRule="auto"/>
               <w:jc w:val="center"/>
             </w:pPr>
@@ -3595,7 +4324,7 @@
                 <w:b w:val="0"/>
                 <w:i w:val="0"/>
                 <w:color w:val="000000"/>
-                <w:sz w:val="28"/>
+                <w:sz w:val="22"/>
               </w:rPr>
               <w:t>92,32%</w:t>
             </w:r>
@@ -3603,7 +4332,7 @@
         </w:tc>
         <w:tc>
           <w:tcPr>
-            <w:tcW w:type="dxa" w:w="1512"/>
+            <w:tcW w:type="dxa" w:w="1304"/>
             <w:shd w:fill="FFFFFF"/>
             <w:tcMar>
               <w:top w:w="90" w:type="dxa"/>
@@ -3615,6 +4344,7 @@
           </w:tcPr>
           <w:p>
             <w:pPr>
+              <w:keepNext/>
               <w:spacing w:line="276" w:lineRule="auto"/>
               <w:jc w:val="center"/>
             </w:pPr>
@@ -3624,7 +4354,7 @@
                 <w:b w:val="0"/>
                 <w:i w:val="0"/>
                 <w:color w:val="000000"/>
-                <w:sz w:val="28"/>
+                <w:sz w:val="22"/>
               </w:rPr>
               <w:t>86,15%</w:t>
             </w:r>
@@ -3632,7 +4362,7 @@
         </w:tc>
         <w:tc>
           <w:tcPr>
-            <w:tcW w:type="dxa" w:w="1512"/>
+            <w:tcW w:type="dxa" w:w="2211"/>
             <w:shd w:fill="FFFFFF"/>
             <w:tcMar>
               <w:top w:w="90" w:type="dxa"/>
@@ -3644,6 +4374,7 @@
           </w:tcPr>
           <w:p>
             <w:pPr>
+              <w:keepNext/>
               <w:spacing w:line="276" w:lineRule="auto"/>
               <w:jc w:val="left"/>
             </w:pPr>
@@ -3653,7 +4384,7 @@
                 <w:b w:val="0"/>
                 <w:i w:val="0"/>
                 <w:color w:val="000000"/>
-                <w:sz w:val="28"/>
+                <w:sz w:val="22"/>
               </w:rPr>
               <w:t>3.209 / 616 / 215 / 2.584</w:t>
             </w:r>
@@ -3661,9 +4392,382 @@
         </w:tc>
       </w:tr>
       <w:tr>
+        <w:trPr>
+          <w:cantSplit/>
+        </w:trPr>
         <w:tc>
           <w:tcPr>
-            <w:tcW w:type="dxa" w:w="1512"/>
+            <w:tcW w:type="dxa" w:w="1757"/>
+            <w:shd w:fill="F8FAFC"/>
+            <w:tcMar>
+              <w:top w:w="90" w:type="dxa"/>
+              <w:bottom w:w="90" w:type="dxa"/>
+              <w:left w:w="120" w:type="dxa"/>
+              <w:right w:w="120" w:type="dxa"/>
+            </w:tcMar>
+            <w:vAlign w:val="center"/>
+          </w:tcPr>
+          <w:p>
+            <w:pPr>
+              <w:keepNext/>
+              <w:spacing w:line="276" w:lineRule="auto"/>
+              <w:jc w:val="left"/>
+            </w:pPr>
+            <w:r>
+              <w:rPr>
+                <w:rFonts w:ascii="Times New Roman" w:hAnsi="Times New Roman" w:eastAsia="Times New Roman"/>
+                <w:b/>
+                <w:i w:val="0"/>
+                <w:color w:val="000000"/>
+                <w:sz w:val="22"/>
+              </w:rPr>
+              <w:t>2. Gradient Boosting</w:t>
+            </w:r>
+          </w:p>
+        </w:tc>
+        <w:tc>
+          <w:tcPr>
+            <w:tcW w:type="dxa" w:w="1191"/>
+            <w:shd w:fill="F8FAFC"/>
+            <w:tcMar>
+              <w:top w:w="90" w:type="dxa"/>
+              <w:bottom w:w="90" w:type="dxa"/>
+              <w:left w:w="120" w:type="dxa"/>
+              <w:right w:w="120" w:type="dxa"/>
+            </w:tcMar>
+            <w:vAlign w:val="center"/>
+          </w:tcPr>
+          <w:p>
+            <w:pPr>
+              <w:keepNext/>
+              <w:spacing w:line="276" w:lineRule="auto"/>
+              <w:jc w:val="center"/>
+            </w:pPr>
+            <w:r>
+              <w:rPr>
+                <w:rFonts w:ascii="Times New Roman" w:hAnsi="Times New Roman" w:eastAsia="Times New Roman"/>
+                <w:b w:val="0"/>
+                <w:i w:val="0"/>
+                <w:color w:val="000000"/>
+                <w:sz w:val="22"/>
+              </w:rPr>
+              <w:t>87,89%</w:t>
+            </w:r>
+          </w:p>
+        </w:tc>
+        <w:tc>
+          <w:tcPr>
+            <w:tcW w:type="dxa" w:w="1304"/>
+            <w:shd w:fill="F8FAFC"/>
+            <w:tcMar>
+              <w:top w:w="90" w:type="dxa"/>
+              <w:bottom w:w="90" w:type="dxa"/>
+              <w:left w:w="120" w:type="dxa"/>
+              <w:right w:w="120" w:type="dxa"/>
+            </w:tcMar>
+            <w:vAlign w:val="center"/>
+          </w:tcPr>
+          <w:p>
+            <w:pPr>
+              <w:keepNext/>
+              <w:spacing w:line="276" w:lineRule="auto"/>
+              <w:jc w:val="center"/>
+            </w:pPr>
+            <w:r>
+              <w:rPr>
+                <w:rFonts w:ascii="Times New Roman" w:hAnsi="Times New Roman" w:eastAsia="Times New Roman"/>
+                <w:b w:val="0"/>
+                <w:i w:val="0"/>
+                <w:color w:val="000000"/>
+                <w:sz w:val="22"/>
+              </w:rPr>
+              <w:t>79,76%</w:t>
+            </w:r>
+          </w:p>
+        </w:tc>
+        <w:tc>
+          <w:tcPr>
+            <w:tcW w:type="dxa" w:w="1304"/>
+            <w:shd w:fill="F8FAFC"/>
+            <w:tcMar>
+              <w:top w:w="90" w:type="dxa"/>
+              <w:bottom w:w="90" w:type="dxa"/>
+              <w:left w:w="120" w:type="dxa"/>
+              <w:right w:w="120" w:type="dxa"/>
+            </w:tcMar>
+            <w:vAlign w:val="center"/>
+          </w:tcPr>
+          <w:p>
+            <w:pPr>
+              <w:keepNext/>
+              <w:spacing w:line="276" w:lineRule="auto"/>
+              <w:jc w:val="center"/>
+            </w:pPr>
+            <w:r>
+              <w:rPr>
+                <w:rFonts w:ascii="Times New Roman" w:hAnsi="Times New Roman" w:eastAsia="Times New Roman"/>
+                <w:b w:val="0"/>
+                <w:i w:val="0"/>
+                <w:color w:val="000000"/>
+                <w:sz w:val="22"/>
+              </w:rPr>
+              <w:t>95,61%</w:t>
+            </w:r>
+          </w:p>
+        </w:tc>
+        <w:tc>
+          <w:tcPr>
+            <w:tcW w:type="dxa" w:w="1304"/>
+            <w:shd w:fill="F8FAFC"/>
+            <w:tcMar>
+              <w:top w:w="90" w:type="dxa"/>
+              <w:bottom w:w="90" w:type="dxa"/>
+              <w:left w:w="120" w:type="dxa"/>
+              <w:right w:w="120" w:type="dxa"/>
+            </w:tcMar>
+            <w:vAlign w:val="center"/>
+          </w:tcPr>
+          <w:p>
+            <w:pPr>
+              <w:keepNext/>
+              <w:spacing w:line="276" w:lineRule="auto"/>
+              <w:jc w:val="center"/>
+            </w:pPr>
+            <w:r>
+              <w:rPr>
+                <w:rFonts w:ascii="Times New Roman" w:hAnsi="Times New Roman" w:eastAsia="Times New Roman"/>
+                <w:b w:val="0"/>
+                <w:i w:val="0"/>
+                <w:color w:val="000000"/>
+                <w:sz w:val="22"/>
+              </w:rPr>
+              <w:t>86,97%</w:t>
+            </w:r>
+          </w:p>
+        </w:tc>
+        <w:tc>
+          <w:tcPr>
+            <w:tcW w:type="dxa" w:w="2211"/>
+            <w:shd w:fill="F8FAFC"/>
+            <w:tcMar>
+              <w:top w:w="90" w:type="dxa"/>
+              <w:bottom w:w="90" w:type="dxa"/>
+              <w:left w:w="120" w:type="dxa"/>
+              <w:right w:w="120" w:type="dxa"/>
+            </w:tcMar>
+            <w:vAlign w:val="center"/>
+          </w:tcPr>
+          <w:p>
+            <w:pPr>
+              <w:keepNext/>
+              <w:spacing w:line="276" w:lineRule="auto"/>
+              <w:jc w:val="left"/>
+            </w:pPr>
+            <w:r>
+              <w:rPr>
+                <w:rFonts w:ascii="Times New Roman" w:hAnsi="Times New Roman" w:eastAsia="Times New Roman"/>
+                <w:b w:val="0"/>
+                <w:i w:val="0"/>
+                <w:color w:val="000000"/>
+                <w:sz w:val="22"/>
+              </w:rPr>
+              <w:t>3.146 / 679 / 123 / 2.676</w:t>
+            </w:r>
+          </w:p>
+        </w:tc>
+      </w:tr>
+      <w:tr>
+        <w:trPr>
+          <w:cantSplit/>
+        </w:trPr>
+        <w:tc>
+          <w:tcPr>
+            <w:tcW w:type="dxa" w:w="1757"/>
+            <w:shd w:fill="FFFFFF"/>
+            <w:tcMar>
+              <w:top w:w="90" w:type="dxa"/>
+              <w:bottom w:w="90" w:type="dxa"/>
+              <w:left w:w="120" w:type="dxa"/>
+              <w:right w:w="120" w:type="dxa"/>
+            </w:tcMar>
+            <w:vAlign w:val="center"/>
+          </w:tcPr>
+          <w:p>
+            <w:pPr>
+              <w:keepNext/>
+              <w:spacing w:line="276" w:lineRule="auto"/>
+              <w:jc w:val="left"/>
+            </w:pPr>
+            <w:r>
+              <w:rPr>
+                <w:rFonts w:ascii="Times New Roman" w:hAnsi="Times New Roman" w:eastAsia="Times New Roman"/>
+                <w:b/>
+                <w:i w:val="0"/>
+                <w:color w:val="000000"/>
+                <w:sz w:val="22"/>
+              </w:rPr>
+              <w:t>3. SVM</w:t>
+            </w:r>
+          </w:p>
+        </w:tc>
+        <w:tc>
+          <w:tcPr>
+            <w:tcW w:type="dxa" w:w="1191"/>
+            <w:shd w:fill="FFFFFF"/>
+            <w:tcMar>
+              <w:top w:w="90" w:type="dxa"/>
+              <w:bottom w:w="90" w:type="dxa"/>
+              <w:left w:w="120" w:type="dxa"/>
+              <w:right w:w="120" w:type="dxa"/>
+            </w:tcMar>
+            <w:vAlign w:val="center"/>
+          </w:tcPr>
+          <w:p>
+            <w:pPr>
+              <w:keepNext/>
+              <w:spacing w:line="276" w:lineRule="auto"/>
+              <w:jc w:val="center"/>
+            </w:pPr>
+            <w:r>
+              <w:rPr>
+                <w:rFonts w:ascii="Times New Roman" w:hAnsi="Times New Roman" w:eastAsia="Times New Roman"/>
+                <w:b w:val="0"/>
+                <w:i w:val="0"/>
+                <w:color w:val="000000"/>
+                <w:sz w:val="22"/>
+              </w:rPr>
+              <w:t>58,05%</w:t>
+            </w:r>
+          </w:p>
+        </w:tc>
+        <w:tc>
+          <w:tcPr>
+            <w:tcW w:type="dxa" w:w="1304"/>
+            <w:shd w:fill="FFFFFF"/>
+            <w:tcMar>
+              <w:top w:w="90" w:type="dxa"/>
+              <w:bottom w:w="90" w:type="dxa"/>
+              <w:left w:w="120" w:type="dxa"/>
+              <w:right w:w="120" w:type="dxa"/>
+            </w:tcMar>
+            <w:vAlign w:val="center"/>
+          </w:tcPr>
+          <w:p>
+            <w:pPr>
+              <w:keepNext/>
+              <w:spacing w:line="276" w:lineRule="auto"/>
+              <w:jc w:val="center"/>
+            </w:pPr>
+            <w:r>
+              <w:rPr>
+                <w:rFonts w:ascii="Times New Roman" w:hAnsi="Times New Roman" w:eastAsia="Times New Roman"/>
+                <w:b w:val="0"/>
+                <w:i w:val="0"/>
+                <w:color w:val="000000"/>
+                <w:sz w:val="22"/>
+              </w:rPr>
+              <w:t>100,00%</w:t>
+            </w:r>
+          </w:p>
+        </w:tc>
+        <w:tc>
+          <w:tcPr>
+            <w:tcW w:type="dxa" w:w="1304"/>
+            <w:shd w:fill="FFFFFF"/>
+            <w:tcMar>
+              <w:top w:w="90" w:type="dxa"/>
+              <w:bottom w:w="90" w:type="dxa"/>
+              <w:left w:w="120" w:type="dxa"/>
+              <w:right w:w="120" w:type="dxa"/>
+            </w:tcMar>
+            <w:vAlign w:val="center"/>
+          </w:tcPr>
+          <w:p>
+            <w:pPr>
+              <w:keepNext/>
+              <w:spacing w:line="276" w:lineRule="auto"/>
+              <w:jc w:val="center"/>
+            </w:pPr>
+            <w:r>
+              <w:rPr>
+                <w:rFonts w:ascii="Times New Roman" w:hAnsi="Times New Roman" w:eastAsia="Times New Roman"/>
+                <w:b w:val="0"/>
+                <w:i w:val="0"/>
+                <w:color w:val="000000"/>
+                <w:sz w:val="22"/>
+              </w:rPr>
+              <w:t>0,71%</w:t>
+            </w:r>
+          </w:p>
+        </w:tc>
+        <w:tc>
+          <w:tcPr>
+            <w:tcW w:type="dxa" w:w="1304"/>
+            <w:shd w:fill="FFFFFF"/>
+            <w:tcMar>
+              <w:top w:w="90" w:type="dxa"/>
+              <w:bottom w:w="90" w:type="dxa"/>
+              <w:left w:w="120" w:type="dxa"/>
+              <w:right w:w="120" w:type="dxa"/>
+            </w:tcMar>
+            <w:vAlign w:val="center"/>
+          </w:tcPr>
+          <w:p>
+            <w:pPr>
+              <w:keepNext/>
+              <w:spacing w:line="276" w:lineRule="auto"/>
+              <w:jc w:val="center"/>
+            </w:pPr>
+            <w:r>
+              <w:rPr>
+                <w:rFonts w:ascii="Times New Roman" w:hAnsi="Times New Roman" w:eastAsia="Times New Roman"/>
+                <w:b w:val="0"/>
+                <w:i w:val="0"/>
+                <w:color w:val="000000"/>
+                <w:sz w:val="22"/>
+              </w:rPr>
+              <w:t>1,42%</w:t>
+            </w:r>
+          </w:p>
+        </w:tc>
+        <w:tc>
+          <w:tcPr>
+            <w:tcW w:type="dxa" w:w="2211"/>
+            <w:shd w:fill="FFFFFF"/>
+            <w:tcMar>
+              <w:top w:w="90" w:type="dxa"/>
+              <w:bottom w:w="90" w:type="dxa"/>
+              <w:left w:w="120" w:type="dxa"/>
+              <w:right w:w="120" w:type="dxa"/>
+            </w:tcMar>
+            <w:vAlign w:val="center"/>
+          </w:tcPr>
+          <w:p>
+            <w:pPr>
+              <w:keepNext/>
+              <w:spacing w:line="276" w:lineRule="auto"/>
+              <w:jc w:val="left"/>
+            </w:pPr>
+            <w:r>
+              <w:rPr>
+                <w:rFonts w:ascii="Times New Roman" w:hAnsi="Times New Roman" w:eastAsia="Times New Roman"/>
+                <w:b w:val="0"/>
+                <w:i w:val="0"/>
+                <w:color w:val="000000"/>
+                <w:sz w:val="22"/>
+              </w:rPr>
+              <w:t>3.825 / 0 / 2.779 / 20</w:t>
+            </w:r>
+          </w:p>
+        </w:tc>
+      </w:tr>
+      <w:tr>
+        <w:trPr>
+          <w:cantSplit/>
+        </w:trPr>
+        <w:tc>
+          <w:tcPr>
+            <w:tcW w:type="dxa" w:w="1757"/>
             <w:shd w:fill="F8FAFC"/>
             <w:tcMar>
               <w:top w:w="90" w:type="dxa"/>
@@ -3684,15 +4788,15 @@
                 <w:b/>
                 <w:i w:val="0"/>
                 <w:color w:val="000000"/>
-                <w:sz w:val="28"/>
+                <w:sz w:val="22"/>
               </w:rPr>
-              <w:t>2. Tăng Cường Độ Dốc</w:t>
+              <w:t>4. Logistic Regression</w:t>
             </w:r>
           </w:p>
         </w:tc>
         <w:tc>
           <w:tcPr>
-            <w:tcW w:type="dxa" w:w="1512"/>
+            <w:tcW w:type="dxa" w:w="1191"/>
             <w:shd w:fill="F8FAFC"/>
             <w:tcMar>
               <w:top w:w="90" w:type="dxa"/>
@@ -3713,15 +4817,15 @@
                 <w:b w:val="0"/>
                 <w:i w:val="0"/>
                 <w:color w:val="000000"/>
-                <w:sz w:val="28"/>
+                <w:sz w:val="22"/>
               </w:rPr>
-              <w:t>87,89%</w:t>
+              <w:t>85,55%</w:t>
             </w:r>
           </w:p>
         </w:tc>
         <w:tc>
           <w:tcPr>
-            <w:tcW w:type="dxa" w:w="1512"/>
+            <w:tcW w:type="dxa" w:w="1304"/>
             <w:shd w:fill="F8FAFC"/>
             <w:tcMar>
               <w:top w:w="90" w:type="dxa"/>
@@ -3742,15 +4846,15 @@
                 <w:b w:val="0"/>
                 <w:i w:val="0"/>
                 <w:color w:val="000000"/>
-                <w:sz w:val="28"/>
+                <w:sz w:val="22"/>
               </w:rPr>
-              <w:t>79,76%</w:t>
+              <w:t>79,96%</w:t>
             </w:r>
           </w:p>
         </w:tc>
         <w:tc>
           <w:tcPr>
-            <w:tcW w:type="dxa" w:w="1512"/>
+            <w:tcW w:type="dxa" w:w="1304"/>
             <w:shd w:fill="F8FAFC"/>
             <w:tcMar>
               <w:top w:w="90" w:type="dxa"/>
@@ -3771,15 +4875,15 @@
                 <w:b w:val="0"/>
                 <w:i w:val="0"/>
                 <w:color w:val="000000"/>
-                <w:sz w:val="28"/>
+                <w:sz w:val="22"/>
               </w:rPr>
-              <w:t>95,61%</w:t>
+              <w:t>87,82%</w:t>
             </w:r>
           </w:p>
         </w:tc>
         <w:tc>
           <w:tcPr>
-            <w:tcW w:type="dxa" w:w="1512"/>
+            <w:tcW w:type="dxa" w:w="1304"/>
             <w:shd w:fill="F8FAFC"/>
             <w:tcMar>
               <w:top w:w="90" w:type="dxa"/>
@@ -3800,15 +4904,15 @@
                 <w:b w:val="0"/>
                 <w:i w:val="0"/>
                 <w:color w:val="000000"/>
-                <w:sz w:val="28"/>
+                <w:sz w:val="22"/>
               </w:rPr>
-              <w:t>86,97%</w:t>
+              <w:t>83,71%</w:t>
             </w:r>
           </w:p>
         </w:tc>
         <w:tc>
           <w:tcPr>
-            <w:tcW w:type="dxa" w:w="1512"/>
+            <w:tcW w:type="dxa" w:w="2211"/>
             <w:shd w:fill="F8FAFC"/>
             <w:tcMar>
               <w:top w:w="90" w:type="dxa"/>
@@ -3829,359 +4933,7 @@
                 <w:b w:val="0"/>
                 <w:i w:val="0"/>
                 <w:color w:val="000000"/>
-                <w:sz w:val="28"/>
-              </w:rPr>
-              <w:t>3.146 / 679 / 123 / 2.676</w:t>
-            </w:r>
-          </w:p>
-        </w:tc>
-      </w:tr>
-      <w:tr>
-        <w:tc>
-          <w:tcPr>
-            <w:tcW w:type="dxa" w:w="1512"/>
-            <w:shd w:fill="FFFFFF"/>
-            <w:tcMar>
-              <w:top w:w="90" w:type="dxa"/>
-              <w:bottom w:w="90" w:type="dxa"/>
-              <w:left w:w="120" w:type="dxa"/>
-              <w:right w:w="120" w:type="dxa"/>
-            </w:tcMar>
-            <w:vAlign w:val="center"/>
-          </w:tcPr>
-          <w:p>
-            <w:pPr>
-              <w:spacing w:line="276" w:lineRule="auto"/>
-              <w:jc w:val="left"/>
-            </w:pPr>
-            <w:r>
-              <w:rPr>
-                <w:rFonts w:ascii="Times New Roman" w:hAnsi="Times New Roman" w:eastAsia="Times New Roman"/>
-                <w:b/>
-                <w:i w:val="0"/>
-                <w:color w:val="000000"/>
-                <w:sz w:val="28"/>
-              </w:rPr>
-              <w:t>3. Máy Véc-tơ Hỗ Trợ</w:t>
-            </w:r>
-          </w:p>
-        </w:tc>
-        <w:tc>
-          <w:tcPr>
-            <w:tcW w:type="dxa" w:w="1512"/>
-            <w:shd w:fill="FFFFFF"/>
-            <w:tcMar>
-              <w:top w:w="90" w:type="dxa"/>
-              <w:bottom w:w="90" w:type="dxa"/>
-              <w:left w:w="120" w:type="dxa"/>
-              <w:right w:w="120" w:type="dxa"/>
-            </w:tcMar>
-            <w:vAlign w:val="center"/>
-          </w:tcPr>
-          <w:p>
-            <w:pPr>
-              <w:spacing w:line="276" w:lineRule="auto"/>
-              <w:jc w:val="center"/>
-            </w:pPr>
-            <w:r>
-              <w:rPr>
-                <w:rFonts w:ascii="Times New Roman" w:hAnsi="Times New Roman" w:eastAsia="Times New Roman"/>
-                <w:b w:val="0"/>
-                <w:i w:val="0"/>
-                <w:color w:val="000000"/>
-                <w:sz w:val="28"/>
-              </w:rPr>
-              <w:t>58,05%</w:t>
-            </w:r>
-          </w:p>
-        </w:tc>
-        <w:tc>
-          <w:tcPr>
-            <w:tcW w:type="dxa" w:w="1512"/>
-            <w:shd w:fill="FFFFFF"/>
-            <w:tcMar>
-              <w:top w:w="90" w:type="dxa"/>
-              <w:bottom w:w="90" w:type="dxa"/>
-              <w:left w:w="120" w:type="dxa"/>
-              <w:right w:w="120" w:type="dxa"/>
-            </w:tcMar>
-            <w:vAlign w:val="center"/>
-          </w:tcPr>
-          <w:p>
-            <w:pPr>
-              <w:spacing w:line="276" w:lineRule="auto"/>
-              <w:jc w:val="center"/>
-            </w:pPr>
-            <w:r>
-              <w:rPr>
-                <w:rFonts w:ascii="Times New Roman" w:hAnsi="Times New Roman" w:eastAsia="Times New Roman"/>
-                <w:b w:val="0"/>
-                <w:i w:val="0"/>
-                <w:color w:val="000000"/>
-                <w:sz w:val="28"/>
-              </w:rPr>
-              <w:t>100,00%</w:t>
-            </w:r>
-          </w:p>
-        </w:tc>
-        <w:tc>
-          <w:tcPr>
-            <w:tcW w:type="dxa" w:w="1512"/>
-            <w:shd w:fill="FFFFFF"/>
-            <w:tcMar>
-              <w:top w:w="90" w:type="dxa"/>
-              <w:bottom w:w="90" w:type="dxa"/>
-              <w:left w:w="120" w:type="dxa"/>
-              <w:right w:w="120" w:type="dxa"/>
-            </w:tcMar>
-            <w:vAlign w:val="center"/>
-          </w:tcPr>
-          <w:p>
-            <w:pPr>
-              <w:spacing w:line="276" w:lineRule="auto"/>
-              <w:jc w:val="center"/>
-            </w:pPr>
-            <w:r>
-              <w:rPr>
-                <w:rFonts w:ascii="Times New Roman" w:hAnsi="Times New Roman" w:eastAsia="Times New Roman"/>
-                <w:b w:val="0"/>
-                <w:i w:val="0"/>
-                <w:color w:val="000000"/>
-                <w:sz w:val="28"/>
-              </w:rPr>
-              <w:t>0,71%</w:t>
-            </w:r>
-          </w:p>
-        </w:tc>
-        <w:tc>
-          <w:tcPr>
-            <w:tcW w:type="dxa" w:w="1512"/>
-            <w:shd w:fill="FFFFFF"/>
-            <w:tcMar>
-              <w:top w:w="90" w:type="dxa"/>
-              <w:bottom w:w="90" w:type="dxa"/>
-              <w:left w:w="120" w:type="dxa"/>
-              <w:right w:w="120" w:type="dxa"/>
-            </w:tcMar>
-            <w:vAlign w:val="center"/>
-          </w:tcPr>
-          <w:p>
-            <w:pPr>
-              <w:spacing w:line="276" w:lineRule="auto"/>
-              <w:jc w:val="center"/>
-            </w:pPr>
-            <w:r>
-              <w:rPr>
-                <w:rFonts w:ascii="Times New Roman" w:hAnsi="Times New Roman" w:eastAsia="Times New Roman"/>
-                <w:b w:val="0"/>
-                <w:i w:val="0"/>
-                <w:color w:val="000000"/>
-                <w:sz w:val="28"/>
-              </w:rPr>
-              <w:t>1,42%</w:t>
-            </w:r>
-          </w:p>
-        </w:tc>
-        <w:tc>
-          <w:tcPr>
-            <w:tcW w:type="dxa" w:w="1512"/>
-            <w:shd w:fill="FFFFFF"/>
-            <w:tcMar>
-              <w:top w:w="90" w:type="dxa"/>
-              <w:bottom w:w="90" w:type="dxa"/>
-              <w:left w:w="120" w:type="dxa"/>
-              <w:right w:w="120" w:type="dxa"/>
-            </w:tcMar>
-            <w:vAlign w:val="center"/>
-          </w:tcPr>
-          <w:p>
-            <w:pPr>
-              <w:spacing w:line="276" w:lineRule="auto"/>
-              <w:jc w:val="left"/>
-            </w:pPr>
-            <w:r>
-              <w:rPr>
-                <w:rFonts w:ascii="Times New Roman" w:hAnsi="Times New Roman" w:eastAsia="Times New Roman"/>
-                <w:b w:val="0"/>
-                <w:i w:val="0"/>
-                <w:color w:val="000000"/>
-                <w:sz w:val="28"/>
-              </w:rPr>
-              <w:t>3.825 / 0 / 2.779 / 20</w:t>
-            </w:r>
-          </w:p>
-        </w:tc>
-      </w:tr>
-      <w:tr>
-        <w:tc>
-          <w:tcPr>
-            <w:tcW w:type="dxa" w:w="1512"/>
-            <w:shd w:fill="F8FAFC"/>
-            <w:tcMar>
-              <w:top w:w="90" w:type="dxa"/>
-              <w:bottom w:w="90" w:type="dxa"/>
-              <w:left w:w="120" w:type="dxa"/>
-              <w:right w:w="120" w:type="dxa"/>
-            </w:tcMar>
-            <w:vAlign w:val="center"/>
-          </w:tcPr>
-          <w:p>
-            <w:pPr>
-              <w:spacing w:line="276" w:lineRule="auto"/>
-              <w:jc w:val="left"/>
-            </w:pPr>
-            <w:r>
-              <w:rPr>
-                <w:rFonts w:ascii="Times New Roman" w:hAnsi="Times New Roman" w:eastAsia="Times New Roman"/>
-                <w:b/>
-                <w:i w:val="0"/>
-                <w:color w:val="000000"/>
-                <w:sz w:val="28"/>
-              </w:rPr>
-              <w:t>4. Hồi Quy Logic</w:t>
-            </w:r>
-          </w:p>
-        </w:tc>
-        <w:tc>
-          <w:tcPr>
-            <w:tcW w:type="dxa" w:w="1512"/>
-            <w:shd w:fill="F8FAFC"/>
-            <w:tcMar>
-              <w:top w:w="90" w:type="dxa"/>
-              <w:bottom w:w="90" w:type="dxa"/>
-              <w:left w:w="120" w:type="dxa"/>
-              <w:right w:w="120" w:type="dxa"/>
-            </w:tcMar>
-            <w:vAlign w:val="center"/>
-          </w:tcPr>
-          <w:p>
-            <w:pPr>
-              <w:spacing w:line="276" w:lineRule="auto"/>
-              <w:jc w:val="center"/>
-            </w:pPr>
-            <w:r>
-              <w:rPr>
-                <w:rFonts w:ascii="Times New Roman" w:hAnsi="Times New Roman" w:eastAsia="Times New Roman"/>
-                <w:b w:val="0"/>
-                <w:i w:val="0"/>
-                <w:color w:val="000000"/>
-                <w:sz w:val="28"/>
-              </w:rPr>
-              <w:t>85,55%</w:t>
-            </w:r>
-          </w:p>
-        </w:tc>
-        <w:tc>
-          <w:tcPr>
-            <w:tcW w:type="dxa" w:w="1512"/>
-            <w:shd w:fill="F8FAFC"/>
-            <w:tcMar>
-              <w:top w:w="90" w:type="dxa"/>
-              <w:bottom w:w="90" w:type="dxa"/>
-              <w:left w:w="120" w:type="dxa"/>
-              <w:right w:w="120" w:type="dxa"/>
-            </w:tcMar>
-            <w:vAlign w:val="center"/>
-          </w:tcPr>
-          <w:p>
-            <w:pPr>
-              <w:spacing w:line="276" w:lineRule="auto"/>
-              <w:jc w:val="center"/>
-            </w:pPr>
-            <w:r>
-              <w:rPr>
-                <w:rFonts w:ascii="Times New Roman" w:hAnsi="Times New Roman" w:eastAsia="Times New Roman"/>
-                <w:b w:val="0"/>
-                <w:i w:val="0"/>
-                <w:color w:val="000000"/>
-                <w:sz w:val="28"/>
-              </w:rPr>
-              <w:t>79,96%</w:t>
-            </w:r>
-          </w:p>
-        </w:tc>
-        <w:tc>
-          <w:tcPr>
-            <w:tcW w:type="dxa" w:w="1512"/>
-            <w:shd w:fill="F8FAFC"/>
-            <w:tcMar>
-              <w:top w:w="90" w:type="dxa"/>
-              <w:bottom w:w="90" w:type="dxa"/>
-              <w:left w:w="120" w:type="dxa"/>
-              <w:right w:w="120" w:type="dxa"/>
-            </w:tcMar>
-            <w:vAlign w:val="center"/>
-          </w:tcPr>
-          <w:p>
-            <w:pPr>
-              <w:spacing w:line="276" w:lineRule="auto"/>
-              <w:jc w:val="center"/>
-            </w:pPr>
-            <w:r>
-              <w:rPr>
-                <w:rFonts w:ascii="Times New Roman" w:hAnsi="Times New Roman" w:eastAsia="Times New Roman"/>
-                <w:b w:val="0"/>
-                <w:i w:val="0"/>
-                <w:color w:val="000000"/>
-                <w:sz w:val="28"/>
-              </w:rPr>
-              <w:t>87,82%</w:t>
-            </w:r>
-          </w:p>
-        </w:tc>
-        <w:tc>
-          <w:tcPr>
-            <w:tcW w:type="dxa" w:w="1512"/>
-            <w:shd w:fill="F8FAFC"/>
-            <w:tcMar>
-              <w:top w:w="90" w:type="dxa"/>
-              <w:bottom w:w="90" w:type="dxa"/>
-              <w:left w:w="120" w:type="dxa"/>
-              <w:right w:w="120" w:type="dxa"/>
-            </w:tcMar>
-            <w:vAlign w:val="center"/>
-          </w:tcPr>
-          <w:p>
-            <w:pPr>
-              <w:spacing w:line="276" w:lineRule="auto"/>
-              <w:jc w:val="center"/>
-            </w:pPr>
-            <w:r>
-              <w:rPr>
-                <w:rFonts w:ascii="Times New Roman" w:hAnsi="Times New Roman" w:eastAsia="Times New Roman"/>
-                <w:b w:val="0"/>
-                <w:i w:val="0"/>
-                <w:color w:val="000000"/>
-                <w:sz w:val="28"/>
-              </w:rPr>
-              <w:t>83,71%</w:t>
-            </w:r>
-          </w:p>
-        </w:tc>
-        <w:tc>
-          <w:tcPr>
-            <w:tcW w:type="dxa" w:w="1512"/>
-            <w:shd w:fill="F8FAFC"/>
-            <w:tcMar>
-              <w:top w:w="90" w:type="dxa"/>
-              <w:bottom w:w="90" w:type="dxa"/>
-              <w:left w:w="120" w:type="dxa"/>
-              <w:right w:w="120" w:type="dxa"/>
-            </w:tcMar>
-            <w:vAlign w:val="center"/>
-          </w:tcPr>
-          <w:p>
-            <w:pPr>
-              <w:spacing w:line="276" w:lineRule="auto"/>
-              <w:jc w:val="left"/>
-            </w:pPr>
-            <w:r>
-              <w:rPr>
-                <w:rFonts w:ascii="Times New Roman" w:hAnsi="Times New Roman" w:eastAsia="Times New Roman"/>
-                <w:b w:val="0"/>
-                <w:i w:val="0"/>
-                <w:color w:val="000000"/>
-                <w:sz w:val="28"/>
+                <w:sz w:val="22"/>
               </w:rPr>
               <w:t>3.209 / 616 / 341 / 2.458</w:t>
             </w:r>
@@ -4219,7 +4971,7 @@
           <w:color w:val="000000"/>
           <w:sz w:val="28"/>
         </w:rPr>
-        <w:t>Trong 2.799 trang lừa đảo của bộ thử, mô hình Tăng Cường Độ Dốc phát hiện 2.676 trang, tức gần 96 trong mỗi 100 trang, và bỏ sót 123. Độ chuẩn xác khi báo động là 79,76%: trong 100 cảnh báo, khoảng 80 đúng. Rừng Ngẫu Nhiên phát hiện 2.584 trang; Hồi Quy Logic phát hiện 2.458. Mô hình Máy Véc-tơ Hỗ Trợ chỉ phát hiện 20 trang và bỏ sót 2.779, nên đây là hạn chế cần xử lý, dù 20 cảnh báo của nó đều đúng trong bộ thử.</w:t>
+        <w:t>Trong 2.799 trang lừa đảo của bộ thử, mô hình Gradient Boosting phát hiện 2.676 trang, tức gần 96 trong mỗi 100 trang, và bỏ sót 123. Độ chuẩn xác khi báo động là 79,76%: trong 100 cảnh báo, khoảng 80 đúng. Random Forest phát hiện 2.584 trang; Logistic Regression phát hiện 2.458. SVM chỉ phát hiện 20 trang và bỏ sót 2.779, nên đây là hạn chế cần xử lý, dù 20 cảnh báo của nó đều đúng trong bộ thử.</w:t>
       </w:r>
     </w:p>
     <w:p>
@@ -4307,7 +5059,7 @@
           <w:color w:val="000000"/>
           <w:sz w:val="28"/>
         </w:rPr>
-        <w:t>Thực hiện 16 bài kiểm thử tự động, bao gồm các thao tác nhập địa chỉ, chạy mô hình, đối chiếu kho dữ liệu và kiểm tra nội dung giao diện. Kết quả lần chạy hiện tại: đạt 16 / 16.</w:t>
+        <w:t>Thực hiện 16 bài kiểm thử tự động, bao gồm các thao tác nhập địa chỉ, chạy mô hình, đối chiếu cơ sở dữ liệu và kiểm tra nội dung giao diện. Kết quả lần chạy hiện tại: đạt 16 / 16.</w:t>
       </w:r>
     </w:p>
     <w:p>
@@ -4361,7 +5113,7 @@
           <w:color w:val="000000"/>
           <w:sz w:val="28"/>
         </w:rPr>
-        <w:t>Xử lý cục bộ giống như tự mở cuốn sổ tra cứu và dùng bốn người giám khảo ngay tại bàn của mình: địa chỉ được chuẩn hóa, dò kho dữ liệu và chấm điểm trong trình duyệt, không tự gửi đi dịch vụ bên ngoài. Nếu người dùng chủ động bật kiểm tra DNS hoặc ảnh xem trước, địa chỉ sẽ được chia sẻ với dịch vụ tương ứng; vì vậy không thể gọi mọi chế độ là hoàn toàn không gửi dữ liệu.</w:t>
+        <w:t>Xử lý cục bộ giống như tự mở cuốn sổ tra cứu và dùng bốn người giám khảo ngay tại bàn của mình: địa chỉ được chuẩn hóa, dò cơ sở dữ liệu và chấm điểm trong trình duyệt, không tự gửi đi dịch vụ bên ngoài. Nếu người dùng chủ động bật kiểm tra DNS hoặc ảnh xem trước, địa chỉ sẽ được chia sẻ với dịch vụ tương ứng; vì vậy không thể gọi mọi chế độ là hoàn toàn không gửi dữ liệu.</w:t>
       </w:r>
     </w:p>
     <w:p>
@@ -4531,7 +5283,7 @@
           <w:color w:val="000000"/>
           <w:sz w:val="28"/>
         </w:rPr>
-        <w:t>Nhìn màu sắc cảnh báo (Xanh = Thấp, Vàng = Thận trọng, Đỏ = Nguy hiểm), xem điểm của 4 mô hình AI, đọc lý do cụ thể tại ô 'Vì sao có kết quả này?' hoặc tra cứu thêm trong 'Kho Dữ Liệu PhishVN'.</w:t>
+        <w:t>Nhìn màu sắc cảnh báo (Xanh = Thấp, Vàng = Thận trọng, Đỏ = Nguy hiểm), xem điểm của 4 mô hình AI, đọc lý do cụ thể tại ô 'Vì sao có kết quả này?' hoặc tra cứu thêm trong 'Cơ sở dữ liệu URL'.</w:t>
       </w:r>
     </w:p>
     <w:p>
@@ -4704,7 +5456,7 @@
           <w:color w:val="000000"/>
           <w:sz w:val="28"/>
         </w:rPr>
-        <w:t>SafeWeb đặt cạnh nhau ba loại thông tin: hồ sơ đã có trong kho, dấu hiệu cấu trúc của địa chỉ và ý kiến của bốn mô hình. Trên bộ thử tên miền tách riêng, mô hình Tăng Cường Độ Dốc phát hiện 95,61% trang lừa đảo. Dự án chưa thử đối chứng trực tiếp với các dịch vụ ngoài thị trường, nên không kết luận mình chính xác hơn mọi công cụ khác.</w:t>
+        <w:t>SafeWeb đặt cạnh nhau ba loại thông tin: hồ sơ đã có trong cơ sở dữ liệu, dấu hiệu cấu trúc của địa chỉ và ý kiến của bốn mô hình. Trên bộ thử tên miền tách riêng, mô hình Gradient Boosting phát hiện 95,61% trang lừa đảo. Dự án chưa thử đối chứng trực tiếp với các dịch vụ ngoài thị trường, nên không kết luận mình chính xác hơn mọi công cụ khác.</w:t>
       </w:r>
     </w:p>
     <w:p>
@@ -4765,7 +5517,7 @@
           <w:color w:val="000000"/>
           <w:sz w:val="28"/>
         </w:rPr>
-        <w:t>SafeWeb có bộ tra cứu, bốn mô hình, giao diện giải thích kết quả và biểu mẫu tạo phiếu phản hồi. Trong phép thử hiện có, mô hình Tăng Cường Độ Dốc phát hiện 95,61% trang lừa đảo; mô hình Máy Véc-tơ Hỗ Trợ còn bỏ sót nhiều trường hợp và cần được hiệu chỉnh. Mọi con số đều phụ thuộc vào bộ dữ liệu và cách thử đã nêu.</w:t>
+        <w:t>SafeWeb có bộ tra cứu, bốn mô hình, giao diện giải thích kết quả và biểu mẫu tạo phiếu phản hồi. Trong phép thử hiện có, mô hình Gradient Boosting phát hiện 95,61% trang lừa đảo; SVM còn bỏ sót nhiều trường hợp và cần được hiệu chỉnh. Mọi con số đều phụ thuộc vào bộ dữ liệu và cách thử đã nêu.</w:t>
       </w:r>
     </w:p>
     <w:p>
@@ -4817,7 +5569,23 @@
           <w:color w:val="0F4C5C"/>
           <w:sz w:val="28"/>
         </w:rPr>
-        <w:t>TÀI LIỆU THAM KHẢO VÀ CÔNG CỤ</w:t>
+        <w:t>TÀI LIỆU THAM KHẢO</w:t>
+      </w:r>
+    </w:p>
+    <w:p>
+      <w:pPr>
+        <w:spacing w:line="276" w:lineRule="auto" w:before="0" w:after="80"/>
+        <w:jc w:val="left"/>
+      </w:pPr>
+      <w:r>
+        <w:rPr>
+          <w:rFonts w:ascii="Times New Roman" w:hAnsi="Times New Roman" w:eastAsia="Times New Roman"/>
+          <w:b w:val="0"/>
+          <w:i/>
+          <w:color w:val="000000"/>
+          <w:sz w:val="28"/>
+        </w:rPr>
+        <w:t>Nguồn: Internet. Các đường liên kết dưới đây là nơi nhóm lấy dữ liệu và công cụ.</w:t>
       </w:r>
     </w:p>
     <w:p>
@@ -4834,7 +5602,7 @@
           <w:color w:val="000000"/>
           <w:sz w:val="28"/>
         </w:rPr>
-        <w:t xml:space="preserve">• 1. Bộ dữ liệu địa chỉ trang web tiếng Việt: </w:t>
+        <w:t xml:space="preserve">• 1. Bộ dữ liệu PhishVN (địa chỉ trang web tiếng Việt): </w:t>
       </w:r>
       <w:r>
         <w:rPr>
@@ -4844,7 +5612,7 @@
           <w:color w:val="000000"/>
           <w:sz w:val="28"/>
         </w:rPr>
-        <w:t>Dùng làm nguồn hồ sơ tra cứu và một phần bài học, đề thi của dự án.</w:t>
+        <w:t>dùng làm cơ sở dữ liệu tra cứu và một phần bài học, đề thi. https://doi.org/10.17632/b97hxbxtpd.4</w:t>
       </w:r>
     </w:p>
     <w:p>
@@ -4861,7 +5629,7 @@
           <w:color w:val="000000"/>
           <w:sz w:val="28"/>
         </w:rPr>
-        <w:t xml:space="preserve">• 2. Bộ dữ liệu địa chỉ web mở rộng: </w:t>
+        <w:t xml:space="preserve">• 2. Bộ dữ liệu PhiUSIIL Phishing URL: </w:t>
       </w:r>
       <w:r>
         <w:rPr>
@@ -4871,7 +5639,7 @@
           <w:color w:val="000000"/>
           <w:sz w:val="28"/>
         </w:rPr>
-        <w:t>Bổ sung nhiều kiểu địa chỉ để các mô hình học thêm dấu hiệu đa dạng.</w:t>
+        <w:t>bổ sung nhiều kiểu địa chỉ để các mô hình học thêm dấu hiệu. https://archive.ics.uci.edu/dataset/967/phiusiil+phishing+url+dataset</w:t>
       </w:r>
     </w:p>
     <w:p>
@@ -4888,7 +5656,7 @@
           <w:color w:val="000000"/>
           <w:sz w:val="28"/>
         </w:rPr>
-        <w:t xml:space="preserve">• 3. Thư viện scikit-learn và ngôn ngữ Python: </w:t>
+        <w:t xml:space="preserve">• 3. Thư viện scikit-learn: </w:t>
       </w:r>
       <w:r>
         <w:rPr>
@@ -4898,7 +5666,7 @@
           <w:color w:val="000000"/>
           <w:sz w:val="28"/>
         </w:rPr>
-        <w:t>Dùng để huấn luyện, chấm điểm và thống kê bốn mô hình.</w:t>
+        <w:t>dùng để huấn luyện, chấm điểm và thống kê bốn mô hình. https://scikit-learn.org/stable/</w:t>
       </w:r>
     </w:p>
     <w:p>
@@ -4915,7 +5683,7 @@
           <w:color w:val="000000"/>
           <w:sz w:val="28"/>
         </w:rPr>
-        <w:t xml:space="preserve">• 4. Các quy chuẩn kỹ thuật về địa chỉ web và tên miền (RFC 3986, RFC 9110, RFC 1035): </w:t>
+        <w:t xml:space="preserve">• 4. Chuẩn kỹ thuật về địa chỉ web (RFC 3986): </w:t>
       </w:r>
       <w:r>
         <w:rPr>
@@ -4925,7 +5693,7 @@
           <w:color w:val="000000"/>
           <w:sz w:val="28"/>
         </w:rPr>
-        <w:t>Dùng để tách, chuẩn hóa và kiểm tra thành phần địa chỉ.</w:t>
+        <w:t>dùng để tách và chuẩn hóa các phần của địa chỉ. https://www.rfc-editor.org/rfc/rfc3986</w:t>
       </w:r>
     </w:p>
     <w:p>
@@ -4951,6 +5719,7 @@
         <w:tblStyle w:val="TableGrid"/>
         <w:tblW w:type="auto" w:w="0"/>
         <w:jc w:val="center"/>
+        <w:tblLayout w:type="fixed"/>
         <w:tblLook w:firstColumn="1" w:firstRow="1" w:lastColumn="0" w:lastRow="0" w:noHBand="0" w:noVBand="1" w:val="04A0"/>
       </w:tblPr>
       <w:tblGrid>
@@ -4959,9 +5728,12 @@
         <w:gridCol w:w="3024"/>
       </w:tblGrid>
       <w:tr>
+        <w:trPr>
+          <w:cantSplit/>
+        </w:trPr>
         <w:tc>
           <w:tcPr>
-            <w:tcW w:type="dxa" w:w="3024"/>
+            <w:tcW w:type="dxa" w:w="2494"/>
             <w:shd w:fill="0F766E"/>
             <w:tcMar>
               <w:top w:w="100" w:type="dxa"/>
@@ -4973,6 +5745,7 @@
           </w:tcPr>
           <w:p>
             <w:pPr>
+              <w:keepNext/>
               <w:spacing w:line="276" w:lineRule="auto"/>
               <w:jc w:val="center"/>
             </w:pPr>
@@ -4982,7 +5755,7 @@
                 <w:b/>
                 <w:i w:val="0"/>
                 <w:color w:val="FFFFFF"/>
-                <w:sz w:val="28"/>
+                <w:sz w:val="24"/>
               </w:rPr>
               <w:t>Tên gọi tiếng Việt</w:t>
             </w:r>
@@ -4990,7 +5763,7 @@
         </w:tc>
         <w:tc>
           <w:tcPr>
-            <w:tcW w:type="dxa" w:w="3024"/>
+            <w:tcW w:type="dxa" w:w="2041"/>
             <w:shd w:fill="0F766E"/>
             <w:tcMar>
               <w:top w:w="100" w:type="dxa"/>
@@ -5002,6 +5775,7 @@
           </w:tcPr>
           <w:p>
             <w:pPr>
+              <w:keepNext/>
               <w:spacing w:line="276" w:lineRule="auto"/>
               <w:jc w:val="center"/>
             </w:pPr>
@@ -5011,7 +5785,7 @@
                 <w:b/>
                 <w:i w:val="0"/>
                 <w:color w:val="FFFFFF"/>
-                <w:sz w:val="28"/>
+                <w:sz w:val="24"/>
               </w:rPr>
               <w:t>Tên kỹ thuật</w:t>
             </w:r>
@@ -5019,7 +5793,7 @@
         </w:tc>
         <w:tc>
           <w:tcPr>
-            <w:tcW w:type="dxa" w:w="3024"/>
+            <w:tcW w:type="dxa" w:w="4535"/>
             <w:shd w:fill="0F766E"/>
             <w:tcMar>
               <w:top w:w="100" w:type="dxa"/>
@@ -5031,6 +5805,7 @@
           </w:tcPr>
           <w:p>
             <w:pPr>
+              <w:keepNext/>
               <w:spacing w:line="276" w:lineRule="auto"/>
               <w:jc w:val="center"/>
             </w:pPr>
@@ -5040,7 +5815,7 @@
                 <w:b/>
                 <w:i w:val="0"/>
                 <w:color w:val="FFFFFF"/>
-                <w:sz w:val="28"/>
+                <w:sz w:val="24"/>
               </w:rPr>
               <w:t>Giải thích đời thường</w:t>
             </w:r>
@@ -5048,9 +5823,12 @@
         </w:tc>
       </w:tr>
       <w:tr>
+        <w:trPr>
+          <w:cantSplit/>
+        </w:trPr>
         <w:tc>
           <w:tcPr>
-            <w:tcW w:type="dxa" w:w="3024"/>
+            <w:tcW w:type="dxa" w:w="2494"/>
             <w:shd w:fill="FFFFFF"/>
             <w:tcMar>
               <w:top w:w="90" w:type="dxa"/>
@@ -5062,6 +5840,7 @@
           </w:tcPr>
           <w:p>
             <w:pPr>
+              <w:keepNext/>
               <w:spacing w:line="276" w:lineRule="auto"/>
               <w:jc w:val="left"/>
             </w:pPr>
@@ -5071,7 +5850,7 @@
                 <w:b/>
                 <w:i w:val="0"/>
                 <w:color w:val="000000"/>
-                <w:sz w:val="28"/>
+                <w:sz w:val="24"/>
               </w:rPr>
               <w:t>Đường dẫn trang web</w:t>
             </w:r>
@@ -5079,7 +5858,7 @@
         </w:tc>
         <w:tc>
           <w:tcPr>
-            <w:tcW w:type="dxa" w:w="3024"/>
+            <w:tcW w:type="dxa" w:w="2041"/>
             <w:shd w:fill="FFFFFF"/>
             <w:tcMar>
               <w:top w:w="90" w:type="dxa"/>
@@ -5091,6 +5870,7 @@
           </w:tcPr>
           <w:p>
             <w:pPr>
+              <w:keepNext/>
               <w:spacing w:line="276" w:lineRule="auto"/>
               <w:jc w:val="center"/>
             </w:pPr>
@@ -5100,7 +5880,7 @@
                 <w:b w:val="0"/>
                 <w:i w:val="0"/>
                 <w:color w:val="000000"/>
-                <w:sz w:val="28"/>
+                <w:sz w:val="24"/>
               </w:rPr>
               <w:t>URL</w:t>
             </w:r>
@@ -5108,7 +5888,7 @@
         </w:tc>
         <w:tc>
           <w:tcPr>
-            <w:tcW w:type="dxa" w:w="3024"/>
+            <w:tcW w:type="dxa" w:w="4535"/>
             <w:shd w:fill="FFFFFF"/>
             <w:tcMar>
               <w:top w:w="90" w:type="dxa"/>
@@ -5120,6 +5900,7 @@
           </w:tcPr>
           <w:p>
             <w:pPr>
+              <w:keepNext/>
               <w:spacing w:line="276" w:lineRule="auto"/>
               <w:jc w:val="left"/>
             </w:pPr>
@@ -5129,7 +5910,7 @@
                 <w:b w:val="0"/>
                 <w:i w:val="0"/>
                 <w:color w:val="000000"/>
-                <w:sz w:val="28"/>
+                <w:sz w:val="24"/>
               </w:rPr>
               <w:t>Địa chỉ để đi đến một trang, giống số nhà và tên đường.</w:t>
             </w:r>
@@ -5137,9 +5918,582 @@
         </w:tc>
       </w:tr>
       <w:tr>
+        <w:trPr>
+          <w:cantSplit/>
+        </w:trPr>
         <w:tc>
           <w:tcPr>
-            <w:tcW w:type="dxa" w:w="3024"/>
+            <w:tcW w:type="dxa" w:w="2494"/>
+            <w:shd w:fill="F8FAFC"/>
+            <w:tcMar>
+              <w:top w:w="90" w:type="dxa"/>
+              <w:bottom w:w="90" w:type="dxa"/>
+              <w:left w:w="120" w:type="dxa"/>
+              <w:right w:w="120" w:type="dxa"/>
+            </w:tcMar>
+            <w:vAlign w:val="center"/>
+          </w:tcPr>
+          <w:p>
+            <w:pPr>
+              <w:keepNext/>
+              <w:spacing w:line="276" w:lineRule="auto"/>
+              <w:jc w:val="left"/>
+            </w:pPr>
+            <w:r>
+              <w:rPr>
+                <w:rFonts w:ascii="Times New Roman" w:hAnsi="Times New Roman" w:eastAsia="Times New Roman"/>
+                <w:b/>
+                <w:i w:val="0"/>
+                <w:color w:val="000000"/>
+                <w:sz w:val="24"/>
+              </w:rPr>
+              <w:t>Trang web lừa đảo</w:t>
+            </w:r>
+          </w:p>
+        </w:tc>
+        <w:tc>
+          <w:tcPr>
+            <w:tcW w:type="dxa" w:w="2041"/>
+            <w:shd w:fill="F8FAFC"/>
+            <w:tcMar>
+              <w:top w:w="90" w:type="dxa"/>
+              <w:bottom w:w="90" w:type="dxa"/>
+              <w:left w:w="120" w:type="dxa"/>
+              <w:right w:w="120" w:type="dxa"/>
+            </w:tcMar>
+            <w:vAlign w:val="center"/>
+          </w:tcPr>
+          <w:p>
+            <w:pPr>
+              <w:keepNext/>
+              <w:spacing w:line="276" w:lineRule="auto"/>
+              <w:jc w:val="center"/>
+            </w:pPr>
+            <w:r>
+              <w:rPr>
+                <w:rFonts w:ascii="Times New Roman" w:hAnsi="Times New Roman" w:eastAsia="Times New Roman"/>
+                <w:b w:val="0"/>
+                <w:i w:val="0"/>
+                <w:color w:val="000000"/>
+                <w:sz w:val="24"/>
+              </w:rPr>
+              <w:t>Phishing</w:t>
+            </w:r>
+          </w:p>
+        </w:tc>
+        <w:tc>
+          <w:tcPr>
+            <w:tcW w:type="dxa" w:w="4535"/>
+            <w:shd w:fill="F8FAFC"/>
+            <w:tcMar>
+              <w:top w:w="90" w:type="dxa"/>
+              <w:bottom w:w="90" w:type="dxa"/>
+              <w:left w:w="120" w:type="dxa"/>
+              <w:right w:w="120" w:type="dxa"/>
+            </w:tcMar>
+            <w:vAlign w:val="center"/>
+          </w:tcPr>
+          <w:p>
+            <w:pPr>
+              <w:keepNext/>
+              <w:spacing w:line="276" w:lineRule="auto"/>
+              <w:jc w:val="left"/>
+            </w:pPr>
+            <w:r>
+              <w:rPr>
+                <w:rFonts w:ascii="Times New Roman" w:hAnsi="Times New Roman" w:eastAsia="Times New Roman"/>
+                <w:b w:val="0"/>
+                <w:i w:val="0"/>
+                <w:color w:val="000000"/>
+                <w:sz w:val="24"/>
+              </w:rPr>
+              <w:t>Trang giả mạo nhằm dụ người xem giao mật khẩu hoặc tiền.</w:t>
+            </w:r>
+          </w:p>
+        </w:tc>
+      </w:tr>
+      <w:tr>
+        <w:trPr>
+          <w:cantSplit/>
+        </w:trPr>
+        <w:tc>
+          <w:tcPr>
+            <w:tcW w:type="dxa" w:w="2494"/>
+            <w:shd w:fill="FFFFFF"/>
+            <w:tcMar>
+              <w:top w:w="90" w:type="dxa"/>
+              <w:bottom w:w="90" w:type="dxa"/>
+              <w:left w:w="120" w:type="dxa"/>
+              <w:right w:w="120" w:type="dxa"/>
+            </w:tcMar>
+            <w:vAlign w:val="center"/>
+          </w:tcPr>
+          <w:p>
+            <w:pPr>
+              <w:keepNext/>
+              <w:spacing w:line="276" w:lineRule="auto"/>
+              <w:jc w:val="left"/>
+            </w:pPr>
+            <w:r>
+              <w:rPr>
+                <w:rFonts w:ascii="Times New Roman" w:hAnsi="Times New Roman" w:eastAsia="Times New Roman"/>
+                <w:b/>
+                <w:i w:val="0"/>
+                <w:color w:val="000000"/>
+                <w:sz w:val="24"/>
+              </w:rPr>
+              <w:t>Tên miền</w:t>
+            </w:r>
+          </w:p>
+        </w:tc>
+        <w:tc>
+          <w:tcPr>
+            <w:tcW w:type="dxa" w:w="2041"/>
+            <w:shd w:fill="FFFFFF"/>
+            <w:tcMar>
+              <w:top w:w="90" w:type="dxa"/>
+              <w:bottom w:w="90" w:type="dxa"/>
+              <w:left w:w="120" w:type="dxa"/>
+              <w:right w:w="120" w:type="dxa"/>
+            </w:tcMar>
+            <w:vAlign w:val="center"/>
+          </w:tcPr>
+          <w:p>
+            <w:pPr>
+              <w:keepNext/>
+              <w:spacing w:line="276" w:lineRule="auto"/>
+              <w:jc w:val="center"/>
+            </w:pPr>
+            <w:r>
+              <w:rPr>
+                <w:rFonts w:ascii="Times New Roman" w:hAnsi="Times New Roman" w:eastAsia="Times New Roman"/>
+                <w:b w:val="0"/>
+                <w:i w:val="0"/>
+                <w:color w:val="000000"/>
+                <w:sz w:val="24"/>
+              </w:rPr>
+              <w:t>Domain</w:t>
+            </w:r>
+          </w:p>
+        </w:tc>
+        <w:tc>
+          <w:tcPr>
+            <w:tcW w:type="dxa" w:w="4535"/>
+            <w:shd w:fill="FFFFFF"/>
+            <w:tcMar>
+              <w:top w:w="90" w:type="dxa"/>
+              <w:bottom w:w="90" w:type="dxa"/>
+              <w:left w:w="120" w:type="dxa"/>
+              <w:right w:w="120" w:type="dxa"/>
+            </w:tcMar>
+            <w:vAlign w:val="center"/>
+          </w:tcPr>
+          <w:p>
+            <w:pPr>
+              <w:keepNext/>
+              <w:spacing w:line="276" w:lineRule="auto"/>
+              <w:jc w:val="left"/>
+            </w:pPr>
+            <w:r>
+              <w:rPr>
+                <w:rFonts w:ascii="Times New Roman" w:hAnsi="Times New Roman" w:eastAsia="Times New Roman"/>
+                <w:b w:val="0"/>
+                <w:i w:val="0"/>
+                <w:color w:val="000000"/>
+                <w:sz w:val="24"/>
+              </w:rPr>
+              <w:t>Tên dễ nhớ thay cho dãy số của máy chủ, như tên một cửa hàng.</w:t>
+            </w:r>
+          </w:p>
+        </w:tc>
+      </w:tr>
+      <w:tr>
+        <w:trPr>
+          <w:cantSplit/>
+        </w:trPr>
+        <w:tc>
+          <w:tcPr>
+            <w:tcW w:type="dxa" w:w="2494"/>
+            <w:shd w:fill="F8FAFC"/>
+            <w:tcMar>
+              <w:top w:w="90" w:type="dxa"/>
+              <w:bottom w:w="90" w:type="dxa"/>
+              <w:left w:w="120" w:type="dxa"/>
+              <w:right w:w="120" w:type="dxa"/>
+            </w:tcMar>
+            <w:vAlign w:val="center"/>
+          </w:tcPr>
+          <w:p>
+            <w:pPr>
+              <w:keepNext/>
+              <w:spacing w:line="276" w:lineRule="auto"/>
+              <w:jc w:val="left"/>
+            </w:pPr>
+            <w:r>
+              <w:rPr>
+                <w:rFonts w:ascii="Times New Roman" w:hAnsi="Times New Roman" w:eastAsia="Times New Roman"/>
+                <w:b/>
+                <w:i w:val="0"/>
+                <w:color w:val="000000"/>
+                <w:sz w:val="24"/>
+              </w:rPr>
+              <w:t>Kết nối HTTPS</w:t>
+            </w:r>
+          </w:p>
+        </w:tc>
+        <w:tc>
+          <w:tcPr>
+            <w:tcW w:type="dxa" w:w="2041"/>
+            <w:shd w:fill="F8FAFC"/>
+            <w:tcMar>
+              <w:top w:w="90" w:type="dxa"/>
+              <w:bottom w:w="90" w:type="dxa"/>
+              <w:left w:w="120" w:type="dxa"/>
+              <w:right w:w="120" w:type="dxa"/>
+            </w:tcMar>
+            <w:vAlign w:val="center"/>
+          </w:tcPr>
+          <w:p>
+            <w:pPr>
+              <w:keepNext/>
+              <w:spacing w:line="276" w:lineRule="auto"/>
+              <w:jc w:val="center"/>
+            </w:pPr>
+            <w:r>
+              <w:rPr>
+                <w:rFonts w:ascii="Times New Roman" w:hAnsi="Times New Roman" w:eastAsia="Times New Roman"/>
+                <w:b w:val="0"/>
+                <w:i w:val="0"/>
+                <w:color w:val="000000"/>
+                <w:sz w:val="24"/>
+              </w:rPr>
+              <w:t>HTTPS</w:t>
+            </w:r>
+          </w:p>
+        </w:tc>
+        <w:tc>
+          <w:tcPr>
+            <w:tcW w:type="dxa" w:w="4535"/>
+            <w:shd w:fill="F8FAFC"/>
+            <w:tcMar>
+              <w:top w:w="90" w:type="dxa"/>
+              <w:bottom w:w="90" w:type="dxa"/>
+              <w:left w:w="120" w:type="dxa"/>
+              <w:right w:w="120" w:type="dxa"/>
+            </w:tcMar>
+            <w:vAlign w:val="center"/>
+          </w:tcPr>
+          <w:p>
+            <w:pPr>
+              <w:keepNext/>
+              <w:spacing w:line="276" w:lineRule="auto"/>
+              <w:jc w:val="left"/>
+            </w:pPr>
+            <w:r>
+              <w:rPr>
+                <w:rFonts w:ascii="Times New Roman" w:hAnsi="Times New Roman" w:eastAsia="Times New Roman"/>
+                <w:b w:val="0"/>
+                <w:i w:val="0"/>
+                <w:color w:val="000000"/>
+                <w:sz w:val="24"/>
+              </w:rPr>
+              <w:t>Lớp mã hóa đường truyền; có khóa không đồng nghĩa cửa hàng là thật.</w:t>
+            </w:r>
+          </w:p>
+        </w:tc>
+      </w:tr>
+      <w:tr>
+        <w:trPr>
+          <w:cantSplit/>
+        </w:trPr>
+        <w:tc>
+          <w:tcPr>
+            <w:tcW w:type="dxa" w:w="2494"/>
+            <w:shd w:fill="FFFFFF"/>
+            <w:tcMar>
+              <w:top w:w="90" w:type="dxa"/>
+              <w:bottom w:w="90" w:type="dxa"/>
+              <w:left w:w="120" w:type="dxa"/>
+              <w:right w:w="120" w:type="dxa"/>
+            </w:tcMar>
+            <w:vAlign w:val="center"/>
+          </w:tcPr>
+          <w:p>
+            <w:pPr>
+              <w:keepNext/>
+              <w:spacing w:line="276" w:lineRule="auto"/>
+              <w:jc w:val="left"/>
+            </w:pPr>
+            <w:r>
+              <w:rPr>
+                <w:rFonts w:ascii="Times New Roman" w:hAnsi="Times New Roman" w:eastAsia="Times New Roman"/>
+                <w:b/>
+                <w:i w:val="0"/>
+                <w:color w:val="000000"/>
+                <w:sz w:val="24"/>
+              </w:rPr>
+              <w:t>Danh bạ tên miền</w:t>
+            </w:r>
+          </w:p>
+        </w:tc>
+        <w:tc>
+          <w:tcPr>
+            <w:tcW w:type="dxa" w:w="2041"/>
+            <w:shd w:fill="FFFFFF"/>
+            <w:tcMar>
+              <w:top w:w="90" w:type="dxa"/>
+              <w:bottom w:w="90" w:type="dxa"/>
+              <w:left w:w="120" w:type="dxa"/>
+              <w:right w:w="120" w:type="dxa"/>
+            </w:tcMar>
+            <w:vAlign w:val="center"/>
+          </w:tcPr>
+          <w:p>
+            <w:pPr>
+              <w:keepNext/>
+              <w:spacing w:line="276" w:lineRule="auto"/>
+              <w:jc w:val="center"/>
+            </w:pPr>
+            <w:r>
+              <w:rPr>
+                <w:rFonts w:ascii="Times New Roman" w:hAnsi="Times New Roman" w:eastAsia="Times New Roman"/>
+                <w:b w:val="0"/>
+                <w:i w:val="0"/>
+                <w:color w:val="000000"/>
+                <w:sz w:val="24"/>
+              </w:rPr>
+              <w:t>DNS</w:t>
+            </w:r>
+          </w:p>
+        </w:tc>
+        <w:tc>
+          <w:tcPr>
+            <w:tcW w:type="dxa" w:w="4535"/>
+            <w:shd w:fill="FFFFFF"/>
+            <w:tcMar>
+              <w:top w:w="90" w:type="dxa"/>
+              <w:bottom w:w="90" w:type="dxa"/>
+              <w:left w:w="120" w:type="dxa"/>
+              <w:right w:w="120" w:type="dxa"/>
+            </w:tcMar>
+            <w:vAlign w:val="center"/>
+          </w:tcPr>
+          <w:p>
+            <w:pPr>
+              <w:keepNext/>
+              <w:spacing w:line="276" w:lineRule="auto"/>
+              <w:jc w:val="left"/>
+            </w:pPr>
+            <w:r>
+              <w:rPr>
+                <w:rFonts w:ascii="Times New Roman" w:hAnsi="Times New Roman" w:eastAsia="Times New Roman"/>
+                <w:b w:val="0"/>
+                <w:i w:val="0"/>
+                <w:color w:val="000000"/>
+                <w:sz w:val="24"/>
+              </w:rPr>
+              <w:t>Dịch vụ đổi tên trang thành địa chỉ máy chủ, như danh bạ tìm số điện thoại.</w:t>
+            </w:r>
+          </w:p>
+        </w:tc>
+      </w:tr>
+      <w:tr>
+        <w:trPr>
+          <w:cantSplit/>
+        </w:trPr>
+        <w:tc>
+          <w:tcPr>
+            <w:tcW w:type="dxa" w:w="2494"/>
+            <w:shd w:fill="F8FAFC"/>
+            <w:tcMar>
+              <w:top w:w="90" w:type="dxa"/>
+              <w:bottom w:w="90" w:type="dxa"/>
+              <w:left w:w="120" w:type="dxa"/>
+              <w:right w:w="120" w:type="dxa"/>
+            </w:tcMar>
+            <w:vAlign w:val="center"/>
+          </w:tcPr>
+          <w:p>
+            <w:pPr>
+              <w:keepNext/>
+              <w:spacing w:line="276" w:lineRule="auto"/>
+              <w:jc w:val="left"/>
+            </w:pPr>
+            <w:r>
+              <w:rPr>
+                <w:rFonts w:ascii="Times New Roman" w:hAnsi="Times New Roman" w:eastAsia="Times New Roman"/>
+                <w:b/>
+                <w:i w:val="0"/>
+                <w:color w:val="000000"/>
+                <w:sz w:val="24"/>
+              </w:rPr>
+              <w:t>Học máy</w:t>
+            </w:r>
+          </w:p>
+        </w:tc>
+        <w:tc>
+          <w:tcPr>
+            <w:tcW w:type="dxa" w:w="2041"/>
+            <w:shd w:fill="F8FAFC"/>
+            <w:tcMar>
+              <w:top w:w="90" w:type="dxa"/>
+              <w:bottom w:w="90" w:type="dxa"/>
+              <w:left w:w="120" w:type="dxa"/>
+              <w:right w:w="120" w:type="dxa"/>
+            </w:tcMar>
+            <w:vAlign w:val="center"/>
+          </w:tcPr>
+          <w:p>
+            <w:pPr>
+              <w:keepNext/>
+              <w:spacing w:line="276" w:lineRule="auto"/>
+              <w:jc w:val="center"/>
+            </w:pPr>
+            <w:r>
+              <w:rPr>
+                <w:rFonts w:ascii="Times New Roman" w:hAnsi="Times New Roman" w:eastAsia="Times New Roman"/>
+                <w:b w:val="0"/>
+                <w:i w:val="0"/>
+                <w:color w:val="000000"/>
+                <w:sz w:val="24"/>
+              </w:rPr>
+              <w:t>Machine Learning</w:t>
+            </w:r>
+          </w:p>
+        </w:tc>
+        <w:tc>
+          <w:tcPr>
+            <w:tcW w:type="dxa" w:w="4535"/>
+            <w:shd w:fill="F8FAFC"/>
+            <w:tcMar>
+              <w:top w:w="90" w:type="dxa"/>
+              <w:bottom w:w="90" w:type="dxa"/>
+              <w:left w:w="120" w:type="dxa"/>
+              <w:right w:w="120" w:type="dxa"/>
+            </w:tcMar>
+            <w:vAlign w:val="center"/>
+          </w:tcPr>
+          <w:p>
+            <w:pPr>
+              <w:keepNext/>
+              <w:spacing w:line="276" w:lineRule="auto"/>
+              <w:jc w:val="left"/>
+            </w:pPr>
+            <w:r>
+              <w:rPr>
+                <w:rFonts w:ascii="Times New Roman" w:hAnsi="Times New Roman" w:eastAsia="Times New Roman"/>
+                <w:b w:val="0"/>
+                <w:i w:val="0"/>
+                <w:color w:val="000000"/>
+                <w:sz w:val="24"/>
+              </w:rPr>
+              <w:t>Cho máy xem nhiều ví dụ để nó học cách nhận ra mẫu giống nhau.</w:t>
+            </w:r>
+          </w:p>
+        </w:tc>
+      </w:tr>
+      <w:tr>
+        <w:trPr>
+          <w:cantSplit/>
+        </w:trPr>
+        <w:tc>
+          <w:tcPr>
+            <w:tcW w:type="dxa" w:w="2494"/>
+            <w:shd w:fill="FFFFFF"/>
+            <w:tcMar>
+              <w:top w:w="90" w:type="dxa"/>
+              <w:bottom w:w="90" w:type="dxa"/>
+              <w:left w:w="120" w:type="dxa"/>
+              <w:right w:w="120" w:type="dxa"/>
+            </w:tcMar>
+            <w:vAlign w:val="center"/>
+          </w:tcPr>
+          <w:p>
+            <w:pPr>
+              <w:keepNext/>
+              <w:spacing w:line="276" w:lineRule="auto"/>
+              <w:jc w:val="left"/>
+            </w:pPr>
+            <w:r>
+              <w:rPr>
+                <w:rFonts w:ascii="Times New Roman" w:hAnsi="Times New Roman" w:eastAsia="Times New Roman"/>
+                <w:b/>
+                <w:i w:val="0"/>
+                <w:color w:val="000000"/>
+                <w:sz w:val="24"/>
+              </w:rPr>
+              <w:t>Tính ngay trong trình duyệt</w:t>
+            </w:r>
+          </w:p>
+        </w:tc>
+        <w:tc>
+          <w:tcPr>
+            <w:tcW w:type="dxa" w:w="2041"/>
+            <w:shd w:fill="FFFFFF"/>
+            <w:tcMar>
+              <w:top w:w="90" w:type="dxa"/>
+              <w:bottom w:w="90" w:type="dxa"/>
+              <w:left w:w="120" w:type="dxa"/>
+              <w:right w:w="120" w:type="dxa"/>
+            </w:tcMar>
+            <w:vAlign w:val="center"/>
+          </w:tcPr>
+          <w:p>
+            <w:pPr>
+              <w:keepNext/>
+              <w:spacing w:line="276" w:lineRule="auto"/>
+              <w:jc w:val="center"/>
+            </w:pPr>
+            <w:r>
+              <w:rPr>
+                <w:rFonts w:ascii="Times New Roman" w:hAnsi="Times New Roman" w:eastAsia="Times New Roman"/>
+                <w:b w:val="0"/>
+                <w:i w:val="0"/>
+                <w:color w:val="000000"/>
+                <w:sz w:val="24"/>
+              </w:rPr>
+              <w:t>Browser inference</w:t>
+            </w:r>
+          </w:p>
+        </w:tc>
+        <w:tc>
+          <w:tcPr>
+            <w:tcW w:type="dxa" w:w="4535"/>
+            <w:shd w:fill="FFFFFF"/>
+            <w:tcMar>
+              <w:top w:w="90" w:type="dxa"/>
+              <w:bottom w:w="90" w:type="dxa"/>
+              <w:left w:w="120" w:type="dxa"/>
+              <w:right w:w="120" w:type="dxa"/>
+            </w:tcMar>
+            <w:vAlign w:val="center"/>
+          </w:tcPr>
+          <w:p>
+            <w:pPr>
+              <w:keepNext/>
+              <w:spacing w:line="276" w:lineRule="auto"/>
+              <w:jc w:val="left"/>
+            </w:pPr>
+            <w:r>
+              <w:rPr>
+                <w:rFonts w:ascii="Times New Roman" w:hAnsi="Times New Roman" w:eastAsia="Times New Roman"/>
+                <w:b w:val="0"/>
+                <w:i w:val="0"/>
+                <w:color w:val="000000"/>
+                <w:sz w:val="24"/>
+              </w:rPr>
+              <w:t>Máy người dùng tự chấm điểm, như tự làm phép tính tại bàn.</w:t>
+            </w:r>
+          </w:p>
+        </w:tc>
+      </w:tr>
+      <w:tr>
+        <w:trPr>
+          <w:cantSplit/>
+        </w:trPr>
+        <w:tc>
+          <w:tcPr>
+            <w:tcW w:type="dxa" w:w="2494"/>
             <w:shd w:fill="F8FAFC"/>
             <w:tcMar>
               <w:top w:w="90" w:type="dxa"/>
@@ -5160,15 +6514,15 @@
                 <w:b/>
                 <w:i w:val="0"/>
                 <w:color w:val="000000"/>
-                <w:sz w:val="28"/>
+                <w:sz w:val="24"/>
               </w:rPr>
-              <w:t>Trang web lừa đảo</w:t>
+              <w:t>Tiện ích gắn vào trình duyệt</w:t>
             </w:r>
           </w:p>
         </w:tc>
         <w:tc>
           <w:tcPr>
-            <w:tcW w:type="dxa" w:w="3024"/>
+            <w:tcW w:type="dxa" w:w="2041"/>
             <w:shd w:fill="F8FAFC"/>
             <w:tcMar>
               <w:top w:w="90" w:type="dxa"/>
@@ -5189,15 +6543,15 @@
                 <w:b w:val="0"/>
                 <w:i w:val="0"/>
                 <w:color w:val="000000"/>
-                <w:sz w:val="28"/>
+                <w:sz w:val="24"/>
               </w:rPr>
-              <w:t>Phishing</w:t>
+              <w:t>Browser extension</w:t>
             </w:r>
           </w:p>
         </w:tc>
         <w:tc>
           <w:tcPr>
-            <w:tcW w:type="dxa" w:w="3024"/>
+            <w:tcW w:type="dxa" w:w="4535"/>
             <w:shd w:fill="F8FAFC"/>
             <w:tcMar>
               <w:top w:w="90" w:type="dxa"/>
@@ -5218,541 +6572,7 @@
                 <w:b w:val="0"/>
                 <w:i w:val="0"/>
                 <w:color w:val="000000"/>
-                <w:sz w:val="28"/>
-              </w:rPr>
-              <w:t>Trang giả mạo nhằm dụ người xem giao mật khẩu hoặc tiền.</w:t>
-            </w:r>
-          </w:p>
-        </w:tc>
-      </w:tr>
-      <w:tr>
-        <w:tc>
-          <w:tcPr>
-            <w:tcW w:type="dxa" w:w="3024"/>
-            <w:shd w:fill="FFFFFF"/>
-            <w:tcMar>
-              <w:top w:w="90" w:type="dxa"/>
-              <w:bottom w:w="90" w:type="dxa"/>
-              <w:left w:w="120" w:type="dxa"/>
-              <w:right w:w="120" w:type="dxa"/>
-            </w:tcMar>
-            <w:vAlign w:val="center"/>
-          </w:tcPr>
-          <w:p>
-            <w:pPr>
-              <w:spacing w:line="276" w:lineRule="auto"/>
-              <w:jc w:val="left"/>
-            </w:pPr>
-            <w:r>
-              <w:rPr>
-                <w:rFonts w:ascii="Times New Roman" w:hAnsi="Times New Roman" w:eastAsia="Times New Roman"/>
-                <w:b/>
-                <w:i w:val="0"/>
-                <w:color w:val="000000"/>
-                <w:sz w:val="28"/>
-              </w:rPr>
-              <w:t>Tên miền</w:t>
-            </w:r>
-          </w:p>
-        </w:tc>
-        <w:tc>
-          <w:tcPr>
-            <w:tcW w:type="dxa" w:w="3024"/>
-            <w:shd w:fill="FFFFFF"/>
-            <w:tcMar>
-              <w:top w:w="90" w:type="dxa"/>
-              <w:bottom w:w="90" w:type="dxa"/>
-              <w:left w:w="120" w:type="dxa"/>
-              <w:right w:w="120" w:type="dxa"/>
-            </w:tcMar>
-            <w:vAlign w:val="center"/>
-          </w:tcPr>
-          <w:p>
-            <w:pPr>
-              <w:spacing w:line="276" w:lineRule="auto"/>
-              <w:jc w:val="center"/>
-            </w:pPr>
-            <w:r>
-              <w:rPr>
-                <w:rFonts w:ascii="Times New Roman" w:hAnsi="Times New Roman" w:eastAsia="Times New Roman"/>
-                <w:b w:val="0"/>
-                <w:i w:val="0"/>
-                <w:color w:val="000000"/>
-                <w:sz w:val="28"/>
-              </w:rPr>
-              <w:t>Domain</w:t>
-            </w:r>
-          </w:p>
-        </w:tc>
-        <w:tc>
-          <w:tcPr>
-            <w:tcW w:type="dxa" w:w="3024"/>
-            <w:shd w:fill="FFFFFF"/>
-            <w:tcMar>
-              <w:top w:w="90" w:type="dxa"/>
-              <w:bottom w:w="90" w:type="dxa"/>
-              <w:left w:w="120" w:type="dxa"/>
-              <w:right w:w="120" w:type="dxa"/>
-            </w:tcMar>
-            <w:vAlign w:val="center"/>
-          </w:tcPr>
-          <w:p>
-            <w:pPr>
-              <w:spacing w:line="276" w:lineRule="auto"/>
-              <w:jc w:val="left"/>
-            </w:pPr>
-            <w:r>
-              <w:rPr>
-                <w:rFonts w:ascii="Times New Roman" w:hAnsi="Times New Roman" w:eastAsia="Times New Roman"/>
-                <w:b w:val="0"/>
-                <w:i w:val="0"/>
-                <w:color w:val="000000"/>
-                <w:sz w:val="28"/>
-              </w:rPr>
-              <w:t>Tên dễ nhớ thay cho dãy số của máy chủ, như tên một cửa hàng.</w:t>
-            </w:r>
-          </w:p>
-        </w:tc>
-      </w:tr>
-      <w:tr>
-        <w:tc>
-          <w:tcPr>
-            <w:tcW w:type="dxa" w:w="3024"/>
-            <w:shd w:fill="F8FAFC"/>
-            <w:tcMar>
-              <w:top w:w="90" w:type="dxa"/>
-              <w:bottom w:w="90" w:type="dxa"/>
-              <w:left w:w="120" w:type="dxa"/>
-              <w:right w:w="120" w:type="dxa"/>
-            </w:tcMar>
-            <w:vAlign w:val="center"/>
-          </w:tcPr>
-          <w:p>
-            <w:pPr>
-              <w:spacing w:line="276" w:lineRule="auto"/>
-              <w:jc w:val="left"/>
-            </w:pPr>
-            <w:r>
-              <w:rPr>
-                <w:rFonts w:ascii="Times New Roman" w:hAnsi="Times New Roman" w:eastAsia="Times New Roman"/>
-                <w:b/>
-                <w:i w:val="0"/>
-                <w:color w:val="000000"/>
-                <w:sz w:val="28"/>
-              </w:rPr>
-              <w:t>Kết nối HTTPS</w:t>
-            </w:r>
-          </w:p>
-        </w:tc>
-        <w:tc>
-          <w:tcPr>
-            <w:tcW w:type="dxa" w:w="3024"/>
-            <w:shd w:fill="F8FAFC"/>
-            <w:tcMar>
-              <w:top w:w="90" w:type="dxa"/>
-              <w:bottom w:w="90" w:type="dxa"/>
-              <w:left w:w="120" w:type="dxa"/>
-              <w:right w:w="120" w:type="dxa"/>
-            </w:tcMar>
-            <w:vAlign w:val="center"/>
-          </w:tcPr>
-          <w:p>
-            <w:pPr>
-              <w:spacing w:line="276" w:lineRule="auto"/>
-              <w:jc w:val="center"/>
-            </w:pPr>
-            <w:r>
-              <w:rPr>
-                <w:rFonts w:ascii="Times New Roman" w:hAnsi="Times New Roman" w:eastAsia="Times New Roman"/>
-                <w:b w:val="0"/>
-                <w:i w:val="0"/>
-                <w:color w:val="000000"/>
-                <w:sz w:val="28"/>
-              </w:rPr>
-              <w:t>HTTPS</w:t>
-            </w:r>
-          </w:p>
-        </w:tc>
-        <w:tc>
-          <w:tcPr>
-            <w:tcW w:type="dxa" w:w="3024"/>
-            <w:shd w:fill="F8FAFC"/>
-            <w:tcMar>
-              <w:top w:w="90" w:type="dxa"/>
-              <w:bottom w:w="90" w:type="dxa"/>
-              <w:left w:w="120" w:type="dxa"/>
-              <w:right w:w="120" w:type="dxa"/>
-            </w:tcMar>
-            <w:vAlign w:val="center"/>
-          </w:tcPr>
-          <w:p>
-            <w:pPr>
-              <w:spacing w:line="276" w:lineRule="auto"/>
-              <w:jc w:val="left"/>
-            </w:pPr>
-            <w:r>
-              <w:rPr>
-                <w:rFonts w:ascii="Times New Roman" w:hAnsi="Times New Roman" w:eastAsia="Times New Roman"/>
-                <w:b w:val="0"/>
-                <w:i w:val="0"/>
-                <w:color w:val="000000"/>
-                <w:sz w:val="28"/>
-              </w:rPr>
-              <w:t>Lớp mã hóa đường truyền; có khóa không đồng nghĩa cửa hàng là thật.</w:t>
-            </w:r>
-          </w:p>
-        </w:tc>
-      </w:tr>
-      <w:tr>
-        <w:tc>
-          <w:tcPr>
-            <w:tcW w:type="dxa" w:w="3024"/>
-            <w:shd w:fill="FFFFFF"/>
-            <w:tcMar>
-              <w:top w:w="90" w:type="dxa"/>
-              <w:bottom w:w="90" w:type="dxa"/>
-              <w:left w:w="120" w:type="dxa"/>
-              <w:right w:w="120" w:type="dxa"/>
-            </w:tcMar>
-            <w:vAlign w:val="center"/>
-          </w:tcPr>
-          <w:p>
-            <w:pPr>
-              <w:spacing w:line="276" w:lineRule="auto"/>
-              <w:jc w:val="left"/>
-            </w:pPr>
-            <w:r>
-              <w:rPr>
-                <w:rFonts w:ascii="Times New Roman" w:hAnsi="Times New Roman" w:eastAsia="Times New Roman"/>
-                <w:b/>
-                <w:i w:val="0"/>
-                <w:color w:val="000000"/>
-                <w:sz w:val="28"/>
-              </w:rPr>
-              <w:t>Danh bạ tên miền</w:t>
-            </w:r>
-          </w:p>
-        </w:tc>
-        <w:tc>
-          <w:tcPr>
-            <w:tcW w:type="dxa" w:w="3024"/>
-            <w:shd w:fill="FFFFFF"/>
-            <w:tcMar>
-              <w:top w:w="90" w:type="dxa"/>
-              <w:bottom w:w="90" w:type="dxa"/>
-              <w:left w:w="120" w:type="dxa"/>
-              <w:right w:w="120" w:type="dxa"/>
-            </w:tcMar>
-            <w:vAlign w:val="center"/>
-          </w:tcPr>
-          <w:p>
-            <w:pPr>
-              <w:spacing w:line="276" w:lineRule="auto"/>
-              <w:jc w:val="center"/>
-            </w:pPr>
-            <w:r>
-              <w:rPr>
-                <w:rFonts w:ascii="Times New Roman" w:hAnsi="Times New Roman" w:eastAsia="Times New Roman"/>
-                <w:b w:val="0"/>
-                <w:i w:val="0"/>
-                <w:color w:val="000000"/>
-                <w:sz w:val="28"/>
-              </w:rPr>
-              <w:t>DNS</w:t>
-            </w:r>
-          </w:p>
-        </w:tc>
-        <w:tc>
-          <w:tcPr>
-            <w:tcW w:type="dxa" w:w="3024"/>
-            <w:shd w:fill="FFFFFF"/>
-            <w:tcMar>
-              <w:top w:w="90" w:type="dxa"/>
-              <w:bottom w:w="90" w:type="dxa"/>
-              <w:left w:w="120" w:type="dxa"/>
-              <w:right w:w="120" w:type="dxa"/>
-            </w:tcMar>
-            <w:vAlign w:val="center"/>
-          </w:tcPr>
-          <w:p>
-            <w:pPr>
-              <w:spacing w:line="276" w:lineRule="auto"/>
-              <w:jc w:val="left"/>
-            </w:pPr>
-            <w:r>
-              <w:rPr>
-                <w:rFonts w:ascii="Times New Roman" w:hAnsi="Times New Roman" w:eastAsia="Times New Roman"/>
-                <w:b w:val="0"/>
-                <w:i w:val="0"/>
-                <w:color w:val="000000"/>
-                <w:sz w:val="28"/>
-              </w:rPr>
-              <w:t>Dịch vụ đổi tên trang thành địa chỉ máy chủ, như danh bạ tìm số điện thoại.</w:t>
-            </w:r>
-          </w:p>
-        </w:tc>
-      </w:tr>
-      <w:tr>
-        <w:tc>
-          <w:tcPr>
-            <w:tcW w:type="dxa" w:w="3024"/>
-            <w:shd w:fill="F8FAFC"/>
-            <w:tcMar>
-              <w:top w:w="90" w:type="dxa"/>
-              <w:bottom w:w="90" w:type="dxa"/>
-              <w:left w:w="120" w:type="dxa"/>
-              <w:right w:w="120" w:type="dxa"/>
-            </w:tcMar>
-            <w:vAlign w:val="center"/>
-          </w:tcPr>
-          <w:p>
-            <w:pPr>
-              <w:spacing w:line="276" w:lineRule="auto"/>
-              <w:jc w:val="left"/>
-            </w:pPr>
-            <w:r>
-              <w:rPr>
-                <w:rFonts w:ascii="Times New Roman" w:hAnsi="Times New Roman" w:eastAsia="Times New Roman"/>
-                <w:b/>
-                <w:i w:val="0"/>
-                <w:color w:val="000000"/>
-                <w:sz w:val="28"/>
-              </w:rPr>
-              <w:t>Học máy</w:t>
-            </w:r>
-          </w:p>
-        </w:tc>
-        <w:tc>
-          <w:tcPr>
-            <w:tcW w:type="dxa" w:w="3024"/>
-            <w:shd w:fill="F8FAFC"/>
-            <w:tcMar>
-              <w:top w:w="90" w:type="dxa"/>
-              <w:bottom w:w="90" w:type="dxa"/>
-              <w:left w:w="120" w:type="dxa"/>
-              <w:right w:w="120" w:type="dxa"/>
-            </w:tcMar>
-            <w:vAlign w:val="center"/>
-          </w:tcPr>
-          <w:p>
-            <w:pPr>
-              <w:spacing w:line="276" w:lineRule="auto"/>
-              <w:jc w:val="center"/>
-            </w:pPr>
-            <w:r>
-              <w:rPr>
-                <w:rFonts w:ascii="Times New Roman" w:hAnsi="Times New Roman" w:eastAsia="Times New Roman"/>
-                <w:b w:val="0"/>
-                <w:i w:val="0"/>
-                <w:color w:val="000000"/>
-                <w:sz w:val="28"/>
-              </w:rPr>
-              <w:t>Machine Learning</w:t>
-            </w:r>
-          </w:p>
-        </w:tc>
-        <w:tc>
-          <w:tcPr>
-            <w:tcW w:type="dxa" w:w="3024"/>
-            <w:shd w:fill="F8FAFC"/>
-            <w:tcMar>
-              <w:top w:w="90" w:type="dxa"/>
-              <w:bottom w:w="90" w:type="dxa"/>
-              <w:left w:w="120" w:type="dxa"/>
-              <w:right w:w="120" w:type="dxa"/>
-            </w:tcMar>
-            <w:vAlign w:val="center"/>
-          </w:tcPr>
-          <w:p>
-            <w:pPr>
-              <w:spacing w:line="276" w:lineRule="auto"/>
-              <w:jc w:val="left"/>
-            </w:pPr>
-            <w:r>
-              <w:rPr>
-                <w:rFonts w:ascii="Times New Roman" w:hAnsi="Times New Roman" w:eastAsia="Times New Roman"/>
-                <w:b w:val="0"/>
-                <w:i w:val="0"/>
-                <w:color w:val="000000"/>
-                <w:sz w:val="28"/>
-              </w:rPr>
-              <w:t>Cho máy xem nhiều ví dụ để nó học cách nhận ra mẫu giống nhau.</w:t>
-            </w:r>
-          </w:p>
-        </w:tc>
-      </w:tr>
-      <w:tr>
-        <w:tc>
-          <w:tcPr>
-            <w:tcW w:type="dxa" w:w="3024"/>
-            <w:shd w:fill="FFFFFF"/>
-            <w:tcMar>
-              <w:top w:w="90" w:type="dxa"/>
-              <w:bottom w:w="90" w:type="dxa"/>
-              <w:left w:w="120" w:type="dxa"/>
-              <w:right w:w="120" w:type="dxa"/>
-            </w:tcMar>
-            <w:vAlign w:val="center"/>
-          </w:tcPr>
-          <w:p>
-            <w:pPr>
-              <w:spacing w:line="276" w:lineRule="auto"/>
-              <w:jc w:val="left"/>
-            </w:pPr>
-            <w:r>
-              <w:rPr>
-                <w:rFonts w:ascii="Times New Roman" w:hAnsi="Times New Roman" w:eastAsia="Times New Roman"/>
-                <w:b/>
-                <w:i w:val="0"/>
-                <w:color w:val="000000"/>
-                <w:sz w:val="28"/>
-              </w:rPr>
-              <w:t>Tính ngay trong trình duyệt</w:t>
-            </w:r>
-          </w:p>
-        </w:tc>
-        <w:tc>
-          <w:tcPr>
-            <w:tcW w:type="dxa" w:w="3024"/>
-            <w:shd w:fill="FFFFFF"/>
-            <w:tcMar>
-              <w:top w:w="90" w:type="dxa"/>
-              <w:bottom w:w="90" w:type="dxa"/>
-              <w:left w:w="120" w:type="dxa"/>
-              <w:right w:w="120" w:type="dxa"/>
-            </w:tcMar>
-            <w:vAlign w:val="center"/>
-          </w:tcPr>
-          <w:p>
-            <w:pPr>
-              <w:spacing w:line="276" w:lineRule="auto"/>
-              <w:jc w:val="center"/>
-            </w:pPr>
-            <w:r>
-              <w:rPr>
-                <w:rFonts w:ascii="Times New Roman" w:hAnsi="Times New Roman" w:eastAsia="Times New Roman"/>
-                <w:b w:val="0"/>
-                <w:i w:val="0"/>
-                <w:color w:val="000000"/>
-                <w:sz w:val="28"/>
-              </w:rPr>
-              <w:t>Browser inference</w:t>
-            </w:r>
-          </w:p>
-        </w:tc>
-        <w:tc>
-          <w:tcPr>
-            <w:tcW w:type="dxa" w:w="3024"/>
-            <w:shd w:fill="FFFFFF"/>
-            <w:tcMar>
-              <w:top w:w="90" w:type="dxa"/>
-              <w:bottom w:w="90" w:type="dxa"/>
-              <w:left w:w="120" w:type="dxa"/>
-              <w:right w:w="120" w:type="dxa"/>
-            </w:tcMar>
-            <w:vAlign w:val="center"/>
-          </w:tcPr>
-          <w:p>
-            <w:pPr>
-              <w:spacing w:line="276" w:lineRule="auto"/>
-              <w:jc w:val="left"/>
-            </w:pPr>
-            <w:r>
-              <w:rPr>
-                <w:rFonts w:ascii="Times New Roman" w:hAnsi="Times New Roman" w:eastAsia="Times New Roman"/>
-                <w:b w:val="0"/>
-                <w:i w:val="0"/>
-                <w:color w:val="000000"/>
-                <w:sz w:val="28"/>
-              </w:rPr>
-              <w:t>Máy người dùng tự chấm điểm, như tự làm phép tính tại bàn.</w:t>
-            </w:r>
-          </w:p>
-        </w:tc>
-      </w:tr>
-      <w:tr>
-        <w:tc>
-          <w:tcPr>
-            <w:tcW w:type="dxa" w:w="3024"/>
-            <w:shd w:fill="F8FAFC"/>
-            <w:tcMar>
-              <w:top w:w="90" w:type="dxa"/>
-              <w:bottom w:w="90" w:type="dxa"/>
-              <w:left w:w="120" w:type="dxa"/>
-              <w:right w:w="120" w:type="dxa"/>
-            </w:tcMar>
-            <w:vAlign w:val="center"/>
-          </w:tcPr>
-          <w:p>
-            <w:pPr>
-              <w:spacing w:line="276" w:lineRule="auto"/>
-              <w:jc w:val="left"/>
-            </w:pPr>
-            <w:r>
-              <w:rPr>
-                <w:rFonts w:ascii="Times New Roman" w:hAnsi="Times New Roman" w:eastAsia="Times New Roman"/>
-                <w:b/>
-                <w:i w:val="0"/>
-                <w:color w:val="000000"/>
-                <w:sz w:val="28"/>
-              </w:rPr>
-              <w:t>Tiện ích gắn vào trình duyệt</w:t>
-            </w:r>
-          </w:p>
-        </w:tc>
-        <w:tc>
-          <w:tcPr>
-            <w:tcW w:type="dxa" w:w="3024"/>
-            <w:shd w:fill="F8FAFC"/>
-            <w:tcMar>
-              <w:top w:w="90" w:type="dxa"/>
-              <w:bottom w:w="90" w:type="dxa"/>
-              <w:left w:w="120" w:type="dxa"/>
-              <w:right w:w="120" w:type="dxa"/>
-            </w:tcMar>
-            <w:vAlign w:val="center"/>
-          </w:tcPr>
-          <w:p>
-            <w:pPr>
-              <w:spacing w:line="276" w:lineRule="auto"/>
-              <w:jc w:val="center"/>
-            </w:pPr>
-            <w:r>
-              <w:rPr>
-                <w:rFonts w:ascii="Times New Roman" w:hAnsi="Times New Roman" w:eastAsia="Times New Roman"/>
-                <w:b w:val="0"/>
-                <w:i w:val="0"/>
-                <w:color w:val="000000"/>
-                <w:sz w:val="28"/>
-              </w:rPr>
-              <w:t>Browser extension</w:t>
-            </w:r>
-          </w:p>
-        </w:tc>
-        <w:tc>
-          <w:tcPr>
-            <w:tcW w:type="dxa" w:w="3024"/>
-            <w:shd w:fill="F8FAFC"/>
-            <w:tcMar>
-              <w:top w:w="90" w:type="dxa"/>
-              <w:bottom w:w="90" w:type="dxa"/>
-              <w:left w:w="120" w:type="dxa"/>
-              <w:right w:w="120" w:type="dxa"/>
-            </w:tcMar>
-            <w:vAlign w:val="center"/>
-          </w:tcPr>
-          <w:p>
-            <w:pPr>
-              <w:spacing w:line="276" w:lineRule="auto"/>
-              <w:jc w:val="left"/>
-            </w:pPr>
-            <w:r>
-              <w:rPr>
-                <w:rFonts w:ascii="Times New Roman" w:hAnsi="Times New Roman" w:eastAsia="Times New Roman"/>
-                <w:b w:val="0"/>
-                <w:i w:val="0"/>
-                <w:color w:val="000000"/>
-                <w:sz w:val="28"/>
+                <w:sz w:val="24"/>
               </w:rPr>
               <w:t>Chương trình nhỏ thêm chức năng vào trình duyệt; đây là hướng phát triển.</w:t>
             </w:r>

</xml_diff>